<commit_message>
Report - Added a front cover and initial details
</commit_message>
<xml_diff>
--- a/w2149479_ShamlaAqthar_Report.docx
+++ b/w2149479_ShamlaAqthar_Report.docx
@@ -2,15 +2,1011 @@
 <file path=word/document.xml><?xml version="1.0" encoding="utf-8"?>
 <w:document xmlns:wpc="http://schemas.microsoft.com/office/word/2010/wordprocessingCanvas" xmlns:cx="http://schemas.microsoft.com/office/drawing/2014/chartex" xmlns:cx1="http://schemas.microsoft.com/office/drawing/2015/9/8/chartex" xmlns:cx2="http://schemas.microsoft.com/office/drawing/2015/10/21/chartex" xmlns:cx3="http://schemas.microsoft.com/office/drawing/2016/5/9/chartex" xmlns:cx4="http://schemas.microsoft.com/office/drawing/2016/5/10/chartex" xmlns:cx5="http://schemas.microsoft.com/office/drawing/2016/5/11/chartex" xmlns:cx6="http://schemas.microsoft.com/office/drawing/2016/5/12/chartex" xmlns:cx7="http://schemas.microsoft.com/office/drawing/2016/5/13/chartex" xmlns:cx8="http://schemas.microsoft.com/office/drawing/2016/5/14/chartex" xmlns:mc="http://schemas.openxmlformats.org/markup-compatibility/2006" xmlns:aink="http://schemas.microsoft.com/office/drawing/2016/ink" xmlns:am3d="http://schemas.microsoft.com/office/drawing/2017/model3d" xmlns:o="urn:schemas-microsoft-com:office:office" xmlns:oel="http://schemas.microsoft.com/office/2019/extlst" xmlns:r="http://schemas.openxmlformats.org/officeDocument/2006/relationships" xmlns:m="http://schemas.openxmlformats.org/officeDocument/2006/math" xmlns:v="urn:schemas-microsoft-com:vml" xmlns:wp14="http://schemas.microsoft.com/office/word/2010/wordprocessingDrawing" xmlns:wp="http://schemas.openxmlformats.org/drawingml/2006/wordprocessingDrawing" xmlns:w10="urn:schemas-microsoft-com:office:word" xmlns:w="http://schemas.openxmlformats.org/wordprocessingml/2006/main" xmlns:w14="http://schemas.microsoft.com/office/word/2010/wordml" xmlns:w15="http://schemas.microsoft.com/office/word/2012/wordml" xmlns:w16cex="http://schemas.microsoft.com/office/word/2018/wordml/cex" xmlns:w16cid="http://schemas.microsoft.com/office/word/2016/wordml/cid" xmlns:w16="http://schemas.microsoft.com/office/word/2018/wordml" xmlns:w16du="http://schemas.microsoft.com/office/word/2023/wordml/word16du" xmlns:w16sdtdh="http://schemas.microsoft.com/office/word/2020/wordml/sdtdatahash" xmlns:w16sdtfl="http://schemas.microsoft.com/office/word/2024/wordml/sdtformatlock" xmlns:w16se="http://schemas.microsoft.com/office/word/2015/wordml/symex" xmlns:wpg="http://schemas.microsoft.com/office/word/2010/wordprocessingGroup" xmlns:wpi="http://schemas.microsoft.com/office/word/2010/wordprocessingInk" xmlns:wne="http://schemas.microsoft.com/office/word/2006/wordml" xmlns:wps="http://schemas.microsoft.com/office/word/2010/wordprocessingShape" mc:Ignorable="w14 w15 w16se w16cid w16 w16cex w16sdtdh w16sdtfl w16du wp14">
   <w:body>
-    <w:p/>
+    <w:p>
+      <w:pPr>
+        <w:pStyle w:val="p1"/>
+        <w:spacing w:line="360" w:lineRule="auto"/>
+        <w:rPr>
+          <w:rFonts w:ascii="Times New Roman" w:hAnsi="Times New Roman"/>
+          <w:sz w:val="24"/>
+          <w:szCs w:val="24"/>
+        </w:rPr>
+      </w:pPr>
+      <w:r>
+        <w:rPr>
+          <w:rFonts w:ascii="Times New Roman" w:hAnsi="Times New Roman"/>
+          <w:noProof/>
+        </w:rPr>
+        <w:drawing>
+          <wp:anchor distT="0" distB="0" distL="114300" distR="114300" simplePos="0" relativeHeight="251659264" behindDoc="0" locked="0" layoutInCell="1" allowOverlap="1" wp14:anchorId="1691B864" wp14:editId="366C97CC">
+            <wp:simplePos x="0" y="0"/>
+            <wp:positionH relativeFrom="column">
+              <wp:posOffset>3604260</wp:posOffset>
+            </wp:positionH>
+            <wp:positionV relativeFrom="paragraph">
+              <wp:posOffset>461</wp:posOffset>
+            </wp:positionV>
+            <wp:extent cx="2413000" cy="1259205"/>
+            <wp:effectExtent l="0" t="0" r="0" b="0"/>
+            <wp:wrapThrough wrapText="bothSides">
+              <wp:wrapPolygon edited="0">
+                <wp:start x="114" y="2396"/>
+                <wp:lineTo x="227" y="13289"/>
+                <wp:lineTo x="1137" y="16775"/>
+                <wp:lineTo x="1137" y="16992"/>
+                <wp:lineTo x="2956" y="19607"/>
+                <wp:lineTo x="3752" y="19607"/>
+                <wp:lineTo x="10914" y="19171"/>
+                <wp:lineTo x="21032" y="17864"/>
+                <wp:lineTo x="20918" y="16775"/>
+                <wp:lineTo x="21486" y="14160"/>
+                <wp:lineTo x="20577" y="13943"/>
+                <wp:lineTo x="6480" y="13289"/>
+                <wp:lineTo x="20577" y="12200"/>
+                <wp:lineTo x="21486" y="10021"/>
+                <wp:lineTo x="21486" y="3050"/>
+                <wp:lineTo x="20577" y="2832"/>
+                <wp:lineTo x="6594" y="2396"/>
+                <wp:lineTo x="114" y="2396"/>
+              </wp:wrapPolygon>
+            </wp:wrapThrough>
+            <wp:docPr id="342664188" name="Picture 2" descr="A red shield with a microphone on it&#10;&#10;AI-generated content may be incorrect."/>
+            <wp:cNvGraphicFramePr>
+              <a:graphicFrameLocks xmlns:a="http://schemas.openxmlformats.org/drawingml/2006/main" noChangeAspect="1"/>
+            </wp:cNvGraphicFramePr>
+            <a:graphic xmlns:a="http://schemas.openxmlformats.org/drawingml/2006/main">
+              <a:graphicData uri="http://schemas.openxmlformats.org/drawingml/2006/picture">
+                <pic:pic xmlns:pic="http://schemas.openxmlformats.org/drawingml/2006/picture">
+                  <pic:nvPicPr>
+                    <pic:cNvPr id="342664188" name="Picture 2" descr="A red shield with a microphone on it&#10;&#10;AI-generated content may be incorrect."/>
+                    <pic:cNvPicPr/>
+                  </pic:nvPicPr>
+                  <pic:blipFill>
+                    <a:blip r:embed="rId6" cstate="print">
+                      <a:extLst>
+                        <a:ext uri="{28A0092B-C50C-407E-A947-70E740481C1C}">
+                          <a14:useLocalDpi xmlns:a14="http://schemas.microsoft.com/office/drawing/2010/main" val="0"/>
+                        </a:ext>
+                      </a:extLst>
+                    </a:blip>
+                    <a:stretch>
+                      <a:fillRect/>
+                    </a:stretch>
+                  </pic:blipFill>
+                  <pic:spPr>
+                    <a:xfrm>
+                      <a:off x="0" y="0"/>
+                      <a:ext cx="2413000" cy="1259205"/>
+                    </a:xfrm>
+                    <a:prstGeom prst="rect">
+                      <a:avLst/>
+                    </a:prstGeom>
+                  </pic:spPr>
+                </pic:pic>
+              </a:graphicData>
+            </a:graphic>
+            <wp14:sizeRelH relativeFrom="page">
+              <wp14:pctWidth>0</wp14:pctWidth>
+            </wp14:sizeRelH>
+            <wp14:sizeRelV relativeFrom="page">
+              <wp14:pctHeight>0</wp14:pctHeight>
+            </wp14:sizeRelV>
+          </wp:anchor>
+        </w:drawing>
+      </w:r>
+    </w:p>
+    <w:p>
+      <w:pPr>
+        <w:spacing w:line="360" w:lineRule="auto"/>
+        <w:rPr>
+          <w:rFonts w:ascii="Times New Roman" w:hAnsi="Times New Roman" w:cs="Times New Roman"/>
+        </w:rPr>
+      </w:pPr>
+      <w:r>
+        <w:rPr>
+          <w:rFonts w:ascii="Times New Roman" w:hAnsi="Times New Roman" w:cs="Times New Roman"/>
+          <w:noProof/>
+        </w:rPr>
+        <w:drawing>
+          <wp:anchor distT="0" distB="0" distL="114300" distR="114300" simplePos="0" relativeHeight="251660288" behindDoc="0" locked="0" layoutInCell="1" allowOverlap="1" wp14:anchorId="27BD4142" wp14:editId="1FC7C794">
+            <wp:simplePos x="0" y="0"/>
+            <wp:positionH relativeFrom="column">
+              <wp:posOffset>-152400</wp:posOffset>
+            </wp:positionH>
+            <wp:positionV relativeFrom="paragraph">
+              <wp:posOffset>139065</wp:posOffset>
+            </wp:positionV>
+            <wp:extent cx="1594485" cy="376555"/>
+            <wp:effectExtent l="0" t="0" r="5715" b="4445"/>
+            <wp:wrapThrough wrapText="bothSides">
+              <wp:wrapPolygon edited="0">
+                <wp:start x="0" y="0"/>
+                <wp:lineTo x="0" y="21126"/>
+                <wp:lineTo x="21505" y="21126"/>
+                <wp:lineTo x="21505" y="0"/>
+                <wp:lineTo x="0" y="0"/>
+              </wp:wrapPolygon>
+            </wp:wrapThrough>
+            <wp:docPr id="923770333" name="Picture 1" descr="A close up of a sign&#10;&#10;AI-generated content may be incorrect."/>
+            <wp:cNvGraphicFramePr>
+              <a:graphicFrameLocks xmlns:a="http://schemas.openxmlformats.org/drawingml/2006/main" noChangeAspect="1"/>
+            </wp:cNvGraphicFramePr>
+            <a:graphic xmlns:a="http://schemas.openxmlformats.org/drawingml/2006/main">
+              <a:graphicData uri="http://schemas.openxmlformats.org/drawingml/2006/picture">
+                <pic:pic xmlns:pic="http://schemas.openxmlformats.org/drawingml/2006/picture">
+                  <pic:nvPicPr>
+                    <pic:cNvPr id="923770333" name="Picture 1" descr="A close up of a sign&#10;&#10;AI-generated content may be incorrect."/>
+                    <pic:cNvPicPr>
+                      <a:picLocks noChangeAspect="1" noChangeArrowheads="1"/>
+                    </pic:cNvPicPr>
+                  </pic:nvPicPr>
+                  <pic:blipFill>
+                    <a:blip r:embed="rId7" cstate="print">
+                      <a:grayscl/>
+                      <a:extLst>
+                        <a:ext uri="{28A0092B-C50C-407E-A947-70E740481C1C}">
+                          <a14:useLocalDpi xmlns:a14="http://schemas.microsoft.com/office/drawing/2010/main" val="0"/>
+                        </a:ext>
+                      </a:extLst>
+                    </a:blip>
+                    <a:srcRect/>
+                    <a:stretch>
+                      <a:fillRect/>
+                    </a:stretch>
+                  </pic:blipFill>
+                  <pic:spPr bwMode="auto">
+                    <a:xfrm>
+                      <a:off x="0" y="0"/>
+                      <a:ext cx="1594485" cy="376555"/>
+                    </a:xfrm>
+                    <a:prstGeom prst="rect">
+                      <a:avLst/>
+                    </a:prstGeom>
+                    <a:noFill/>
+                    <a:ln>
+                      <a:noFill/>
+                    </a:ln>
+                  </pic:spPr>
+                </pic:pic>
+              </a:graphicData>
+            </a:graphic>
+            <wp14:sizeRelH relativeFrom="page">
+              <wp14:pctWidth>0</wp14:pctWidth>
+            </wp14:sizeRelH>
+            <wp14:sizeRelV relativeFrom="page">
+              <wp14:pctHeight>0</wp14:pctHeight>
+            </wp14:sizeRelV>
+          </wp:anchor>
+        </w:drawing>
+      </w:r>
+    </w:p>
+    <w:p>
+      <w:pPr>
+        <w:spacing w:line="360" w:lineRule="auto"/>
+        <w:rPr>
+          <w:rFonts w:ascii="Times New Roman" w:hAnsi="Times New Roman" w:cs="Times New Roman"/>
+        </w:rPr>
+      </w:pPr>
+    </w:p>
+    <w:p>
+      <w:pPr>
+        <w:spacing w:line="360" w:lineRule="auto"/>
+        <w:rPr>
+          <w:rFonts w:ascii="Times New Roman" w:hAnsi="Times New Roman" w:cs="Times New Roman"/>
+        </w:rPr>
+      </w:pPr>
+    </w:p>
+    <w:p>
+      <w:pPr>
+        <w:spacing w:line="360" w:lineRule="auto"/>
+        <w:rPr>
+          <w:rFonts w:ascii="Times New Roman" w:hAnsi="Times New Roman" w:cs="Times New Roman"/>
+          <w:color w:val="EE0000"/>
+        </w:rPr>
+      </w:pPr>
+    </w:p>
+    <w:p>
+      <w:pPr>
+        <w:spacing w:line="360" w:lineRule="auto"/>
+        <w:jc w:val="center"/>
+        <w:rPr>
+          <w:rFonts w:ascii="Times New Roman" w:hAnsi="Times New Roman" w:cs="Times New Roman"/>
+          <w:b/>
+          <w:bCs/>
+          <w:iCs/>
+          <w:color w:val="000000" w:themeColor="text1"/>
+          <w:sz w:val="56"/>
+          <w:szCs w:val="56"/>
+          <w:lang w:eastAsia="en-GB"/>
+        </w:rPr>
+      </w:pPr>
+      <w:r>
+        <w:rPr>
+          <w:rFonts w:ascii="Times New Roman" w:hAnsi="Times New Roman" w:cs="Times New Roman"/>
+          <w:b/>
+          <w:bCs/>
+          <w:iCs/>
+          <w:color w:val="000000" w:themeColor="text1"/>
+          <w:sz w:val="56"/>
+          <w:szCs w:val="56"/>
+          <w:lang w:eastAsia="en-GB"/>
+        </w:rPr>
+        <w:t xml:space="preserve">DATA SCIENCE PROJECT LIFECYCLE </w:t>
+      </w:r>
+    </w:p>
+    <w:p>
+      <w:pPr>
+        <w:spacing w:line="360" w:lineRule="auto"/>
+        <w:jc w:val="center"/>
+        <w:rPr>
+          <w:rFonts w:ascii="Times New Roman" w:hAnsi="Times New Roman" w:cs="Times New Roman"/>
+          <w:b/>
+          <w:bCs/>
+          <w:iCs/>
+          <w:color w:val="000000" w:themeColor="text1"/>
+          <w:sz w:val="48"/>
+          <w:szCs w:val="48"/>
+          <w:lang w:eastAsia="en-GB"/>
+        </w:rPr>
+      </w:pPr>
+      <w:r>
+        <w:rPr>
+          <w:rFonts w:ascii="Times New Roman" w:hAnsi="Times New Roman" w:cs="Times New Roman"/>
+          <w:b/>
+          <w:bCs/>
+          <w:iCs/>
+          <w:color w:val="000000" w:themeColor="text1"/>
+          <w:sz w:val="48"/>
+          <w:szCs w:val="48"/>
+          <w:lang w:eastAsia="en-GB"/>
+        </w:rPr>
+        <w:t>5DATA004C</w:t>
+      </w:r>
+      <w:r>
+        <w:rPr>
+          <w:rFonts w:ascii="Times New Roman" w:hAnsi="Times New Roman" w:cs="Times New Roman"/>
+          <w:b/>
+          <w:bCs/>
+          <w:iCs/>
+          <w:color w:val="000000" w:themeColor="text1"/>
+          <w:sz w:val="48"/>
+          <w:szCs w:val="48"/>
+          <w:lang w:eastAsia="en-GB"/>
+        </w:rPr>
+        <w:br/>
+      </w:r>
+    </w:p>
+    <w:p>
+      <w:pPr>
+        <w:spacing w:line="360" w:lineRule="auto"/>
+        <w:jc w:val="center"/>
+        <w:rPr>
+          <w:rFonts w:ascii="Times New Roman" w:hAnsi="Times New Roman" w:cs="Times New Roman"/>
+          <w:b/>
+          <w:bCs/>
+          <w:sz w:val="56"/>
+          <w:szCs w:val="56"/>
+        </w:rPr>
+      </w:pPr>
+      <w:r>
+        <w:rPr>
+          <w:rFonts w:ascii="Times New Roman" w:hAnsi="Times New Roman" w:cs="Times New Roman"/>
+          <w:b/>
+          <w:bCs/>
+          <w:sz w:val="56"/>
+          <w:szCs w:val="56"/>
+        </w:rPr>
+        <w:t>Level 5 Business Data Analytics</w:t>
+      </w:r>
+      <w:r>
+        <w:rPr>
+          <w:rFonts w:ascii="Times New Roman" w:hAnsi="Times New Roman" w:cs="Times New Roman"/>
+          <w:b/>
+          <w:bCs/>
+          <w:sz w:val="56"/>
+          <w:szCs w:val="56"/>
+        </w:rPr>
+        <w:br/>
+      </w:r>
+    </w:p>
+    <w:p>
+      <w:pPr>
+        <w:spacing w:line="360" w:lineRule="auto"/>
+        <w:jc w:val="center"/>
+        <w:rPr>
+          <w:rFonts w:ascii="Times New Roman" w:hAnsi="Times New Roman" w:cs="Times New Roman"/>
+          <w:b/>
+          <w:bCs/>
+          <w:sz w:val="56"/>
+          <w:szCs w:val="56"/>
+        </w:rPr>
+      </w:pPr>
+      <w:r>
+        <w:rPr>
+          <w:rFonts w:ascii="Times New Roman" w:hAnsi="Times New Roman" w:cs="Times New Roman"/>
+          <w:b/>
+          <w:bCs/>
+          <w:sz w:val="56"/>
+          <w:szCs w:val="56"/>
+        </w:rPr>
+        <w:t xml:space="preserve">INDIVIDUAL COURSEWORK </w:t>
+      </w:r>
+    </w:p>
+    <w:p>
+      <w:pPr>
+        <w:spacing w:line="360" w:lineRule="auto"/>
+        <w:jc w:val="center"/>
+        <w:rPr>
+          <w:rFonts w:ascii="Times New Roman" w:hAnsi="Times New Roman" w:cs="Times New Roman"/>
+          <w:b/>
+          <w:bCs/>
+          <w:sz w:val="48"/>
+          <w:szCs w:val="48"/>
+        </w:rPr>
+      </w:pPr>
+      <w:r>
+        <w:rPr>
+          <w:rFonts w:ascii="Times New Roman" w:hAnsi="Times New Roman" w:cs="Times New Roman"/>
+          <w:b/>
+          <w:bCs/>
+          <w:sz w:val="48"/>
+          <w:szCs w:val="48"/>
+        </w:rPr>
+        <w:t xml:space="preserve">Module Leader - Mr. </w:t>
+      </w:r>
+      <w:proofErr w:type="spellStart"/>
+      <w:r>
+        <w:rPr>
+          <w:rFonts w:ascii="Times New Roman" w:hAnsi="Times New Roman" w:cs="Times New Roman"/>
+          <w:b/>
+          <w:bCs/>
+          <w:sz w:val="48"/>
+          <w:szCs w:val="48"/>
+        </w:rPr>
+        <w:t>Fouzul</w:t>
+      </w:r>
+      <w:proofErr w:type="spellEnd"/>
+      <w:r>
+        <w:rPr>
+          <w:rFonts w:ascii="Times New Roman" w:hAnsi="Times New Roman" w:cs="Times New Roman"/>
+          <w:b/>
+          <w:bCs/>
+          <w:sz w:val="48"/>
+          <w:szCs w:val="48"/>
+        </w:rPr>
+        <w:t xml:space="preserve"> Hassan</w:t>
+      </w:r>
+    </w:p>
+    <w:p>
+      <w:pPr>
+        <w:spacing w:line="360" w:lineRule="auto"/>
+        <w:jc w:val="center"/>
+        <w:rPr>
+          <w:rFonts w:ascii="Times New Roman" w:hAnsi="Times New Roman" w:cs="Times New Roman"/>
+          <w:b/>
+          <w:bCs/>
+          <w:sz w:val="48"/>
+          <w:szCs w:val="48"/>
+        </w:rPr>
+      </w:pPr>
+    </w:p>
+    <w:p>
+      <w:pPr>
+        <w:spacing w:line="240" w:lineRule="auto"/>
+        <w:jc w:val="left"/>
+        <w:rPr>
+          <w:rFonts w:ascii="Times New Roman" w:hAnsi="Times New Roman" w:cs="Times New Roman"/>
+          <w:b/>
+          <w:bCs/>
+          <w:sz w:val="36"/>
+          <w:szCs w:val="36"/>
+        </w:rPr>
+      </w:pPr>
+      <w:r>
+        <w:rPr>
+          <w:rFonts w:ascii="Times New Roman" w:hAnsi="Times New Roman" w:cs="Times New Roman"/>
+          <w:b/>
+          <w:bCs/>
+          <w:sz w:val="36"/>
+          <w:szCs w:val="36"/>
+        </w:rPr>
+        <w:t>Name: Shamla Aqthar</w:t>
+      </w:r>
+    </w:p>
+    <w:p>
+      <w:pPr>
+        <w:spacing w:line="240" w:lineRule="auto"/>
+        <w:jc w:val="left"/>
+        <w:rPr>
+          <w:rFonts w:ascii="Times New Roman" w:hAnsi="Times New Roman" w:cs="Times New Roman"/>
+          <w:b/>
+          <w:bCs/>
+          <w:sz w:val="36"/>
+          <w:szCs w:val="36"/>
+        </w:rPr>
+      </w:pPr>
+      <w:proofErr w:type="spellStart"/>
+      <w:r>
+        <w:rPr>
+          <w:rFonts w:ascii="Times New Roman" w:hAnsi="Times New Roman" w:cs="Times New Roman"/>
+          <w:b/>
+          <w:bCs/>
+          <w:sz w:val="36"/>
+          <w:szCs w:val="36"/>
+        </w:rPr>
+        <w:t>UoW</w:t>
+      </w:r>
+      <w:proofErr w:type="spellEnd"/>
+      <w:r>
+        <w:rPr>
+          <w:rFonts w:ascii="Times New Roman" w:hAnsi="Times New Roman" w:cs="Times New Roman"/>
+          <w:b/>
+          <w:bCs/>
+          <w:sz w:val="36"/>
+          <w:szCs w:val="36"/>
+        </w:rPr>
+        <w:t xml:space="preserve"> Id: w2149479</w:t>
+      </w:r>
+    </w:p>
+    <w:p>
+      <w:pPr>
+        <w:spacing w:line="240" w:lineRule="auto"/>
+        <w:jc w:val="left"/>
+        <w:rPr>
+          <w:rFonts w:ascii="Times New Roman" w:hAnsi="Times New Roman" w:cs="Times New Roman"/>
+          <w:b/>
+          <w:bCs/>
+          <w:sz w:val="36"/>
+          <w:szCs w:val="36"/>
+        </w:rPr>
+      </w:pPr>
+      <w:r>
+        <w:rPr>
+          <w:rFonts w:ascii="Times New Roman" w:hAnsi="Times New Roman" w:cs="Times New Roman"/>
+          <w:b/>
+          <w:bCs/>
+          <w:sz w:val="36"/>
+          <w:szCs w:val="36"/>
+        </w:rPr>
+        <w:t>IIT Id: 20241956</w:t>
+      </w:r>
+    </w:p>
+    <w:p>
+      <w:pPr>
+        <w:jc w:val="left"/>
+        <w:rPr>
+          <w:rFonts w:ascii="Times New Roman" w:hAnsi="Times New Roman" w:cs="Times New Roman"/>
+        </w:rPr>
+      </w:pPr>
+      <w:r>
+        <w:rPr>
+          <w:rFonts w:ascii="Times New Roman" w:hAnsi="Times New Roman" w:cs="Times New Roman"/>
+        </w:rPr>
+        <w:br w:type="page"/>
+      </w:r>
+    </w:p>
+    <w:p>
+      <w:pPr>
+        <w:pStyle w:val="Heading1"/>
+        <w:jc w:val="center"/>
+      </w:pPr>
+      <w:r>
+        <w:lastRenderedPageBreak/>
+        <w:t>Individual Coursework 5DATA004C Data Science Project Lifecycle</w:t>
+      </w:r>
+    </w:p>
+    <w:p>
+      <w:pPr>
+        <w:jc w:val="center"/>
+        <w:rPr>
+          <w:rFonts w:ascii="Times New Roman" w:hAnsi="Times New Roman" w:cs="Times New Roman"/>
+          <w:b/>
+          <w:bCs/>
+          <w:sz w:val="28"/>
+          <w:szCs w:val="28"/>
+          <w:u w:val="single"/>
+        </w:rPr>
+      </w:pPr>
+    </w:p>
+    <w:p>
+      <w:pPr>
+        <w:rPr>
+          <w:rFonts w:ascii="Times New Roman" w:hAnsi="Times New Roman" w:cs="Times New Roman"/>
+          <w:sz w:val="28"/>
+          <w:szCs w:val="28"/>
+        </w:rPr>
+      </w:pPr>
+      <w:r>
+        <w:rPr>
+          <w:rFonts w:ascii="Times New Roman" w:hAnsi="Times New Roman" w:cs="Times New Roman"/>
+          <w:b/>
+          <w:bCs/>
+          <w:sz w:val="28"/>
+          <w:szCs w:val="28"/>
+        </w:rPr>
+        <w:t>Name:</w:t>
+      </w:r>
+      <w:r>
+        <w:rPr>
+          <w:rFonts w:ascii="Times New Roman" w:hAnsi="Times New Roman" w:cs="Times New Roman"/>
+          <w:sz w:val="28"/>
+          <w:szCs w:val="28"/>
+        </w:rPr>
+        <w:t xml:space="preserve"> </w:t>
+      </w:r>
+      <w:r>
+        <w:rPr>
+          <w:rFonts w:ascii="Times New Roman" w:hAnsi="Times New Roman" w:cs="Times New Roman"/>
+          <w:sz w:val="28"/>
+          <w:szCs w:val="28"/>
+        </w:rPr>
+        <w:t>Shamla Aqthar</w:t>
+      </w:r>
+    </w:p>
+    <w:p>
+      <w:pPr>
+        <w:rPr>
+          <w:rFonts w:ascii="Times New Roman" w:hAnsi="Times New Roman" w:cs="Times New Roman"/>
+          <w:sz w:val="28"/>
+          <w:szCs w:val="28"/>
+        </w:rPr>
+      </w:pPr>
+      <w:r>
+        <w:rPr>
+          <w:rFonts w:ascii="Times New Roman" w:hAnsi="Times New Roman" w:cs="Times New Roman"/>
+          <w:b/>
+          <w:bCs/>
+          <w:sz w:val="28"/>
+          <w:szCs w:val="28"/>
+        </w:rPr>
+        <w:t>Student Id:</w:t>
+      </w:r>
+      <w:r>
+        <w:rPr>
+          <w:rFonts w:ascii="Times New Roman" w:hAnsi="Times New Roman" w:cs="Times New Roman"/>
+          <w:sz w:val="28"/>
+          <w:szCs w:val="28"/>
+        </w:rPr>
+        <w:t xml:space="preserve"> 20241956</w:t>
+      </w:r>
+      <w:r>
+        <w:rPr>
+          <w:rFonts w:ascii="Times New Roman" w:hAnsi="Times New Roman" w:cs="Times New Roman"/>
+          <w:sz w:val="28"/>
+          <w:szCs w:val="28"/>
+        </w:rPr>
+        <w:tab/>
+      </w:r>
+    </w:p>
+    <w:p>
+      <w:pPr>
+        <w:rPr>
+          <w:rFonts w:ascii="Times New Roman" w:hAnsi="Times New Roman" w:cs="Times New Roman"/>
+          <w:sz w:val="28"/>
+          <w:szCs w:val="28"/>
+        </w:rPr>
+      </w:pPr>
+      <w:r>
+        <w:rPr>
+          <w:rFonts w:ascii="Times New Roman" w:hAnsi="Times New Roman" w:cs="Times New Roman"/>
+          <w:b/>
+          <w:bCs/>
+          <w:sz w:val="28"/>
+          <w:szCs w:val="28"/>
+        </w:rPr>
+        <w:t>Dataset:</w:t>
+      </w:r>
+      <w:r>
+        <w:rPr>
+          <w:rFonts w:ascii="Times New Roman" w:hAnsi="Times New Roman" w:cs="Times New Roman"/>
+          <w:sz w:val="28"/>
+          <w:szCs w:val="28"/>
+        </w:rPr>
+        <w:t xml:space="preserve"> Internal displacements (new displacements) associated with disasters</w:t>
+      </w:r>
+      <w:r>
+        <w:rPr>
+          <w:rFonts w:ascii="Times New Roman" w:hAnsi="Times New Roman" w:cs="Times New Roman"/>
+          <w:sz w:val="28"/>
+          <w:szCs w:val="28"/>
+        </w:rPr>
+        <w:tab/>
+      </w:r>
+    </w:p>
+    <w:p>
+      <w:pPr>
+        <w:rPr>
+          <w:rFonts w:ascii="Times New Roman" w:hAnsi="Times New Roman" w:cs="Times New Roman"/>
+          <w:b/>
+          <w:bCs/>
+          <w:sz w:val="28"/>
+          <w:szCs w:val="28"/>
+        </w:rPr>
+      </w:pPr>
+      <w:r>
+        <w:rPr>
+          <w:rFonts w:ascii="Times New Roman" w:hAnsi="Times New Roman" w:cs="Times New Roman"/>
+          <w:b/>
+          <w:bCs/>
+          <w:sz w:val="28"/>
+          <w:szCs w:val="28"/>
+        </w:rPr>
+        <w:t>Link to Video presentation:</w:t>
+      </w:r>
+    </w:p>
+    <w:p>
+      <w:pPr>
+        <w:rPr>
+          <w:rFonts w:ascii="Times New Roman" w:hAnsi="Times New Roman" w:cs="Times New Roman"/>
+          <w:b/>
+          <w:bCs/>
+          <w:sz w:val="28"/>
+          <w:szCs w:val="28"/>
+        </w:rPr>
+      </w:pPr>
+      <w:r>
+        <w:rPr>
+          <w:rFonts w:ascii="Times New Roman" w:hAnsi="Times New Roman" w:cs="Times New Roman"/>
+          <w:b/>
+          <w:bCs/>
+          <w:sz w:val="28"/>
+          <w:szCs w:val="28"/>
+        </w:rPr>
+        <w:t xml:space="preserve">Link to </w:t>
+      </w:r>
+      <w:proofErr w:type="spellStart"/>
+      <w:r>
+        <w:rPr>
+          <w:rFonts w:ascii="Times New Roman" w:hAnsi="Times New Roman" w:cs="Times New Roman"/>
+          <w:b/>
+          <w:bCs/>
+          <w:sz w:val="28"/>
+          <w:szCs w:val="28"/>
+        </w:rPr>
+        <w:t>Streamlit</w:t>
+      </w:r>
+      <w:proofErr w:type="spellEnd"/>
+      <w:r>
+        <w:rPr>
+          <w:rFonts w:ascii="Times New Roman" w:hAnsi="Times New Roman" w:cs="Times New Roman"/>
+          <w:b/>
+          <w:bCs/>
+          <w:sz w:val="28"/>
+          <w:szCs w:val="28"/>
+        </w:rPr>
+        <w:t xml:space="preserve"> app:</w:t>
+      </w:r>
+      <w:r>
+        <w:rPr>
+          <w:rFonts w:ascii="Times New Roman" w:hAnsi="Times New Roman" w:cs="Times New Roman"/>
+          <w:b/>
+          <w:bCs/>
+          <w:sz w:val="28"/>
+          <w:szCs w:val="28"/>
+        </w:rPr>
+        <w:tab/>
+      </w:r>
+      <w:r>
+        <w:rPr>
+          <w:rFonts w:ascii="Times New Roman" w:hAnsi="Times New Roman" w:cs="Times New Roman"/>
+          <w:b/>
+          <w:bCs/>
+          <w:sz w:val="28"/>
+          <w:szCs w:val="28"/>
+        </w:rPr>
+        <w:tab/>
+      </w:r>
+    </w:p>
+    <w:p>
+      <w:pPr>
+        <w:rPr>
+          <w:rFonts w:ascii="Times New Roman" w:hAnsi="Times New Roman" w:cs="Times New Roman"/>
+          <w:b/>
+          <w:bCs/>
+          <w:sz w:val="28"/>
+          <w:szCs w:val="28"/>
+        </w:rPr>
+      </w:pPr>
+      <w:r>
+        <w:rPr>
+          <w:rFonts w:ascii="Times New Roman" w:hAnsi="Times New Roman" w:cs="Times New Roman"/>
+          <w:b/>
+          <w:bCs/>
+          <w:sz w:val="28"/>
+          <w:szCs w:val="28"/>
+        </w:rPr>
+        <w:t>Link to GitHub repository:</w:t>
+      </w:r>
+    </w:p>
     <w:sectPr>
       <w:pgSz w:w="11906" w:h="16838"/>
       <w:pgMar w:top="1440" w:right="1440" w:bottom="1440" w:left="1440" w:header="708" w:footer="708" w:gutter="0"/>
+      <w:pgBorders w:display="firstPage" w:offsetFrom="page">
+        <w:top w:val="single" w:sz="4" w:space="24" w:color="auto"/>
+        <w:left w:val="single" w:sz="4" w:space="24" w:color="auto"/>
+        <w:bottom w:val="single" w:sz="4" w:space="24" w:color="auto"/>
+        <w:right w:val="single" w:sz="4" w:space="24" w:color="auto"/>
+      </w:pgBorders>
       <w:cols w:space="708"/>
       <w:docGrid w:linePitch="360"/>
     </w:sectPr>
   </w:body>
 </w:document>
+</file>
+
+<file path=word/numbering.xml><?xml version="1.0" encoding="utf-8"?>
+<w:numbering xmlns:wpc="http://schemas.microsoft.com/office/word/2010/wordprocessingCanvas" xmlns:cx="http://schemas.microsoft.com/office/drawing/2014/chartex" xmlns:cx1="http://schemas.microsoft.com/office/drawing/2015/9/8/chartex" xmlns:cx2="http://schemas.microsoft.com/office/drawing/2015/10/21/chartex" xmlns:cx3="http://schemas.microsoft.com/office/drawing/2016/5/9/chartex" xmlns:cx4="http://schemas.microsoft.com/office/drawing/2016/5/10/chartex" xmlns:cx5="http://schemas.microsoft.com/office/drawing/2016/5/11/chartex" xmlns:cx6="http://schemas.microsoft.com/office/drawing/2016/5/12/chartex" xmlns:cx7="http://schemas.microsoft.com/office/drawing/2016/5/13/chartex" xmlns:cx8="http://schemas.microsoft.com/office/drawing/2016/5/14/chartex" xmlns:mc="http://schemas.openxmlformats.org/markup-compatibility/2006" xmlns:aink="http://schemas.microsoft.com/office/drawing/2016/ink" xmlns:am3d="http://schemas.microsoft.com/office/drawing/2017/model3d" xmlns:o="urn:schemas-microsoft-com:office:office" xmlns:oel="http://schemas.microsoft.com/office/2019/extlst" xmlns:r="http://schemas.openxmlformats.org/officeDocument/2006/relationships" xmlns:m="http://schemas.openxmlformats.org/officeDocument/2006/math" xmlns:v="urn:schemas-microsoft-com:vml" xmlns:wp14="http://schemas.microsoft.com/office/word/2010/wordprocessingDrawing" xmlns:wp="http://schemas.openxmlformats.org/drawingml/2006/wordprocessingDrawing" xmlns:w10="urn:schemas-microsoft-com:office:word" xmlns:w="http://schemas.openxmlformats.org/wordprocessingml/2006/main" xmlns:w14="http://schemas.microsoft.com/office/word/2010/wordml" xmlns:w15="http://schemas.microsoft.com/office/word/2012/wordml" xmlns:w16cex="http://schemas.microsoft.com/office/word/2018/wordml/cex" xmlns:w16cid="http://schemas.microsoft.com/office/word/2016/wordml/cid" xmlns:w16="http://schemas.microsoft.com/office/word/2018/wordml" xmlns:w16du="http://schemas.microsoft.com/office/word/2023/wordml/word16du" xmlns:w16sdtdh="http://schemas.microsoft.com/office/word/2020/wordml/sdtdatahash" xmlns:w16sdtfl="http://schemas.microsoft.com/office/word/2024/wordml/sdtformatlock" xmlns:w16se="http://schemas.microsoft.com/office/word/2015/wordml/symex" xmlns:wpg="http://schemas.microsoft.com/office/word/2010/wordprocessingGroup" xmlns:wpi="http://schemas.microsoft.com/office/word/2010/wordprocessingInk" xmlns:wne="http://schemas.microsoft.com/office/word/2006/wordml" xmlns:wps="http://schemas.microsoft.com/office/word/2010/wordprocessingShape" mc:Ignorable="w14 w15 w16se w16cid w16 w16cex w16sdtdh w16sdtfl w16du wp14">
+  <w:abstractNum w:abstractNumId="0" w15:restartNumberingAfterBreak="0">
+    <w:nsid w:val="08B65AF8"/>
+    <w:multiLevelType w:val="hybridMultilevel"/>
+    <w:tmpl w:val="60AC40A0"/>
+    <w:lvl w:ilvl="0" w:tplc="0809000F">
+      <w:start w:val="1"/>
+      <w:numFmt w:val="decimal"/>
+      <w:lvlText w:val="%1."/>
+      <w:lvlJc w:val="left"/>
+      <w:pPr>
+        <w:ind w:left="784" w:hanging="360"/>
+      </w:pPr>
+    </w:lvl>
+    <w:lvl w:ilvl="1" w:tplc="08090019" w:tentative="1">
+      <w:start w:val="1"/>
+      <w:numFmt w:val="lowerLetter"/>
+      <w:lvlText w:val="%2."/>
+      <w:lvlJc w:val="left"/>
+      <w:pPr>
+        <w:ind w:left="1504" w:hanging="360"/>
+      </w:pPr>
+    </w:lvl>
+    <w:lvl w:ilvl="2" w:tplc="0809001B" w:tentative="1">
+      <w:start w:val="1"/>
+      <w:numFmt w:val="lowerRoman"/>
+      <w:lvlText w:val="%3."/>
+      <w:lvlJc w:val="right"/>
+      <w:pPr>
+        <w:ind w:left="2224" w:hanging="180"/>
+      </w:pPr>
+    </w:lvl>
+    <w:lvl w:ilvl="3" w:tplc="0809000F" w:tentative="1">
+      <w:start w:val="1"/>
+      <w:numFmt w:val="decimal"/>
+      <w:lvlText w:val="%4."/>
+      <w:lvlJc w:val="left"/>
+      <w:pPr>
+        <w:ind w:left="2944" w:hanging="360"/>
+      </w:pPr>
+    </w:lvl>
+    <w:lvl w:ilvl="4" w:tplc="08090019" w:tentative="1">
+      <w:start w:val="1"/>
+      <w:numFmt w:val="lowerLetter"/>
+      <w:lvlText w:val="%5."/>
+      <w:lvlJc w:val="left"/>
+      <w:pPr>
+        <w:ind w:left="3664" w:hanging="360"/>
+      </w:pPr>
+    </w:lvl>
+    <w:lvl w:ilvl="5" w:tplc="0809001B" w:tentative="1">
+      <w:start w:val="1"/>
+      <w:numFmt w:val="lowerRoman"/>
+      <w:lvlText w:val="%6."/>
+      <w:lvlJc w:val="right"/>
+      <w:pPr>
+        <w:ind w:left="4384" w:hanging="180"/>
+      </w:pPr>
+    </w:lvl>
+    <w:lvl w:ilvl="6" w:tplc="0809000F" w:tentative="1">
+      <w:start w:val="1"/>
+      <w:numFmt w:val="decimal"/>
+      <w:lvlText w:val="%7."/>
+      <w:lvlJc w:val="left"/>
+      <w:pPr>
+        <w:ind w:left="5104" w:hanging="360"/>
+      </w:pPr>
+    </w:lvl>
+    <w:lvl w:ilvl="7" w:tplc="08090019" w:tentative="1">
+      <w:start w:val="1"/>
+      <w:numFmt w:val="lowerLetter"/>
+      <w:lvlText w:val="%8."/>
+      <w:lvlJc w:val="left"/>
+      <w:pPr>
+        <w:ind w:left="5824" w:hanging="360"/>
+      </w:pPr>
+    </w:lvl>
+    <w:lvl w:ilvl="8" w:tplc="0809001B" w:tentative="1">
+      <w:start w:val="1"/>
+      <w:numFmt w:val="lowerRoman"/>
+      <w:lvlText w:val="%9."/>
+      <w:lvlJc w:val="right"/>
+      <w:pPr>
+        <w:ind w:left="6544" w:hanging="180"/>
+      </w:pPr>
+    </w:lvl>
+  </w:abstractNum>
+  <w:abstractNum w:abstractNumId="1" w15:restartNumberingAfterBreak="0">
+    <w:nsid w:val="654250F3"/>
+    <w:multiLevelType w:val="hybridMultilevel"/>
+    <w:tmpl w:val="9A8C8EEA"/>
+    <w:lvl w:ilvl="0" w:tplc="0809000F">
+      <w:start w:val="1"/>
+      <w:numFmt w:val="decimal"/>
+      <w:lvlText w:val="%1."/>
+      <w:lvlJc w:val="left"/>
+      <w:pPr>
+        <w:ind w:left="720" w:hanging="360"/>
+      </w:pPr>
+    </w:lvl>
+    <w:lvl w:ilvl="1" w:tplc="08090019" w:tentative="1">
+      <w:start w:val="1"/>
+      <w:numFmt w:val="lowerLetter"/>
+      <w:lvlText w:val="%2."/>
+      <w:lvlJc w:val="left"/>
+      <w:pPr>
+        <w:ind w:left="1440" w:hanging="360"/>
+      </w:pPr>
+    </w:lvl>
+    <w:lvl w:ilvl="2" w:tplc="0809001B" w:tentative="1">
+      <w:start w:val="1"/>
+      <w:numFmt w:val="lowerRoman"/>
+      <w:lvlText w:val="%3."/>
+      <w:lvlJc w:val="right"/>
+      <w:pPr>
+        <w:ind w:left="2160" w:hanging="180"/>
+      </w:pPr>
+    </w:lvl>
+    <w:lvl w:ilvl="3" w:tplc="0809000F" w:tentative="1">
+      <w:start w:val="1"/>
+      <w:numFmt w:val="decimal"/>
+      <w:lvlText w:val="%4."/>
+      <w:lvlJc w:val="left"/>
+      <w:pPr>
+        <w:ind w:left="2880" w:hanging="360"/>
+      </w:pPr>
+    </w:lvl>
+    <w:lvl w:ilvl="4" w:tplc="08090019" w:tentative="1">
+      <w:start w:val="1"/>
+      <w:numFmt w:val="lowerLetter"/>
+      <w:lvlText w:val="%5."/>
+      <w:lvlJc w:val="left"/>
+      <w:pPr>
+        <w:ind w:left="3600" w:hanging="360"/>
+      </w:pPr>
+    </w:lvl>
+    <w:lvl w:ilvl="5" w:tplc="0809001B" w:tentative="1">
+      <w:start w:val="1"/>
+      <w:numFmt w:val="lowerRoman"/>
+      <w:lvlText w:val="%6."/>
+      <w:lvlJc w:val="right"/>
+      <w:pPr>
+        <w:ind w:left="4320" w:hanging="180"/>
+      </w:pPr>
+    </w:lvl>
+    <w:lvl w:ilvl="6" w:tplc="0809000F" w:tentative="1">
+      <w:start w:val="1"/>
+      <w:numFmt w:val="decimal"/>
+      <w:lvlText w:val="%7."/>
+      <w:lvlJc w:val="left"/>
+      <w:pPr>
+        <w:ind w:left="5040" w:hanging="360"/>
+      </w:pPr>
+    </w:lvl>
+    <w:lvl w:ilvl="7" w:tplc="08090019" w:tentative="1">
+      <w:start w:val="1"/>
+      <w:numFmt w:val="lowerLetter"/>
+      <w:lvlText w:val="%8."/>
+      <w:lvlJc w:val="left"/>
+      <w:pPr>
+        <w:ind w:left="5760" w:hanging="360"/>
+      </w:pPr>
+    </w:lvl>
+    <w:lvl w:ilvl="8" w:tplc="0809001B" w:tentative="1">
+      <w:start w:val="1"/>
+      <w:numFmt w:val="lowerRoman"/>
+      <w:lvlText w:val="%9."/>
+      <w:lvlJc w:val="right"/>
+      <w:pPr>
+        <w:ind w:left="6480" w:hanging="180"/>
+      </w:pPr>
+    </w:lvl>
+  </w:abstractNum>
+  <w:abstractNum w:abstractNumId="2" w15:restartNumberingAfterBreak="0">
+    <w:nsid w:val="7D1E43FE"/>
+    <w:multiLevelType w:val="hybridMultilevel"/>
+    <w:tmpl w:val="93ACC526"/>
+    <w:lvl w:ilvl="0" w:tplc="0809000F">
+      <w:start w:val="1"/>
+      <w:numFmt w:val="decimal"/>
+      <w:lvlText w:val="%1."/>
+      <w:lvlJc w:val="left"/>
+      <w:pPr>
+        <w:ind w:left="720" w:hanging="360"/>
+      </w:pPr>
+      <w:rPr>
+        <w:rFonts w:hint="default"/>
+      </w:rPr>
+    </w:lvl>
+    <w:lvl w:ilvl="1" w:tplc="08090019" w:tentative="1">
+      <w:start w:val="1"/>
+      <w:numFmt w:val="lowerLetter"/>
+      <w:lvlText w:val="%2."/>
+      <w:lvlJc w:val="left"/>
+      <w:pPr>
+        <w:ind w:left="1440" w:hanging="360"/>
+      </w:pPr>
+    </w:lvl>
+    <w:lvl w:ilvl="2" w:tplc="0809001B" w:tentative="1">
+      <w:start w:val="1"/>
+      <w:numFmt w:val="lowerRoman"/>
+      <w:lvlText w:val="%3."/>
+      <w:lvlJc w:val="right"/>
+      <w:pPr>
+        <w:ind w:left="2160" w:hanging="180"/>
+      </w:pPr>
+    </w:lvl>
+    <w:lvl w:ilvl="3" w:tplc="0809000F" w:tentative="1">
+      <w:start w:val="1"/>
+      <w:numFmt w:val="decimal"/>
+      <w:lvlText w:val="%4."/>
+      <w:lvlJc w:val="left"/>
+      <w:pPr>
+        <w:ind w:left="2880" w:hanging="360"/>
+      </w:pPr>
+    </w:lvl>
+    <w:lvl w:ilvl="4" w:tplc="08090019" w:tentative="1">
+      <w:start w:val="1"/>
+      <w:numFmt w:val="lowerLetter"/>
+      <w:lvlText w:val="%5."/>
+      <w:lvlJc w:val="left"/>
+      <w:pPr>
+        <w:ind w:left="3600" w:hanging="360"/>
+      </w:pPr>
+    </w:lvl>
+    <w:lvl w:ilvl="5" w:tplc="0809001B" w:tentative="1">
+      <w:start w:val="1"/>
+      <w:numFmt w:val="lowerRoman"/>
+      <w:lvlText w:val="%6."/>
+      <w:lvlJc w:val="right"/>
+      <w:pPr>
+        <w:ind w:left="4320" w:hanging="180"/>
+      </w:pPr>
+    </w:lvl>
+    <w:lvl w:ilvl="6" w:tplc="0809000F" w:tentative="1">
+      <w:start w:val="1"/>
+      <w:numFmt w:val="decimal"/>
+      <w:lvlText w:val="%7."/>
+      <w:lvlJc w:val="left"/>
+      <w:pPr>
+        <w:ind w:left="5040" w:hanging="360"/>
+      </w:pPr>
+    </w:lvl>
+    <w:lvl w:ilvl="7" w:tplc="08090019" w:tentative="1">
+      <w:start w:val="1"/>
+      <w:numFmt w:val="lowerLetter"/>
+      <w:lvlText w:val="%8."/>
+      <w:lvlJc w:val="left"/>
+      <w:pPr>
+        <w:ind w:left="5760" w:hanging="360"/>
+      </w:pPr>
+    </w:lvl>
+    <w:lvl w:ilvl="8" w:tplc="0809001B" w:tentative="1">
+      <w:start w:val="1"/>
+      <w:numFmt w:val="lowerRoman"/>
+      <w:lvlText w:val="%9."/>
+      <w:lvlJc w:val="right"/>
+      <w:pPr>
+        <w:ind w:left="6480" w:hanging="180"/>
+      </w:pPr>
+    </w:lvl>
+  </w:abstractNum>
+  <w:num w:numId="1" w16cid:durableId="1688678227">
+    <w:abstractNumId w:val="2"/>
+  </w:num>
+  <w:num w:numId="2" w16cid:durableId="1636911611">
+    <w:abstractNumId w:val="1"/>
+  </w:num>
+  <w:num w:numId="3" w16cid:durableId="1822383326">
+    <w:abstractNumId w:val="0"/>
+  </w:num>
+</w:numbering>
 </file>
 
 <file path=word/styles.xml><?xml version="1.0" encoding="utf-8"?>
@@ -413,6 +1409,10 @@
   <w:style w:type="paragraph" w:default="1" w:styleId="Normal">
     <w:name w:val="Normal"/>
     <w:qFormat/>
+    <w:rsid w:val="00E048C8"/>
+    <w:pPr>
+      <w:jc w:val="both"/>
+    </w:pPr>
   </w:style>
   <w:style w:type="paragraph" w:styleId="Heading1">
     <w:name w:val="heading 1"/>
@@ -421,7 +1421,7 @@
     <w:link w:val="Heading1Char"/>
     <w:uiPriority w:val="9"/>
     <w:qFormat/>
-    <w:rsid w:val="00F02E38"/>
+    <w:rsid w:val="00E048C8"/>
     <w:pPr>
       <w:keepNext/>
       <w:keepLines/>
@@ -429,7 +1429,9 @@
       <w:outlineLvl w:val="0"/>
     </w:pPr>
     <w:rPr>
-      <w:rFonts w:asciiTheme="majorHAnsi" w:eastAsiaTheme="majorEastAsia" w:hAnsiTheme="majorHAnsi" w:cstheme="majorBidi"/>
+      <w:rFonts w:ascii="Times New Roman" w:eastAsiaTheme="majorEastAsia" w:hAnsi="Times New Roman" w:cs="Times New Roman"/>
+      <w:b/>
+      <w:bCs/>
       <w:color w:val="0F4761" w:themeColor="accent1" w:themeShade="BF"/>
       <w:sz w:val="40"/>
       <w:szCs w:val="40"/>
@@ -645,9 +1647,11 @@
     <w:basedOn w:val="DefaultParagraphFont"/>
     <w:link w:val="Heading1"/>
     <w:uiPriority w:val="9"/>
-    <w:rsid w:val="00F02E38"/>
-    <w:rPr>
-      <w:rFonts w:asciiTheme="majorHAnsi" w:eastAsiaTheme="majorEastAsia" w:hAnsiTheme="majorHAnsi" w:cstheme="majorBidi"/>
+    <w:rsid w:val="00E048C8"/>
+    <w:rPr>
+      <w:rFonts w:ascii="Times New Roman" w:eastAsiaTheme="majorEastAsia" w:hAnsi="Times New Roman" w:cs="Times New Roman"/>
+      <w:b/>
+      <w:bCs/>
       <w:color w:val="0F4761" w:themeColor="accent1" w:themeShade="BF"/>
       <w:sz w:val="40"/>
       <w:szCs w:val="40"/>
@@ -929,6 +1933,300 @@
       <w:color w:val="0F4761" w:themeColor="accent1" w:themeShade="BF"/>
       <w:spacing w:val="5"/>
     </w:rPr>
+  </w:style>
+  <w:style w:type="paragraph" w:customStyle="1" w:styleId="p1">
+    <w:name w:val="p1"/>
+    <w:basedOn w:val="Normal"/>
+    <w:rsid w:val="00E048C8"/>
+    <w:pPr>
+      <w:spacing w:after="0" w:line="240" w:lineRule="auto"/>
+    </w:pPr>
+    <w:rPr>
+      <w:rFonts w:ascii="Helvetica" w:eastAsia="Times New Roman" w:hAnsi="Helvetica" w:cs="Times New Roman"/>
+      <w:color w:val="000000"/>
+      <w:kern w:val="0"/>
+      <w:sz w:val="17"/>
+      <w:szCs w:val="17"/>
+      <w:lang w:eastAsia="en-GB"/>
+      <w14:ligatures w14:val="none"/>
+    </w:rPr>
+  </w:style>
+  <w:style w:type="table" w:styleId="TableGrid">
+    <w:name w:val="Table Grid"/>
+    <w:basedOn w:val="TableNormal"/>
+    <w:uiPriority w:val="39"/>
+    <w:rsid w:val="00E048C8"/>
+    <w:pPr>
+      <w:spacing w:after="0" w:line="240" w:lineRule="auto"/>
+    </w:pPr>
+    <w:tblPr>
+      <w:tblBorders>
+        <w:top w:val="single" w:sz="4" w:space="0" w:color="auto"/>
+        <w:left w:val="single" w:sz="4" w:space="0" w:color="auto"/>
+        <w:bottom w:val="single" w:sz="4" w:space="0" w:color="auto"/>
+        <w:right w:val="single" w:sz="4" w:space="0" w:color="auto"/>
+        <w:insideH w:val="single" w:sz="4" w:space="0" w:color="auto"/>
+        <w:insideV w:val="single" w:sz="4" w:space="0" w:color="auto"/>
+      </w:tblBorders>
+    </w:tblPr>
+  </w:style>
+  <w:style w:type="table" w:styleId="GridTable4-Accent5">
+    <w:name w:val="Grid Table 4 Accent 5"/>
+    <w:basedOn w:val="TableNormal"/>
+    <w:uiPriority w:val="49"/>
+    <w:rsid w:val="002B14C3"/>
+    <w:pPr>
+      <w:spacing w:after="0" w:line="240" w:lineRule="auto"/>
+    </w:pPr>
+    <w:tblPr>
+      <w:tblStyleRowBandSize w:val="1"/>
+      <w:tblStyleColBandSize w:val="1"/>
+      <w:tblBorders>
+        <w:top w:val="single" w:sz="4" w:space="0" w:color="D86DCB" w:themeColor="accent5" w:themeTint="99"/>
+        <w:left w:val="single" w:sz="4" w:space="0" w:color="D86DCB" w:themeColor="accent5" w:themeTint="99"/>
+        <w:bottom w:val="single" w:sz="4" w:space="0" w:color="D86DCB" w:themeColor="accent5" w:themeTint="99"/>
+        <w:right w:val="single" w:sz="4" w:space="0" w:color="D86DCB" w:themeColor="accent5" w:themeTint="99"/>
+        <w:insideH w:val="single" w:sz="4" w:space="0" w:color="D86DCB" w:themeColor="accent5" w:themeTint="99"/>
+        <w:insideV w:val="single" w:sz="4" w:space="0" w:color="D86DCB" w:themeColor="accent5" w:themeTint="99"/>
+      </w:tblBorders>
+    </w:tblPr>
+    <w:tblStylePr w:type="firstRow">
+      <w:rPr>
+        <w:b/>
+        <w:bCs/>
+        <w:color w:val="FFFFFF" w:themeColor="background1"/>
+      </w:rPr>
+      <w:tblPr/>
+      <w:tcPr>
+        <w:tcBorders>
+          <w:top w:val="single" w:sz="4" w:space="0" w:color="A02B93" w:themeColor="accent5"/>
+          <w:left w:val="single" w:sz="4" w:space="0" w:color="A02B93" w:themeColor="accent5"/>
+          <w:bottom w:val="single" w:sz="4" w:space="0" w:color="A02B93" w:themeColor="accent5"/>
+          <w:right w:val="single" w:sz="4" w:space="0" w:color="A02B93" w:themeColor="accent5"/>
+          <w:insideH w:val="nil"/>
+          <w:insideV w:val="nil"/>
+        </w:tcBorders>
+        <w:shd w:val="clear" w:color="auto" w:fill="A02B93" w:themeFill="accent5"/>
+      </w:tcPr>
+    </w:tblStylePr>
+    <w:tblStylePr w:type="lastRow">
+      <w:rPr>
+        <w:b/>
+        <w:bCs/>
+      </w:rPr>
+      <w:tblPr/>
+      <w:tcPr>
+        <w:tcBorders>
+          <w:top w:val="double" w:sz="4" w:space="0" w:color="A02B93" w:themeColor="accent5"/>
+        </w:tcBorders>
+      </w:tcPr>
+    </w:tblStylePr>
+    <w:tblStylePr w:type="firstCol">
+      <w:rPr>
+        <w:b/>
+        <w:bCs/>
+      </w:rPr>
+    </w:tblStylePr>
+    <w:tblStylePr w:type="lastCol">
+      <w:rPr>
+        <w:b/>
+        <w:bCs/>
+      </w:rPr>
+    </w:tblStylePr>
+    <w:tblStylePr w:type="band1Vert">
+      <w:tblPr/>
+      <w:tcPr>
+        <w:shd w:val="clear" w:color="auto" w:fill="F2CEED" w:themeFill="accent5" w:themeFillTint="33"/>
+      </w:tcPr>
+    </w:tblStylePr>
+    <w:tblStylePr w:type="band1Horz">
+      <w:tblPr/>
+      <w:tcPr>
+        <w:shd w:val="clear" w:color="auto" w:fill="F2CEED" w:themeFill="accent5" w:themeFillTint="33"/>
+      </w:tcPr>
+    </w:tblStylePr>
+  </w:style>
+  <w:style w:type="table" w:styleId="GridTable5Dark-Accent2">
+    <w:name w:val="Grid Table 5 Dark Accent 2"/>
+    <w:basedOn w:val="TableNormal"/>
+    <w:uiPriority w:val="50"/>
+    <w:rsid w:val="002E7B8F"/>
+    <w:pPr>
+      <w:spacing w:after="0" w:line="240" w:lineRule="auto"/>
+    </w:pPr>
+    <w:tblPr>
+      <w:tblStyleRowBandSize w:val="1"/>
+      <w:tblStyleColBandSize w:val="1"/>
+      <w:tblBorders>
+        <w:top w:val="single" w:sz="4" w:space="0" w:color="FFFFFF" w:themeColor="background1"/>
+        <w:left w:val="single" w:sz="4" w:space="0" w:color="FFFFFF" w:themeColor="background1"/>
+        <w:bottom w:val="single" w:sz="4" w:space="0" w:color="FFFFFF" w:themeColor="background1"/>
+        <w:right w:val="single" w:sz="4" w:space="0" w:color="FFFFFF" w:themeColor="background1"/>
+        <w:insideH w:val="single" w:sz="4" w:space="0" w:color="FFFFFF" w:themeColor="background1"/>
+        <w:insideV w:val="single" w:sz="4" w:space="0" w:color="FFFFFF" w:themeColor="background1"/>
+      </w:tblBorders>
+    </w:tblPr>
+    <w:tcPr>
+      <w:shd w:val="clear" w:color="auto" w:fill="FAE2D5" w:themeFill="accent2" w:themeFillTint="33"/>
+    </w:tcPr>
+    <w:tblStylePr w:type="firstRow">
+      <w:rPr>
+        <w:b/>
+        <w:bCs/>
+        <w:color w:val="FFFFFF" w:themeColor="background1"/>
+      </w:rPr>
+      <w:tblPr/>
+      <w:tcPr>
+        <w:tcBorders>
+          <w:top w:val="single" w:sz="4" w:space="0" w:color="FFFFFF" w:themeColor="background1"/>
+          <w:left w:val="single" w:sz="4" w:space="0" w:color="FFFFFF" w:themeColor="background1"/>
+          <w:right w:val="single" w:sz="4" w:space="0" w:color="FFFFFF" w:themeColor="background1"/>
+          <w:insideH w:val="nil"/>
+          <w:insideV w:val="nil"/>
+        </w:tcBorders>
+        <w:shd w:val="clear" w:color="auto" w:fill="E97132" w:themeFill="accent2"/>
+      </w:tcPr>
+    </w:tblStylePr>
+    <w:tblStylePr w:type="lastRow">
+      <w:rPr>
+        <w:b/>
+        <w:bCs/>
+        <w:color w:val="FFFFFF" w:themeColor="background1"/>
+      </w:rPr>
+      <w:tblPr/>
+      <w:tcPr>
+        <w:tcBorders>
+          <w:left w:val="single" w:sz="4" w:space="0" w:color="FFFFFF" w:themeColor="background1"/>
+          <w:bottom w:val="single" w:sz="4" w:space="0" w:color="FFFFFF" w:themeColor="background1"/>
+          <w:right w:val="single" w:sz="4" w:space="0" w:color="FFFFFF" w:themeColor="background1"/>
+          <w:insideH w:val="nil"/>
+          <w:insideV w:val="nil"/>
+        </w:tcBorders>
+        <w:shd w:val="clear" w:color="auto" w:fill="E97132" w:themeFill="accent2"/>
+      </w:tcPr>
+    </w:tblStylePr>
+    <w:tblStylePr w:type="firstCol">
+      <w:rPr>
+        <w:b/>
+        <w:bCs/>
+        <w:color w:val="FFFFFF" w:themeColor="background1"/>
+      </w:rPr>
+      <w:tblPr/>
+      <w:tcPr>
+        <w:tcBorders>
+          <w:top w:val="single" w:sz="4" w:space="0" w:color="FFFFFF" w:themeColor="background1"/>
+          <w:left w:val="single" w:sz="4" w:space="0" w:color="FFFFFF" w:themeColor="background1"/>
+          <w:bottom w:val="single" w:sz="4" w:space="0" w:color="FFFFFF" w:themeColor="background1"/>
+          <w:insideV w:val="nil"/>
+        </w:tcBorders>
+        <w:shd w:val="clear" w:color="auto" w:fill="E97132" w:themeFill="accent2"/>
+      </w:tcPr>
+    </w:tblStylePr>
+    <w:tblStylePr w:type="lastCol">
+      <w:rPr>
+        <w:b/>
+        <w:bCs/>
+        <w:color w:val="FFFFFF" w:themeColor="background1"/>
+      </w:rPr>
+      <w:tblPr/>
+      <w:tcPr>
+        <w:tcBorders>
+          <w:top w:val="single" w:sz="4" w:space="0" w:color="FFFFFF" w:themeColor="background1"/>
+          <w:bottom w:val="single" w:sz="4" w:space="0" w:color="FFFFFF" w:themeColor="background1"/>
+          <w:right w:val="single" w:sz="4" w:space="0" w:color="FFFFFF" w:themeColor="background1"/>
+          <w:insideV w:val="nil"/>
+        </w:tcBorders>
+        <w:shd w:val="clear" w:color="auto" w:fill="E97132" w:themeFill="accent2"/>
+      </w:tcPr>
+    </w:tblStylePr>
+    <w:tblStylePr w:type="band1Vert">
+      <w:tblPr/>
+      <w:tcPr>
+        <w:shd w:val="clear" w:color="auto" w:fill="F6C5AC" w:themeFill="accent2" w:themeFillTint="66"/>
+      </w:tcPr>
+    </w:tblStylePr>
+    <w:tblStylePr w:type="band1Horz">
+      <w:tblPr/>
+      <w:tcPr>
+        <w:shd w:val="clear" w:color="auto" w:fill="F6C5AC" w:themeFill="accent2" w:themeFillTint="66"/>
+      </w:tcPr>
+    </w:tblStylePr>
+  </w:style>
+  <w:style w:type="table" w:styleId="GridTable4-Accent2">
+    <w:name w:val="Grid Table 4 Accent 2"/>
+    <w:basedOn w:val="TableNormal"/>
+    <w:uiPriority w:val="49"/>
+    <w:rsid w:val="002E7B8F"/>
+    <w:pPr>
+      <w:spacing w:after="0" w:line="240" w:lineRule="auto"/>
+    </w:pPr>
+    <w:tblPr>
+      <w:tblStyleRowBandSize w:val="1"/>
+      <w:tblStyleColBandSize w:val="1"/>
+      <w:tblBorders>
+        <w:top w:val="single" w:sz="4" w:space="0" w:color="F1A983" w:themeColor="accent2" w:themeTint="99"/>
+        <w:left w:val="single" w:sz="4" w:space="0" w:color="F1A983" w:themeColor="accent2" w:themeTint="99"/>
+        <w:bottom w:val="single" w:sz="4" w:space="0" w:color="F1A983" w:themeColor="accent2" w:themeTint="99"/>
+        <w:right w:val="single" w:sz="4" w:space="0" w:color="F1A983" w:themeColor="accent2" w:themeTint="99"/>
+        <w:insideH w:val="single" w:sz="4" w:space="0" w:color="F1A983" w:themeColor="accent2" w:themeTint="99"/>
+        <w:insideV w:val="single" w:sz="4" w:space="0" w:color="F1A983" w:themeColor="accent2" w:themeTint="99"/>
+      </w:tblBorders>
+    </w:tblPr>
+    <w:tblStylePr w:type="firstRow">
+      <w:rPr>
+        <w:b/>
+        <w:bCs/>
+        <w:color w:val="FFFFFF" w:themeColor="background1"/>
+      </w:rPr>
+      <w:tblPr/>
+      <w:tcPr>
+        <w:tcBorders>
+          <w:top w:val="single" w:sz="4" w:space="0" w:color="E97132" w:themeColor="accent2"/>
+          <w:left w:val="single" w:sz="4" w:space="0" w:color="E97132" w:themeColor="accent2"/>
+          <w:bottom w:val="single" w:sz="4" w:space="0" w:color="E97132" w:themeColor="accent2"/>
+          <w:right w:val="single" w:sz="4" w:space="0" w:color="E97132" w:themeColor="accent2"/>
+          <w:insideH w:val="nil"/>
+          <w:insideV w:val="nil"/>
+        </w:tcBorders>
+        <w:shd w:val="clear" w:color="auto" w:fill="E97132" w:themeFill="accent2"/>
+      </w:tcPr>
+    </w:tblStylePr>
+    <w:tblStylePr w:type="lastRow">
+      <w:rPr>
+        <w:b/>
+        <w:bCs/>
+      </w:rPr>
+      <w:tblPr/>
+      <w:tcPr>
+        <w:tcBorders>
+          <w:top w:val="double" w:sz="4" w:space="0" w:color="E97132" w:themeColor="accent2"/>
+        </w:tcBorders>
+      </w:tcPr>
+    </w:tblStylePr>
+    <w:tblStylePr w:type="firstCol">
+      <w:rPr>
+        <w:b/>
+        <w:bCs/>
+      </w:rPr>
+    </w:tblStylePr>
+    <w:tblStylePr w:type="lastCol">
+      <w:rPr>
+        <w:b/>
+        <w:bCs/>
+      </w:rPr>
+    </w:tblStylePr>
+    <w:tblStylePr w:type="band1Vert">
+      <w:tblPr/>
+      <w:tcPr>
+        <w:shd w:val="clear" w:color="auto" w:fill="FAE2D5" w:themeFill="accent2" w:themeFillTint="33"/>
+      </w:tcPr>
+    </w:tblStylePr>
+    <w:tblStylePr w:type="band1Horz">
+      <w:tblPr/>
+      <w:tcPr>
+        <w:shd w:val="clear" w:color="auto" w:fill="FAE2D5" w:themeFill="accent2" w:themeFillTint="33"/>
+      </w:tcPr>
+    </w:tblStylePr>
   </w:style>
 </w:styles>
 </file>
@@ -1246,4 +2544,16 @@
     </a:ext>
   </a:extLst>
 </a:theme>
+</file>
+
+<file path=customXml/item1.xml><?xml version="1.0" encoding="utf-8"?>
+<b:Sources xmlns:b="http://schemas.openxmlformats.org/officeDocument/2006/bibliography" xmlns="http://schemas.openxmlformats.org/officeDocument/2006/bibliography" SelectedStyle="/APASixthEditionOfficeOnline.xsl" StyleName="APA" Version="6"/>
+</file>
+
+<file path=customXml/itemProps1.xml><?xml version="1.0" encoding="utf-8"?>
+<ds:datastoreItem xmlns:ds="http://schemas.openxmlformats.org/officeDocument/2006/customXml" ds:itemID="{35EBCB2F-4F99-644E-BAF5-A2F7109990AC}">
+  <ds:schemaRefs>
+    <ds:schemaRef ds:uri="http://schemas.openxmlformats.org/officeDocument/2006/bibliography"/>
+  </ds:schemaRefs>
+</ds:datastoreItem>
 </file>
</xml_diff>

<commit_message>
Report - Added aims, objectives and development methodology
</commit_message>
<xml_diff>
--- a/w2149479_ShamlaAqthar_Report.docx
+++ b/w2149479_ShamlaAqthar_Report.docx
@@ -717,6 +717,778 @@
         </w:rPr>
         <w:t>Link to GitHub repository:</w:t>
       </w:r>
+    </w:p>
+    <w:p>
+      <w:pPr>
+        <w:pStyle w:val="Heading1"/>
+        <w:spacing w:line="360" w:lineRule="auto"/>
+      </w:pPr>
+      <w:r>
+        <w:t>Aims and Objectives</w:t>
+      </w:r>
+    </w:p>
+    <w:p>
+      <w:pPr>
+        <w:spacing w:line="360" w:lineRule="auto"/>
+        <w:rPr>
+          <w:rFonts w:ascii="Times New Roman" w:hAnsi="Times New Roman" w:cs="Times New Roman"/>
+        </w:rPr>
+      </w:pPr>
+      <w:r>
+        <w:rPr>
+          <w:rFonts w:ascii="Times New Roman" w:hAnsi="Times New Roman" w:cs="Times New Roman"/>
+        </w:rPr>
+        <w:t>The project aim is to develop an interactive data dashboard that analyses global disaster displacement trend, enabling users to better understand the scale, patterns and key drivers of human displacement based on climate and environmental risks</w:t>
+      </w:r>
+    </w:p>
+    <w:p>
+      <w:pPr>
+        <w:spacing w:line="360" w:lineRule="auto"/>
+        <w:rPr>
+          <w:rFonts w:ascii="Times New Roman" w:hAnsi="Times New Roman" w:cs="Times New Roman"/>
+          <w:b/>
+          <w:bCs/>
+        </w:rPr>
+      </w:pPr>
+      <w:r>
+        <w:rPr>
+          <w:rFonts w:ascii="Times New Roman" w:hAnsi="Times New Roman" w:cs="Times New Roman"/>
+          <w:b/>
+          <w:bCs/>
+        </w:rPr>
+        <w:t xml:space="preserve">Objectives </w:t>
+      </w:r>
+    </w:p>
+    <w:p>
+      <w:pPr>
+        <w:pStyle w:val="ListParagraph"/>
+        <w:numPr>
+          <w:ilvl w:val="0"/>
+          <w:numId w:val="3"/>
+        </w:numPr>
+        <w:spacing w:line="360" w:lineRule="auto"/>
+        <w:rPr>
+          <w:rFonts w:ascii="Times New Roman" w:hAnsi="Times New Roman" w:cs="Times New Roman"/>
+        </w:rPr>
+      </w:pPr>
+      <w:r>
+        <w:rPr>
+          <w:rFonts w:ascii="Times New Roman" w:hAnsi="Times New Roman" w:cs="Times New Roman"/>
+        </w:rPr>
+        <w:t xml:space="preserve">Exploratory data analysis: </w:t>
+      </w:r>
+      <w:r>
+        <w:rPr>
+          <w:rFonts w:ascii="Times New Roman" w:hAnsi="Times New Roman" w:cs="Times New Roman"/>
+        </w:rPr>
+        <w:t>T</w:t>
+      </w:r>
+      <w:r>
+        <w:rPr>
+          <w:rFonts w:ascii="Times New Roman" w:hAnsi="Times New Roman" w:cs="Times New Roman"/>
+        </w:rPr>
+        <w:t>o identify patterns which include the most contributing hazard type and calculating displacements across time.</w:t>
+      </w:r>
+    </w:p>
+    <w:p>
+      <w:pPr>
+        <w:pStyle w:val="ListParagraph"/>
+        <w:numPr>
+          <w:ilvl w:val="0"/>
+          <w:numId w:val="3"/>
+        </w:numPr>
+        <w:spacing w:line="360" w:lineRule="auto"/>
+        <w:rPr>
+          <w:rFonts w:ascii="Times New Roman" w:hAnsi="Times New Roman" w:cs="Times New Roman"/>
+        </w:rPr>
+      </w:pPr>
+      <w:r>
+        <w:rPr>
+          <w:rFonts w:ascii="Times New Roman" w:hAnsi="Times New Roman" w:cs="Times New Roman"/>
+        </w:rPr>
+        <w:t xml:space="preserve">Data preparation: </w:t>
+      </w:r>
+      <w:r>
+        <w:rPr>
+          <w:rFonts w:ascii="Times New Roman" w:hAnsi="Times New Roman" w:cs="Times New Roman"/>
+        </w:rPr>
+        <w:t>C</w:t>
+      </w:r>
+      <w:r>
+        <w:rPr>
+          <w:rFonts w:ascii="Times New Roman" w:hAnsi="Times New Roman" w:cs="Times New Roman"/>
+        </w:rPr>
+        <w:t xml:space="preserve">lean and preprocess </w:t>
+      </w:r>
+      <w:r>
+        <w:rPr>
+          <w:rFonts w:ascii="Times New Roman" w:hAnsi="Times New Roman" w:cs="Times New Roman"/>
+        </w:rPr>
+        <w:t>a la</w:t>
+      </w:r>
+      <w:r>
+        <w:rPr>
+          <w:rFonts w:ascii="Times New Roman" w:hAnsi="Times New Roman" w:cs="Times New Roman"/>
+        </w:rPr>
+        <w:t>rgescale dataset using python, addressing missing values, inconsistencies and formatting issues to ensure data reliability.</w:t>
+      </w:r>
+    </w:p>
+    <w:p>
+      <w:pPr>
+        <w:pStyle w:val="ListParagraph"/>
+        <w:numPr>
+          <w:ilvl w:val="0"/>
+          <w:numId w:val="3"/>
+        </w:numPr>
+        <w:spacing w:line="360" w:lineRule="auto"/>
+        <w:rPr>
+          <w:rFonts w:ascii="Times New Roman" w:hAnsi="Times New Roman" w:cs="Times New Roman"/>
+        </w:rPr>
+      </w:pPr>
+      <w:r>
+        <w:rPr>
+          <w:rFonts w:ascii="Times New Roman" w:hAnsi="Times New Roman" w:cs="Times New Roman"/>
+        </w:rPr>
+        <w:t xml:space="preserve">Interactive dashboard: </w:t>
+      </w:r>
+      <w:r>
+        <w:rPr>
+          <w:rFonts w:ascii="Times New Roman" w:hAnsi="Times New Roman" w:cs="Times New Roman"/>
+        </w:rPr>
+        <w:t xml:space="preserve">To </w:t>
+      </w:r>
+      <w:r>
+        <w:rPr>
+          <w:rFonts w:ascii="Times New Roman" w:hAnsi="Times New Roman" w:cs="Times New Roman"/>
+        </w:rPr>
+        <w:t>develop a dynamic and user-friendly visual</w:t>
+      </w:r>
+      <w:r>
+        <w:rPr>
+          <w:rFonts w:ascii="Times New Roman" w:hAnsi="Times New Roman" w:cs="Times New Roman"/>
+        </w:rPr>
+        <w:t>isation</w:t>
+      </w:r>
+      <w:r>
+        <w:rPr>
+          <w:rFonts w:ascii="Times New Roman" w:hAnsi="Times New Roman" w:cs="Times New Roman"/>
+        </w:rPr>
+        <w:t xml:space="preserve"> using </w:t>
+      </w:r>
+      <w:r>
+        <w:rPr>
+          <w:rFonts w:ascii="Times New Roman" w:hAnsi="Times New Roman" w:cs="Times New Roman"/>
+        </w:rPr>
+        <w:t>Pl</w:t>
+      </w:r>
+      <w:r>
+        <w:rPr>
+          <w:rFonts w:ascii="Times New Roman" w:hAnsi="Times New Roman" w:cs="Times New Roman"/>
+        </w:rPr>
+        <w:t>otly allowing the users to explore trends from 20</w:t>
+      </w:r>
+      <w:r>
+        <w:rPr>
+          <w:rFonts w:ascii="Times New Roman" w:hAnsi="Times New Roman" w:cs="Times New Roman"/>
+        </w:rPr>
+        <w:t>0</w:t>
+      </w:r>
+      <w:r>
+        <w:rPr>
+          <w:rFonts w:ascii="Times New Roman" w:hAnsi="Times New Roman" w:cs="Times New Roman"/>
+        </w:rPr>
+        <w:t>8 to 2024</w:t>
+      </w:r>
+    </w:p>
+    <w:p>
+      <w:pPr>
+        <w:pStyle w:val="ListParagraph"/>
+        <w:numPr>
+          <w:ilvl w:val="0"/>
+          <w:numId w:val="3"/>
+        </w:numPr>
+        <w:spacing w:line="360" w:lineRule="auto"/>
+        <w:rPr>
+          <w:rFonts w:ascii="Times New Roman" w:hAnsi="Times New Roman" w:cs="Times New Roman"/>
+        </w:rPr>
+      </w:pPr>
+      <w:r>
+        <w:rPr>
+          <w:rFonts w:ascii="Times New Roman" w:hAnsi="Times New Roman" w:cs="Times New Roman"/>
+        </w:rPr>
+        <w:t xml:space="preserve">Insight generation: </w:t>
+      </w:r>
+      <w:r>
+        <w:rPr>
+          <w:rFonts w:ascii="Times New Roman" w:hAnsi="Times New Roman" w:cs="Times New Roman"/>
+        </w:rPr>
+        <w:t>Derive meaningful insights on displacement patterns hazard impacts and affected regions to support data driven understanding.</w:t>
+      </w:r>
+    </w:p>
+    <w:p>
+      <w:pPr>
+        <w:pStyle w:val="ListParagraph"/>
+        <w:numPr>
+          <w:ilvl w:val="0"/>
+          <w:numId w:val="3"/>
+        </w:numPr>
+        <w:spacing w:line="360" w:lineRule="auto"/>
+        <w:rPr>
+          <w:rFonts w:ascii="Times New Roman" w:hAnsi="Times New Roman" w:cs="Times New Roman"/>
+        </w:rPr>
+      </w:pPr>
+      <w:r>
+        <w:rPr>
+          <w:rFonts w:ascii="Times New Roman" w:hAnsi="Times New Roman" w:cs="Times New Roman"/>
+        </w:rPr>
+        <w:t xml:space="preserve">Deployment: </w:t>
+      </w:r>
+      <w:r>
+        <w:rPr>
+          <w:rFonts w:ascii="Times New Roman" w:hAnsi="Times New Roman" w:cs="Times New Roman"/>
+        </w:rPr>
+        <w:t>De</w:t>
+      </w:r>
+      <w:r>
+        <w:rPr>
+          <w:rFonts w:ascii="Times New Roman" w:hAnsi="Times New Roman" w:cs="Times New Roman"/>
+        </w:rPr>
+        <w:t xml:space="preserve">ploy the dashboard using </w:t>
+      </w:r>
+      <w:proofErr w:type="spellStart"/>
+      <w:r>
+        <w:rPr>
+          <w:rFonts w:ascii="Times New Roman" w:hAnsi="Times New Roman" w:cs="Times New Roman"/>
+        </w:rPr>
+        <w:t>Streamlit</w:t>
+      </w:r>
+      <w:proofErr w:type="spellEnd"/>
+      <w:r>
+        <w:rPr>
+          <w:rFonts w:ascii="Times New Roman" w:hAnsi="Times New Roman" w:cs="Times New Roman"/>
+        </w:rPr>
+        <w:t xml:space="preserve"> </w:t>
+      </w:r>
+      <w:r>
+        <w:rPr>
+          <w:rFonts w:ascii="Times New Roman" w:hAnsi="Times New Roman" w:cs="Times New Roman"/>
+        </w:rPr>
+        <w:t>C</w:t>
+      </w:r>
+      <w:r>
+        <w:rPr>
+          <w:rFonts w:ascii="Times New Roman" w:hAnsi="Times New Roman" w:cs="Times New Roman"/>
+        </w:rPr>
+        <w:t xml:space="preserve">loud which ensures accessibility and enables real-time interaction for users. </w:t>
+      </w:r>
+    </w:p>
+    <w:p>
+      <w:pPr>
+        <w:pStyle w:val="ListParagraph"/>
+        <w:spacing w:line="360" w:lineRule="auto"/>
+        <w:ind w:left="784"/>
+        <w:rPr>
+          <w:rFonts w:ascii="Times New Roman" w:hAnsi="Times New Roman" w:cs="Times New Roman"/>
+        </w:rPr>
+      </w:pPr>
+    </w:p>
+    <w:p>
+      <w:pPr>
+        <w:pStyle w:val="Heading1"/>
+        <w:spacing w:line="360" w:lineRule="auto"/>
+      </w:pPr>
+      <w:r>
+        <w:lastRenderedPageBreak/>
+        <w:t>Development Methodology</w:t>
+      </w:r>
+    </w:p>
+    <w:p>
+      <w:pPr>
+        <w:spacing w:line="360" w:lineRule="auto"/>
+        <w:rPr>
+          <w:rFonts w:ascii="Times New Roman" w:hAnsi="Times New Roman" w:cs="Times New Roman"/>
+        </w:rPr>
+      </w:pPr>
+      <w:r>
+        <w:rPr>
+          <w:rFonts w:ascii="Times New Roman" w:hAnsi="Times New Roman" w:cs="Times New Roman"/>
+        </w:rPr>
+        <w:t>Methodolog</w:t>
+      </w:r>
+      <w:r>
+        <w:rPr>
+          <w:rFonts w:ascii="Times New Roman" w:hAnsi="Times New Roman" w:cs="Times New Roman"/>
+        </w:rPr>
+        <w:t>y use was</w:t>
+      </w:r>
+      <w:r>
+        <w:rPr>
+          <w:rFonts w:ascii="Times New Roman" w:hAnsi="Times New Roman" w:cs="Times New Roman"/>
+        </w:rPr>
+        <w:t xml:space="preserve"> iterative development</w:t>
+      </w:r>
+      <w:r>
+        <w:rPr>
+          <w:rFonts w:ascii="Times New Roman" w:hAnsi="Times New Roman" w:cs="Times New Roman"/>
+        </w:rPr>
+        <w:t xml:space="preserve">. </w:t>
+      </w:r>
+      <w:r>
+        <w:rPr>
+          <w:rFonts w:ascii="Times New Roman" w:hAnsi="Times New Roman" w:cs="Times New Roman"/>
+        </w:rPr>
+        <w:t xml:space="preserve">This approach was used to gradually build and </w:t>
+      </w:r>
+      <w:r>
+        <w:rPr>
+          <w:rFonts w:ascii="Times New Roman" w:hAnsi="Times New Roman" w:cs="Times New Roman"/>
+        </w:rPr>
+        <w:t xml:space="preserve">adjust </w:t>
+      </w:r>
+      <w:r>
+        <w:rPr>
+          <w:rFonts w:ascii="Times New Roman" w:hAnsi="Times New Roman" w:cs="Times New Roman"/>
+        </w:rPr>
+        <w:t>the dashboard in manageable stages.</w:t>
+      </w:r>
+      <w:r>
+        <w:rPr>
+          <w:rFonts w:ascii="Times New Roman" w:hAnsi="Times New Roman" w:cs="Times New Roman"/>
+        </w:rPr>
+        <w:t xml:space="preserve"> This</w:t>
+      </w:r>
+      <w:r>
+        <w:rPr>
+          <w:rFonts w:ascii="Times New Roman" w:hAnsi="Times New Roman" w:cs="Times New Roman"/>
+        </w:rPr>
+        <w:t xml:space="preserve"> allowed early development of a </w:t>
+      </w:r>
+      <w:r>
+        <w:rPr>
+          <w:rFonts w:ascii="Times New Roman" w:hAnsi="Times New Roman" w:cs="Times New Roman"/>
+        </w:rPr>
+        <w:t xml:space="preserve">Minimum Viable Product (MVP), </w:t>
+      </w:r>
+      <w:r>
+        <w:rPr>
+          <w:rFonts w:ascii="Times New Roman" w:hAnsi="Times New Roman" w:cs="Times New Roman"/>
+        </w:rPr>
+        <w:t xml:space="preserve">enabling validation of data processing and visual outputs before expanding functionality. </w:t>
+      </w:r>
+      <w:r>
+        <w:rPr>
+          <w:rFonts w:ascii="Times New Roman" w:hAnsi="Times New Roman" w:cs="Times New Roman"/>
+        </w:rPr>
+        <w:t>This helped r</w:t>
+      </w:r>
+      <w:r>
+        <w:rPr>
+          <w:rFonts w:ascii="Times New Roman" w:hAnsi="Times New Roman" w:cs="Times New Roman"/>
+        </w:rPr>
+        <w:t>educe</w:t>
+      </w:r>
+      <w:r>
+        <w:rPr>
+          <w:rFonts w:ascii="Times New Roman" w:hAnsi="Times New Roman" w:cs="Times New Roman"/>
+        </w:rPr>
+        <w:t xml:space="preserve"> </w:t>
+      </w:r>
+      <w:r>
+        <w:rPr>
+          <w:rFonts w:ascii="Times New Roman" w:hAnsi="Times New Roman" w:cs="Times New Roman"/>
+        </w:rPr>
+        <w:t>the risk of major errors by allowing continuous testing and debugging throughout the development.</w:t>
+      </w:r>
+    </w:p>
+    <w:p>
+      <w:pPr>
+        <w:spacing w:line="360" w:lineRule="auto"/>
+        <w:rPr>
+          <w:rFonts w:ascii="Times New Roman" w:hAnsi="Times New Roman" w:cs="Times New Roman"/>
+          <w:b/>
+          <w:bCs/>
+        </w:rPr>
+      </w:pPr>
+      <w:r>
+        <w:rPr>
+          <w:rFonts w:ascii="Times New Roman" w:hAnsi="Times New Roman" w:cs="Times New Roman"/>
+          <w:b/>
+          <w:bCs/>
+        </w:rPr>
+        <w:t xml:space="preserve">Phase-1: </w:t>
+      </w:r>
+      <w:r>
+        <w:rPr>
+          <w:rFonts w:ascii="Times New Roman" w:hAnsi="Times New Roman" w:cs="Times New Roman"/>
+          <w:b/>
+          <w:bCs/>
+        </w:rPr>
+        <w:t xml:space="preserve">Environmental Setup </w:t>
+      </w:r>
+    </w:p>
+    <w:p>
+      <w:pPr>
+        <w:spacing w:line="360" w:lineRule="auto"/>
+        <w:rPr>
+          <w:rFonts w:ascii="Times New Roman" w:hAnsi="Times New Roman" w:cs="Times New Roman"/>
+        </w:rPr>
+      </w:pPr>
+      <w:r>
+        <w:rPr>
+          <w:rFonts w:ascii="Times New Roman" w:hAnsi="Times New Roman" w:cs="Times New Roman"/>
+        </w:rPr>
+        <w:t>Set up the development environment using</w:t>
+      </w:r>
+      <w:r>
+        <w:rPr>
+          <w:rFonts w:ascii="Times New Roman" w:hAnsi="Times New Roman" w:cs="Times New Roman"/>
+        </w:rPr>
+        <w:t xml:space="preserve"> </w:t>
+      </w:r>
+      <w:proofErr w:type="spellStart"/>
+      <w:r>
+        <w:rPr>
+          <w:rFonts w:ascii="Times New Roman" w:hAnsi="Times New Roman" w:cs="Times New Roman"/>
+        </w:rPr>
+        <w:t>Miniconda</w:t>
+      </w:r>
+      <w:proofErr w:type="spellEnd"/>
+      <w:r>
+        <w:rPr>
+          <w:rFonts w:ascii="Times New Roman" w:hAnsi="Times New Roman" w:cs="Times New Roman"/>
+        </w:rPr>
+        <w:t xml:space="preserve"> </w:t>
+      </w:r>
+      <w:r>
+        <w:rPr>
+          <w:rFonts w:ascii="Times New Roman" w:hAnsi="Times New Roman" w:cs="Times New Roman"/>
+        </w:rPr>
+        <w:t xml:space="preserve">and installed required libraries such as Pandas, Plotly and </w:t>
+      </w:r>
+      <w:proofErr w:type="spellStart"/>
+      <w:r>
+        <w:rPr>
+          <w:rFonts w:ascii="Times New Roman" w:hAnsi="Times New Roman" w:cs="Times New Roman"/>
+        </w:rPr>
+        <w:t>Streamlit</w:t>
+      </w:r>
+      <w:proofErr w:type="spellEnd"/>
+      <w:r>
+        <w:rPr>
+          <w:rFonts w:ascii="Times New Roman" w:hAnsi="Times New Roman" w:cs="Times New Roman"/>
+        </w:rPr>
+        <w:t>.</w:t>
+      </w:r>
+    </w:p>
+    <w:p>
+      <w:pPr>
+        <w:spacing w:line="360" w:lineRule="auto"/>
+        <w:rPr>
+          <w:rFonts w:ascii="Times New Roman" w:hAnsi="Times New Roman" w:cs="Times New Roman"/>
+          <w:b/>
+          <w:bCs/>
+        </w:rPr>
+      </w:pPr>
+      <w:r>
+        <w:rPr>
+          <w:rFonts w:ascii="Times New Roman" w:hAnsi="Times New Roman" w:cs="Times New Roman"/>
+          <w:b/>
+          <w:bCs/>
+        </w:rPr>
+        <w:t>Phase-</w:t>
+      </w:r>
+      <w:r>
+        <w:rPr>
+          <w:rFonts w:ascii="Times New Roman" w:hAnsi="Times New Roman" w:cs="Times New Roman"/>
+          <w:b/>
+          <w:bCs/>
+        </w:rPr>
+        <w:t>2</w:t>
+      </w:r>
+      <w:r>
+        <w:rPr>
+          <w:rFonts w:ascii="Times New Roman" w:hAnsi="Times New Roman" w:cs="Times New Roman"/>
+          <w:b/>
+          <w:bCs/>
+        </w:rPr>
+        <w:t xml:space="preserve">: </w:t>
+      </w:r>
+      <w:r>
+        <w:rPr>
+          <w:rFonts w:ascii="Times New Roman" w:hAnsi="Times New Roman" w:cs="Times New Roman"/>
+          <w:b/>
+          <w:bCs/>
+        </w:rPr>
+        <w:t>Pre profiling</w:t>
+      </w:r>
+    </w:p>
+    <w:p>
+      <w:pPr>
+        <w:spacing w:line="360" w:lineRule="auto"/>
+        <w:rPr>
+          <w:rFonts w:ascii="Times New Roman" w:hAnsi="Times New Roman" w:cs="Times New Roman"/>
+        </w:rPr>
+      </w:pPr>
+      <w:r>
+        <w:rPr>
+          <w:rFonts w:ascii="Times New Roman" w:hAnsi="Times New Roman" w:cs="Times New Roman"/>
+        </w:rPr>
+        <w:t>Performed both initial and post cleaning data explorations to understand the data structure (</w:t>
+      </w:r>
+      <w:proofErr w:type="spellStart"/>
+      <w:r>
+        <w:rPr>
+          <w:rFonts w:ascii="Times New Roman" w:hAnsi="Times New Roman" w:cs="Times New Roman"/>
+        </w:rPr>
+        <w:t>eg</w:t>
+      </w:r>
+      <w:proofErr w:type="spellEnd"/>
+      <w:r>
+        <w:rPr>
+          <w:rFonts w:ascii="Times New Roman" w:hAnsi="Times New Roman" w:cs="Times New Roman"/>
+        </w:rPr>
+        <w:t>: data type), identify missing values</w:t>
+      </w:r>
+      <w:r>
+        <w:rPr>
+          <w:rFonts w:ascii="Times New Roman" w:hAnsi="Times New Roman" w:cs="Times New Roman"/>
+        </w:rPr>
+        <w:t xml:space="preserve"> and inconsistencies</w:t>
+      </w:r>
+      <w:r>
+        <w:rPr>
+          <w:rFonts w:ascii="Times New Roman" w:hAnsi="Times New Roman" w:cs="Times New Roman"/>
+        </w:rPr>
+        <w:t>.</w:t>
+      </w:r>
+    </w:p>
+    <w:p>
+      <w:pPr>
+        <w:spacing w:line="360" w:lineRule="auto"/>
+        <w:rPr>
+          <w:rFonts w:ascii="Times New Roman" w:hAnsi="Times New Roman" w:cs="Times New Roman"/>
+          <w:b/>
+          <w:bCs/>
+        </w:rPr>
+      </w:pPr>
+      <w:r>
+        <w:rPr>
+          <w:rFonts w:ascii="Times New Roman" w:hAnsi="Times New Roman" w:cs="Times New Roman"/>
+          <w:b/>
+          <w:bCs/>
+        </w:rPr>
+        <w:t>Phase-</w:t>
+      </w:r>
+      <w:r>
+        <w:rPr>
+          <w:rFonts w:ascii="Times New Roman" w:hAnsi="Times New Roman" w:cs="Times New Roman"/>
+          <w:b/>
+          <w:bCs/>
+        </w:rPr>
+        <w:t>3</w:t>
+      </w:r>
+      <w:r>
+        <w:rPr>
+          <w:rFonts w:ascii="Times New Roman" w:hAnsi="Times New Roman" w:cs="Times New Roman"/>
+          <w:b/>
+          <w:bCs/>
+        </w:rPr>
+        <w:t xml:space="preserve">: </w:t>
+      </w:r>
+      <w:r>
+        <w:rPr>
+          <w:rFonts w:ascii="Times New Roman" w:hAnsi="Times New Roman" w:cs="Times New Roman"/>
+          <w:b/>
+          <w:bCs/>
+        </w:rPr>
+        <w:t>Data Preparation</w:t>
+      </w:r>
+    </w:p>
+    <w:p>
+      <w:pPr>
+        <w:spacing w:line="360" w:lineRule="auto"/>
+        <w:rPr>
+          <w:rFonts w:ascii="Times New Roman" w:hAnsi="Times New Roman" w:cs="Times New Roman"/>
+        </w:rPr>
+      </w:pPr>
+      <w:r>
+        <w:rPr>
+          <w:rFonts w:ascii="Times New Roman" w:hAnsi="Times New Roman" w:cs="Times New Roman"/>
+        </w:rPr>
+        <w:t>Cleaned and structured the dataset by handling missing values, removing duplicates and exporting a processed dataset for analysis.</w:t>
+      </w:r>
+    </w:p>
+    <w:p>
+      <w:pPr>
+        <w:spacing w:line="360" w:lineRule="auto"/>
+        <w:rPr>
+          <w:rFonts w:ascii="Times New Roman" w:hAnsi="Times New Roman" w:cs="Times New Roman"/>
+          <w:b/>
+          <w:bCs/>
+        </w:rPr>
+      </w:pPr>
+      <w:r>
+        <w:rPr>
+          <w:rFonts w:ascii="Times New Roman" w:hAnsi="Times New Roman" w:cs="Times New Roman"/>
+          <w:b/>
+          <w:bCs/>
+        </w:rPr>
+        <w:t>Phase-</w:t>
+      </w:r>
+      <w:r>
+        <w:rPr>
+          <w:rFonts w:ascii="Times New Roman" w:hAnsi="Times New Roman" w:cs="Times New Roman"/>
+          <w:b/>
+          <w:bCs/>
+        </w:rPr>
+        <w:t>4</w:t>
+      </w:r>
+      <w:r>
+        <w:rPr>
+          <w:rFonts w:ascii="Times New Roman" w:hAnsi="Times New Roman" w:cs="Times New Roman"/>
+          <w:b/>
+          <w:bCs/>
+        </w:rPr>
+        <w:t>:</w:t>
+      </w:r>
+      <w:r>
+        <w:rPr>
+          <w:rFonts w:ascii="Times New Roman" w:hAnsi="Times New Roman" w:cs="Times New Roman"/>
+          <w:b/>
+          <w:bCs/>
+        </w:rPr>
+        <w:t xml:space="preserve"> Exploratory Data Analysis (EDA)</w:t>
+      </w:r>
+    </w:p>
+    <w:p>
+      <w:pPr>
+        <w:spacing w:line="360" w:lineRule="auto"/>
+        <w:rPr>
+          <w:rFonts w:ascii="Times New Roman" w:hAnsi="Times New Roman" w:cs="Times New Roman"/>
+        </w:rPr>
+      </w:pPr>
+      <w:r>
+        <w:rPr>
+          <w:rFonts w:ascii="Times New Roman" w:hAnsi="Times New Roman" w:cs="Times New Roman"/>
+        </w:rPr>
+        <w:t xml:space="preserve">Performed data explorations to </w:t>
+      </w:r>
+      <w:r>
+        <w:rPr>
+          <w:rFonts w:ascii="Times New Roman" w:hAnsi="Times New Roman" w:cs="Times New Roman"/>
+        </w:rPr>
+        <w:t>understand the identify key patterns such as most contribution hazard type.</w:t>
+      </w:r>
+    </w:p>
+    <w:p>
+      <w:pPr>
+        <w:spacing w:line="360" w:lineRule="auto"/>
+        <w:rPr>
+          <w:rFonts w:ascii="Times New Roman" w:hAnsi="Times New Roman" w:cs="Times New Roman"/>
+          <w:b/>
+          <w:bCs/>
+        </w:rPr>
+      </w:pPr>
+      <w:r>
+        <w:rPr>
+          <w:rFonts w:ascii="Times New Roman" w:hAnsi="Times New Roman" w:cs="Times New Roman"/>
+          <w:b/>
+          <w:bCs/>
+        </w:rPr>
+        <w:t>Phase-4:</w:t>
+      </w:r>
+      <w:r>
+        <w:rPr>
+          <w:rFonts w:ascii="Times New Roman" w:hAnsi="Times New Roman" w:cs="Times New Roman"/>
+          <w:b/>
+          <w:bCs/>
+        </w:rPr>
+        <w:t xml:space="preserve"> Dashboard Development</w:t>
+      </w:r>
+    </w:p>
+    <w:p>
+      <w:pPr>
+        <w:spacing w:line="360" w:lineRule="auto"/>
+        <w:rPr>
+          <w:rFonts w:ascii="Times New Roman" w:hAnsi="Times New Roman" w:cs="Times New Roman"/>
+        </w:rPr>
+      </w:pPr>
+      <w:r>
+        <w:rPr>
+          <w:rFonts w:ascii="Times New Roman" w:hAnsi="Times New Roman" w:cs="Times New Roman"/>
+        </w:rPr>
+        <w:t xml:space="preserve">Developed an interactive dashboard using </w:t>
+      </w:r>
+      <w:proofErr w:type="spellStart"/>
+      <w:r>
+        <w:rPr>
+          <w:rFonts w:ascii="Times New Roman" w:hAnsi="Times New Roman" w:cs="Times New Roman"/>
+        </w:rPr>
+        <w:t>Streamlit</w:t>
+      </w:r>
+      <w:proofErr w:type="spellEnd"/>
+      <w:r>
+        <w:rPr>
+          <w:rFonts w:ascii="Times New Roman" w:hAnsi="Times New Roman" w:cs="Times New Roman"/>
+        </w:rPr>
+        <w:t xml:space="preserve"> with KPIs, line charts, bar charts and map visualisations to present insights.</w:t>
+      </w:r>
+    </w:p>
+    <w:p>
+      <w:pPr>
+        <w:spacing w:line="360" w:lineRule="auto"/>
+        <w:rPr>
+          <w:rFonts w:ascii="Times New Roman" w:hAnsi="Times New Roman" w:cs="Times New Roman"/>
+          <w:b/>
+          <w:bCs/>
+        </w:rPr>
+      </w:pPr>
+      <w:r>
+        <w:rPr>
+          <w:rFonts w:ascii="Times New Roman" w:hAnsi="Times New Roman" w:cs="Times New Roman"/>
+          <w:b/>
+          <w:bCs/>
+        </w:rPr>
+        <w:t>Phase-5:</w:t>
+      </w:r>
+      <w:r>
+        <w:rPr>
+          <w:rFonts w:ascii="Times New Roman" w:hAnsi="Times New Roman" w:cs="Times New Roman"/>
+          <w:b/>
+          <w:bCs/>
+        </w:rPr>
+        <w:t xml:space="preserve">  Testing and Deployment</w:t>
+      </w:r>
+    </w:p>
+    <w:p>
+      <w:pPr>
+        <w:spacing w:line="360" w:lineRule="auto"/>
+        <w:rPr>
+          <w:rFonts w:ascii="Times New Roman" w:hAnsi="Times New Roman" w:cs="Times New Roman"/>
+        </w:rPr>
+      </w:pPr>
+      <w:r>
+        <w:rPr>
+          <w:rFonts w:ascii="Times New Roman" w:hAnsi="Times New Roman" w:cs="Times New Roman"/>
+        </w:rPr>
+        <w:t xml:space="preserve">Conducted functional testing using test cases and deployed the finalised dashboard on </w:t>
+      </w:r>
+      <w:proofErr w:type="spellStart"/>
+      <w:r>
+        <w:rPr>
+          <w:rFonts w:ascii="Times New Roman" w:hAnsi="Times New Roman" w:cs="Times New Roman"/>
+        </w:rPr>
+        <w:t>Streamlit</w:t>
+      </w:r>
+      <w:proofErr w:type="spellEnd"/>
+    </w:p>
+    <w:p>
+      <w:pPr>
+        <w:spacing w:line="360" w:lineRule="auto"/>
+        <w:rPr>
+          <w:rFonts w:ascii="Times New Roman" w:hAnsi="Times New Roman" w:cs="Times New Roman"/>
+        </w:rPr>
+      </w:pPr>
     </w:p>
     <w:sectPr>
       <w:pgSz w:w="11906" w:h="16838"/>

</xml_diff>

<commit_message>
Report - Requirements added
</commit_message>
<xml_diff>
--- a/w2149479_ShamlaAqthar_Report.docx
+++ b/w2149479_ShamlaAqthar_Report.docx
@@ -1482,6 +1482,389 @@
       </w:r>
       <w:proofErr w:type="spellEnd"/>
     </w:p>
+    <w:p>
+      <w:pPr>
+        <w:spacing w:line="360" w:lineRule="auto"/>
+        <w:rPr>
+          <w:rFonts w:ascii="Times New Roman" w:hAnsi="Times New Roman" w:cs="Times New Roman"/>
+        </w:rPr>
+      </w:pPr>
+    </w:p>
+    <w:p>
+      <w:pPr>
+        <w:spacing w:line="360" w:lineRule="auto"/>
+        <w:rPr>
+          <w:rFonts w:ascii="Times New Roman" w:hAnsi="Times New Roman" w:cs="Times New Roman"/>
+        </w:rPr>
+      </w:pPr>
+    </w:p>
+    <w:p>
+      <w:pPr>
+        <w:keepNext/>
+        <w:keepLines/>
+        <w:spacing w:before="360" w:after="80" w:line="360" w:lineRule="auto"/>
+        <w:outlineLvl w:val="0"/>
+        <w:rPr>
+          <w:rFonts w:ascii="Times New Roman" w:eastAsia="Times New Roman" w:hAnsi="Times New Roman" w:cs="Times New Roman"/>
+          <w:b/>
+          <w:bCs/>
+          <w:color w:val="0F4761"/>
+          <w:sz w:val="40"/>
+          <w:szCs w:val="40"/>
+        </w:rPr>
+      </w:pPr>
+      <w:r>
+        <w:rPr>
+          <w:rFonts w:ascii="Times New Roman" w:eastAsia="Times New Roman" w:hAnsi="Times New Roman" w:cs="Times New Roman"/>
+          <w:b/>
+          <w:bCs/>
+          <w:color w:val="0F4761"/>
+          <w:sz w:val="40"/>
+          <w:szCs w:val="40"/>
+        </w:rPr>
+        <w:lastRenderedPageBreak/>
+        <w:t>Requirements</w:t>
+      </w:r>
+    </w:p>
+    <w:tbl>
+      <w:tblPr>
+        <w:tblStyle w:val="GridTable4-Accent21"/>
+        <w:tblW w:w="0" w:type="auto"/>
+        <w:tblLook w:val="04A0" w:firstRow="1" w:lastRow="0" w:firstColumn="1" w:lastColumn="0" w:noHBand="0" w:noVBand="1"/>
+      </w:tblPr>
+      <w:tblGrid>
+        <w:gridCol w:w="4508"/>
+        <w:gridCol w:w="4508"/>
+      </w:tblGrid>
+      <w:tr>
+        <w:trPr>
+          <w:cnfStyle w:val="100000000000" w:firstRow="1" w:lastRow="0" w:firstColumn="0" w:lastColumn="0" w:oddVBand="0" w:evenVBand="0" w:oddHBand="0" w:evenHBand="0" w:firstRowFirstColumn="0" w:firstRowLastColumn="0" w:lastRowFirstColumn="0" w:lastRowLastColumn="0"/>
+        </w:trPr>
+        <w:tc>
+          <w:tcPr>
+            <w:cnfStyle w:val="001000000000" w:firstRow="0" w:lastRow="0" w:firstColumn="1" w:lastColumn="0" w:oddVBand="0" w:evenVBand="0" w:oddHBand="0" w:evenHBand="0" w:firstRowFirstColumn="0" w:firstRowLastColumn="0" w:lastRowFirstColumn="0" w:lastRowLastColumn="0"/>
+            <w:tcW w:w="4508" w:type="dxa"/>
+          </w:tcPr>
+          <w:p>
+            <w:pPr>
+              <w:spacing w:line="360" w:lineRule="auto"/>
+              <w:jc w:val="center"/>
+              <w:rPr>
+                <w:rFonts w:ascii="Times New Roman" w:eastAsia="Aptos" w:hAnsi="Times New Roman" w:cs="Times New Roman"/>
+              </w:rPr>
+            </w:pPr>
+            <w:r>
+              <w:rPr>
+                <w:rFonts w:ascii="Times New Roman" w:eastAsia="Aptos" w:hAnsi="Times New Roman" w:cs="Times New Roman"/>
+              </w:rPr>
+              <w:t>Functional</w:t>
+            </w:r>
+          </w:p>
+        </w:tc>
+        <w:tc>
+          <w:tcPr>
+            <w:tcW w:w="4508" w:type="dxa"/>
+          </w:tcPr>
+          <w:p>
+            <w:pPr>
+              <w:spacing w:line="360" w:lineRule="auto"/>
+              <w:jc w:val="center"/>
+              <w:cnfStyle w:val="100000000000" w:firstRow="1" w:lastRow="0" w:firstColumn="0" w:lastColumn="0" w:oddVBand="0" w:evenVBand="0" w:oddHBand="0" w:evenHBand="0" w:firstRowFirstColumn="0" w:firstRowLastColumn="0" w:lastRowFirstColumn="0" w:lastRowLastColumn="0"/>
+              <w:rPr>
+                <w:rFonts w:ascii="Times New Roman" w:eastAsia="Aptos" w:hAnsi="Times New Roman" w:cs="Times New Roman"/>
+              </w:rPr>
+            </w:pPr>
+            <w:r>
+              <w:rPr>
+                <w:rFonts w:ascii="Times New Roman" w:eastAsia="Aptos" w:hAnsi="Times New Roman" w:cs="Times New Roman"/>
+              </w:rPr>
+              <w:t>Non-Functional</w:t>
+            </w:r>
+          </w:p>
+        </w:tc>
+      </w:tr>
+      <w:tr>
+        <w:trPr>
+          <w:cnfStyle w:val="000000100000" w:firstRow="0" w:lastRow="0" w:firstColumn="0" w:lastColumn="0" w:oddVBand="0" w:evenVBand="0" w:oddHBand="1" w:evenHBand="0" w:firstRowFirstColumn="0" w:firstRowLastColumn="0" w:lastRowFirstColumn="0" w:lastRowLastColumn="0"/>
+          <w:trHeight w:val="842"/>
+        </w:trPr>
+        <w:tc>
+          <w:tcPr>
+            <w:cnfStyle w:val="001000000000" w:firstRow="0" w:lastRow="0" w:firstColumn="1" w:lastColumn="0" w:oddVBand="0" w:evenVBand="0" w:oddHBand="0" w:evenHBand="0" w:firstRowFirstColumn="0" w:firstRowLastColumn="0" w:lastRowFirstColumn="0" w:lastRowLastColumn="0"/>
+            <w:tcW w:w="4508" w:type="dxa"/>
+          </w:tcPr>
+          <w:p>
+            <w:pPr>
+              <w:spacing w:line="360" w:lineRule="auto"/>
+              <w:rPr>
+                <w:rFonts w:ascii="Times New Roman" w:eastAsia="Aptos" w:hAnsi="Times New Roman" w:cs="Times New Roman"/>
+                <w:b w:val="0"/>
+                <w:bCs w:val="0"/>
+                <w:color w:val="000000"/>
+              </w:rPr>
+            </w:pPr>
+            <w:r>
+              <w:rPr>
+                <w:rFonts w:ascii="Times New Roman" w:eastAsia="Aptos" w:hAnsi="Times New Roman" w:cs="Times New Roman"/>
+                <w:b w:val="0"/>
+                <w:bCs w:val="0"/>
+                <w:color w:val="000000"/>
+              </w:rPr>
+              <w:t>The system shall display aggregated KPI metrics of total displacement, leading hazard types and the most affected country.</w:t>
+            </w:r>
+          </w:p>
+        </w:tc>
+        <w:tc>
+          <w:tcPr>
+            <w:tcW w:w="4508" w:type="dxa"/>
+          </w:tcPr>
+          <w:p>
+            <w:pPr>
+              <w:spacing w:line="360" w:lineRule="auto"/>
+              <w:cnfStyle w:val="000000100000" w:firstRow="0" w:lastRow="0" w:firstColumn="0" w:lastColumn="0" w:oddVBand="0" w:evenVBand="0" w:oddHBand="1" w:evenHBand="0" w:firstRowFirstColumn="0" w:firstRowLastColumn="0" w:lastRowFirstColumn="0" w:lastRowLastColumn="0"/>
+              <w:rPr>
+                <w:rFonts w:ascii="Times New Roman" w:eastAsia="Aptos" w:hAnsi="Times New Roman" w:cs="Times New Roman"/>
+                <w:color w:val="000000"/>
+              </w:rPr>
+            </w:pPr>
+            <w:r>
+              <w:rPr>
+                <w:rFonts w:ascii="Times New Roman" w:eastAsia="Aptos" w:hAnsi="Times New Roman" w:cs="Times New Roman"/>
+                <w:color w:val="000000"/>
+              </w:rPr>
+              <w:t>The dashboard must have an intuitive layout with clear visual hierarchy</w:t>
+            </w:r>
+          </w:p>
+        </w:tc>
+      </w:tr>
+      <w:tr>
+        <w:tc>
+          <w:tcPr>
+            <w:cnfStyle w:val="001000000000" w:firstRow="0" w:lastRow="0" w:firstColumn="1" w:lastColumn="0" w:oddVBand="0" w:evenVBand="0" w:oddHBand="0" w:evenHBand="0" w:firstRowFirstColumn="0" w:firstRowLastColumn="0" w:lastRowFirstColumn="0" w:lastRowLastColumn="0"/>
+            <w:tcW w:w="4508" w:type="dxa"/>
+          </w:tcPr>
+          <w:p>
+            <w:pPr>
+              <w:spacing w:line="360" w:lineRule="auto"/>
+              <w:rPr>
+                <w:rFonts w:ascii="Times New Roman" w:eastAsia="Aptos" w:hAnsi="Times New Roman" w:cs="Times New Roman"/>
+                <w:b w:val="0"/>
+                <w:bCs w:val="0"/>
+                <w:color w:val="000000"/>
+              </w:rPr>
+            </w:pPr>
+            <w:r>
+              <w:rPr>
+                <w:rFonts w:ascii="Times New Roman" w:eastAsia="Aptos" w:hAnsi="Times New Roman" w:cs="Times New Roman"/>
+                <w:b w:val="0"/>
+                <w:bCs w:val="0"/>
+                <w:color w:val="000000"/>
+              </w:rPr>
+              <w:t>The app shall provide a time series line chart to visualise displacement trends from 2008-2024</w:t>
+            </w:r>
+          </w:p>
+        </w:tc>
+        <w:tc>
+          <w:tcPr>
+            <w:tcW w:w="4508" w:type="dxa"/>
+          </w:tcPr>
+          <w:p>
+            <w:pPr>
+              <w:spacing w:line="360" w:lineRule="auto"/>
+              <w:cnfStyle w:val="000000000000" w:firstRow="0" w:lastRow="0" w:firstColumn="0" w:lastColumn="0" w:oddVBand="0" w:evenVBand="0" w:oddHBand="0" w:evenHBand="0" w:firstRowFirstColumn="0" w:firstRowLastColumn="0" w:lastRowFirstColumn="0" w:lastRowLastColumn="0"/>
+              <w:rPr>
+                <w:rFonts w:ascii="Times New Roman" w:eastAsia="Aptos" w:hAnsi="Times New Roman" w:cs="Times New Roman"/>
+                <w:color w:val="000000"/>
+              </w:rPr>
+            </w:pPr>
+            <w:r>
+              <w:rPr>
+                <w:rFonts w:ascii="Times New Roman" w:eastAsia="Aptos" w:hAnsi="Times New Roman" w:cs="Times New Roman"/>
+                <w:color w:val="000000"/>
+              </w:rPr>
+              <w:t>Data loading must be optimized using @</w:t>
+            </w:r>
+            <w:proofErr w:type="gramStart"/>
+            <w:r>
+              <w:rPr>
+                <w:rFonts w:ascii="Times New Roman" w:eastAsia="Aptos" w:hAnsi="Times New Roman" w:cs="Times New Roman"/>
+                <w:color w:val="000000"/>
+              </w:rPr>
+              <w:t>st.cache</w:t>
+            </w:r>
+            <w:proofErr w:type="gramEnd"/>
+            <w:r>
+              <w:rPr>
+                <w:rFonts w:ascii="Times New Roman" w:eastAsia="Aptos" w:hAnsi="Times New Roman" w:cs="Times New Roman"/>
+                <w:color w:val="000000"/>
+              </w:rPr>
+              <w:t>_date to ensure smooth interactivity.</w:t>
+            </w:r>
+          </w:p>
+        </w:tc>
+      </w:tr>
+      <w:tr>
+        <w:trPr>
+          <w:cnfStyle w:val="000000100000" w:firstRow="0" w:lastRow="0" w:firstColumn="0" w:lastColumn="0" w:oddVBand="0" w:evenVBand="0" w:oddHBand="1" w:evenHBand="0" w:firstRowFirstColumn="0" w:firstRowLastColumn="0" w:lastRowFirstColumn="0" w:lastRowLastColumn="0"/>
+          <w:trHeight w:val="712"/>
+        </w:trPr>
+        <w:tc>
+          <w:tcPr>
+            <w:cnfStyle w:val="001000000000" w:firstRow="0" w:lastRow="0" w:firstColumn="1" w:lastColumn="0" w:oddVBand="0" w:evenVBand="0" w:oddHBand="0" w:evenHBand="0" w:firstRowFirstColumn="0" w:firstRowLastColumn="0" w:lastRowFirstColumn="0" w:lastRowLastColumn="0"/>
+            <w:tcW w:w="4508" w:type="dxa"/>
+          </w:tcPr>
+          <w:p>
+            <w:pPr>
+              <w:spacing w:line="360" w:lineRule="auto"/>
+              <w:rPr>
+                <w:rFonts w:ascii="Times New Roman" w:eastAsia="Aptos" w:hAnsi="Times New Roman" w:cs="Times New Roman"/>
+                <w:b w:val="0"/>
+                <w:bCs w:val="0"/>
+                <w:color w:val="000000"/>
+              </w:rPr>
+            </w:pPr>
+            <w:r>
+              <w:rPr>
+                <w:rFonts w:ascii="Times New Roman" w:eastAsia="Aptos" w:hAnsi="Times New Roman" w:cs="Times New Roman"/>
+                <w:b w:val="0"/>
+                <w:bCs w:val="0"/>
+                <w:color w:val="000000"/>
+              </w:rPr>
+              <w:t>The system shall include a map to illustrate the regional impact of disasters</w:t>
+            </w:r>
+          </w:p>
+        </w:tc>
+        <w:tc>
+          <w:tcPr>
+            <w:tcW w:w="4508" w:type="dxa"/>
+          </w:tcPr>
+          <w:p>
+            <w:pPr>
+              <w:spacing w:line="360" w:lineRule="auto"/>
+              <w:cnfStyle w:val="000000100000" w:firstRow="0" w:lastRow="0" w:firstColumn="0" w:lastColumn="0" w:oddVBand="0" w:evenVBand="0" w:oddHBand="1" w:evenHBand="0" w:firstRowFirstColumn="0" w:firstRowLastColumn="0" w:lastRowFirstColumn="0" w:lastRowLastColumn="0"/>
+              <w:rPr>
+                <w:rFonts w:ascii="Times New Roman" w:eastAsia="Aptos" w:hAnsi="Times New Roman" w:cs="Times New Roman"/>
+                <w:color w:val="000000"/>
+              </w:rPr>
+            </w:pPr>
+            <w:r>
+              <w:rPr>
+                <w:rFonts w:ascii="Times New Roman" w:eastAsia="Aptos" w:hAnsi="Times New Roman" w:cs="Times New Roman"/>
+                <w:color w:val="000000"/>
+              </w:rPr>
+              <w:t>The visuals must scale dynamically to fit the user’s screen width</w:t>
+            </w:r>
+          </w:p>
+        </w:tc>
+      </w:tr>
+      <w:tr>
+        <w:trPr>
+          <w:trHeight w:val="712"/>
+        </w:trPr>
+        <w:tc>
+          <w:tcPr>
+            <w:cnfStyle w:val="001000000000" w:firstRow="0" w:lastRow="0" w:firstColumn="1" w:lastColumn="0" w:oddVBand="0" w:evenVBand="0" w:oddHBand="0" w:evenHBand="0" w:firstRowFirstColumn="0" w:firstRowLastColumn="0" w:lastRowFirstColumn="0" w:lastRowLastColumn="0"/>
+            <w:tcW w:w="4508" w:type="dxa"/>
+          </w:tcPr>
+          <w:p>
+            <w:pPr>
+              <w:spacing w:line="360" w:lineRule="auto"/>
+              <w:rPr>
+                <w:rFonts w:ascii="Times New Roman" w:eastAsia="Aptos" w:hAnsi="Times New Roman" w:cs="Times New Roman"/>
+                <w:b w:val="0"/>
+                <w:bCs w:val="0"/>
+                <w:color w:val="000000"/>
+              </w:rPr>
+            </w:pPr>
+            <w:r>
+              <w:rPr>
+                <w:rFonts w:ascii="Times New Roman" w:eastAsia="Aptos" w:hAnsi="Times New Roman" w:cs="Times New Roman"/>
+                <w:b w:val="0"/>
+                <w:bCs w:val="0"/>
+                <w:color w:val="000000"/>
+              </w:rPr>
+              <w:t>The system shall include bar charts to display the top 5 contributing hazards and total number of displacements by hazard type.</w:t>
+            </w:r>
+          </w:p>
+        </w:tc>
+        <w:tc>
+          <w:tcPr>
+            <w:tcW w:w="4508" w:type="dxa"/>
+          </w:tcPr>
+          <w:p>
+            <w:pPr>
+              <w:spacing w:line="360" w:lineRule="auto"/>
+              <w:cnfStyle w:val="000000000000" w:firstRow="0" w:lastRow="0" w:firstColumn="0" w:lastColumn="0" w:oddVBand="0" w:evenVBand="0" w:oddHBand="0" w:evenHBand="0" w:firstRowFirstColumn="0" w:firstRowLastColumn="0" w:lastRowFirstColumn="0" w:lastRowLastColumn="0"/>
+              <w:rPr>
+                <w:rFonts w:ascii="Times New Roman" w:eastAsia="Aptos" w:hAnsi="Times New Roman" w:cs="Times New Roman"/>
+                <w:color w:val="000000"/>
+              </w:rPr>
+            </w:pPr>
+            <w:r>
+              <w:rPr>
+                <w:rFonts w:ascii="Times New Roman" w:eastAsia="Aptos" w:hAnsi="Times New Roman" w:cs="Times New Roman"/>
+                <w:color w:val="000000"/>
+              </w:rPr>
+              <w:t>The system must provide a fast interaction with less latency.</w:t>
+            </w:r>
+          </w:p>
+        </w:tc>
+      </w:tr>
+      <w:tr>
+        <w:trPr>
+          <w:cnfStyle w:val="000000100000" w:firstRow="0" w:lastRow="0" w:firstColumn="0" w:lastColumn="0" w:oddVBand="0" w:evenVBand="0" w:oddHBand="1" w:evenHBand="0" w:firstRowFirstColumn="0" w:firstRowLastColumn="0" w:lastRowFirstColumn="0" w:lastRowLastColumn="0"/>
+          <w:trHeight w:val="708"/>
+        </w:trPr>
+        <w:tc>
+          <w:tcPr>
+            <w:cnfStyle w:val="001000000000" w:firstRow="0" w:lastRow="0" w:firstColumn="1" w:lastColumn="0" w:oddVBand="0" w:evenVBand="0" w:oddHBand="0" w:evenHBand="0" w:firstRowFirstColumn="0" w:firstRowLastColumn="0" w:lastRowFirstColumn="0" w:lastRowLastColumn="0"/>
+            <w:tcW w:w="4508" w:type="dxa"/>
+          </w:tcPr>
+          <w:p>
+            <w:pPr>
+              <w:spacing w:line="360" w:lineRule="auto"/>
+              <w:rPr>
+                <w:rFonts w:ascii="Times New Roman" w:eastAsia="Aptos" w:hAnsi="Times New Roman" w:cs="Times New Roman"/>
+                <w:b w:val="0"/>
+                <w:bCs w:val="0"/>
+                <w:color w:val="000000"/>
+              </w:rPr>
+            </w:pPr>
+            <w:r>
+              <w:rPr>
+                <w:rFonts w:ascii="Times New Roman" w:eastAsia="Aptos" w:hAnsi="Times New Roman" w:cs="Times New Roman"/>
+                <w:b w:val="0"/>
+                <w:bCs w:val="0"/>
+                <w:color w:val="000000"/>
+              </w:rPr>
+              <w:t>The app will provide filters and slicers to allow user interaction</w:t>
+            </w:r>
+          </w:p>
+        </w:tc>
+        <w:tc>
+          <w:tcPr>
+            <w:tcW w:w="4508" w:type="dxa"/>
+          </w:tcPr>
+          <w:p>
+            <w:pPr>
+              <w:spacing w:line="360" w:lineRule="auto"/>
+              <w:cnfStyle w:val="000000100000" w:firstRow="0" w:lastRow="0" w:firstColumn="0" w:lastColumn="0" w:oddVBand="0" w:evenVBand="0" w:oddHBand="1" w:evenHBand="0" w:firstRowFirstColumn="0" w:firstRowLastColumn="0" w:lastRowFirstColumn="0" w:lastRowLastColumn="0"/>
+              <w:rPr>
+                <w:rFonts w:ascii="Times New Roman" w:eastAsia="Aptos" w:hAnsi="Times New Roman" w:cs="Times New Roman"/>
+                <w:color w:val="000000"/>
+              </w:rPr>
+            </w:pPr>
+            <w:r>
+              <w:rPr>
+                <w:rFonts w:ascii="Times New Roman" w:eastAsia="Aptos" w:hAnsi="Times New Roman" w:cs="Times New Roman"/>
+                <w:color w:val="000000"/>
+              </w:rPr>
+              <w:t>The visualisation must be clear, readable and clutter free.</w:t>
+            </w:r>
+          </w:p>
+        </w:tc>
+      </w:tr>
+    </w:tbl>
     <w:p>
       <w:pPr>
         <w:spacing w:line="360" w:lineRule="auto"/>
@@ -3000,6 +3383,83 @@
       </w:tcPr>
     </w:tblStylePr>
   </w:style>
+  <w:style w:type="table" w:customStyle="1" w:styleId="GridTable4-Accent21">
+    <w:name w:val="Grid Table 4 - Accent 21"/>
+    <w:basedOn w:val="TableNormal"/>
+    <w:next w:val="GridTable4-Accent2"/>
+    <w:uiPriority w:val="49"/>
+    <w:rsid w:val="009E5080"/>
+    <w:pPr>
+      <w:spacing w:after="0" w:line="240" w:lineRule="auto"/>
+    </w:pPr>
+    <w:tblPr>
+      <w:tblStyleRowBandSize w:val="1"/>
+      <w:tblStyleColBandSize w:val="1"/>
+      <w:tblBorders>
+        <w:top w:val="single" w:sz="4" w:space="0" w:color="F1A983"/>
+        <w:left w:val="single" w:sz="4" w:space="0" w:color="F1A983"/>
+        <w:bottom w:val="single" w:sz="4" w:space="0" w:color="F1A983"/>
+        <w:right w:val="single" w:sz="4" w:space="0" w:color="F1A983"/>
+        <w:insideH w:val="single" w:sz="4" w:space="0" w:color="F1A983"/>
+        <w:insideV w:val="single" w:sz="4" w:space="0" w:color="F1A983"/>
+      </w:tblBorders>
+    </w:tblPr>
+    <w:tblStylePr w:type="firstRow">
+      <w:rPr>
+        <w:b/>
+        <w:bCs/>
+        <w:color w:val="FFFFFF"/>
+      </w:rPr>
+      <w:tblPr/>
+      <w:tcPr>
+        <w:tcBorders>
+          <w:top w:val="single" w:sz="4" w:space="0" w:color="E97132"/>
+          <w:left w:val="single" w:sz="4" w:space="0" w:color="E97132"/>
+          <w:bottom w:val="single" w:sz="4" w:space="0" w:color="E97132"/>
+          <w:right w:val="single" w:sz="4" w:space="0" w:color="E97132"/>
+          <w:insideH w:val="nil"/>
+          <w:insideV w:val="nil"/>
+        </w:tcBorders>
+        <w:shd w:val="clear" w:color="auto" w:fill="E97132"/>
+      </w:tcPr>
+    </w:tblStylePr>
+    <w:tblStylePr w:type="lastRow">
+      <w:rPr>
+        <w:b/>
+        <w:bCs/>
+      </w:rPr>
+      <w:tblPr/>
+      <w:tcPr>
+        <w:tcBorders>
+          <w:top w:val="double" w:sz="4" w:space="0" w:color="E97132"/>
+        </w:tcBorders>
+      </w:tcPr>
+    </w:tblStylePr>
+    <w:tblStylePr w:type="firstCol">
+      <w:rPr>
+        <w:b/>
+        <w:bCs/>
+      </w:rPr>
+    </w:tblStylePr>
+    <w:tblStylePr w:type="lastCol">
+      <w:rPr>
+        <w:b/>
+        <w:bCs/>
+      </w:rPr>
+    </w:tblStylePr>
+    <w:tblStylePr w:type="band1Vert">
+      <w:tblPr/>
+      <w:tcPr>
+        <w:shd w:val="clear" w:color="auto" w:fill="FAE2D5"/>
+      </w:tcPr>
+    </w:tblStylePr>
+    <w:tblStylePr w:type="band1Horz">
+      <w:tblPr/>
+      <w:tcPr>
+        <w:shd w:val="clear" w:color="auto" w:fill="FAE2D5"/>
+      </w:tcPr>
+    </w:tblStylePr>
+  </w:style>
 </w:styles>
 </file>
 

</xml_diff>

<commit_message>
Report - Test cases and logs added
</commit_message>
<xml_diff>
--- a/w2149479_ShamlaAqthar_Report.docx
+++ b/w2149479_ShamlaAqthar_Report.docx
@@ -108,7 +108,7 @@
           <w:noProof/>
         </w:rPr>
         <w:drawing>
-          <wp:anchor distT="0" distB="0" distL="114300" distR="114300" simplePos="0" relativeHeight="251660288" behindDoc="0" locked="0" layoutInCell="1" allowOverlap="1" wp14:anchorId="27BD4142" wp14:editId="1FC7C794">
+          <wp:anchor distT="0" distB="0" distL="114300" distR="114300" simplePos="0" relativeHeight="251660288" behindDoc="0" locked="0" layoutInCell="1" allowOverlap="1" wp14:anchorId="27BD4142" wp14:editId="5FC34893">
             <wp:simplePos x="0" y="0"/>
             <wp:positionH relativeFrom="column">
               <wp:posOffset>-152400</wp:posOffset>
@@ -284,10 +284,20 @@
           <w:rFonts w:ascii="Times New Roman" w:hAnsi="Times New Roman" w:cs="Times New Roman"/>
           <w:b/>
           <w:bCs/>
+          <w:sz w:val="48"/>
+          <w:szCs w:val="48"/>
+        </w:rPr>
+      </w:pPr>
+      <w:r>
+        <w:rPr>
+          <w:rFonts w:ascii="Times New Roman" w:hAnsi="Times New Roman" w:cs="Times New Roman"/>
+          <w:b/>
+          <w:bCs/>
           <w:sz w:val="56"/>
           <w:szCs w:val="56"/>
         </w:rPr>
-      </w:pPr>
+        <w:t>Level 5 Business Data Analytics</w:t>
+      </w:r>
       <w:r>
         <w:rPr>
           <w:rFonts w:ascii="Times New Roman" w:hAnsi="Times New Roman" w:cs="Times New Roman"/>
@@ -296,9 +306,13 @@
           <w:sz w:val="56"/>
           <w:szCs w:val="56"/>
         </w:rPr>
-        <w:t>Level 5 Business Data Analytics</w:t>
-      </w:r>
-      <w:r>
+        <w:br/>
+      </w:r>
+    </w:p>
+    <w:p>
+      <w:pPr>
+        <w:spacing w:line="360" w:lineRule="auto"/>
+        <w:jc w:val="center"/>
         <w:rPr>
           <w:rFonts w:ascii="Times New Roman" w:hAnsi="Times New Roman" w:cs="Times New Roman"/>
           <w:b/>
@@ -306,7 +320,16 @@
           <w:sz w:val="56"/>
           <w:szCs w:val="56"/>
         </w:rPr>
-        <w:br/>
+      </w:pPr>
+      <w:r>
+        <w:rPr>
+          <w:rFonts w:ascii="Times New Roman" w:hAnsi="Times New Roman" w:cs="Times New Roman"/>
+          <w:b/>
+          <w:bCs/>
+          <w:sz w:val="56"/>
+          <w:szCs w:val="56"/>
+        </w:rPr>
+        <w:t xml:space="preserve">INDIVIDUAL COURSEWORK </w:t>
       </w:r>
     </w:p>
     <w:p>
@@ -317,19 +340,41 @@
           <w:rFonts w:ascii="Times New Roman" w:hAnsi="Times New Roman" w:cs="Times New Roman"/>
           <w:b/>
           <w:bCs/>
-          <w:sz w:val="56"/>
-          <w:szCs w:val="56"/>
-        </w:rPr>
-      </w:pPr>
-      <w:r>
-        <w:rPr>
-          <w:rFonts w:ascii="Times New Roman" w:hAnsi="Times New Roman" w:cs="Times New Roman"/>
-          <w:b/>
-          <w:bCs/>
-          <w:sz w:val="56"/>
-          <w:szCs w:val="56"/>
-        </w:rPr>
-        <w:t xml:space="preserve">INDIVIDUAL COURSEWORK </w:t>
+          <w:sz w:val="48"/>
+          <w:szCs w:val="48"/>
+        </w:rPr>
+      </w:pPr>
+      <w:r>
+        <w:rPr>
+          <w:rFonts w:ascii="Times New Roman" w:hAnsi="Times New Roman" w:cs="Times New Roman"/>
+          <w:b/>
+          <w:bCs/>
+          <w:sz w:val="48"/>
+          <w:szCs w:val="48"/>
+        </w:rPr>
+        <w:t xml:space="preserve">Module Leader - Mr. </w:t>
+      </w:r>
+      <w:proofErr w:type="spellStart"/>
+      <w:r>
+        <w:rPr>
+          <w:rFonts w:ascii="Times New Roman" w:hAnsi="Times New Roman" w:cs="Times New Roman"/>
+          <w:b/>
+          <w:bCs/>
+          <w:sz w:val="48"/>
+          <w:szCs w:val="48"/>
+        </w:rPr>
+        <w:t>Fouzul</w:t>
+      </w:r>
+      <w:proofErr w:type="spellEnd"/>
+      <w:r>
+        <w:rPr>
+          <w:rFonts w:ascii="Times New Roman" w:hAnsi="Times New Roman" w:cs="Times New Roman"/>
+          <w:b/>
+          <w:bCs/>
+          <w:sz w:val="48"/>
+          <w:szCs w:val="48"/>
+        </w:rPr>
+        <w:t xml:space="preserve"> Hassan</w:t>
       </w:r>
     </w:p>
     <w:p>
@@ -344,51 +389,6 @@
           <w:szCs w:val="48"/>
         </w:rPr>
       </w:pPr>
-      <w:r>
-        <w:rPr>
-          <w:rFonts w:ascii="Times New Roman" w:hAnsi="Times New Roman" w:cs="Times New Roman"/>
-          <w:b/>
-          <w:bCs/>
-          <w:sz w:val="48"/>
-          <w:szCs w:val="48"/>
-        </w:rPr>
-        <w:t xml:space="preserve">Module Leader - Mr. </w:t>
-      </w:r>
-      <w:proofErr w:type="spellStart"/>
-      <w:r>
-        <w:rPr>
-          <w:rFonts w:ascii="Times New Roman" w:hAnsi="Times New Roman" w:cs="Times New Roman"/>
-          <w:b/>
-          <w:bCs/>
-          <w:sz w:val="48"/>
-          <w:szCs w:val="48"/>
-        </w:rPr>
-        <w:t>Fouzul</w:t>
-      </w:r>
-      <w:proofErr w:type="spellEnd"/>
-      <w:r>
-        <w:rPr>
-          <w:rFonts w:ascii="Times New Roman" w:hAnsi="Times New Roman" w:cs="Times New Roman"/>
-          <w:b/>
-          <w:bCs/>
-          <w:sz w:val="48"/>
-          <w:szCs w:val="48"/>
-        </w:rPr>
-        <w:t xml:space="preserve"> Hassan</w:t>
-      </w:r>
-    </w:p>
-    <w:p>
-      <w:pPr>
-        <w:spacing w:line="360" w:lineRule="auto"/>
-        <w:jc w:val="center"/>
-        <w:rPr>
-          <w:rFonts w:ascii="Times New Roman" w:hAnsi="Times New Roman" w:cs="Times New Roman"/>
-          <w:b/>
-          <w:bCs/>
-          <w:sz w:val="48"/>
-          <w:szCs w:val="48"/>
-        </w:rPr>
-      </w:pPr>
     </w:p>
     <w:p>
       <w:pPr>
@@ -469,20 +469,6 @@
           <w:szCs w:val="36"/>
         </w:rPr>
         <w:t>IIT Id: 20241956</w:t>
-      </w:r>
-    </w:p>
-    <w:p>
-      <w:pPr>
-        <w:jc w:val="left"/>
-        <w:rPr>
-          <w:rFonts w:ascii="Times New Roman" w:hAnsi="Times New Roman" w:cs="Times New Roman"/>
-        </w:rPr>
-      </w:pPr>
-      <w:r>
-        <w:rPr>
-          <w:rFonts w:ascii="Times New Roman" w:hAnsi="Times New Roman" w:cs="Times New Roman"/>
-        </w:rPr>
-        <w:br w:type="page"/>
       </w:r>
     </w:p>
     <w:p>
@@ -1195,6 +1181,72 @@
           <w:b/>
           <w:bCs/>
         </w:rPr>
+        <w:t xml:space="preserve">Phase-2: </w:t>
+      </w:r>
+      <w:r>
+        <w:rPr>
+          <w:rFonts w:ascii="Times New Roman" w:hAnsi="Times New Roman" w:cs="Times New Roman"/>
+          <w:b/>
+          <w:bCs/>
+        </w:rPr>
+        <w:t>Pre profiling</w:t>
+      </w:r>
+    </w:p>
+    <w:p>
+      <w:pPr>
+        <w:spacing w:line="360" w:lineRule="auto"/>
+        <w:rPr>
+          <w:rFonts w:ascii="Times New Roman" w:hAnsi="Times New Roman" w:cs="Times New Roman"/>
+        </w:rPr>
+      </w:pPr>
+      <w:r>
+        <w:rPr>
+          <w:rFonts w:ascii="Times New Roman" w:hAnsi="Times New Roman" w:cs="Times New Roman"/>
+        </w:rPr>
+        <w:t>Performed both initial and post cleaning data explorations to understand the data structure (</w:t>
+      </w:r>
+      <w:proofErr w:type="spellStart"/>
+      <w:r>
+        <w:rPr>
+          <w:rFonts w:ascii="Times New Roman" w:hAnsi="Times New Roman" w:cs="Times New Roman"/>
+        </w:rPr>
+        <w:t>eg</w:t>
+      </w:r>
+      <w:proofErr w:type="spellEnd"/>
+      <w:r>
+        <w:rPr>
+          <w:rFonts w:ascii="Times New Roman" w:hAnsi="Times New Roman" w:cs="Times New Roman"/>
+        </w:rPr>
+        <w:t>: data type), identify missing values</w:t>
+      </w:r>
+      <w:r>
+        <w:rPr>
+          <w:rFonts w:ascii="Times New Roman" w:hAnsi="Times New Roman" w:cs="Times New Roman"/>
+        </w:rPr>
+        <w:t xml:space="preserve"> and inconsistencies</w:t>
+      </w:r>
+      <w:r>
+        <w:rPr>
+          <w:rFonts w:ascii="Times New Roman" w:hAnsi="Times New Roman" w:cs="Times New Roman"/>
+        </w:rPr>
+        <w:t>.</w:t>
+      </w:r>
+    </w:p>
+    <w:p>
+      <w:pPr>
+        <w:spacing w:line="360" w:lineRule="auto"/>
+        <w:rPr>
+          <w:rFonts w:ascii="Times New Roman" w:hAnsi="Times New Roman" w:cs="Times New Roman"/>
+          <w:b/>
+          <w:bCs/>
+        </w:rPr>
+      </w:pPr>
+      <w:r>
+        <w:rPr>
+          <w:rFonts w:ascii="Times New Roman" w:hAnsi="Times New Roman" w:cs="Times New Roman"/>
+          <w:b/>
+          <w:bCs/>
+        </w:rPr>
         <w:t>Phase-</w:t>
       </w:r>
       <w:r>
@@ -1203,7 +1255,7 @@
           <w:b/>
           <w:bCs/>
         </w:rPr>
-        <w:t>2</w:t>
+        <w:t>3</w:t>
       </w:r>
       <w:r>
         <w:rPr>
@@ -1219,7 +1271,7 @@
           <w:b/>
           <w:bCs/>
         </w:rPr>
-        <w:t>Pre profiling</w:t>
+        <w:t>Data Preparation</w:t>
       </w:r>
     </w:p>
     <w:p>
@@ -1233,33 +1285,123 @@
         <w:rPr>
           <w:rFonts w:ascii="Times New Roman" w:hAnsi="Times New Roman" w:cs="Times New Roman"/>
         </w:rPr>
-        <w:t>Performed both initial and post cleaning data explorations to understand the data structure (</w:t>
+        <w:t>Cleaned and structured the dataset by handling missing values, removing duplicates and exporting a processed dataset for analysis.</w:t>
+      </w:r>
+    </w:p>
+    <w:p>
+      <w:pPr>
+        <w:spacing w:line="360" w:lineRule="auto"/>
+        <w:rPr>
+          <w:rFonts w:ascii="Times New Roman" w:hAnsi="Times New Roman" w:cs="Times New Roman"/>
+          <w:b/>
+          <w:bCs/>
+        </w:rPr>
+      </w:pPr>
+      <w:r>
+        <w:rPr>
+          <w:rFonts w:ascii="Times New Roman" w:hAnsi="Times New Roman" w:cs="Times New Roman"/>
+          <w:b/>
+          <w:bCs/>
+        </w:rPr>
+        <w:t>Phase-</w:t>
+      </w:r>
+      <w:r>
+        <w:rPr>
+          <w:rFonts w:ascii="Times New Roman" w:hAnsi="Times New Roman" w:cs="Times New Roman"/>
+          <w:b/>
+          <w:bCs/>
+        </w:rPr>
+        <w:t>4</w:t>
+      </w:r>
+      <w:r>
+        <w:rPr>
+          <w:rFonts w:ascii="Times New Roman" w:hAnsi="Times New Roman" w:cs="Times New Roman"/>
+          <w:b/>
+          <w:bCs/>
+        </w:rPr>
+        <w:t>:</w:t>
+      </w:r>
+      <w:r>
+        <w:rPr>
+          <w:rFonts w:ascii="Times New Roman" w:hAnsi="Times New Roman" w:cs="Times New Roman"/>
+          <w:b/>
+          <w:bCs/>
+        </w:rPr>
+        <w:t xml:space="preserve"> Exploratory Data Analysis (EDA)</w:t>
+      </w:r>
+    </w:p>
+    <w:p>
+      <w:pPr>
+        <w:spacing w:line="360" w:lineRule="auto"/>
+        <w:rPr>
+          <w:rFonts w:ascii="Times New Roman" w:hAnsi="Times New Roman" w:cs="Times New Roman"/>
+        </w:rPr>
+      </w:pPr>
+      <w:r>
+        <w:rPr>
+          <w:rFonts w:ascii="Times New Roman" w:hAnsi="Times New Roman" w:cs="Times New Roman"/>
+        </w:rPr>
+        <w:t xml:space="preserve">Performed data explorations to </w:t>
+      </w:r>
+      <w:r>
+        <w:rPr>
+          <w:rFonts w:ascii="Times New Roman" w:hAnsi="Times New Roman" w:cs="Times New Roman"/>
+        </w:rPr>
+        <w:t>understand the identify key patterns such as most contribution hazard type.</w:t>
+      </w:r>
+    </w:p>
+    <w:p>
+      <w:pPr>
+        <w:spacing w:line="360" w:lineRule="auto"/>
+        <w:rPr>
+          <w:rFonts w:ascii="Times New Roman" w:hAnsi="Times New Roman" w:cs="Times New Roman"/>
+          <w:b/>
+          <w:bCs/>
+        </w:rPr>
+      </w:pPr>
+      <w:r>
+        <w:rPr>
+          <w:rFonts w:ascii="Times New Roman" w:hAnsi="Times New Roman" w:cs="Times New Roman"/>
+          <w:b/>
+          <w:bCs/>
+        </w:rPr>
+        <w:t>Phase-4:</w:t>
+      </w:r>
+      <w:r>
+        <w:rPr>
+          <w:rFonts w:ascii="Times New Roman" w:hAnsi="Times New Roman" w:cs="Times New Roman"/>
+          <w:b/>
+          <w:bCs/>
+        </w:rPr>
+        <w:t xml:space="preserve"> Dashboard Development</w:t>
+      </w:r>
+    </w:p>
+    <w:p>
+      <w:pPr>
+        <w:spacing w:line="360" w:lineRule="auto"/>
+        <w:rPr>
+          <w:rFonts w:ascii="Times New Roman" w:hAnsi="Times New Roman" w:cs="Times New Roman"/>
+        </w:rPr>
+      </w:pPr>
+      <w:r>
+        <w:rPr>
+          <w:rFonts w:ascii="Times New Roman" w:hAnsi="Times New Roman" w:cs="Times New Roman"/>
+        </w:rPr>
+        <w:t xml:space="preserve">Developed an interactive dashboard using </w:t>
       </w:r>
       <w:proofErr w:type="spellStart"/>
       <w:r>
         <w:rPr>
           <w:rFonts w:ascii="Times New Roman" w:hAnsi="Times New Roman" w:cs="Times New Roman"/>
         </w:rPr>
-        <w:t>eg</w:t>
+        <w:t>Streamlit</w:t>
       </w:r>
       <w:proofErr w:type="spellEnd"/>
       <w:r>
         <w:rPr>
           <w:rFonts w:ascii="Times New Roman" w:hAnsi="Times New Roman" w:cs="Times New Roman"/>
         </w:rPr>
-        <w:t>: data type), identify missing values</w:t>
-      </w:r>
-      <w:r>
-        <w:rPr>
-          <w:rFonts w:ascii="Times New Roman" w:hAnsi="Times New Roman" w:cs="Times New Roman"/>
-        </w:rPr>
-        <w:t xml:space="preserve"> and inconsistencies</w:t>
-      </w:r>
-      <w:r>
-        <w:rPr>
-          <w:rFonts w:ascii="Times New Roman" w:hAnsi="Times New Roman" w:cs="Times New Roman"/>
-        </w:rPr>
-        <w:t>.</w:t>
+        <w:t xml:space="preserve"> with KPIs, line charts, bar charts and map visualisations to present insights.</w:t>
       </w:r>
     </w:p>
     <w:p>
@@ -1277,31 +1419,15 @@
           <w:b/>
           <w:bCs/>
         </w:rPr>
-        <w:t>Phase-</w:t>
-      </w:r>
-      <w:r>
-        <w:rPr>
-          <w:rFonts w:ascii="Times New Roman" w:hAnsi="Times New Roman" w:cs="Times New Roman"/>
-          <w:b/>
-          <w:bCs/>
-        </w:rPr>
-        <w:t>3</w:t>
-      </w:r>
-      <w:r>
-        <w:rPr>
-          <w:rFonts w:ascii="Times New Roman" w:hAnsi="Times New Roman" w:cs="Times New Roman"/>
-          <w:b/>
-          <w:bCs/>
-        </w:rPr>
-        <w:t xml:space="preserve">: </w:t>
-      </w:r>
-      <w:r>
-        <w:rPr>
-          <w:rFonts w:ascii="Times New Roman" w:hAnsi="Times New Roman" w:cs="Times New Roman"/>
-          <w:b/>
-          <w:bCs/>
-        </w:rPr>
-        <w:t>Data Preparation</w:t>
+        <w:t>Phase-5:</w:t>
+      </w:r>
+      <w:r>
+        <w:rPr>
+          <w:rFonts w:ascii="Times New Roman" w:hAnsi="Times New Roman" w:cs="Times New Roman"/>
+          <w:b/>
+          <w:bCs/>
+        </w:rPr>
+        <w:t xml:space="preserve">  Testing and Deployment</w:t>
       </w:r>
     </w:p>
     <w:p>
@@ -1315,176 +1441,21 @@
         <w:rPr>
           <w:rFonts w:ascii="Times New Roman" w:hAnsi="Times New Roman" w:cs="Times New Roman"/>
         </w:rPr>
-        <w:t>Cleaned and structured the dataset by handling missing values, removing duplicates and exporting a processed dataset for analysis.</w:t>
-      </w:r>
+        <w:t xml:space="preserve">Conducted functional testing using test cases and deployed the finalised dashboard on </w:t>
+      </w:r>
+      <w:proofErr w:type="spellStart"/>
+      <w:r>
+        <w:rPr>
+          <w:rFonts w:ascii="Times New Roman" w:hAnsi="Times New Roman" w:cs="Times New Roman"/>
+        </w:rPr>
+        <w:t>Streamlit</w:t>
+      </w:r>
+      <w:proofErr w:type="spellEnd"/>
     </w:p>
     <w:p>
       <w:pPr>
         <w:spacing w:line="360" w:lineRule="auto"/>
-        <w:rPr>
-          <w:rFonts w:ascii="Times New Roman" w:hAnsi="Times New Roman" w:cs="Times New Roman"/>
-          <w:b/>
-          <w:bCs/>
-        </w:rPr>
-      </w:pPr>
-      <w:r>
-        <w:rPr>
-          <w:rFonts w:ascii="Times New Roman" w:hAnsi="Times New Roman" w:cs="Times New Roman"/>
-          <w:b/>
-          <w:bCs/>
-        </w:rPr>
-        <w:t>Phase-</w:t>
-      </w:r>
-      <w:r>
-        <w:rPr>
-          <w:rFonts w:ascii="Times New Roman" w:hAnsi="Times New Roman" w:cs="Times New Roman"/>
-          <w:b/>
-          <w:bCs/>
-        </w:rPr>
-        <w:t>4</w:t>
-      </w:r>
-      <w:r>
-        <w:rPr>
-          <w:rFonts w:ascii="Times New Roman" w:hAnsi="Times New Roman" w:cs="Times New Roman"/>
-          <w:b/>
-          <w:bCs/>
-        </w:rPr>
-        <w:t>:</w:t>
-      </w:r>
-      <w:r>
-        <w:rPr>
-          <w:rFonts w:ascii="Times New Roman" w:hAnsi="Times New Roman" w:cs="Times New Roman"/>
-          <w:b/>
-          <w:bCs/>
-        </w:rPr>
-        <w:t xml:space="preserve"> Exploratory Data Analysis (EDA)</w:t>
-      </w:r>
-    </w:p>
-    <w:p>
-      <w:pPr>
-        <w:spacing w:line="360" w:lineRule="auto"/>
-        <w:rPr>
-          <w:rFonts w:ascii="Times New Roman" w:hAnsi="Times New Roman" w:cs="Times New Roman"/>
-        </w:rPr>
-      </w:pPr>
-      <w:r>
-        <w:rPr>
-          <w:rFonts w:ascii="Times New Roman" w:hAnsi="Times New Roman" w:cs="Times New Roman"/>
-        </w:rPr>
-        <w:t xml:space="preserve">Performed data explorations to </w:t>
-      </w:r>
-      <w:r>
-        <w:rPr>
-          <w:rFonts w:ascii="Times New Roman" w:hAnsi="Times New Roman" w:cs="Times New Roman"/>
-        </w:rPr>
-        <w:t>understand the identify key patterns such as most contribution hazard type.</w:t>
-      </w:r>
-    </w:p>
-    <w:p>
-      <w:pPr>
-        <w:spacing w:line="360" w:lineRule="auto"/>
-        <w:rPr>
-          <w:rFonts w:ascii="Times New Roman" w:hAnsi="Times New Roman" w:cs="Times New Roman"/>
-          <w:b/>
-          <w:bCs/>
-        </w:rPr>
-      </w:pPr>
-      <w:r>
-        <w:rPr>
-          <w:rFonts w:ascii="Times New Roman" w:hAnsi="Times New Roman" w:cs="Times New Roman"/>
-          <w:b/>
-          <w:bCs/>
-        </w:rPr>
-        <w:t>Phase-4:</w:t>
-      </w:r>
-      <w:r>
-        <w:rPr>
-          <w:rFonts w:ascii="Times New Roman" w:hAnsi="Times New Roman" w:cs="Times New Roman"/>
-          <w:b/>
-          <w:bCs/>
-        </w:rPr>
-        <w:t xml:space="preserve"> Dashboard Development</w:t>
-      </w:r>
-    </w:p>
-    <w:p>
-      <w:pPr>
-        <w:spacing w:line="360" w:lineRule="auto"/>
-        <w:rPr>
-          <w:rFonts w:ascii="Times New Roman" w:hAnsi="Times New Roman" w:cs="Times New Roman"/>
-        </w:rPr>
-      </w:pPr>
-      <w:r>
-        <w:rPr>
-          <w:rFonts w:ascii="Times New Roman" w:hAnsi="Times New Roman" w:cs="Times New Roman"/>
-        </w:rPr>
-        <w:t xml:space="preserve">Developed an interactive dashboard using </w:t>
-      </w:r>
-      <w:proofErr w:type="spellStart"/>
-      <w:r>
-        <w:rPr>
-          <w:rFonts w:ascii="Times New Roman" w:hAnsi="Times New Roman" w:cs="Times New Roman"/>
-        </w:rPr>
-        <w:t>Streamlit</w:t>
-      </w:r>
-      <w:proofErr w:type="spellEnd"/>
-      <w:r>
-        <w:rPr>
-          <w:rFonts w:ascii="Times New Roman" w:hAnsi="Times New Roman" w:cs="Times New Roman"/>
-        </w:rPr>
-        <w:t xml:space="preserve"> with KPIs, line charts, bar charts and map visualisations to present insights.</w:t>
-      </w:r>
-    </w:p>
-    <w:p>
-      <w:pPr>
-        <w:spacing w:line="360" w:lineRule="auto"/>
-        <w:rPr>
-          <w:rFonts w:ascii="Times New Roman" w:hAnsi="Times New Roman" w:cs="Times New Roman"/>
-          <w:b/>
-          <w:bCs/>
-        </w:rPr>
-      </w:pPr>
-      <w:r>
-        <w:rPr>
-          <w:rFonts w:ascii="Times New Roman" w:hAnsi="Times New Roman" w:cs="Times New Roman"/>
-          <w:b/>
-          <w:bCs/>
-        </w:rPr>
-        <w:t>Phase-5:</w:t>
-      </w:r>
-      <w:r>
-        <w:rPr>
-          <w:rFonts w:ascii="Times New Roman" w:hAnsi="Times New Roman" w:cs="Times New Roman"/>
-          <w:b/>
-          <w:bCs/>
-        </w:rPr>
-        <w:t xml:space="preserve">  Testing and Deployment</w:t>
-      </w:r>
-    </w:p>
-    <w:p>
-      <w:pPr>
-        <w:spacing w:line="360" w:lineRule="auto"/>
-        <w:rPr>
-          <w:rFonts w:ascii="Times New Roman" w:hAnsi="Times New Roman" w:cs="Times New Roman"/>
-        </w:rPr>
-      </w:pPr>
-      <w:r>
-        <w:rPr>
-          <w:rFonts w:ascii="Times New Roman" w:hAnsi="Times New Roman" w:cs="Times New Roman"/>
-        </w:rPr>
-        <w:t xml:space="preserve">Conducted functional testing using test cases and deployed the finalised dashboard on </w:t>
-      </w:r>
-      <w:proofErr w:type="spellStart"/>
-      <w:r>
-        <w:rPr>
-          <w:rFonts w:ascii="Times New Roman" w:hAnsi="Times New Roman" w:cs="Times New Roman"/>
-        </w:rPr>
-        <w:t>Streamlit</w:t>
-      </w:r>
-      <w:proofErr w:type="spellEnd"/>
-    </w:p>
-    <w:p>
-      <w:pPr>
-        <w:spacing w:line="360" w:lineRule="auto"/>
+        <w:jc w:val="center"/>
         <w:rPr>
           <w:rFonts w:ascii="Times New Roman" w:hAnsi="Times New Roman" w:cs="Times New Roman"/>
         </w:rPr>
@@ -1867,7 +1838,2854 @@
     </w:tbl>
     <w:p>
       <w:pPr>
-        <w:spacing w:line="360" w:lineRule="auto"/>
+        <w:keepNext/>
+        <w:keepLines/>
+        <w:spacing w:before="360" w:after="80" w:line="360" w:lineRule="auto"/>
+        <w:outlineLvl w:val="0"/>
+        <w:rPr>
+          <w:rFonts w:ascii="Times New Roman" w:eastAsia="Times New Roman" w:hAnsi="Times New Roman" w:cs="Times New Roman"/>
+          <w:b/>
+          <w:bCs/>
+          <w:color w:val="0F4761"/>
+          <w:sz w:val="40"/>
+          <w:szCs w:val="40"/>
+        </w:rPr>
+      </w:pPr>
+    </w:p>
+    <w:p>
+      <w:pPr>
+        <w:spacing w:before="360" w:after="80" w:line="240" w:lineRule="auto"/>
+        <w:outlineLvl w:val="0"/>
+        <w:rPr>
+          <w:rFonts w:ascii="Times New Roman" w:eastAsia="Times New Roman" w:hAnsi="Times New Roman" w:cs="Times New Roman"/>
+          <w:b/>
+          <w:bCs/>
+          <w:color w:val="0F4761"/>
+          <w:sz w:val="40"/>
+          <w:szCs w:val="40"/>
+        </w:rPr>
+      </w:pPr>
+    </w:p>
+    <w:p>
+      <w:pPr>
+        <w:spacing w:before="360" w:after="80" w:line="240" w:lineRule="auto"/>
+        <w:outlineLvl w:val="0"/>
+        <w:rPr>
+          <w:rFonts w:ascii="Times New Roman" w:eastAsia="Times New Roman" w:hAnsi="Times New Roman" w:cs="Times New Roman"/>
+          <w:b/>
+          <w:bCs/>
+          <w:color w:val="0F4761"/>
+          <w:sz w:val="40"/>
+          <w:szCs w:val="40"/>
+        </w:rPr>
+      </w:pPr>
+    </w:p>
+    <w:p>
+      <w:pPr>
+        <w:spacing w:before="360" w:after="80" w:line="240" w:lineRule="auto"/>
+        <w:outlineLvl w:val="0"/>
+        <w:rPr>
+          <w:rFonts w:ascii="Times New Roman" w:eastAsia="Times New Roman" w:hAnsi="Times New Roman" w:cs="Times New Roman"/>
+          <w:b/>
+          <w:bCs/>
+          <w:color w:val="0F4761"/>
+          <w:sz w:val="40"/>
+          <w:szCs w:val="40"/>
+        </w:rPr>
+      </w:pPr>
+    </w:p>
+    <w:p>
+      <w:pPr>
+        <w:spacing w:before="360" w:after="80" w:line="240" w:lineRule="auto"/>
+        <w:outlineLvl w:val="0"/>
+        <w:rPr>
+          <w:rFonts w:ascii="Times New Roman" w:eastAsia="Times New Roman" w:hAnsi="Times New Roman" w:cs="Times New Roman"/>
+          <w:b/>
+          <w:bCs/>
+          <w:color w:val="0F4761"/>
+          <w:sz w:val="40"/>
+          <w:szCs w:val="40"/>
+        </w:rPr>
+      </w:pPr>
+    </w:p>
+    <w:p>
+      <w:pPr>
+        <w:spacing w:before="360" w:after="80" w:line="240" w:lineRule="auto"/>
+        <w:outlineLvl w:val="0"/>
+        <w:rPr>
+          <w:rFonts w:ascii="Times New Roman" w:eastAsia="Times New Roman" w:hAnsi="Times New Roman" w:cs="Times New Roman"/>
+          <w:b/>
+          <w:bCs/>
+          <w:color w:val="0F4761"/>
+          <w:sz w:val="40"/>
+          <w:szCs w:val="40"/>
+        </w:rPr>
+      </w:pPr>
+    </w:p>
+    <w:p>
+      <w:pPr>
+        <w:spacing w:before="360" w:after="80" w:line="240" w:lineRule="auto"/>
+        <w:outlineLvl w:val="0"/>
+        <w:rPr>
+          <w:rFonts w:ascii="Times New Roman" w:eastAsia="Times New Roman" w:hAnsi="Times New Roman" w:cs="Times New Roman"/>
+          <w:b/>
+          <w:bCs/>
+          <w:color w:val="0F4761"/>
+          <w:sz w:val="40"/>
+          <w:szCs w:val="40"/>
+        </w:rPr>
+      </w:pPr>
+    </w:p>
+    <w:p>
+      <w:pPr>
+        <w:spacing w:before="360" w:after="80" w:line="240" w:lineRule="auto"/>
+        <w:outlineLvl w:val="0"/>
+        <w:rPr>
+          <w:rFonts w:ascii="Times New Roman" w:eastAsia="Times New Roman" w:hAnsi="Times New Roman" w:cs="Times New Roman"/>
+          <w:b/>
+          <w:bCs/>
+          <w:color w:val="0F4761"/>
+          <w:sz w:val="40"/>
+          <w:szCs w:val="40"/>
+        </w:rPr>
+      </w:pPr>
+    </w:p>
+    <w:p>
+      <w:pPr>
+        <w:spacing w:before="360" w:after="80" w:line="240" w:lineRule="auto"/>
+        <w:outlineLvl w:val="0"/>
+        <w:rPr>
+          <w:rFonts w:ascii="Times New Roman" w:eastAsia="Times New Roman" w:hAnsi="Times New Roman" w:cs="Times New Roman"/>
+          <w:b/>
+          <w:bCs/>
+          <w:color w:val="0F4761"/>
+          <w:sz w:val="40"/>
+          <w:szCs w:val="40"/>
+        </w:rPr>
+      </w:pPr>
+      <w:r>
+        <w:rPr>
+          <w:rFonts w:ascii="Times New Roman" w:eastAsia="Times New Roman" w:hAnsi="Times New Roman" w:cs="Times New Roman"/>
+          <w:b/>
+          <w:bCs/>
+          <w:color w:val="0F4761"/>
+          <w:sz w:val="40"/>
+          <w:szCs w:val="40"/>
+        </w:rPr>
+        <w:lastRenderedPageBreak/>
+        <w:t>Test cases</w:t>
+      </w:r>
+    </w:p>
+    <w:tbl>
+      <w:tblPr>
+        <w:tblStyle w:val="TableGrid"/>
+        <w:tblW w:w="9024" w:type="dxa"/>
+        <w:tblLook w:val="04A0" w:firstRow="1" w:lastRow="0" w:firstColumn="1" w:lastColumn="0" w:noHBand="0" w:noVBand="1"/>
+      </w:tblPr>
+      <w:tblGrid>
+        <w:gridCol w:w="576"/>
+        <w:gridCol w:w="987"/>
+        <w:gridCol w:w="459"/>
+        <w:gridCol w:w="2509"/>
+        <w:gridCol w:w="4493"/>
+      </w:tblGrid>
+      <w:tr>
+        <w:tc>
+          <w:tcPr>
+            <w:tcW w:w="576" w:type="dxa"/>
+            <w:vAlign w:val="center"/>
+          </w:tcPr>
+          <w:p>
+            <w:pPr>
+              <w:jc w:val="left"/>
+              <w:rPr>
+                <w:rFonts w:ascii="Times New Roman" w:eastAsia="Aptos" w:hAnsi="Times New Roman" w:cs="Times New Roman"/>
+                <w:b/>
+                <w:bCs/>
+              </w:rPr>
+            </w:pPr>
+            <w:r>
+              <w:rPr>
+                <w:rFonts w:ascii="Times New Roman" w:eastAsia="Aptos" w:hAnsi="Times New Roman" w:cs="Times New Roman"/>
+                <w:b/>
+                <w:bCs/>
+              </w:rPr>
+              <w:t>#01</w:t>
+            </w:r>
+          </w:p>
+        </w:tc>
+        <w:tc>
+          <w:tcPr>
+            <w:tcW w:w="987" w:type="dxa"/>
+            <w:vAlign w:val="center"/>
+          </w:tcPr>
+          <w:p>
+            <w:pPr>
+              <w:jc w:val="left"/>
+              <w:rPr>
+                <w:rFonts w:ascii="Times New Roman" w:eastAsia="Aptos" w:hAnsi="Times New Roman" w:cs="Times New Roman"/>
+                <w:b/>
+                <w:bCs/>
+              </w:rPr>
+            </w:pPr>
+            <w:r>
+              <w:rPr>
+                <w:rFonts w:ascii="Times New Roman" w:eastAsia="Aptos" w:hAnsi="Times New Roman" w:cs="Times New Roman"/>
+                <w:b/>
+                <w:bCs/>
+              </w:rPr>
+              <w:t>TC1</w:t>
+            </w:r>
+          </w:p>
+        </w:tc>
+        <w:tc>
+          <w:tcPr>
+            <w:tcW w:w="2968" w:type="dxa"/>
+            <w:gridSpan w:val="2"/>
+            <w:vAlign w:val="center"/>
+          </w:tcPr>
+          <w:p>
+            <w:pPr>
+              <w:jc w:val="left"/>
+              <w:rPr>
+                <w:rFonts w:ascii="Times New Roman" w:eastAsia="Aptos" w:hAnsi="Times New Roman" w:cs="Times New Roman"/>
+                <w:b/>
+                <w:bCs/>
+              </w:rPr>
+            </w:pPr>
+            <w:r>
+              <w:rPr>
+                <w:rFonts w:ascii="Times New Roman" w:eastAsia="Aptos" w:hAnsi="Times New Roman" w:cs="Times New Roman"/>
+                <w:b/>
+                <w:bCs/>
+              </w:rPr>
+              <w:t>Title:</w:t>
+            </w:r>
+            <w:r>
+              <w:rPr>
+                <w:rFonts w:ascii="Times New Roman" w:eastAsia="Aptos" w:hAnsi="Times New Roman" w:cs="Times New Roman"/>
+              </w:rPr>
+              <w:t xml:space="preserve"> Global Data Filtering</w:t>
+            </w:r>
+          </w:p>
+        </w:tc>
+        <w:tc>
+          <w:tcPr>
+            <w:tcW w:w="4493" w:type="dxa"/>
+            <w:vAlign w:val="center"/>
+          </w:tcPr>
+          <w:p>
+            <w:pPr>
+              <w:jc w:val="left"/>
+              <w:rPr>
+                <w:rFonts w:ascii="Times New Roman" w:eastAsia="Aptos" w:hAnsi="Times New Roman" w:cs="Times New Roman"/>
+                <w:b/>
+                <w:bCs/>
+              </w:rPr>
+            </w:pPr>
+            <w:r>
+              <w:rPr>
+                <w:rFonts w:ascii="Times New Roman" w:eastAsia="Aptos" w:hAnsi="Times New Roman" w:cs="Times New Roman"/>
+                <w:b/>
+                <w:bCs/>
+              </w:rPr>
+              <w:t xml:space="preserve">Test case Title: </w:t>
+            </w:r>
+            <w:r>
+              <w:rPr>
+                <w:rFonts w:ascii="Times New Roman" w:eastAsia="Aptos" w:hAnsi="Times New Roman" w:cs="Times New Roman"/>
+              </w:rPr>
+              <w:t>Global Data Filtering</w:t>
+            </w:r>
+          </w:p>
+        </w:tc>
+      </w:tr>
+      <w:tr>
+        <w:tc>
+          <w:tcPr>
+            <w:tcW w:w="2022" w:type="dxa"/>
+            <w:gridSpan w:val="3"/>
+            <w:vAlign w:val="center"/>
+          </w:tcPr>
+          <w:p>
+            <w:pPr>
+              <w:jc w:val="left"/>
+              <w:rPr>
+                <w:rFonts w:ascii="Times New Roman" w:eastAsia="Aptos" w:hAnsi="Times New Roman" w:cs="Times New Roman"/>
+                <w:b/>
+                <w:bCs/>
+              </w:rPr>
+            </w:pPr>
+            <w:r>
+              <w:rPr>
+                <w:rFonts w:ascii="Times New Roman" w:eastAsia="Aptos" w:hAnsi="Times New Roman" w:cs="Times New Roman"/>
+                <w:b/>
+                <w:bCs/>
+              </w:rPr>
+              <w:t>Description</w:t>
+            </w:r>
+          </w:p>
+        </w:tc>
+        <w:tc>
+          <w:tcPr>
+            <w:tcW w:w="7002" w:type="dxa"/>
+            <w:gridSpan w:val="2"/>
+            <w:vAlign w:val="center"/>
+          </w:tcPr>
+          <w:p>
+            <w:pPr>
+              <w:jc w:val="left"/>
+              <w:rPr>
+                <w:rFonts w:ascii="Times New Roman" w:eastAsia="Aptos" w:hAnsi="Times New Roman" w:cs="Times New Roman"/>
+              </w:rPr>
+            </w:pPr>
+            <w:r>
+              <w:rPr>
+                <w:rFonts w:ascii="Times New Roman" w:eastAsia="Aptos" w:hAnsi="Times New Roman" w:cs="Times New Roman"/>
+              </w:rPr>
+              <w:t>Changing the year slider to a specific range to ensure all visuals adjust accordingly</w:t>
+            </w:r>
+          </w:p>
+        </w:tc>
+      </w:tr>
+      <w:tr>
+        <w:tc>
+          <w:tcPr>
+            <w:tcW w:w="2022" w:type="dxa"/>
+            <w:gridSpan w:val="3"/>
+            <w:vAlign w:val="center"/>
+          </w:tcPr>
+          <w:p>
+            <w:pPr>
+              <w:jc w:val="left"/>
+              <w:rPr>
+                <w:rFonts w:ascii="Times New Roman" w:eastAsia="Aptos" w:hAnsi="Times New Roman" w:cs="Times New Roman"/>
+                <w:b/>
+                <w:bCs/>
+              </w:rPr>
+            </w:pPr>
+            <w:r>
+              <w:rPr>
+                <w:rFonts w:ascii="Times New Roman" w:eastAsia="Aptos" w:hAnsi="Times New Roman" w:cs="Times New Roman"/>
+                <w:b/>
+                <w:bCs/>
+              </w:rPr>
+              <w:t>Steps and input data</w:t>
+            </w:r>
+          </w:p>
+        </w:tc>
+        <w:tc>
+          <w:tcPr>
+            <w:tcW w:w="7002" w:type="dxa"/>
+            <w:gridSpan w:val="2"/>
+            <w:vAlign w:val="center"/>
+          </w:tcPr>
+          <w:p>
+            <w:pPr>
+              <w:jc w:val="left"/>
+              <w:rPr>
+                <w:rFonts w:ascii="Times New Roman" w:eastAsia="Aptos" w:hAnsi="Times New Roman" w:cs="Times New Roman"/>
+              </w:rPr>
+            </w:pPr>
+            <w:r>
+              <w:rPr>
+                <w:rFonts w:ascii="Times New Roman" w:eastAsia="Aptos" w:hAnsi="Times New Roman" w:cs="Times New Roman"/>
+              </w:rPr>
+              <w:t>Locate the ‘Years’ slider on the left-hand side of the dashboard</w:t>
+            </w:r>
+          </w:p>
+          <w:p>
+            <w:pPr>
+              <w:jc w:val="left"/>
+              <w:rPr>
+                <w:rFonts w:ascii="Times New Roman" w:eastAsia="Aptos" w:hAnsi="Times New Roman" w:cs="Times New Roman"/>
+              </w:rPr>
+            </w:pPr>
+            <w:r>
+              <w:rPr>
+                <w:rFonts w:ascii="Times New Roman" w:eastAsia="Aptos" w:hAnsi="Times New Roman" w:cs="Times New Roman"/>
+              </w:rPr>
+              <w:t>Drag the lower bound to 2014 and upper bound to 2020</w:t>
+            </w:r>
+          </w:p>
+          <w:p>
+            <w:pPr>
+              <w:jc w:val="left"/>
+              <w:rPr>
+                <w:rFonts w:ascii="Times New Roman" w:eastAsia="Aptos" w:hAnsi="Times New Roman" w:cs="Times New Roman"/>
+              </w:rPr>
+            </w:pPr>
+            <w:r>
+              <w:rPr>
+                <w:rFonts w:ascii="Times New Roman" w:eastAsia="Aptos" w:hAnsi="Times New Roman" w:cs="Times New Roman"/>
+              </w:rPr>
+              <w:t>Observe the KPI and visuals</w:t>
+            </w:r>
+          </w:p>
+        </w:tc>
+      </w:tr>
+      <w:tr>
+        <w:tc>
+          <w:tcPr>
+            <w:tcW w:w="2022" w:type="dxa"/>
+            <w:gridSpan w:val="3"/>
+            <w:vAlign w:val="center"/>
+          </w:tcPr>
+          <w:p>
+            <w:pPr>
+              <w:jc w:val="left"/>
+              <w:rPr>
+                <w:rFonts w:ascii="Times New Roman" w:eastAsia="Aptos" w:hAnsi="Times New Roman" w:cs="Times New Roman"/>
+                <w:b/>
+                <w:bCs/>
+              </w:rPr>
+            </w:pPr>
+            <w:r>
+              <w:rPr>
+                <w:rFonts w:ascii="Times New Roman" w:eastAsia="Aptos" w:hAnsi="Times New Roman" w:cs="Times New Roman"/>
+                <w:b/>
+                <w:bCs/>
+              </w:rPr>
+              <w:t>Dependencies</w:t>
+            </w:r>
+          </w:p>
+        </w:tc>
+        <w:tc>
+          <w:tcPr>
+            <w:tcW w:w="7002" w:type="dxa"/>
+            <w:gridSpan w:val="2"/>
+            <w:vAlign w:val="center"/>
+          </w:tcPr>
+          <w:p>
+            <w:pPr>
+              <w:jc w:val="left"/>
+              <w:rPr>
+                <w:rFonts w:ascii="Times New Roman" w:eastAsia="Aptos" w:hAnsi="Times New Roman" w:cs="Times New Roman"/>
+              </w:rPr>
+            </w:pPr>
+            <w:r>
+              <w:rPr>
+                <w:rFonts w:ascii="Times New Roman" w:eastAsia="Aptos" w:hAnsi="Times New Roman" w:cs="Times New Roman"/>
+              </w:rPr>
+              <w:t>Cleaned dataset must be loaded</w:t>
+            </w:r>
+          </w:p>
+          <w:p>
+            <w:pPr>
+              <w:jc w:val="left"/>
+              <w:rPr>
+                <w:rFonts w:ascii="Times New Roman" w:eastAsia="Aptos" w:hAnsi="Times New Roman" w:cs="Times New Roman"/>
+              </w:rPr>
+            </w:pPr>
+            <w:proofErr w:type="spellStart"/>
+            <w:r>
+              <w:rPr>
+                <w:rFonts w:ascii="Times New Roman" w:eastAsia="Aptos" w:hAnsi="Times New Roman" w:cs="Times New Roman"/>
+              </w:rPr>
+              <w:t>Streamlit</w:t>
+            </w:r>
+            <w:proofErr w:type="spellEnd"/>
+            <w:r>
+              <w:rPr>
+                <w:rFonts w:ascii="Times New Roman" w:eastAsia="Aptos" w:hAnsi="Times New Roman" w:cs="Times New Roman"/>
+              </w:rPr>
+              <w:t xml:space="preserve"> sidebar must be functional</w:t>
+            </w:r>
+          </w:p>
+        </w:tc>
+      </w:tr>
+      <w:tr>
+        <w:tc>
+          <w:tcPr>
+            <w:tcW w:w="2022" w:type="dxa"/>
+            <w:gridSpan w:val="3"/>
+            <w:vAlign w:val="center"/>
+          </w:tcPr>
+          <w:p>
+            <w:pPr>
+              <w:jc w:val="left"/>
+              <w:rPr>
+                <w:rFonts w:ascii="Times New Roman" w:eastAsia="Aptos" w:hAnsi="Times New Roman" w:cs="Times New Roman"/>
+                <w:b/>
+                <w:bCs/>
+              </w:rPr>
+            </w:pPr>
+            <w:r>
+              <w:rPr>
+                <w:rFonts w:ascii="Times New Roman" w:eastAsia="Aptos" w:hAnsi="Times New Roman" w:cs="Times New Roman"/>
+                <w:b/>
+                <w:bCs/>
+              </w:rPr>
+              <w:t>Expected result</w:t>
+            </w:r>
+          </w:p>
+        </w:tc>
+        <w:tc>
+          <w:tcPr>
+            <w:tcW w:w="7002" w:type="dxa"/>
+            <w:gridSpan w:val="2"/>
+            <w:vAlign w:val="center"/>
+          </w:tcPr>
+          <w:p>
+            <w:pPr>
+              <w:jc w:val="left"/>
+              <w:rPr>
+                <w:rFonts w:ascii="Times New Roman" w:eastAsia="Aptos" w:hAnsi="Times New Roman" w:cs="Times New Roman"/>
+              </w:rPr>
+            </w:pPr>
+            <w:r>
+              <w:rPr>
+                <w:rFonts w:ascii="Times New Roman" w:eastAsia="Aptos" w:hAnsi="Times New Roman" w:cs="Times New Roman"/>
+              </w:rPr>
+              <w:t>The total displaced KPI must reflect the sum for 2014-2020</w:t>
+            </w:r>
+          </w:p>
+          <w:p>
+            <w:pPr>
+              <w:jc w:val="left"/>
+              <w:rPr>
+                <w:rFonts w:ascii="Times New Roman" w:eastAsia="Aptos" w:hAnsi="Times New Roman" w:cs="Times New Roman"/>
+              </w:rPr>
+            </w:pPr>
+            <w:r>
+              <w:rPr>
+                <w:rFonts w:ascii="Times New Roman" w:eastAsia="Aptos" w:hAnsi="Times New Roman" w:cs="Times New Roman"/>
+              </w:rPr>
+              <w:t>The x axis of the line chart must display years from 2014 – 2020</w:t>
+            </w:r>
+          </w:p>
+          <w:p>
+            <w:pPr>
+              <w:jc w:val="left"/>
+              <w:rPr>
+                <w:rFonts w:ascii="Times New Roman" w:eastAsia="Aptos" w:hAnsi="Times New Roman" w:cs="Times New Roman"/>
+                <w:b/>
+                <w:bCs/>
+              </w:rPr>
+            </w:pPr>
+            <w:r>
+              <w:rPr>
+                <w:rFonts w:ascii="Times New Roman" w:eastAsia="Aptos" w:hAnsi="Times New Roman" w:cs="Times New Roman"/>
+              </w:rPr>
+              <w:t>No data point should be visible from 2008-2013 and 2021-2024</w:t>
+            </w:r>
+          </w:p>
+        </w:tc>
+      </w:tr>
+    </w:tbl>
+    <w:p>
+      <w:pPr>
+        <w:spacing w:line="240" w:lineRule="auto"/>
+        <w:rPr>
+          <w:rFonts w:ascii="Times New Roman" w:eastAsia="Aptos" w:hAnsi="Times New Roman" w:cs="Times New Roman"/>
+          <w:b/>
+          <w:bCs/>
+        </w:rPr>
+      </w:pPr>
+    </w:p>
+    <w:tbl>
+      <w:tblPr>
+        <w:tblStyle w:val="TableGrid"/>
+        <w:tblW w:w="9024" w:type="dxa"/>
+        <w:tblLook w:val="04A0" w:firstRow="1" w:lastRow="0" w:firstColumn="1" w:lastColumn="0" w:noHBand="0" w:noVBand="1"/>
+      </w:tblPr>
+      <w:tblGrid>
+        <w:gridCol w:w="576"/>
+        <w:gridCol w:w="987"/>
+        <w:gridCol w:w="459"/>
+        <w:gridCol w:w="2509"/>
+        <w:gridCol w:w="4493"/>
+      </w:tblGrid>
+      <w:tr>
+        <w:tc>
+          <w:tcPr>
+            <w:tcW w:w="576" w:type="dxa"/>
+            <w:vAlign w:val="center"/>
+          </w:tcPr>
+          <w:p>
+            <w:pPr>
+              <w:jc w:val="left"/>
+              <w:rPr>
+                <w:rFonts w:ascii="Times New Roman" w:eastAsia="Aptos" w:hAnsi="Times New Roman" w:cs="Times New Roman"/>
+                <w:b/>
+                <w:bCs/>
+              </w:rPr>
+            </w:pPr>
+            <w:r>
+              <w:rPr>
+                <w:rFonts w:ascii="Times New Roman" w:eastAsia="Aptos" w:hAnsi="Times New Roman" w:cs="Times New Roman"/>
+                <w:b/>
+                <w:bCs/>
+              </w:rPr>
+              <w:t>#02</w:t>
+            </w:r>
+          </w:p>
+        </w:tc>
+        <w:tc>
+          <w:tcPr>
+            <w:tcW w:w="987" w:type="dxa"/>
+            <w:vAlign w:val="center"/>
+          </w:tcPr>
+          <w:p>
+            <w:pPr>
+              <w:jc w:val="left"/>
+              <w:rPr>
+                <w:rFonts w:ascii="Times New Roman" w:eastAsia="Aptos" w:hAnsi="Times New Roman" w:cs="Times New Roman"/>
+                <w:b/>
+                <w:bCs/>
+              </w:rPr>
+            </w:pPr>
+            <w:r>
+              <w:rPr>
+                <w:rFonts w:ascii="Times New Roman" w:eastAsia="Aptos" w:hAnsi="Times New Roman" w:cs="Times New Roman"/>
+                <w:b/>
+                <w:bCs/>
+              </w:rPr>
+              <w:t>TC2</w:t>
+            </w:r>
+          </w:p>
+        </w:tc>
+        <w:tc>
+          <w:tcPr>
+            <w:tcW w:w="2968" w:type="dxa"/>
+            <w:gridSpan w:val="2"/>
+            <w:vAlign w:val="center"/>
+          </w:tcPr>
+          <w:p>
+            <w:pPr>
+              <w:jc w:val="left"/>
+              <w:rPr>
+                <w:rFonts w:ascii="Times New Roman" w:eastAsia="Aptos" w:hAnsi="Times New Roman" w:cs="Times New Roman"/>
+                <w:b/>
+                <w:bCs/>
+              </w:rPr>
+            </w:pPr>
+            <w:r>
+              <w:rPr>
+                <w:rFonts w:ascii="Times New Roman" w:eastAsia="Aptos" w:hAnsi="Times New Roman" w:cs="Times New Roman"/>
+                <w:b/>
+                <w:bCs/>
+              </w:rPr>
+              <w:t>Title:</w:t>
+            </w:r>
+            <w:r>
+              <w:rPr>
+                <w:rFonts w:ascii="Times New Roman" w:eastAsia="Aptos" w:hAnsi="Times New Roman" w:cs="Times New Roman"/>
+              </w:rPr>
+              <w:t xml:space="preserve"> Categorical Filtering</w:t>
+            </w:r>
+          </w:p>
+        </w:tc>
+        <w:tc>
+          <w:tcPr>
+            <w:tcW w:w="4493" w:type="dxa"/>
+            <w:vAlign w:val="center"/>
+          </w:tcPr>
+          <w:p>
+            <w:pPr>
+              <w:jc w:val="left"/>
+              <w:rPr>
+                <w:rFonts w:ascii="Times New Roman" w:eastAsia="Aptos" w:hAnsi="Times New Roman" w:cs="Times New Roman"/>
+                <w:b/>
+                <w:bCs/>
+              </w:rPr>
+            </w:pPr>
+            <w:r>
+              <w:rPr>
+                <w:rFonts w:ascii="Times New Roman" w:eastAsia="Aptos" w:hAnsi="Times New Roman" w:cs="Times New Roman"/>
+                <w:b/>
+                <w:bCs/>
+              </w:rPr>
+              <w:t xml:space="preserve">Test case Title: </w:t>
+            </w:r>
+            <w:r>
+              <w:rPr>
+                <w:rFonts w:ascii="Times New Roman" w:eastAsia="Aptos" w:hAnsi="Times New Roman" w:cs="Times New Roman"/>
+              </w:rPr>
+              <w:t>Hazard Type filtering</w:t>
+            </w:r>
+          </w:p>
+        </w:tc>
+      </w:tr>
+      <w:tr>
+        <w:tc>
+          <w:tcPr>
+            <w:tcW w:w="2022" w:type="dxa"/>
+            <w:gridSpan w:val="3"/>
+            <w:vAlign w:val="center"/>
+          </w:tcPr>
+          <w:p>
+            <w:pPr>
+              <w:jc w:val="left"/>
+              <w:rPr>
+                <w:rFonts w:ascii="Times New Roman" w:eastAsia="Aptos" w:hAnsi="Times New Roman" w:cs="Times New Roman"/>
+                <w:b/>
+                <w:bCs/>
+              </w:rPr>
+            </w:pPr>
+            <w:r>
+              <w:rPr>
+                <w:rFonts w:ascii="Times New Roman" w:eastAsia="Aptos" w:hAnsi="Times New Roman" w:cs="Times New Roman"/>
+                <w:b/>
+                <w:bCs/>
+              </w:rPr>
+              <w:t>Description</w:t>
+            </w:r>
+          </w:p>
+        </w:tc>
+        <w:tc>
+          <w:tcPr>
+            <w:tcW w:w="7002" w:type="dxa"/>
+            <w:gridSpan w:val="2"/>
+            <w:vAlign w:val="center"/>
+          </w:tcPr>
+          <w:p>
+            <w:pPr>
+              <w:jc w:val="left"/>
+              <w:rPr>
+                <w:rFonts w:ascii="Times New Roman" w:eastAsia="Aptos" w:hAnsi="Times New Roman" w:cs="Times New Roman"/>
+              </w:rPr>
+            </w:pPr>
+            <w:r>
+              <w:rPr>
+                <w:rFonts w:ascii="Times New Roman" w:eastAsia="Aptos" w:hAnsi="Times New Roman" w:cs="Times New Roman"/>
+              </w:rPr>
+              <w:t>Deselecting all hazard type and selecting on only ‘flood’ to analyse that specific hazard type</w:t>
+            </w:r>
+          </w:p>
+        </w:tc>
+      </w:tr>
+      <w:tr>
+        <w:tc>
+          <w:tcPr>
+            <w:tcW w:w="2022" w:type="dxa"/>
+            <w:gridSpan w:val="3"/>
+            <w:vAlign w:val="center"/>
+          </w:tcPr>
+          <w:p>
+            <w:pPr>
+              <w:jc w:val="left"/>
+              <w:rPr>
+                <w:rFonts w:ascii="Times New Roman" w:eastAsia="Aptos" w:hAnsi="Times New Roman" w:cs="Times New Roman"/>
+                <w:b/>
+                <w:bCs/>
+              </w:rPr>
+            </w:pPr>
+            <w:r>
+              <w:rPr>
+                <w:rFonts w:ascii="Times New Roman" w:eastAsia="Aptos" w:hAnsi="Times New Roman" w:cs="Times New Roman"/>
+                <w:b/>
+                <w:bCs/>
+              </w:rPr>
+              <w:t>Steps and input data</w:t>
+            </w:r>
+          </w:p>
+        </w:tc>
+        <w:tc>
+          <w:tcPr>
+            <w:tcW w:w="7002" w:type="dxa"/>
+            <w:gridSpan w:val="2"/>
+            <w:vAlign w:val="center"/>
+          </w:tcPr>
+          <w:p>
+            <w:pPr>
+              <w:jc w:val="left"/>
+              <w:rPr>
+                <w:rFonts w:ascii="Times New Roman" w:eastAsia="Aptos" w:hAnsi="Times New Roman" w:cs="Times New Roman"/>
+              </w:rPr>
+            </w:pPr>
+            <w:r>
+              <w:rPr>
+                <w:rFonts w:ascii="Times New Roman" w:eastAsia="Aptos" w:hAnsi="Times New Roman" w:cs="Times New Roman"/>
+              </w:rPr>
+              <w:t>Locate the ‘Hazard Type’ multi selector on the left-hand side of the dashboard</w:t>
+            </w:r>
+          </w:p>
+          <w:p>
+            <w:pPr>
+              <w:jc w:val="left"/>
+              <w:rPr>
+                <w:rFonts w:ascii="Times New Roman" w:eastAsia="Aptos" w:hAnsi="Times New Roman" w:cs="Times New Roman"/>
+              </w:rPr>
+            </w:pPr>
+            <w:r>
+              <w:rPr>
+                <w:rFonts w:ascii="Times New Roman" w:eastAsia="Aptos" w:hAnsi="Times New Roman" w:cs="Times New Roman"/>
+              </w:rPr>
+              <w:t>Deselect all the hazard types</w:t>
+            </w:r>
+          </w:p>
+          <w:p>
+            <w:pPr>
+              <w:jc w:val="left"/>
+              <w:rPr>
+                <w:rFonts w:ascii="Times New Roman" w:eastAsia="Aptos" w:hAnsi="Times New Roman" w:cs="Times New Roman"/>
+              </w:rPr>
+            </w:pPr>
+            <w:r>
+              <w:rPr>
+                <w:rFonts w:ascii="Times New Roman" w:eastAsia="Aptos" w:hAnsi="Times New Roman" w:cs="Times New Roman"/>
+              </w:rPr>
+              <w:t>Choose only ‘flood’ as hazard type</w:t>
+            </w:r>
+          </w:p>
+          <w:p>
+            <w:pPr>
+              <w:jc w:val="left"/>
+              <w:rPr>
+                <w:rFonts w:ascii="Times New Roman" w:eastAsia="Aptos" w:hAnsi="Times New Roman" w:cs="Times New Roman"/>
+              </w:rPr>
+            </w:pPr>
+            <w:r>
+              <w:rPr>
+                <w:rFonts w:ascii="Times New Roman" w:eastAsia="Aptos" w:hAnsi="Times New Roman" w:cs="Times New Roman"/>
+              </w:rPr>
+              <w:t>Observe the KPI and visuals</w:t>
+            </w:r>
+          </w:p>
+        </w:tc>
+      </w:tr>
+      <w:tr>
+        <w:tc>
+          <w:tcPr>
+            <w:tcW w:w="2022" w:type="dxa"/>
+            <w:gridSpan w:val="3"/>
+            <w:vAlign w:val="center"/>
+          </w:tcPr>
+          <w:p>
+            <w:pPr>
+              <w:jc w:val="left"/>
+              <w:rPr>
+                <w:rFonts w:ascii="Times New Roman" w:eastAsia="Aptos" w:hAnsi="Times New Roman" w:cs="Times New Roman"/>
+                <w:b/>
+                <w:bCs/>
+              </w:rPr>
+            </w:pPr>
+            <w:r>
+              <w:rPr>
+                <w:rFonts w:ascii="Times New Roman" w:eastAsia="Aptos" w:hAnsi="Times New Roman" w:cs="Times New Roman"/>
+                <w:b/>
+                <w:bCs/>
+              </w:rPr>
+              <w:t>Dependencies</w:t>
+            </w:r>
+          </w:p>
+        </w:tc>
+        <w:tc>
+          <w:tcPr>
+            <w:tcW w:w="7002" w:type="dxa"/>
+            <w:gridSpan w:val="2"/>
+            <w:vAlign w:val="center"/>
+          </w:tcPr>
+          <w:p>
+            <w:pPr>
+              <w:jc w:val="left"/>
+              <w:rPr>
+                <w:rFonts w:ascii="Times New Roman" w:eastAsia="Aptos" w:hAnsi="Times New Roman" w:cs="Times New Roman"/>
+              </w:rPr>
+            </w:pPr>
+            <w:r>
+              <w:rPr>
+                <w:rFonts w:ascii="Times New Roman" w:eastAsia="Aptos" w:hAnsi="Times New Roman" w:cs="Times New Roman"/>
+              </w:rPr>
+              <w:t>Cleaned dataset must be loaded</w:t>
+            </w:r>
+          </w:p>
+          <w:p>
+            <w:pPr>
+              <w:jc w:val="left"/>
+              <w:rPr>
+                <w:rFonts w:ascii="Times New Roman" w:eastAsia="Aptos" w:hAnsi="Times New Roman" w:cs="Times New Roman"/>
+              </w:rPr>
+            </w:pPr>
+            <w:proofErr w:type="spellStart"/>
+            <w:r>
+              <w:rPr>
+                <w:rFonts w:ascii="Times New Roman" w:eastAsia="Aptos" w:hAnsi="Times New Roman" w:cs="Times New Roman"/>
+              </w:rPr>
+              <w:t>Streamlit</w:t>
+            </w:r>
+            <w:proofErr w:type="spellEnd"/>
+            <w:r>
+              <w:rPr>
+                <w:rFonts w:ascii="Times New Roman" w:eastAsia="Aptos" w:hAnsi="Times New Roman" w:cs="Times New Roman"/>
+              </w:rPr>
+              <w:t xml:space="preserve"> sidebar must be functional</w:t>
+            </w:r>
+          </w:p>
+        </w:tc>
+      </w:tr>
+      <w:tr>
+        <w:tc>
+          <w:tcPr>
+            <w:tcW w:w="2022" w:type="dxa"/>
+            <w:gridSpan w:val="3"/>
+            <w:vAlign w:val="center"/>
+          </w:tcPr>
+          <w:p>
+            <w:pPr>
+              <w:jc w:val="left"/>
+              <w:rPr>
+                <w:rFonts w:ascii="Times New Roman" w:eastAsia="Aptos" w:hAnsi="Times New Roman" w:cs="Times New Roman"/>
+                <w:b/>
+                <w:bCs/>
+              </w:rPr>
+            </w:pPr>
+            <w:r>
+              <w:rPr>
+                <w:rFonts w:ascii="Times New Roman" w:eastAsia="Aptos" w:hAnsi="Times New Roman" w:cs="Times New Roman"/>
+                <w:b/>
+                <w:bCs/>
+              </w:rPr>
+              <w:t>Expected result</w:t>
+            </w:r>
+          </w:p>
+        </w:tc>
+        <w:tc>
+          <w:tcPr>
+            <w:tcW w:w="7002" w:type="dxa"/>
+            <w:gridSpan w:val="2"/>
+            <w:vAlign w:val="center"/>
+          </w:tcPr>
+          <w:p>
+            <w:pPr>
+              <w:jc w:val="left"/>
+              <w:rPr>
+                <w:rFonts w:ascii="Times New Roman" w:eastAsia="Aptos" w:hAnsi="Times New Roman" w:cs="Times New Roman"/>
+              </w:rPr>
+            </w:pPr>
+            <w:r>
+              <w:rPr>
+                <w:rFonts w:ascii="Times New Roman" w:eastAsia="Aptos" w:hAnsi="Times New Roman" w:cs="Times New Roman"/>
+              </w:rPr>
+              <w:t>The total displaced KPI and most affected country must reflect the sum for floods</w:t>
+            </w:r>
+          </w:p>
+          <w:p>
+            <w:pPr>
+              <w:jc w:val="left"/>
+              <w:rPr>
+                <w:rFonts w:ascii="Times New Roman" w:eastAsia="Aptos" w:hAnsi="Times New Roman" w:cs="Times New Roman"/>
+              </w:rPr>
+            </w:pPr>
+            <w:r>
+              <w:rPr>
+                <w:rFonts w:ascii="Times New Roman" w:eastAsia="Aptos" w:hAnsi="Times New Roman" w:cs="Times New Roman"/>
+              </w:rPr>
+              <w:t>The line for top 5 hazard types and the bar for displacements by hazard types should display only one legend for flood.</w:t>
+            </w:r>
+          </w:p>
+          <w:p>
+            <w:pPr>
+              <w:jc w:val="left"/>
+              <w:rPr>
+                <w:rFonts w:ascii="Times New Roman" w:eastAsia="Aptos" w:hAnsi="Times New Roman" w:cs="Times New Roman"/>
+                <w:b/>
+                <w:bCs/>
+              </w:rPr>
+            </w:pPr>
+            <w:r>
+              <w:rPr>
+                <w:rFonts w:ascii="Times New Roman" w:eastAsia="Aptos" w:hAnsi="Times New Roman" w:cs="Times New Roman"/>
+              </w:rPr>
+              <w:t>No other hazard types must be visible in the legend.</w:t>
+            </w:r>
+          </w:p>
+        </w:tc>
+      </w:tr>
+    </w:tbl>
+    <w:p>
+      <w:pPr>
+        <w:spacing w:line="240" w:lineRule="auto"/>
+        <w:rPr>
+          <w:rFonts w:ascii="Times New Roman" w:eastAsia="Aptos" w:hAnsi="Times New Roman" w:cs="Times New Roman"/>
+          <w:b/>
+          <w:bCs/>
+        </w:rPr>
+      </w:pPr>
+    </w:p>
+    <w:tbl>
+      <w:tblPr>
+        <w:tblStyle w:val="TableGrid"/>
+        <w:tblW w:w="9024" w:type="dxa"/>
+        <w:tblLook w:val="04A0" w:firstRow="1" w:lastRow="0" w:firstColumn="1" w:lastColumn="0" w:noHBand="0" w:noVBand="1"/>
+      </w:tblPr>
+      <w:tblGrid>
+        <w:gridCol w:w="576"/>
+        <w:gridCol w:w="987"/>
+        <w:gridCol w:w="459"/>
+        <w:gridCol w:w="2509"/>
+        <w:gridCol w:w="4493"/>
+      </w:tblGrid>
+      <w:tr>
+        <w:tc>
+          <w:tcPr>
+            <w:tcW w:w="576" w:type="dxa"/>
+            <w:vAlign w:val="center"/>
+          </w:tcPr>
+          <w:p>
+            <w:pPr>
+              <w:jc w:val="left"/>
+              <w:rPr>
+                <w:rFonts w:ascii="Times New Roman" w:eastAsia="Aptos" w:hAnsi="Times New Roman" w:cs="Times New Roman"/>
+                <w:b/>
+                <w:bCs/>
+              </w:rPr>
+            </w:pPr>
+            <w:r>
+              <w:rPr>
+                <w:rFonts w:ascii="Times New Roman" w:eastAsia="Aptos" w:hAnsi="Times New Roman" w:cs="Times New Roman"/>
+                <w:b/>
+                <w:bCs/>
+              </w:rPr>
+              <w:t>#03</w:t>
+            </w:r>
+          </w:p>
+        </w:tc>
+        <w:tc>
+          <w:tcPr>
+            <w:tcW w:w="987" w:type="dxa"/>
+            <w:vAlign w:val="center"/>
+          </w:tcPr>
+          <w:p>
+            <w:pPr>
+              <w:jc w:val="left"/>
+              <w:rPr>
+                <w:rFonts w:ascii="Times New Roman" w:eastAsia="Aptos" w:hAnsi="Times New Roman" w:cs="Times New Roman"/>
+                <w:b/>
+                <w:bCs/>
+              </w:rPr>
+            </w:pPr>
+            <w:r>
+              <w:rPr>
+                <w:rFonts w:ascii="Times New Roman" w:eastAsia="Aptos" w:hAnsi="Times New Roman" w:cs="Times New Roman"/>
+                <w:b/>
+                <w:bCs/>
+              </w:rPr>
+              <w:t>TC3</w:t>
+            </w:r>
+          </w:p>
+        </w:tc>
+        <w:tc>
+          <w:tcPr>
+            <w:tcW w:w="2968" w:type="dxa"/>
+            <w:gridSpan w:val="2"/>
+            <w:vAlign w:val="center"/>
+          </w:tcPr>
+          <w:p>
+            <w:pPr>
+              <w:jc w:val="left"/>
+              <w:rPr>
+                <w:rFonts w:ascii="Times New Roman" w:eastAsia="Aptos" w:hAnsi="Times New Roman" w:cs="Times New Roman"/>
+                <w:b/>
+                <w:bCs/>
+              </w:rPr>
+            </w:pPr>
+            <w:r>
+              <w:rPr>
+                <w:rFonts w:ascii="Times New Roman" w:eastAsia="Aptos" w:hAnsi="Times New Roman" w:cs="Times New Roman"/>
+                <w:b/>
+                <w:bCs/>
+              </w:rPr>
+              <w:t>Title:</w:t>
+            </w:r>
+            <w:r>
+              <w:rPr>
+                <w:rFonts w:ascii="Times New Roman" w:eastAsia="Aptos" w:hAnsi="Times New Roman" w:cs="Times New Roman"/>
+              </w:rPr>
+              <w:t xml:space="preserve"> top 5 Hazard trend logic</w:t>
+            </w:r>
+          </w:p>
+        </w:tc>
+        <w:tc>
+          <w:tcPr>
+            <w:tcW w:w="4493" w:type="dxa"/>
+            <w:vAlign w:val="center"/>
+          </w:tcPr>
+          <w:p>
+            <w:pPr>
+              <w:jc w:val="left"/>
+              <w:rPr>
+                <w:rFonts w:ascii="Times New Roman" w:eastAsia="Aptos" w:hAnsi="Times New Roman" w:cs="Times New Roman"/>
+                <w:b/>
+                <w:bCs/>
+              </w:rPr>
+            </w:pPr>
+            <w:r>
+              <w:rPr>
+                <w:rFonts w:ascii="Times New Roman" w:eastAsia="Aptos" w:hAnsi="Times New Roman" w:cs="Times New Roman"/>
+                <w:b/>
+                <w:bCs/>
+              </w:rPr>
+              <w:t>Test case Title: Top 5 Hazard trend analysis</w:t>
+            </w:r>
+          </w:p>
+        </w:tc>
+      </w:tr>
+      <w:tr>
+        <w:tc>
+          <w:tcPr>
+            <w:tcW w:w="2022" w:type="dxa"/>
+            <w:gridSpan w:val="3"/>
+            <w:vAlign w:val="center"/>
+          </w:tcPr>
+          <w:p>
+            <w:pPr>
+              <w:jc w:val="left"/>
+              <w:rPr>
+                <w:rFonts w:ascii="Times New Roman" w:eastAsia="Aptos" w:hAnsi="Times New Roman" w:cs="Times New Roman"/>
+                <w:b/>
+                <w:bCs/>
+              </w:rPr>
+            </w:pPr>
+            <w:r>
+              <w:rPr>
+                <w:rFonts w:ascii="Times New Roman" w:eastAsia="Aptos" w:hAnsi="Times New Roman" w:cs="Times New Roman"/>
+                <w:b/>
+                <w:bCs/>
+              </w:rPr>
+              <w:t>Description</w:t>
+            </w:r>
+          </w:p>
+        </w:tc>
+        <w:tc>
+          <w:tcPr>
+            <w:tcW w:w="7002" w:type="dxa"/>
+            <w:gridSpan w:val="2"/>
+            <w:vAlign w:val="center"/>
+          </w:tcPr>
+          <w:p>
+            <w:pPr>
+              <w:jc w:val="left"/>
+              <w:rPr>
+                <w:rFonts w:ascii="Times New Roman" w:eastAsia="Aptos" w:hAnsi="Times New Roman" w:cs="Times New Roman"/>
+              </w:rPr>
+            </w:pPr>
+            <w:r>
+              <w:rPr>
+                <w:rFonts w:ascii="Times New Roman" w:eastAsia="Aptos" w:hAnsi="Times New Roman" w:cs="Times New Roman"/>
+              </w:rPr>
+              <w:t>Ensuring that the multiline chart displays the top 5 hazards only to maintain the clarity of the dashboard.</w:t>
+            </w:r>
+          </w:p>
+        </w:tc>
+      </w:tr>
+      <w:tr>
+        <w:tc>
+          <w:tcPr>
+            <w:tcW w:w="2022" w:type="dxa"/>
+            <w:gridSpan w:val="3"/>
+            <w:vAlign w:val="center"/>
+          </w:tcPr>
+          <w:p>
+            <w:pPr>
+              <w:jc w:val="left"/>
+              <w:rPr>
+                <w:rFonts w:ascii="Times New Roman" w:eastAsia="Aptos" w:hAnsi="Times New Roman" w:cs="Times New Roman"/>
+                <w:b/>
+                <w:bCs/>
+              </w:rPr>
+            </w:pPr>
+            <w:r>
+              <w:rPr>
+                <w:rFonts w:ascii="Times New Roman" w:eastAsia="Aptos" w:hAnsi="Times New Roman" w:cs="Times New Roman"/>
+                <w:b/>
+                <w:bCs/>
+              </w:rPr>
+              <w:t>Steps and input data</w:t>
+            </w:r>
+          </w:p>
+        </w:tc>
+        <w:tc>
+          <w:tcPr>
+            <w:tcW w:w="7002" w:type="dxa"/>
+            <w:gridSpan w:val="2"/>
+            <w:vAlign w:val="center"/>
+          </w:tcPr>
+          <w:p>
+            <w:pPr>
+              <w:jc w:val="left"/>
+              <w:rPr>
+                <w:rFonts w:ascii="Times New Roman" w:eastAsia="Aptos" w:hAnsi="Times New Roman" w:cs="Times New Roman"/>
+              </w:rPr>
+            </w:pPr>
+            <w:r>
+              <w:rPr>
+                <w:rFonts w:ascii="Times New Roman" w:eastAsia="Aptos" w:hAnsi="Times New Roman" w:cs="Times New Roman"/>
+              </w:rPr>
+              <w:t>Ensure that all hazard types are selected in the filter sidebar</w:t>
+            </w:r>
+          </w:p>
+          <w:p>
+            <w:pPr>
+              <w:jc w:val="left"/>
+              <w:rPr>
+                <w:rFonts w:ascii="Times New Roman" w:eastAsia="Aptos" w:hAnsi="Times New Roman" w:cs="Times New Roman"/>
+              </w:rPr>
+            </w:pPr>
+            <w:r>
+              <w:rPr>
+                <w:rFonts w:ascii="Times New Roman" w:eastAsia="Aptos" w:hAnsi="Times New Roman" w:cs="Times New Roman"/>
+              </w:rPr>
+              <w:t>Observe the Hazard type trend chart</w:t>
+            </w:r>
+          </w:p>
+          <w:p>
+            <w:pPr>
+              <w:jc w:val="left"/>
+              <w:rPr>
+                <w:rFonts w:ascii="Times New Roman" w:eastAsia="Aptos" w:hAnsi="Times New Roman" w:cs="Times New Roman"/>
+              </w:rPr>
+            </w:pPr>
+            <w:r>
+              <w:rPr>
+                <w:rFonts w:ascii="Times New Roman" w:eastAsia="Aptos" w:hAnsi="Times New Roman" w:cs="Times New Roman"/>
+              </w:rPr>
+              <w:t>Count the number of active lines in the legend</w:t>
+            </w:r>
+          </w:p>
+        </w:tc>
+      </w:tr>
+      <w:tr>
+        <w:tc>
+          <w:tcPr>
+            <w:tcW w:w="2022" w:type="dxa"/>
+            <w:gridSpan w:val="3"/>
+            <w:vAlign w:val="center"/>
+          </w:tcPr>
+          <w:p>
+            <w:pPr>
+              <w:jc w:val="left"/>
+              <w:rPr>
+                <w:rFonts w:ascii="Times New Roman" w:eastAsia="Aptos" w:hAnsi="Times New Roman" w:cs="Times New Roman"/>
+                <w:b/>
+                <w:bCs/>
+              </w:rPr>
+            </w:pPr>
+            <w:r>
+              <w:rPr>
+                <w:rFonts w:ascii="Times New Roman" w:eastAsia="Aptos" w:hAnsi="Times New Roman" w:cs="Times New Roman"/>
+                <w:b/>
+                <w:bCs/>
+              </w:rPr>
+              <w:t>Dependencies</w:t>
+            </w:r>
+          </w:p>
+        </w:tc>
+        <w:tc>
+          <w:tcPr>
+            <w:tcW w:w="7002" w:type="dxa"/>
+            <w:gridSpan w:val="2"/>
+            <w:vAlign w:val="center"/>
+          </w:tcPr>
+          <w:p>
+            <w:pPr>
+              <w:jc w:val="left"/>
+              <w:rPr>
+                <w:rFonts w:ascii="Times New Roman" w:eastAsia="Aptos" w:hAnsi="Times New Roman" w:cs="Times New Roman"/>
+              </w:rPr>
+            </w:pPr>
+            <w:r>
+              <w:rPr>
+                <w:rFonts w:ascii="Times New Roman" w:eastAsia="Aptos" w:hAnsi="Times New Roman" w:cs="Times New Roman"/>
+              </w:rPr>
+              <w:t xml:space="preserve">The data aggregation logic must correctly use </w:t>
+            </w:r>
+            <w:proofErr w:type="gramStart"/>
+            <w:r>
+              <w:rPr>
+                <w:rFonts w:ascii="Times New Roman" w:eastAsia="Aptos" w:hAnsi="Times New Roman" w:cs="Times New Roman"/>
+              </w:rPr>
+              <w:t>‘.</w:t>
+            </w:r>
+            <w:proofErr w:type="spellStart"/>
+            <w:r>
+              <w:rPr>
+                <w:rFonts w:ascii="Times New Roman" w:eastAsia="Aptos" w:hAnsi="Times New Roman" w:cs="Times New Roman"/>
+              </w:rPr>
+              <w:t>nlargest</w:t>
+            </w:r>
+            <w:proofErr w:type="spellEnd"/>
+            <w:proofErr w:type="gramEnd"/>
+            <w:r>
+              <w:rPr>
+                <w:rFonts w:ascii="Times New Roman" w:eastAsia="Aptos" w:hAnsi="Times New Roman" w:cs="Times New Roman"/>
+              </w:rPr>
+              <w:t>(5)’ on the filtered data frame.</w:t>
+            </w:r>
+          </w:p>
+        </w:tc>
+      </w:tr>
+      <w:tr>
+        <w:tc>
+          <w:tcPr>
+            <w:tcW w:w="2022" w:type="dxa"/>
+            <w:gridSpan w:val="3"/>
+            <w:vAlign w:val="center"/>
+          </w:tcPr>
+          <w:p>
+            <w:pPr>
+              <w:jc w:val="left"/>
+              <w:rPr>
+                <w:rFonts w:ascii="Times New Roman" w:eastAsia="Aptos" w:hAnsi="Times New Roman" w:cs="Times New Roman"/>
+                <w:b/>
+                <w:bCs/>
+              </w:rPr>
+            </w:pPr>
+            <w:r>
+              <w:rPr>
+                <w:rFonts w:ascii="Times New Roman" w:eastAsia="Aptos" w:hAnsi="Times New Roman" w:cs="Times New Roman"/>
+                <w:b/>
+                <w:bCs/>
+              </w:rPr>
+              <w:t>Expected result</w:t>
+            </w:r>
+          </w:p>
+        </w:tc>
+        <w:tc>
+          <w:tcPr>
+            <w:tcW w:w="7002" w:type="dxa"/>
+            <w:gridSpan w:val="2"/>
+            <w:vAlign w:val="center"/>
+          </w:tcPr>
+          <w:p>
+            <w:pPr>
+              <w:jc w:val="left"/>
+              <w:rPr>
+                <w:rFonts w:ascii="Times New Roman" w:eastAsia="Aptos" w:hAnsi="Times New Roman" w:cs="Times New Roman"/>
+              </w:rPr>
+            </w:pPr>
+            <w:r>
+              <w:rPr>
+                <w:rFonts w:ascii="Times New Roman" w:eastAsia="Aptos" w:hAnsi="Times New Roman" w:cs="Times New Roman"/>
+              </w:rPr>
+              <w:t>Only 5 hazard types are displayed in the legend</w:t>
+            </w:r>
+          </w:p>
+          <w:p>
+            <w:pPr>
+              <w:jc w:val="left"/>
+              <w:rPr>
+                <w:rFonts w:ascii="Times New Roman" w:eastAsia="Aptos" w:hAnsi="Times New Roman" w:cs="Times New Roman"/>
+              </w:rPr>
+            </w:pPr>
+            <w:r>
+              <w:rPr>
+                <w:rFonts w:ascii="Times New Roman" w:eastAsia="Aptos" w:hAnsi="Times New Roman" w:cs="Times New Roman"/>
+              </w:rPr>
+              <w:t>The chart is readable without lines overlapping</w:t>
+            </w:r>
+          </w:p>
+          <w:p>
+            <w:pPr>
+              <w:jc w:val="left"/>
+              <w:rPr>
+                <w:rFonts w:ascii="Times New Roman" w:eastAsia="Aptos" w:hAnsi="Times New Roman" w:cs="Times New Roman"/>
+                <w:b/>
+                <w:bCs/>
+              </w:rPr>
+            </w:pPr>
+            <w:r>
+              <w:rPr>
+                <w:rFonts w:ascii="Times New Roman" w:eastAsia="Aptos" w:hAnsi="Times New Roman" w:cs="Times New Roman"/>
+              </w:rPr>
+              <w:t>The lines are continuous across the year range</w:t>
+            </w:r>
+          </w:p>
+        </w:tc>
+      </w:tr>
+    </w:tbl>
+    <w:p>
+      <w:pPr>
+        <w:spacing w:line="240" w:lineRule="auto"/>
+        <w:rPr>
+          <w:rFonts w:ascii="Times New Roman" w:eastAsia="Aptos" w:hAnsi="Times New Roman" w:cs="Times New Roman"/>
+          <w:b/>
+          <w:bCs/>
+        </w:rPr>
+      </w:pPr>
+      <w:r>
+        <w:rPr>
+          <w:rFonts w:ascii="Times New Roman" w:eastAsia="Aptos" w:hAnsi="Times New Roman" w:cs="Times New Roman"/>
+          <w:b/>
+          <w:bCs/>
+        </w:rPr>
+        <w:br/>
+      </w:r>
+    </w:p>
+    <w:p>
+      <w:pPr>
+        <w:spacing w:line="240" w:lineRule="auto"/>
+        <w:rPr>
+          <w:rFonts w:ascii="Times New Roman" w:eastAsia="Aptos" w:hAnsi="Times New Roman" w:cs="Times New Roman"/>
+          <w:b/>
+          <w:bCs/>
+        </w:rPr>
+      </w:pPr>
+    </w:p>
+    <w:p>
+      <w:pPr>
+        <w:spacing w:line="240" w:lineRule="auto"/>
+        <w:rPr>
+          <w:rFonts w:ascii="Times New Roman" w:eastAsia="Aptos" w:hAnsi="Times New Roman" w:cs="Times New Roman"/>
+          <w:b/>
+          <w:bCs/>
+        </w:rPr>
+      </w:pPr>
+    </w:p>
+    <w:tbl>
+      <w:tblPr>
+        <w:tblStyle w:val="TableGrid"/>
+        <w:tblW w:w="9024" w:type="dxa"/>
+        <w:tblLook w:val="04A0" w:firstRow="1" w:lastRow="0" w:firstColumn="1" w:lastColumn="0" w:noHBand="0" w:noVBand="1"/>
+      </w:tblPr>
+      <w:tblGrid>
+        <w:gridCol w:w="576"/>
+        <w:gridCol w:w="987"/>
+        <w:gridCol w:w="459"/>
+        <w:gridCol w:w="2509"/>
+        <w:gridCol w:w="4493"/>
+      </w:tblGrid>
+      <w:tr>
+        <w:tc>
+          <w:tcPr>
+            <w:tcW w:w="576" w:type="dxa"/>
+            <w:vAlign w:val="center"/>
+          </w:tcPr>
+          <w:p>
+            <w:pPr>
+              <w:jc w:val="left"/>
+              <w:rPr>
+                <w:rFonts w:ascii="Times New Roman" w:eastAsia="Aptos" w:hAnsi="Times New Roman" w:cs="Times New Roman"/>
+                <w:b/>
+                <w:bCs/>
+              </w:rPr>
+            </w:pPr>
+            <w:r>
+              <w:rPr>
+                <w:rFonts w:ascii="Times New Roman" w:eastAsia="Aptos" w:hAnsi="Times New Roman" w:cs="Times New Roman"/>
+                <w:b/>
+                <w:bCs/>
+              </w:rPr>
+              <w:lastRenderedPageBreak/>
+              <w:t>#04</w:t>
+            </w:r>
+          </w:p>
+        </w:tc>
+        <w:tc>
+          <w:tcPr>
+            <w:tcW w:w="987" w:type="dxa"/>
+            <w:vAlign w:val="center"/>
+          </w:tcPr>
+          <w:p>
+            <w:pPr>
+              <w:jc w:val="left"/>
+              <w:rPr>
+                <w:rFonts w:ascii="Times New Roman" w:eastAsia="Aptos" w:hAnsi="Times New Roman" w:cs="Times New Roman"/>
+                <w:b/>
+                <w:bCs/>
+              </w:rPr>
+            </w:pPr>
+            <w:r>
+              <w:rPr>
+                <w:rFonts w:ascii="Times New Roman" w:eastAsia="Aptos" w:hAnsi="Times New Roman" w:cs="Times New Roman"/>
+                <w:b/>
+                <w:bCs/>
+              </w:rPr>
+              <w:t>TC4</w:t>
+            </w:r>
+          </w:p>
+        </w:tc>
+        <w:tc>
+          <w:tcPr>
+            <w:tcW w:w="2968" w:type="dxa"/>
+            <w:gridSpan w:val="2"/>
+            <w:vAlign w:val="center"/>
+          </w:tcPr>
+          <w:p>
+            <w:pPr>
+              <w:jc w:val="left"/>
+              <w:rPr>
+                <w:rFonts w:ascii="Times New Roman" w:eastAsia="Aptos" w:hAnsi="Times New Roman" w:cs="Times New Roman"/>
+                <w:b/>
+                <w:bCs/>
+              </w:rPr>
+            </w:pPr>
+            <w:r>
+              <w:rPr>
+                <w:rFonts w:ascii="Times New Roman" w:eastAsia="Aptos" w:hAnsi="Times New Roman" w:cs="Times New Roman"/>
+                <w:b/>
+                <w:bCs/>
+              </w:rPr>
+              <w:t>Title:</w:t>
+            </w:r>
+            <w:r>
+              <w:rPr>
+                <w:rFonts w:ascii="Times New Roman" w:eastAsia="Aptos" w:hAnsi="Times New Roman" w:cs="Times New Roman"/>
+              </w:rPr>
+              <w:t xml:space="preserve"> Geospatial Map</w:t>
+            </w:r>
+          </w:p>
+        </w:tc>
+        <w:tc>
+          <w:tcPr>
+            <w:tcW w:w="4493" w:type="dxa"/>
+            <w:vAlign w:val="center"/>
+          </w:tcPr>
+          <w:p>
+            <w:pPr>
+              <w:jc w:val="left"/>
+              <w:rPr>
+                <w:rFonts w:ascii="Times New Roman" w:eastAsia="Aptos" w:hAnsi="Times New Roman" w:cs="Times New Roman"/>
+                <w:b/>
+                <w:bCs/>
+              </w:rPr>
+            </w:pPr>
+            <w:r>
+              <w:rPr>
+                <w:rFonts w:ascii="Times New Roman" w:eastAsia="Aptos" w:hAnsi="Times New Roman" w:cs="Times New Roman"/>
+                <w:b/>
+                <w:bCs/>
+              </w:rPr>
+              <w:t xml:space="preserve">Test case Title: </w:t>
+            </w:r>
+            <w:r>
+              <w:rPr>
+                <w:rFonts w:ascii="Times New Roman" w:eastAsia="Aptos" w:hAnsi="Times New Roman" w:cs="Times New Roman"/>
+              </w:rPr>
+              <w:t>Geospatial Map Hover</w:t>
+            </w:r>
+          </w:p>
+        </w:tc>
+      </w:tr>
+      <w:tr>
+        <w:tc>
+          <w:tcPr>
+            <w:tcW w:w="2022" w:type="dxa"/>
+            <w:gridSpan w:val="3"/>
+            <w:vAlign w:val="center"/>
+          </w:tcPr>
+          <w:p>
+            <w:pPr>
+              <w:jc w:val="left"/>
+              <w:rPr>
+                <w:rFonts w:ascii="Times New Roman" w:eastAsia="Aptos" w:hAnsi="Times New Roman" w:cs="Times New Roman"/>
+                <w:b/>
+                <w:bCs/>
+              </w:rPr>
+            </w:pPr>
+            <w:r>
+              <w:rPr>
+                <w:rFonts w:ascii="Times New Roman" w:eastAsia="Aptos" w:hAnsi="Times New Roman" w:cs="Times New Roman"/>
+                <w:b/>
+                <w:bCs/>
+              </w:rPr>
+              <w:t>Description</w:t>
+            </w:r>
+          </w:p>
+        </w:tc>
+        <w:tc>
+          <w:tcPr>
+            <w:tcW w:w="7002" w:type="dxa"/>
+            <w:gridSpan w:val="2"/>
+            <w:vAlign w:val="center"/>
+          </w:tcPr>
+          <w:p>
+            <w:pPr>
+              <w:jc w:val="left"/>
+              <w:rPr>
+                <w:rFonts w:ascii="Times New Roman" w:eastAsia="Aptos" w:hAnsi="Times New Roman" w:cs="Times New Roman"/>
+              </w:rPr>
+            </w:pPr>
+            <w:r>
+              <w:rPr>
+                <w:rFonts w:ascii="Times New Roman" w:eastAsia="Aptos" w:hAnsi="Times New Roman" w:cs="Times New Roman"/>
+              </w:rPr>
+              <w:t>Hover over a specific country on the map</w:t>
+            </w:r>
+          </w:p>
+        </w:tc>
+      </w:tr>
+      <w:tr>
+        <w:tc>
+          <w:tcPr>
+            <w:tcW w:w="2022" w:type="dxa"/>
+            <w:gridSpan w:val="3"/>
+            <w:vAlign w:val="center"/>
+          </w:tcPr>
+          <w:p>
+            <w:pPr>
+              <w:jc w:val="left"/>
+              <w:rPr>
+                <w:rFonts w:ascii="Times New Roman" w:eastAsia="Aptos" w:hAnsi="Times New Roman" w:cs="Times New Roman"/>
+                <w:b/>
+                <w:bCs/>
+              </w:rPr>
+            </w:pPr>
+            <w:r>
+              <w:rPr>
+                <w:rFonts w:ascii="Times New Roman" w:eastAsia="Aptos" w:hAnsi="Times New Roman" w:cs="Times New Roman"/>
+                <w:b/>
+                <w:bCs/>
+              </w:rPr>
+              <w:t>Steps and input data</w:t>
+            </w:r>
+          </w:p>
+        </w:tc>
+        <w:tc>
+          <w:tcPr>
+            <w:tcW w:w="7002" w:type="dxa"/>
+            <w:gridSpan w:val="2"/>
+            <w:vAlign w:val="center"/>
+          </w:tcPr>
+          <w:p>
+            <w:pPr>
+              <w:jc w:val="left"/>
+              <w:rPr>
+                <w:rFonts w:ascii="Times New Roman" w:eastAsia="Aptos" w:hAnsi="Times New Roman" w:cs="Times New Roman"/>
+              </w:rPr>
+            </w:pPr>
+            <w:r>
+              <w:rPr>
+                <w:rFonts w:ascii="Times New Roman" w:eastAsia="Aptos" w:hAnsi="Times New Roman" w:cs="Times New Roman"/>
+              </w:rPr>
+              <w:t>Hover over any country on the map</w:t>
+            </w:r>
+          </w:p>
+          <w:p>
+            <w:pPr>
+              <w:jc w:val="left"/>
+              <w:rPr>
+                <w:rFonts w:ascii="Times New Roman" w:eastAsia="Aptos" w:hAnsi="Times New Roman" w:cs="Times New Roman"/>
+              </w:rPr>
+            </w:pPr>
+            <w:r>
+              <w:rPr>
+                <w:rFonts w:ascii="Times New Roman" w:eastAsia="Aptos" w:hAnsi="Times New Roman" w:cs="Times New Roman"/>
+              </w:rPr>
+              <w:t>Observe tooltip information</w:t>
+            </w:r>
+          </w:p>
+        </w:tc>
+      </w:tr>
+      <w:tr>
+        <w:tc>
+          <w:tcPr>
+            <w:tcW w:w="2022" w:type="dxa"/>
+            <w:gridSpan w:val="3"/>
+            <w:vAlign w:val="center"/>
+          </w:tcPr>
+          <w:p>
+            <w:pPr>
+              <w:jc w:val="left"/>
+              <w:rPr>
+                <w:rFonts w:ascii="Times New Roman" w:eastAsia="Aptos" w:hAnsi="Times New Roman" w:cs="Times New Roman"/>
+                <w:b/>
+                <w:bCs/>
+              </w:rPr>
+            </w:pPr>
+            <w:r>
+              <w:rPr>
+                <w:rFonts w:ascii="Times New Roman" w:eastAsia="Aptos" w:hAnsi="Times New Roman" w:cs="Times New Roman"/>
+                <w:b/>
+                <w:bCs/>
+              </w:rPr>
+              <w:t>Dependencies</w:t>
+            </w:r>
+          </w:p>
+        </w:tc>
+        <w:tc>
+          <w:tcPr>
+            <w:tcW w:w="7002" w:type="dxa"/>
+            <w:gridSpan w:val="2"/>
+            <w:vAlign w:val="center"/>
+          </w:tcPr>
+          <w:p>
+            <w:pPr>
+              <w:jc w:val="left"/>
+              <w:rPr>
+                <w:rFonts w:ascii="Times New Roman" w:eastAsia="Aptos" w:hAnsi="Times New Roman" w:cs="Times New Roman"/>
+              </w:rPr>
+            </w:pPr>
+            <w:r>
+              <w:rPr>
+                <w:rFonts w:ascii="Times New Roman" w:eastAsia="Aptos" w:hAnsi="Times New Roman" w:cs="Times New Roman"/>
+              </w:rPr>
+              <w:t xml:space="preserve">The choropleth function must correctly use </w:t>
+            </w:r>
+            <w:proofErr w:type="gramStart"/>
+            <w:r>
+              <w:rPr>
+                <w:rFonts w:ascii="Times New Roman" w:eastAsia="Aptos" w:hAnsi="Times New Roman" w:cs="Times New Roman"/>
+              </w:rPr>
+              <w:t>‘.</w:t>
+            </w:r>
+            <w:proofErr w:type="spellStart"/>
+            <w:r>
+              <w:rPr>
+                <w:rFonts w:ascii="Times New Roman" w:eastAsia="Aptos" w:hAnsi="Times New Roman" w:cs="Times New Roman"/>
+              </w:rPr>
+              <w:t>hover</w:t>
+            </w:r>
+            <w:proofErr w:type="gramEnd"/>
+            <w:r>
+              <w:rPr>
+                <w:rFonts w:ascii="Times New Roman" w:eastAsia="Aptos" w:hAnsi="Times New Roman" w:cs="Times New Roman"/>
+              </w:rPr>
+              <w:t>_name</w:t>
+            </w:r>
+            <w:proofErr w:type="spellEnd"/>
+            <w:r>
+              <w:rPr>
+                <w:rFonts w:ascii="Times New Roman" w:eastAsia="Aptos" w:hAnsi="Times New Roman" w:cs="Times New Roman"/>
+              </w:rPr>
+              <w:t>’ on the filtered data frame.</w:t>
+            </w:r>
+          </w:p>
+        </w:tc>
+      </w:tr>
+      <w:tr>
+        <w:tc>
+          <w:tcPr>
+            <w:tcW w:w="2022" w:type="dxa"/>
+            <w:gridSpan w:val="3"/>
+            <w:vAlign w:val="center"/>
+          </w:tcPr>
+          <w:p>
+            <w:pPr>
+              <w:jc w:val="left"/>
+              <w:rPr>
+                <w:rFonts w:ascii="Times New Roman" w:eastAsia="Aptos" w:hAnsi="Times New Roman" w:cs="Times New Roman"/>
+                <w:b/>
+                <w:bCs/>
+              </w:rPr>
+            </w:pPr>
+            <w:r>
+              <w:rPr>
+                <w:rFonts w:ascii="Times New Roman" w:eastAsia="Aptos" w:hAnsi="Times New Roman" w:cs="Times New Roman"/>
+                <w:b/>
+                <w:bCs/>
+              </w:rPr>
+              <w:t>Expected result</w:t>
+            </w:r>
+          </w:p>
+        </w:tc>
+        <w:tc>
+          <w:tcPr>
+            <w:tcW w:w="7002" w:type="dxa"/>
+            <w:gridSpan w:val="2"/>
+            <w:vAlign w:val="center"/>
+          </w:tcPr>
+          <w:p>
+            <w:pPr>
+              <w:jc w:val="left"/>
+              <w:rPr>
+                <w:rFonts w:ascii="Times New Roman" w:eastAsia="Aptos" w:hAnsi="Times New Roman" w:cs="Times New Roman"/>
+              </w:rPr>
+            </w:pPr>
+            <w:r>
+              <w:rPr>
+                <w:rFonts w:ascii="Times New Roman" w:eastAsia="Aptos" w:hAnsi="Times New Roman" w:cs="Times New Roman"/>
+              </w:rPr>
+              <w:t>The country name and total displacement must be displayed when hovering over the specific country</w:t>
+            </w:r>
+          </w:p>
+        </w:tc>
+      </w:tr>
+    </w:tbl>
+    <w:p>
+      <w:pPr>
+        <w:spacing w:line="240" w:lineRule="auto"/>
+        <w:rPr>
+          <w:rFonts w:ascii="Times New Roman" w:eastAsia="Aptos" w:hAnsi="Times New Roman" w:cs="Times New Roman"/>
+          <w:b/>
+          <w:bCs/>
+        </w:rPr>
+      </w:pPr>
+    </w:p>
+    <w:tbl>
+      <w:tblPr>
+        <w:tblStyle w:val="TableGrid"/>
+        <w:tblW w:w="9024" w:type="dxa"/>
+        <w:tblLook w:val="04A0" w:firstRow="1" w:lastRow="0" w:firstColumn="1" w:lastColumn="0" w:noHBand="0" w:noVBand="1"/>
+      </w:tblPr>
+      <w:tblGrid>
+        <w:gridCol w:w="576"/>
+        <w:gridCol w:w="987"/>
+        <w:gridCol w:w="459"/>
+        <w:gridCol w:w="2509"/>
+        <w:gridCol w:w="4493"/>
+      </w:tblGrid>
+      <w:tr>
+        <w:tc>
+          <w:tcPr>
+            <w:tcW w:w="576" w:type="dxa"/>
+            <w:vAlign w:val="center"/>
+          </w:tcPr>
+          <w:p>
+            <w:pPr>
+              <w:jc w:val="left"/>
+              <w:rPr>
+                <w:rFonts w:ascii="Times New Roman" w:eastAsia="Aptos" w:hAnsi="Times New Roman" w:cs="Times New Roman"/>
+                <w:b/>
+                <w:bCs/>
+              </w:rPr>
+            </w:pPr>
+            <w:r>
+              <w:rPr>
+                <w:rFonts w:ascii="Times New Roman" w:eastAsia="Aptos" w:hAnsi="Times New Roman" w:cs="Times New Roman"/>
+                <w:b/>
+                <w:bCs/>
+              </w:rPr>
+              <w:t>#05</w:t>
+            </w:r>
+          </w:p>
+        </w:tc>
+        <w:tc>
+          <w:tcPr>
+            <w:tcW w:w="987" w:type="dxa"/>
+            <w:vAlign w:val="center"/>
+          </w:tcPr>
+          <w:p>
+            <w:pPr>
+              <w:jc w:val="left"/>
+              <w:rPr>
+                <w:rFonts w:ascii="Times New Roman" w:eastAsia="Aptos" w:hAnsi="Times New Roman" w:cs="Times New Roman"/>
+                <w:b/>
+                <w:bCs/>
+              </w:rPr>
+            </w:pPr>
+            <w:r>
+              <w:rPr>
+                <w:rFonts w:ascii="Times New Roman" w:eastAsia="Aptos" w:hAnsi="Times New Roman" w:cs="Times New Roman"/>
+                <w:b/>
+                <w:bCs/>
+              </w:rPr>
+              <w:t>TC5</w:t>
+            </w:r>
+          </w:p>
+        </w:tc>
+        <w:tc>
+          <w:tcPr>
+            <w:tcW w:w="2968" w:type="dxa"/>
+            <w:gridSpan w:val="2"/>
+            <w:vAlign w:val="center"/>
+          </w:tcPr>
+          <w:p>
+            <w:pPr>
+              <w:jc w:val="left"/>
+              <w:rPr>
+                <w:rFonts w:ascii="Times New Roman" w:eastAsia="Aptos" w:hAnsi="Times New Roman" w:cs="Times New Roman"/>
+                <w:b/>
+                <w:bCs/>
+              </w:rPr>
+            </w:pPr>
+            <w:r>
+              <w:rPr>
+                <w:rFonts w:ascii="Times New Roman" w:eastAsia="Aptos" w:hAnsi="Times New Roman" w:cs="Times New Roman"/>
+                <w:b/>
+                <w:bCs/>
+              </w:rPr>
+              <w:t>Title:</w:t>
+            </w:r>
+            <w:r>
+              <w:rPr>
+                <w:rFonts w:ascii="Times New Roman" w:eastAsia="Aptos" w:hAnsi="Times New Roman" w:cs="Times New Roman"/>
+              </w:rPr>
+              <w:t xml:space="preserve"> KPI</w:t>
+            </w:r>
+          </w:p>
+        </w:tc>
+        <w:tc>
+          <w:tcPr>
+            <w:tcW w:w="4493" w:type="dxa"/>
+            <w:vAlign w:val="center"/>
+          </w:tcPr>
+          <w:p>
+            <w:pPr>
+              <w:jc w:val="left"/>
+              <w:rPr>
+                <w:rFonts w:ascii="Times New Roman" w:eastAsia="Aptos" w:hAnsi="Times New Roman" w:cs="Times New Roman"/>
+                <w:b/>
+                <w:bCs/>
+              </w:rPr>
+            </w:pPr>
+            <w:r>
+              <w:rPr>
+                <w:rFonts w:ascii="Times New Roman" w:eastAsia="Aptos" w:hAnsi="Times New Roman" w:cs="Times New Roman"/>
+                <w:b/>
+                <w:bCs/>
+              </w:rPr>
+              <w:t xml:space="preserve">Test case Title: </w:t>
+            </w:r>
+            <w:r>
+              <w:rPr>
+                <w:rFonts w:ascii="Times New Roman" w:eastAsia="Aptos" w:hAnsi="Times New Roman" w:cs="Times New Roman"/>
+              </w:rPr>
+              <w:t>KPI Accuracy</w:t>
+            </w:r>
+          </w:p>
+        </w:tc>
+      </w:tr>
+      <w:tr>
+        <w:tc>
+          <w:tcPr>
+            <w:tcW w:w="2022" w:type="dxa"/>
+            <w:gridSpan w:val="3"/>
+            <w:vAlign w:val="center"/>
+          </w:tcPr>
+          <w:p>
+            <w:pPr>
+              <w:jc w:val="left"/>
+              <w:rPr>
+                <w:rFonts w:ascii="Times New Roman" w:eastAsia="Aptos" w:hAnsi="Times New Roman" w:cs="Times New Roman"/>
+                <w:b/>
+                <w:bCs/>
+              </w:rPr>
+            </w:pPr>
+            <w:r>
+              <w:rPr>
+                <w:rFonts w:ascii="Times New Roman" w:eastAsia="Aptos" w:hAnsi="Times New Roman" w:cs="Times New Roman"/>
+                <w:b/>
+                <w:bCs/>
+              </w:rPr>
+              <w:t>Description</w:t>
+            </w:r>
+          </w:p>
+        </w:tc>
+        <w:tc>
+          <w:tcPr>
+            <w:tcW w:w="7002" w:type="dxa"/>
+            <w:gridSpan w:val="2"/>
+            <w:vAlign w:val="center"/>
+          </w:tcPr>
+          <w:p>
+            <w:pPr>
+              <w:jc w:val="left"/>
+              <w:rPr>
+                <w:rFonts w:ascii="Times New Roman" w:eastAsia="Aptos" w:hAnsi="Times New Roman" w:cs="Times New Roman"/>
+              </w:rPr>
+            </w:pPr>
+            <w:r>
+              <w:rPr>
+                <w:rFonts w:ascii="Times New Roman" w:eastAsia="Aptos" w:hAnsi="Times New Roman" w:cs="Times New Roman"/>
+              </w:rPr>
+              <w:t>Check the most affected country against the top 10 affected countries in the bar chart</w:t>
+            </w:r>
+          </w:p>
+        </w:tc>
+      </w:tr>
+      <w:tr>
+        <w:tc>
+          <w:tcPr>
+            <w:tcW w:w="2022" w:type="dxa"/>
+            <w:gridSpan w:val="3"/>
+            <w:vAlign w:val="center"/>
+          </w:tcPr>
+          <w:p>
+            <w:pPr>
+              <w:jc w:val="left"/>
+              <w:rPr>
+                <w:rFonts w:ascii="Times New Roman" w:eastAsia="Aptos" w:hAnsi="Times New Roman" w:cs="Times New Roman"/>
+                <w:b/>
+                <w:bCs/>
+              </w:rPr>
+            </w:pPr>
+            <w:r>
+              <w:rPr>
+                <w:rFonts w:ascii="Times New Roman" w:eastAsia="Aptos" w:hAnsi="Times New Roman" w:cs="Times New Roman"/>
+                <w:b/>
+                <w:bCs/>
+              </w:rPr>
+              <w:t>Steps and input data</w:t>
+            </w:r>
+          </w:p>
+        </w:tc>
+        <w:tc>
+          <w:tcPr>
+            <w:tcW w:w="7002" w:type="dxa"/>
+            <w:gridSpan w:val="2"/>
+            <w:vAlign w:val="center"/>
+          </w:tcPr>
+          <w:p>
+            <w:pPr>
+              <w:jc w:val="left"/>
+              <w:rPr>
+                <w:rFonts w:ascii="Times New Roman" w:eastAsia="Aptos" w:hAnsi="Times New Roman" w:cs="Times New Roman"/>
+              </w:rPr>
+            </w:pPr>
+            <w:r>
+              <w:rPr>
+                <w:rFonts w:ascii="Times New Roman" w:eastAsia="Aptos" w:hAnsi="Times New Roman" w:cs="Times New Roman"/>
+              </w:rPr>
+              <w:t>Select a specific year range and select all hazard types</w:t>
+            </w:r>
+          </w:p>
+          <w:p>
+            <w:pPr>
+              <w:jc w:val="left"/>
+              <w:rPr>
+                <w:rFonts w:ascii="Times New Roman" w:eastAsia="Aptos" w:hAnsi="Times New Roman" w:cs="Times New Roman"/>
+              </w:rPr>
+            </w:pPr>
+            <w:r>
+              <w:rPr>
+                <w:rFonts w:ascii="Times New Roman" w:eastAsia="Aptos" w:hAnsi="Times New Roman" w:cs="Times New Roman"/>
+              </w:rPr>
+              <w:t>Observe the name</w:t>
+            </w:r>
+          </w:p>
+        </w:tc>
+      </w:tr>
+      <w:tr>
+        <w:tc>
+          <w:tcPr>
+            <w:tcW w:w="2022" w:type="dxa"/>
+            <w:gridSpan w:val="3"/>
+            <w:vAlign w:val="center"/>
+          </w:tcPr>
+          <w:p>
+            <w:pPr>
+              <w:jc w:val="left"/>
+              <w:rPr>
+                <w:rFonts w:ascii="Times New Roman" w:eastAsia="Aptos" w:hAnsi="Times New Roman" w:cs="Times New Roman"/>
+                <w:b/>
+                <w:bCs/>
+              </w:rPr>
+            </w:pPr>
+            <w:r>
+              <w:rPr>
+                <w:rFonts w:ascii="Times New Roman" w:eastAsia="Aptos" w:hAnsi="Times New Roman" w:cs="Times New Roman"/>
+                <w:b/>
+                <w:bCs/>
+              </w:rPr>
+              <w:t>Dependencies</w:t>
+            </w:r>
+          </w:p>
+        </w:tc>
+        <w:tc>
+          <w:tcPr>
+            <w:tcW w:w="7002" w:type="dxa"/>
+            <w:gridSpan w:val="2"/>
+            <w:vAlign w:val="center"/>
+          </w:tcPr>
+          <w:p>
+            <w:pPr>
+              <w:jc w:val="left"/>
+              <w:rPr>
+                <w:rFonts w:ascii="Times New Roman" w:eastAsia="Aptos" w:hAnsi="Times New Roman" w:cs="Times New Roman"/>
+              </w:rPr>
+            </w:pPr>
+            <w:r>
+              <w:rPr>
+                <w:rFonts w:ascii="Times New Roman" w:eastAsia="Aptos" w:hAnsi="Times New Roman" w:cs="Times New Roman"/>
+              </w:rPr>
+              <w:t>Cleaned dataset must be loaded</w:t>
+            </w:r>
+          </w:p>
+          <w:p>
+            <w:pPr>
+              <w:jc w:val="left"/>
+              <w:rPr>
+                <w:rFonts w:ascii="Times New Roman" w:eastAsia="Aptos" w:hAnsi="Times New Roman" w:cs="Times New Roman"/>
+              </w:rPr>
+            </w:pPr>
+            <w:proofErr w:type="spellStart"/>
+            <w:r>
+              <w:rPr>
+                <w:rFonts w:ascii="Times New Roman" w:eastAsia="Aptos" w:hAnsi="Times New Roman" w:cs="Times New Roman"/>
+              </w:rPr>
+              <w:t>Streamlit</w:t>
+            </w:r>
+            <w:proofErr w:type="spellEnd"/>
+            <w:r>
+              <w:rPr>
+                <w:rFonts w:ascii="Times New Roman" w:eastAsia="Aptos" w:hAnsi="Times New Roman" w:cs="Times New Roman"/>
+              </w:rPr>
+              <w:t xml:space="preserve"> sidebar must be functional</w:t>
+            </w:r>
+          </w:p>
+        </w:tc>
+      </w:tr>
+      <w:tr>
+        <w:trPr>
+          <w:trHeight w:val="53"/>
+        </w:trPr>
+        <w:tc>
+          <w:tcPr>
+            <w:tcW w:w="2022" w:type="dxa"/>
+            <w:gridSpan w:val="3"/>
+            <w:vAlign w:val="center"/>
+          </w:tcPr>
+          <w:p>
+            <w:pPr>
+              <w:jc w:val="left"/>
+              <w:rPr>
+                <w:rFonts w:ascii="Times New Roman" w:eastAsia="Aptos" w:hAnsi="Times New Roman" w:cs="Times New Roman"/>
+                <w:b/>
+                <w:bCs/>
+              </w:rPr>
+            </w:pPr>
+            <w:r>
+              <w:rPr>
+                <w:rFonts w:ascii="Times New Roman" w:eastAsia="Aptos" w:hAnsi="Times New Roman" w:cs="Times New Roman"/>
+                <w:b/>
+                <w:bCs/>
+              </w:rPr>
+              <w:t>Expected result</w:t>
+            </w:r>
+          </w:p>
+        </w:tc>
+        <w:tc>
+          <w:tcPr>
+            <w:tcW w:w="7002" w:type="dxa"/>
+            <w:gridSpan w:val="2"/>
+            <w:vAlign w:val="center"/>
+          </w:tcPr>
+          <w:p>
+            <w:pPr>
+              <w:jc w:val="left"/>
+              <w:rPr>
+                <w:rFonts w:ascii="Times New Roman" w:eastAsia="Aptos" w:hAnsi="Times New Roman" w:cs="Times New Roman"/>
+                <w:b/>
+                <w:bCs/>
+              </w:rPr>
+            </w:pPr>
+            <w:r>
+              <w:rPr>
+                <w:rFonts w:ascii="Times New Roman" w:eastAsia="Aptos" w:hAnsi="Times New Roman" w:cs="Times New Roman"/>
+              </w:rPr>
+              <w:t>The KPI value must match the first value in the Top 10 chart</w:t>
+            </w:r>
+          </w:p>
+        </w:tc>
+      </w:tr>
+    </w:tbl>
+    <w:p>
+      <w:pPr>
+        <w:spacing w:line="240" w:lineRule="auto"/>
+        <w:rPr>
+          <w:rFonts w:ascii="Times New Roman" w:eastAsia="Aptos" w:hAnsi="Times New Roman" w:cs="Times New Roman"/>
+          <w:b/>
+          <w:bCs/>
+        </w:rPr>
+      </w:pPr>
+    </w:p>
+    <w:p>
+      <w:pPr>
+        <w:spacing w:before="360" w:after="80" w:line="240" w:lineRule="auto"/>
+        <w:outlineLvl w:val="0"/>
+        <w:rPr>
+          <w:rFonts w:ascii="Times New Roman" w:eastAsia="Times New Roman" w:hAnsi="Times New Roman" w:cs="Times New Roman"/>
+          <w:b/>
+          <w:bCs/>
+          <w:color w:val="0F4761"/>
+          <w:sz w:val="40"/>
+          <w:szCs w:val="40"/>
+        </w:rPr>
+      </w:pPr>
+      <w:r>
+        <w:rPr>
+          <w:rFonts w:ascii="Times New Roman" w:eastAsia="Times New Roman" w:hAnsi="Times New Roman" w:cs="Times New Roman"/>
+          <w:b/>
+          <w:bCs/>
+          <w:color w:val="0F4761"/>
+          <w:sz w:val="40"/>
+          <w:szCs w:val="40"/>
+        </w:rPr>
+        <w:t>Test log</w:t>
+      </w:r>
+    </w:p>
+    <w:tbl>
+      <w:tblPr>
+        <w:tblStyle w:val="TableGrid"/>
+        <w:tblW w:w="0" w:type="auto"/>
+        <w:tblLook w:val="04A0" w:firstRow="1" w:lastRow="0" w:firstColumn="1" w:lastColumn="0" w:noHBand="0" w:noVBand="1"/>
+      </w:tblPr>
+      <w:tblGrid>
+        <w:gridCol w:w="562"/>
+        <w:gridCol w:w="1310"/>
+        <w:gridCol w:w="1667"/>
+        <w:gridCol w:w="2944"/>
+        <w:gridCol w:w="1137"/>
+        <w:gridCol w:w="1396"/>
+      </w:tblGrid>
+      <w:tr>
+        <w:tc>
+          <w:tcPr>
+            <w:tcW w:w="562" w:type="dxa"/>
+          </w:tcPr>
+          <w:p>
+            <w:pPr>
+              <w:rPr>
+                <w:rFonts w:ascii="Times New Roman" w:eastAsia="Aptos" w:hAnsi="Times New Roman" w:cs="Times New Roman"/>
+                <w:b/>
+                <w:bCs/>
+              </w:rPr>
+            </w:pPr>
+            <w:r>
+              <w:rPr>
+                <w:rFonts w:ascii="Times New Roman" w:eastAsia="Aptos" w:hAnsi="Times New Roman" w:cs="Times New Roman"/>
+                <w:b/>
+                <w:bCs/>
+              </w:rPr>
+              <w:t>TC</w:t>
+            </w:r>
+          </w:p>
+        </w:tc>
+        <w:tc>
+          <w:tcPr>
+            <w:tcW w:w="1310" w:type="dxa"/>
+          </w:tcPr>
+          <w:p>
+            <w:pPr>
+              <w:rPr>
+                <w:rFonts w:ascii="Times New Roman" w:eastAsia="Aptos" w:hAnsi="Times New Roman" w:cs="Times New Roman"/>
+                <w:b/>
+                <w:bCs/>
+              </w:rPr>
+            </w:pPr>
+            <w:r>
+              <w:rPr>
+                <w:rFonts w:ascii="Times New Roman" w:eastAsia="Aptos" w:hAnsi="Times New Roman" w:cs="Times New Roman"/>
+                <w:b/>
+                <w:bCs/>
+              </w:rPr>
+              <w:t>Date</w:t>
+            </w:r>
+          </w:p>
+        </w:tc>
+        <w:tc>
+          <w:tcPr>
+            <w:tcW w:w="1667" w:type="dxa"/>
+          </w:tcPr>
+          <w:p>
+            <w:pPr>
+              <w:rPr>
+                <w:rFonts w:ascii="Times New Roman" w:eastAsia="Aptos" w:hAnsi="Times New Roman" w:cs="Times New Roman"/>
+                <w:b/>
+                <w:bCs/>
+              </w:rPr>
+            </w:pPr>
+            <w:r>
+              <w:rPr>
+                <w:rFonts w:ascii="Times New Roman" w:eastAsia="Aptos" w:hAnsi="Times New Roman" w:cs="Times New Roman"/>
+                <w:b/>
+                <w:bCs/>
+              </w:rPr>
+              <w:t>Executed by</w:t>
+            </w:r>
+          </w:p>
+        </w:tc>
+        <w:tc>
+          <w:tcPr>
+            <w:tcW w:w="2944" w:type="dxa"/>
+          </w:tcPr>
+          <w:p>
+            <w:pPr>
+              <w:rPr>
+                <w:rFonts w:ascii="Times New Roman" w:eastAsia="Aptos" w:hAnsi="Times New Roman" w:cs="Times New Roman"/>
+                <w:b/>
+                <w:bCs/>
+              </w:rPr>
+            </w:pPr>
+            <w:r>
+              <w:rPr>
+                <w:rFonts w:ascii="Times New Roman" w:eastAsia="Aptos" w:hAnsi="Times New Roman" w:cs="Times New Roman"/>
+                <w:b/>
+                <w:bCs/>
+              </w:rPr>
+              <w:t>Actual result</w:t>
+            </w:r>
+          </w:p>
+        </w:tc>
+        <w:tc>
+          <w:tcPr>
+            <w:tcW w:w="1137" w:type="dxa"/>
+          </w:tcPr>
+          <w:p>
+            <w:pPr>
+              <w:rPr>
+                <w:rFonts w:ascii="Times New Roman" w:eastAsia="Aptos" w:hAnsi="Times New Roman" w:cs="Times New Roman"/>
+                <w:b/>
+                <w:bCs/>
+              </w:rPr>
+            </w:pPr>
+            <w:r>
+              <w:rPr>
+                <w:rFonts w:ascii="Times New Roman" w:eastAsia="Aptos" w:hAnsi="Times New Roman" w:cs="Times New Roman"/>
+                <w:b/>
+                <w:bCs/>
+              </w:rPr>
+              <w:t>Pass/Fail</w:t>
+            </w:r>
+          </w:p>
+        </w:tc>
+        <w:tc>
+          <w:tcPr>
+            <w:tcW w:w="1396" w:type="dxa"/>
+          </w:tcPr>
+          <w:p>
+            <w:pPr>
+              <w:rPr>
+                <w:rFonts w:ascii="Times New Roman" w:eastAsia="Aptos" w:hAnsi="Times New Roman" w:cs="Times New Roman"/>
+                <w:b/>
+                <w:bCs/>
+              </w:rPr>
+            </w:pPr>
+            <w:r>
+              <w:rPr>
+                <w:rFonts w:ascii="Times New Roman" w:eastAsia="Aptos" w:hAnsi="Times New Roman" w:cs="Times New Roman"/>
+                <w:b/>
+                <w:bCs/>
+              </w:rPr>
+              <w:t>Notes</w:t>
+            </w:r>
+          </w:p>
+        </w:tc>
+      </w:tr>
+      <w:tr>
+        <w:tc>
+          <w:tcPr>
+            <w:tcW w:w="562" w:type="dxa"/>
+          </w:tcPr>
+          <w:p>
+            <w:pPr>
+              <w:rPr>
+                <w:rFonts w:ascii="Times New Roman" w:eastAsia="Aptos" w:hAnsi="Times New Roman" w:cs="Times New Roman"/>
+              </w:rPr>
+            </w:pPr>
+            <w:r>
+              <w:rPr>
+                <w:rFonts w:ascii="Times New Roman" w:eastAsia="Aptos" w:hAnsi="Times New Roman" w:cs="Times New Roman"/>
+              </w:rPr>
+              <w:t>01</w:t>
+            </w:r>
+          </w:p>
+        </w:tc>
+        <w:tc>
+          <w:tcPr>
+            <w:tcW w:w="1310" w:type="dxa"/>
+          </w:tcPr>
+          <w:p>
+            <w:pPr>
+              <w:rPr>
+                <w:rFonts w:ascii="Times New Roman" w:eastAsia="Aptos" w:hAnsi="Times New Roman" w:cs="Times New Roman"/>
+              </w:rPr>
+            </w:pPr>
+            <w:r>
+              <w:rPr>
+                <w:rFonts w:ascii="Times New Roman" w:eastAsia="Aptos" w:hAnsi="Times New Roman" w:cs="Times New Roman"/>
+              </w:rPr>
+              <w:t>21/04/2026</w:t>
+            </w:r>
+          </w:p>
+        </w:tc>
+        <w:tc>
+          <w:tcPr>
+            <w:tcW w:w="1667" w:type="dxa"/>
+          </w:tcPr>
+          <w:p>
+            <w:pPr>
+              <w:rPr>
+                <w:rFonts w:ascii="Times New Roman" w:eastAsia="Aptos" w:hAnsi="Times New Roman" w:cs="Times New Roman"/>
+              </w:rPr>
+            </w:pPr>
+            <w:r>
+              <w:rPr>
+                <w:rFonts w:ascii="Times New Roman" w:eastAsia="Aptos" w:hAnsi="Times New Roman" w:cs="Times New Roman"/>
+              </w:rPr>
+              <w:t>Shamla Aqthar</w:t>
+            </w:r>
+          </w:p>
+        </w:tc>
+        <w:tc>
+          <w:tcPr>
+            <w:tcW w:w="2944" w:type="dxa"/>
+          </w:tcPr>
+          <w:p>
+            <w:pPr>
+              <w:rPr>
+                <w:rFonts w:ascii="Times New Roman" w:eastAsia="Aptos" w:hAnsi="Times New Roman" w:cs="Times New Roman"/>
+              </w:rPr>
+            </w:pPr>
+            <w:r>
+              <w:rPr>
+                <w:rFonts w:ascii="Times New Roman" w:eastAsia="Aptos" w:hAnsi="Times New Roman" w:cs="Times New Roman"/>
+              </w:rPr>
+              <w:t>Dashboard successfully filtered. The KPI updated instantly. Charts correctly started at 2014.</w:t>
+            </w:r>
+          </w:p>
+        </w:tc>
+        <w:tc>
+          <w:tcPr>
+            <w:tcW w:w="1137" w:type="dxa"/>
+          </w:tcPr>
+          <w:p>
+            <w:pPr>
+              <w:rPr>
+                <w:rFonts w:ascii="Times New Roman" w:eastAsia="Aptos" w:hAnsi="Times New Roman" w:cs="Times New Roman"/>
+              </w:rPr>
+            </w:pPr>
+            <w:r>
+              <w:rPr>
+                <w:rFonts w:ascii="Times New Roman" w:eastAsia="Aptos" w:hAnsi="Times New Roman" w:cs="Times New Roman"/>
+              </w:rPr>
+              <w:t>Pass</w:t>
+            </w:r>
+          </w:p>
+        </w:tc>
+        <w:tc>
+          <w:tcPr>
+            <w:tcW w:w="1396" w:type="dxa"/>
+          </w:tcPr>
+          <w:p>
+            <w:pPr>
+              <w:rPr>
+                <w:rFonts w:ascii="Times New Roman" w:eastAsia="Aptos" w:hAnsi="Times New Roman" w:cs="Times New Roman"/>
+              </w:rPr>
+            </w:pPr>
+          </w:p>
+        </w:tc>
+      </w:tr>
+      <w:tr>
+        <w:tc>
+          <w:tcPr>
+            <w:tcW w:w="562" w:type="dxa"/>
+          </w:tcPr>
+          <w:p>
+            <w:pPr>
+              <w:rPr>
+                <w:rFonts w:ascii="Times New Roman" w:eastAsia="Aptos" w:hAnsi="Times New Roman" w:cs="Times New Roman"/>
+              </w:rPr>
+            </w:pPr>
+            <w:r>
+              <w:rPr>
+                <w:rFonts w:ascii="Times New Roman" w:eastAsia="Aptos" w:hAnsi="Times New Roman" w:cs="Times New Roman"/>
+              </w:rPr>
+              <w:t>02</w:t>
+            </w:r>
+          </w:p>
+        </w:tc>
+        <w:tc>
+          <w:tcPr>
+            <w:tcW w:w="1310" w:type="dxa"/>
+          </w:tcPr>
+          <w:p>
+            <w:pPr>
+              <w:rPr>
+                <w:rFonts w:ascii="Times New Roman" w:eastAsia="Aptos" w:hAnsi="Times New Roman" w:cs="Times New Roman"/>
+              </w:rPr>
+            </w:pPr>
+            <w:r>
+              <w:rPr>
+                <w:rFonts w:ascii="Times New Roman" w:eastAsia="Aptos" w:hAnsi="Times New Roman" w:cs="Times New Roman"/>
+              </w:rPr>
+              <w:t>21/04/2026</w:t>
+            </w:r>
+          </w:p>
+        </w:tc>
+        <w:tc>
+          <w:tcPr>
+            <w:tcW w:w="1667" w:type="dxa"/>
+          </w:tcPr>
+          <w:p>
+            <w:pPr>
+              <w:rPr>
+                <w:rFonts w:ascii="Times New Roman" w:eastAsia="Aptos" w:hAnsi="Times New Roman" w:cs="Times New Roman"/>
+              </w:rPr>
+            </w:pPr>
+            <w:r>
+              <w:rPr>
+                <w:rFonts w:ascii="Times New Roman" w:eastAsia="Aptos" w:hAnsi="Times New Roman" w:cs="Times New Roman"/>
+              </w:rPr>
+              <w:t>Shamla Aqthar</w:t>
+            </w:r>
+          </w:p>
+        </w:tc>
+        <w:tc>
+          <w:tcPr>
+            <w:tcW w:w="2944" w:type="dxa"/>
+          </w:tcPr>
+          <w:p>
+            <w:pPr>
+              <w:rPr>
+                <w:rFonts w:ascii="Times New Roman" w:eastAsia="Aptos" w:hAnsi="Times New Roman" w:cs="Times New Roman"/>
+              </w:rPr>
+            </w:pPr>
+            <w:r>
+              <w:rPr>
+                <w:rFonts w:ascii="Times New Roman" w:eastAsia="Aptos" w:hAnsi="Times New Roman" w:cs="Times New Roman"/>
+              </w:rPr>
+              <w:t>Selecting ‘flood’ removed all other lines and bars. Top hazard type displayed correctly as ‘Flood’</w:t>
+            </w:r>
+          </w:p>
+        </w:tc>
+        <w:tc>
+          <w:tcPr>
+            <w:tcW w:w="1137" w:type="dxa"/>
+          </w:tcPr>
+          <w:p>
+            <w:pPr>
+              <w:rPr>
+                <w:rFonts w:ascii="Times New Roman" w:eastAsia="Aptos" w:hAnsi="Times New Roman" w:cs="Times New Roman"/>
+              </w:rPr>
+            </w:pPr>
+            <w:r>
+              <w:rPr>
+                <w:rFonts w:ascii="Times New Roman" w:eastAsia="Aptos" w:hAnsi="Times New Roman" w:cs="Times New Roman"/>
+              </w:rPr>
+              <w:t>Pass</w:t>
+            </w:r>
+          </w:p>
+        </w:tc>
+        <w:tc>
+          <w:tcPr>
+            <w:tcW w:w="1396" w:type="dxa"/>
+          </w:tcPr>
+          <w:p>
+            <w:pPr>
+              <w:rPr>
+                <w:rFonts w:ascii="Times New Roman" w:eastAsia="Aptos" w:hAnsi="Times New Roman" w:cs="Times New Roman"/>
+              </w:rPr>
+            </w:pPr>
+          </w:p>
+        </w:tc>
+      </w:tr>
+      <w:tr>
+        <w:tc>
+          <w:tcPr>
+            <w:tcW w:w="562" w:type="dxa"/>
+          </w:tcPr>
+          <w:p>
+            <w:pPr>
+              <w:rPr>
+                <w:rFonts w:ascii="Times New Roman" w:eastAsia="Aptos" w:hAnsi="Times New Roman" w:cs="Times New Roman"/>
+              </w:rPr>
+            </w:pPr>
+            <w:r>
+              <w:rPr>
+                <w:rFonts w:ascii="Times New Roman" w:eastAsia="Aptos" w:hAnsi="Times New Roman" w:cs="Times New Roman"/>
+              </w:rPr>
+              <w:t>03</w:t>
+            </w:r>
+          </w:p>
+        </w:tc>
+        <w:tc>
+          <w:tcPr>
+            <w:tcW w:w="1310" w:type="dxa"/>
+          </w:tcPr>
+          <w:p>
+            <w:pPr>
+              <w:rPr>
+                <w:rFonts w:ascii="Times New Roman" w:eastAsia="Aptos" w:hAnsi="Times New Roman" w:cs="Times New Roman"/>
+              </w:rPr>
+            </w:pPr>
+            <w:r>
+              <w:rPr>
+                <w:rFonts w:ascii="Times New Roman" w:eastAsia="Aptos" w:hAnsi="Times New Roman" w:cs="Times New Roman"/>
+              </w:rPr>
+              <w:t>22/04/2026</w:t>
+            </w:r>
+          </w:p>
+        </w:tc>
+        <w:tc>
+          <w:tcPr>
+            <w:tcW w:w="1667" w:type="dxa"/>
+          </w:tcPr>
+          <w:p>
+            <w:pPr>
+              <w:rPr>
+                <w:rFonts w:ascii="Times New Roman" w:eastAsia="Aptos" w:hAnsi="Times New Roman" w:cs="Times New Roman"/>
+              </w:rPr>
+            </w:pPr>
+            <w:r>
+              <w:rPr>
+                <w:rFonts w:ascii="Times New Roman" w:eastAsia="Aptos" w:hAnsi="Times New Roman" w:cs="Times New Roman"/>
+              </w:rPr>
+              <w:t>Shamla Aqthar</w:t>
+            </w:r>
+          </w:p>
+        </w:tc>
+        <w:tc>
+          <w:tcPr>
+            <w:tcW w:w="2944" w:type="dxa"/>
+          </w:tcPr>
+          <w:p>
+            <w:pPr>
+              <w:rPr>
+                <w:rFonts w:ascii="Times New Roman" w:eastAsia="Aptos" w:hAnsi="Times New Roman" w:cs="Times New Roman"/>
+              </w:rPr>
+            </w:pPr>
+            <w:r>
+              <w:rPr>
+                <w:rFonts w:ascii="Times New Roman" w:eastAsia="Aptos" w:hAnsi="Times New Roman" w:cs="Times New Roman"/>
+              </w:rPr>
+              <w:t>Legend was successfully limited to just the top 5 hazard types and removed visual noise by identifying each type clearly.</w:t>
+            </w:r>
+          </w:p>
+        </w:tc>
+        <w:tc>
+          <w:tcPr>
+            <w:tcW w:w="1137" w:type="dxa"/>
+          </w:tcPr>
+          <w:p>
+            <w:pPr>
+              <w:rPr>
+                <w:rFonts w:ascii="Times New Roman" w:eastAsia="Aptos" w:hAnsi="Times New Roman" w:cs="Times New Roman"/>
+              </w:rPr>
+            </w:pPr>
+            <w:r>
+              <w:rPr>
+                <w:rFonts w:ascii="Times New Roman" w:eastAsia="Aptos" w:hAnsi="Times New Roman" w:cs="Times New Roman"/>
+              </w:rPr>
+              <w:t>Pass</w:t>
+            </w:r>
+          </w:p>
+        </w:tc>
+        <w:tc>
+          <w:tcPr>
+            <w:tcW w:w="1396" w:type="dxa"/>
+          </w:tcPr>
+          <w:p>
+            <w:pPr>
+              <w:rPr>
+                <w:rFonts w:ascii="Times New Roman" w:eastAsia="Aptos" w:hAnsi="Times New Roman" w:cs="Times New Roman"/>
+              </w:rPr>
+            </w:pPr>
+          </w:p>
+        </w:tc>
+      </w:tr>
+      <w:tr>
+        <w:tc>
+          <w:tcPr>
+            <w:tcW w:w="562" w:type="dxa"/>
+          </w:tcPr>
+          <w:p>
+            <w:pPr>
+              <w:rPr>
+                <w:rFonts w:ascii="Times New Roman" w:eastAsia="Aptos" w:hAnsi="Times New Roman" w:cs="Times New Roman"/>
+              </w:rPr>
+            </w:pPr>
+            <w:r>
+              <w:rPr>
+                <w:rFonts w:ascii="Times New Roman" w:eastAsia="Aptos" w:hAnsi="Times New Roman" w:cs="Times New Roman"/>
+              </w:rPr>
+              <w:t>04</w:t>
+            </w:r>
+          </w:p>
+        </w:tc>
+        <w:tc>
+          <w:tcPr>
+            <w:tcW w:w="1310" w:type="dxa"/>
+          </w:tcPr>
+          <w:p>
+            <w:pPr>
+              <w:rPr>
+                <w:rFonts w:ascii="Times New Roman" w:eastAsia="Aptos" w:hAnsi="Times New Roman" w:cs="Times New Roman"/>
+              </w:rPr>
+            </w:pPr>
+            <w:r>
+              <w:rPr>
+                <w:rFonts w:ascii="Times New Roman" w:eastAsia="Aptos" w:hAnsi="Times New Roman" w:cs="Times New Roman"/>
+              </w:rPr>
+              <w:t>22/04/2026</w:t>
+            </w:r>
+          </w:p>
+        </w:tc>
+        <w:tc>
+          <w:tcPr>
+            <w:tcW w:w="1667" w:type="dxa"/>
+          </w:tcPr>
+          <w:p>
+            <w:pPr>
+              <w:rPr>
+                <w:rFonts w:ascii="Times New Roman" w:eastAsia="Aptos" w:hAnsi="Times New Roman" w:cs="Times New Roman"/>
+              </w:rPr>
+            </w:pPr>
+            <w:r>
+              <w:rPr>
+                <w:rFonts w:ascii="Times New Roman" w:eastAsia="Aptos" w:hAnsi="Times New Roman" w:cs="Times New Roman"/>
+              </w:rPr>
+              <w:t>Shamla Aqthar</w:t>
+            </w:r>
+          </w:p>
+        </w:tc>
+        <w:tc>
+          <w:tcPr>
+            <w:tcW w:w="2944" w:type="dxa"/>
+          </w:tcPr>
+          <w:p>
+            <w:pPr>
+              <w:rPr>
+                <w:rFonts w:ascii="Times New Roman" w:eastAsia="Aptos" w:hAnsi="Times New Roman" w:cs="Times New Roman"/>
+              </w:rPr>
+            </w:pPr>
+            <w:r>
+              <w:rPr>
+                <w:rFonts w:ascii="Times New Roman" w:eastAsia="Aptos" w:hAnsi="Times New Roman" w:cs="Times New Roman"/>
+              </w:rPr>
+              <w:t>Hovering over Sri Lanka correctly displayed the country name and new displacement values in a tooltip.</w:t>
+            </w:r>
+          </w:p>
+        </w:tc>
+        <w:tc>
+          <w:tcPr>
+            <w:tcW w:w="1137" w:type="dxa"/>
+          </w:tcPr>
+          <w:p>
+            <w:pPr>
+              <w:rPr>
+                <w:rFonts w:ascii="Times New Roman" w:eastAsia="Aptos" w:hAnsi="Times New Roman" w:cs="Times New Roman"/>
+              </w:rPr>
+            </w:pPr>
+            <w:r>
+              <w:rPr>
+                <w:rFonts w:ascii="Times New Roman" w:eastAsia="Aptos" w:hAnsi="Times New Roman" w:cs="Times New Roman"/>
+              </w:rPr>
+              <w:t xml:space="preserve">Pass </w:t>
+            </w:r>
+          </w:p>
+        </w:tc>
+        <w:tc>
+          <w:tcPr>
+            <w:tcW w:w="1396" w:type="dxa"/>
+          </w:tcPr>
+          <w:p>
+            <w:pPr>
+              <w:rPr>
+                <w:rFonts w:ascii="Times New Roman" w:eastAsia="Aptos" w:hAnsi="Times New Roman" w:cs="Times New Roman"/>
+              </w:rPr>
+            </w:pPr>
+          </w:p>
+        </w:tc>
+      </w:tr>
+      <w:tr>
+        <w:tc>
+          <w:tcPr>
+            <w:tcW w:w="562" w:type="dxa"/>
+          </w:tcPr>
+          <w:p>
+            <w:pPr>
+              <w:rPr>
+                <w:rFonts w:ascii="Times New Roman" w:eastAsia="Aptos" w:hAnsi="Times New Roman" w:cs="Times New Roman"/>
+              </w:rPr>
+            </w:pPr>
+            <w:r>
+              <w:rPr>
+                <w:rFonts w:ascii="Times New Roman" w:eastAsia="Aptos" w:hAnsi="Times New Roman" w:cs="Times New Roman"/>
+              </w:rPr>
+              <w:t>05</w:t>
+            </w:r>
+          </w:p>
+        </w:tc>
+        <w:tc>
+          <w:tcPr>
+            <w:tcW w:w="1310" w:type="dxa"/>
+          </w:tcPr>
+          <w:p>
+            <w:pPr>
+              <w:rPr>
+                <w:rFonts w:ascii="Times New Roman" w:eastAsia="Aptos" w:hAnsi="Times New Roman" w:cs="Times New Roman"/>
+              </w:rPr>
+            </w:pPr>
+            <w:r>
+              <w:rPr>
+                <w:rFonts w:ascii="Times New Roman" w:eastAsia="Aptos" w:hAnsi="Times New Roman" w:cs="Times New Roman"/>
+              </w:rPr>
+              <w:t>22/04/2026</w:t>
+            </w:r>
+          </w:p>
+        </w:tc>
+        <w:tc>
+          <w:tcPr>
+            <w:tcW w:w="1667" w:type="dxa"/>
+          </w:tcPr>
+          <w:p>
+            <w:pPr>
+              <w:rPr>
+                <w:rFonts w:ascii="Times New Roman" w:eastAsia="Aptos" w:hAnsi="Times New Roman" w:cs="Times New Roman"/>
+              </w:rPr>
+            </w:pPr>
+            <w:r>
+              <w:rPr>
+                <w:rFonts w:ascii="Times New Roman" w:eastAsia="Aptos" w:hAnsi="Times New Roman" w:cs="Times New Roman"/>
+              </w:rPr>
+              <w:t>Shamla Aqthar</w:t>
+            </w:r>
+          </w:p>
+        </w:tc>
+        <w:tc>
+          <w:tcPr>
+            <w:tcW w:w="2944" w:type="dxa"/>
+          </w:tcPr>
+          <w:p>
+            <w:pPr>
+              <w:rPr>
+                <w:rFonts w:ascii="Times New Roman" w:eastAsia="Aptos" w:hAnsi="Times New Roman" w:cs="Times New Roman"/>
+              </w:rPr>
+            </w:pPr>
+            <w:r>
+              <w:rPr>
+                <w:rFonts w:ascii="Times New Roman" w:eastAsia="Aptos" w:hAnsi="Times New Roman" w:cs="Times New Roman"/>
+              </w:rPr>
+              <w:t>The most affected country KPI perfectly match the first bar in the top 10 bar chart.</w:t>
+            </w:r>
+          </w:p>
+        </w:tc>
+        <w:tc>
+          <w:tcPr>
+            <w:tcW w:w="1137" w:type="dxa"/>
+          </w:tcPr>
+          <w:p>
+            <w:pPr>
+              <w:rPr>
+                <w:rFonts w:ascii="Times New Roman" w:eastAsia="Aptos" w:hAnsi="Times New Roman" w:cs="Times New Roman"/>
+              </w:rPr>
+            </w:pPr>
+            <w:r>
+              <w:rPr>
+                <w:rFonts w:ascii="Times New Roman" w:eastAsia="Aptos" w:hAnsi="Times New Roman" w:cs="Times New Roman"/>
+              </w:rPr>
+              <w:t xml:space="preserve">Pass </w:t>
+            </w:r>
+          </w:p>
+        </w:tc>
+        <w:tc>
+          <w:tcPr>
+            <w:tcW w:w="1396" w:type="dxa"/>
+          </w:tcPr>
+          <w:p>
+            <w:pPr>
+              <w:rPr>
+                <w:rFonts w:ascii="Times New Roman" w:eastAsia="Aptos" w:hAnsi="Times New Roman" w:cs="Times New Roman"/>
+              </w:rPr>
+            </w:pPr>
+          </w:p>
+        </w:tc>
+      </w:tr>
+    </w:tbl>
+    <w:p>
+      <w:pPr>
+        <w:spacing w:line="240" w:lineRule="auto"/>
+        <w:rPr>
+          <w:rFonts w:ascii="Times New Roman" w:eastAsia="Aptos" w:hAnsi="Times New Roman" w:cs="Times New Roman"/>
+          <w:b/>
+          <w:bCs/>
+        </w:rPr>
+      </w:pPr>
+    </w:p>
+    <w:p>
+      <w:pPr>
+        <w:spacing w:line="240" w:lineRule="auto"/>
+        <w:rPr>
+          <w:rFonts w:ascii="Times New Roman" w:hAnsi="Times New Roman" w:cs="Times New Roman"/>
+        </w:rPr>
+      </w:pPr>
+    </w:p>
+    <w:p>
+      <w:pPr>
+        <w:spacing w:line="240" w:lineRule="auto"/>
         <w:rPr>
           <w:rFonts w:ascii="Times New Roman" w:hAnsi="Times New Roman" w:cs="Times New Roman"/>
         </w:rPr>

</xml_diff>

<commit_message>
Report - Content addition and adjustments
</commit_message>
<xml_diff>
--- a/w2149479_ShamlaAqthar_Report.docx
+++ b/w2149479_ShamlaAqthar_Report.docx
@@ -108,7 +108,7 @@
           <w:noProof/>
         </w:rPr>
         <w:drawing>
-          <wp:anchor distT="0" distB="0" distL="114300" distR="114300" simplePos="0" relativeHeight="251660288" behindDoc="0" locked="0" layoutInCell="1" allowOverlap="1" wp14:anchorId="27BD4142" wp14:editId="5FC34893">
+          <wp:anchor distT="0" distB="0" distL="114300" distR="114300" simplePos="0" relativeHeight="251660288" behindDoc="0" locked="0" layoutInCell="1" allowOverlap="1" wp14:anchorId="27BD4142" wp14:editId="7EDC99B7">
             <wp:simplePos x="0" y="0"/>
             <wp:positionH relativeFrom="column">
               <wp:posOffset>-152400</wp:posOffset>
@@ -496,6 +496,7 @@
     </w:p>
     <w:p>
       <w:pPr>
+        <w:spacing w:line="720" w:lineRule="auto"/>
         <w:rPr>
           <w:rFonts w:ascii="Times New Roman" w:hAnsi="Times New Roman" w:cs="Times New Roman"/>
           <w:sz w:val="28"/>
@@ -531,6 +532,7 @@
     </w:p>
     <w:p>
       <w:pPr>
+        <w:spacing w:line="720" w:lineRule="auto"/>
         <w:rPr>
           <w:rFonts w:ascii="Times New Roman" w:hAnsi="Times New Roman" w:cs="Times New Roman"/>
           <w:sz w:val="28"/>
@@ -553,7 +555,7 @@
           <w:sz w:val="28"/>
           <w:szCs w:val="28"/>
         </w:rPr>
-        <w:t xml:space="preserve"> 20241956</w:t>
+        <w:t xml:space="preserve"> </w:t>
       </w:r>
       <w:r>
         <w:rPr>
@@ -561,34 +563,35 @@
           <w:sz w:val="28"/>
           <w:szCs w:val="28"/>
         </w:rPr>
-        <w:tab/>
-      </w:r>
-    </w:p>
-    <w:p>
-      <w:pPr>
+        <w:t>w2149479 / 20241956</w:t>
+      </w:r>
+      <w:r>
         <w:rPr>
           <w:rFonts w:ascii="Times New Roman" w:hAnsi="Times New Roman" w:cs="Times New Roman"/>
           <w:sz w:val="28"/>
           <w:szCs w:val="28"/>
         </w:rPr>
-      </w:pPr>
-      <w:r>
-        <w:rPr>
-          <w:rFonts w:ascii="Times New Roman" w:hAnsi="Times New Roman" w:cs="Times New Roman"/>
-          <w:b/>
-          <w:bCs/>
+        <w:tab/>
+      </w:r>
+    </w:p>
+    <w:p>
+      <w:pPr>
+        <w:spacing w:line="720" w:lineRule="auto"/>
+        <w:rPr>
+          <w:rFonts w:ascii="Times New Roman" w:hAnsi="Times New Roman" w:cs="Times New Roman"/>
           <w:sz w:val="28"/>
           <w:szCs w:val="28"/>
         </w:rPr>
-        <w:t>Dataset:</w:t>
-      </w:r>
-      <w:r>
-        <w:rPr>
-          <w:rFonts w:ascii="Times New Roman" w:hAnsi="Times New Roman" w:cs="Times New Roman"/>
+      </w:pPr>
+      <w:r>
+        <w:rPr>
+          <w:rFonts w:ascii="Times New Roman" w:hAnsi="Times New Roman" w:cs="Times New Roman"/>
+          <w:b/>
+          <w:bCs/>
           <w:sz w:val="28"/>
           <w:szCs w:val="28"/>
         </w:rPr>
-        <w:t xml:space="preserve"> Internal displacements (new displacements) associated with disasters</w:t>
+        <w:t>Dataset:</w:t>
       </w:r>
       <w:r>
         <w:rPr>
@@ -596,15 +599,14 @@
           <w:sz w:val="28"/>
           <w:szCs w:val="28"/>
         </w:rPr>
-        <w:tab/>
-      </w:r>
-    </w:p>
-    <w:p>
-      <w:pPr>
-        <w:rPr>
-          <w:rFonts w:ascii="Times New Roman" w:hAnsi="Times New Roman" w:cs="Times New Roman"/>
-          <w:b/>
-          <w:bCs/>
+        <w:t xml:space="preserve"> Internal displacements (new displacements) associated with disasters</w:t>
+      </w:r>
+    </w:p>
+    <w:p>
+      <w:pPr>
+        <w:spacing w:line="720" w:lineRule="auto"/>
+        <w:rPr>
+          <w:rFonts w:ascii="Times New Roman" w:hAnsi="Times New Roman" w:cs="Times New Roman"/>
           <w:sz w:val="28"/>
           <w:szCs w:val="28"/>
         </w:rPr>
@@ -617,11 +619,9 @@
           <w:sz w:val="28"/>
           <w:szCs w:val="28"/>
         </w:rPr>
-        <w:t>Link to Video presentation:</w:t>
-      </w:r>
-    </w:p>
-    <w:p>
-      <w:pPr>
+        <w:t xml:space="preserve">Link to </w:t>
+      </w:r>
+      <w:r>
         <w:rPr>
           <w:rFonts w:ascii="Times New Roman" w:hAnsi="Times New Roman" w:cs="Times New Roman"/>
           <w:b/>
@@ -629,7 +629,8 @@
           <w:sz w:val="28"/>
           <w:szCs w:val="28"/>
         </w:rPr>
-      </w:pPr>
+        <w:t>v</w:t>
+      </w:r>
       <w:r>
         <w:rPr>
           <w:rFonts w:ascii="Times New Roman" w:hAnsi="Times New Roman" w:cs="Times New Roman"/>
@@ -638,10 +639,12 @@
           <w:sz w:val="28"/>
           <w:szCs w:val="28"/>
         </w:rPr>
-        <w:t xml:space="preserve">Link to </w:t>
-      </w:r>
-      <w:proofErr w:type="spellStart"/>
-      <w:r>
+        <w:t>ideo presentation:</w:t>
+      </w:r>
+    </w:p>
+    <w:p>
+      <w:pPr>
+        <w:spacing w:line="720" w:lineRule="auto"/>
         <w:rPr>
           <w:rFonts w:ascii="Times New Roman" w:hAnsi="Times New Roman" w:cs="Times New Roman"/>
           <w:b/>
@@ -649,9 +652,7 @@
           <w:sz w:val="28"/>
           <w:szCs w:val="28"/>
         </w:rPr>
-        <w:t>Streamlit</w:t>
-      </w:r>
-      <w:proofErr w:type="spellEnd"/>
+      </w:pPr>
       <w:r>
         <w:rPr>
           <w:rFonts w:ascii="Times New Roman" w:hAnsi="Times New Roman" w:cs="Times New Roman"/>
@@ -660,8 +661,9 @@
           <w:sz w:val="28"/>
           <w:szCs w:val="28"/>
         </w:rPr>
-        <w:t xml:space="preserve"> app:</w:t>
-      </w:r>
+        <w:t xml:space="preserve">Link to </w:t>
+      </w:r>
+      <w:proofErr w:type="spellStart"/>
       <w:r>
         <w:rPr>
           <w:rFonts w:ascii="Times New Roman" w:hAnsi="Times New Roman" w:cs="Times New Roman"/>
@@ -670,8 +672,9 @@
           <w:sz w:val="28"/>
           <w:szCs w:val="28"/>
         </w:rPr>
-        <w:tab/>
-      </w:r>
+        <w:t>Streamlit</w:t>
+      </w:r>
+      <w:proofErr w:type="spellEnd"/>
       <w:r>
         <w:rPr>
           <w:rFonts w:ascii="Times New Roman" w:hAnsi="Times New Roman" w:cs="Times New Roman"/>
@@ -680,11 +683,9 @@
           <w:sz w:val="28"/>
           <w:szCs w:val="28"/>
         </w:rPr>
-        <w:tab/>
-      </w:r>
-    </w:p>
-    <w:p>
-      <w:pPr>
+        <w:t xml:space="preserve"> app:</w:t>
+      </w:r>
+      <w:r>
         <w:rPr>
           <w:rFonts w:ascii="Times New Roman" w:hAnsi="Times New Roman" w:cs="Times New Roman"/>
           <w:b/>
@@ -692,7 +693,8 @@
           <w:sz w:val="28"/>
           <w:szCs w:val="28"/>
         </w:rPr>
-      </w:pPr>
+        <w:tab/>
+      </w:r>
       <w:r>
         <w:rPr>
           <w:rFonts w:ascii="Times New Roman" w:hAnsi="Times New Roman" w:cs="Times New Roman"/>
@@ -701,8 +703,129 @@
           <w:sz w:val="28"/>
           <w:szCs w:val="28"/>
         </w:rPr>
+        <w:tab/>
+      </w:r>
+    </w:p>
+    <w:p>
+      <w:pPr>
+        <w:spacing w:line="720" w:lineRule="auto"/>
+        <w:rPr>
+          <w:rFonts w:ascii="Times New Roman" w:hAnsi="Times New Roman" w:cs="Times New Roman"/>
+          <w:b/>
+          <w:bCs/>
+          <w:sz w:val="28"/>
+          <w:szCs w:val="28"/>
+        </w:rPr>
+      </w:pPr>
+      <w:r>
+        <w:rPr>
+          <w:rFonts w:ascii="Times New Roman" w:hAnsi="Times New Roman" w:cs="Times New Roman"/>
+          <w:b/>
+          <w:bCs/>
+          <w:sz w:val="28"/>
+          <w:szCs w:val="28"/>
+        </w:rPr>
         <w:t>Link to GitHub repository:</w:t>
       </w:r>
+    </w:p>
+    <w:p>
+      <w:pPr>
+        <w:rPr>
+          <w:rFonts w:ascii="Times New Roman" w:hAnsi="Times New Roman" w:cs="Times New Roman"/>
+          <w:b/>
+          <w:bCs/>
+          <w:sz w:val="28"/>
+          <w:szCs w:val="28"/>
+        </w:rPr>
+      </w:pPr>
+    </w:p>
+    <w:p>
+      <w:pPr>
+        <w:rPr>
+          <w:rFonts w:ascii="Times New Roman" w:hAnsi="Times New Roman" w:cs="Times New Roman"/>
+          <w:b/>
+          <w:bCs/>
+          <w:sz w:val="28"/>
+          <w:szCs w:val="28"/>
+        </w:rPr>
+      </w:pPr>
+    </w:p>
+    <w:p>
+      <w:pPr>
+        <w:rPr>
+          <w:rFonts w:ascii="Times New Roman" w:hAnsi="Times New Roman" w:cs="Times New Roman"/>
+          <w:b/>
+          <w:bCs/>
+          <w:sz w:val="28"/>
+          <w:szCs w:val="28"/>
+        </w:rPr>
+      </w:pPr>
+    </w:p>
+    <w:p>
+      <w:pPr>
+        <w:rPr>
+          <w:rFonts w:ascii="Times New Roman" w:hAnsi="Times New Roman" w:cs="Times New Roman"/>
+          <w:b/>
+          <w:bCs/>
+          <w:sz w:val="28"/>
+          <w:szCs w:val="28"/>
+        </w:rPr>
+      </w:pPr>
+    </w:p>
+    <w:p>
+      <w:pPr>
+        <w:rPr>
+          <w:rFonts w:ascii="Times New Roman" w:hAnsi="Times New Roman" w:cs="Times New Roman"/>
+          <w:b/>
+          <w:bCs/>
+          <w:sz w:val="28"/>
+          <w:szCs w:val="28"/>
+        </w:rPr>
+      </w:pPr>
+    </w:p>
+    <w:p>
+      <w:pPr>
+        <w:rPr>
+          <w:rFonts w:ascii="Times New Roman" w:hAnsi="Times New Roman" w:cs="Times New Roman"/>
+          <w:b/>
+          <w:bCs/>
+          <w:sz w:val="28"/>
+          <w:szCs w:val="28"/>
+        </w:rPr>
+      </w:pPr>
+    </w:p>
+    <w:p>
+      <w:pPr>
+        <w:rPr>
+          <w:rFonts w:ascii="Times New Roman" w:hAnsi="Times New Roman" w:cs="Times New Roman"/>
+          <w:b/>
+          <w:bCs/>
+          <w:sz w:val="28"/>
+          <w:szCs w:val="28"/>
+        </w:rPr>
+      </w:pPr>
+    </w:p>
+    <w:p>
+      <w:pPr>
+        <w:rPr>
+          <w:rFonts w:ascii="Times New Roman" w:hAnsi="Times New Roman" w:cs="Times New Roman"/>
+          <w:b/>
+          <w:bCs/>
+          <w:sz w:val="28"/>
+          <w:szCs w:val="28"/>
+        </w:rPr>
+      </w:pPr>
+    </w:p>
+    <w:p>
+      <w:pPr>
+        <w:rPr>
+          <w:rFonts w:ascii="Times New Roman" w:hAnsi="Times New Roman" w:cs="Times New Roman"/>
+          <w:b/>
+          <w:bCs/>
+          <w:sz w:val="28"/>
+          <w:szCs w:val="28"/>
+        </w:rPr>
+      </w:pPr>
     </w:p>
     <w:p>
       <w:pPr>
@@ -710,6 +833,7 @@
         <w:spacing w:line="360" w:lineRule="auto"/>
       </w:pPr>
       <w:r>
+        <w:lastRenderedPageBreak/>
         <w:t>Aims and Objectives</w:t>
       </w:r>
     </w:p>
@@ -723,8 +847,123 @@
       <w:r>
         <w:rPr>
           <w:rFonts w:ascii="Times New Roman" w:hAnsi="Times New Roman" w:cs="Times New Roman"/>
-        </w:rPr>
-        <w:t>The project aim is to develop an interactive data dashboard that analyses global disaster displacement trend, enabling users to better understand the scale, patterns and key drivers of human displacement based on climate and environmental risks</w:t>
+          <w:b/>
+          <w:bCs/>
+        </w:rPr>
+        <w:t>Dataset name:</w:t>
+      </w:r>
+      <w:r>
+        <w:rPr>
+          <w:rFonts w:ascii="Times New Roman" w:hAnsi="Times New Roman" w:cs="Times New Roman"/>
+          <w:sz w:val="28"/>
+          <w:szCs w:val="28"/>
+        </w:rPr>
+        <w:t xml:space="preserve"> </w:t>
+      </w:r>
+      <w:r>
+        <w:rPr>
+          <w:rFonts w:ascii="Times New Roman" w:hAnsi="Times New Roman" w:cs="Times New Roman"/>
+        </w:rPr>
+        <w:t>Internal displacements (new displacements) associated with disasters</w:t>
+      </w:r>
+    </w:p>
+    <w:p>
+      <w:pPr>
+        <w:spacing w:line="360" w:lineRule="auto"/>
+        <w:rPr>
+          <w:rFonts w:ascii="Times New Roman" w:hAnsi="Times New Roman" w:cs="Times New Roman"/>
+          <w:b/>
+          <w:bCs/>
+        </w:rPr>
+      </w:pPr>
+      <w:r>
+        <w:rPr>
+          <w:rFonts w:ascii="Times New Roman" w:hAnsi="Times New Roman" w:cs="Times New Roman"/>
+          <w:b/>
+          <w:bCs/>
+        </w:rPr>
+        <w:t>Dataset source link</w:t>
+      </w:r>
+      <w:r>
+        <w:rPr>
+          <w:rFonts w:ascii="Times New Roman" w:hAnsi="Times New Roman" w:cs="Times New Roman"/>
+          <w:b/>
+          <w:bCs/>
+        </w:rPr>
+        <w:t>:</w:t>
+      </w:r>
+      <w:r>
+        <w:rPr>
+          <w:rFonts w:ascii="Times New Roman" w:hAnsi="Times New Roman" w:cs="Times New Roman"/>
+          <w:b/>
+          <w:bCs/>
+        </w:rPr>
+        <w:t xml:space="preserve"> </w:t>
+      </w:r>
+      <w:hyperlink r:id="rId8" w:history="1">
+        <w:r>
+          <w:rPr>
+            <w:rStyle w:val="Hyperlink"/>
+            <w:rFonts w:ascii="Times New Roman" w:hAnsi="Times New Roman" w:cs="Times New Roman"/>
+          </w:rPr>
+          <w:t>https://data.humdata.org/dataset/idmc-internal-displacements-new-displacements-associated-with-disasters</w:t>
+        </w:r>
+      </w:hyperlink>
+      <w:r>
+        <w:rPr>
+          <w:rFonts w:ascii="Times New Roman" w:hAnsi="Times New Roman" w:cs="Times New Roman"/>
+        </w:rPr>
+        <w:t xml:space="preserve"> </w:t>
+      </w:r>
+    </w:p>
+    <w:p>
+      <w:pPr>
+        <w:spacing w:line="360" w:lineRule="auto"/>
+        <w:rPr>
+          <w:rFonts w:ascii="Times New Roman" w:hAnsi="Times New Roman" w:cs="Times New Roman"/>
+        </w:rPr>
+      </w:pPr>
+      <w:r>
+        <w:rPr>
+          <w:rFonts w:ascii="Times New Roman" w:hAnsi="Times New Roman" w:cs="Times New Roman"/>
+        </w:rPr>
+        <w:t>The</w:t>
+      </w:r>
+      <w:r>
+        <w:rPr>
+          <w:rFonts w:ascii="Times New Roman" w:hAnsi="Times New Roman" w:cs="Times New Roman"/>
+        </w:rPr>
+        <w:t xml:space="preserve"> </w:t>
+      </w:r>
+      <w:r>
+        <w:rPr>
+          <w:rFonts w:ascii="Times New Roman" w:hAnsi="Times New Roman" w:cs="Times New Roman"/>
+        </w:rPr>
+        <w:t xml:space="preserve">aim </w:t>
+      </w:r>
+      <w:r>
+        <w:rPr>
+          <w:rFonts w:ascii="Times New Roman" w:hAnsi="Times New Roman" w:cs="Times New Roman"/>
+        </w:rPr>
+        <w:t xml:space="preserve">of this project </w:t>
+      </w:r>
+      <w:r>
+        <w:rPr>
+          <w:rFonts w:ascii="Times New Roman" w:hAnsi="Times New Roman" w:cs="Times New Roman"/>
+        </w:rPr>
+        <w:t>is to develop an interactive data dashboard that analyses global disaster displacement trend</w:t>
+      </w:r>
+      <w:r>
+        <w:rPr>
+          <w:rFonts w:ascii="Times New Roman" w:hAnsi="Times New Roman" w:cs="Times New Roman"/>
+        </w:rPr>
+        <w:t>s</w:t>
+      </w:r>
+      <w:r>
+        <w:rPr>
+          <w:rFonts w:ascii="Times New Roman" w:hAnsi="Times New Roman" w:cs="Times New Roman"/>
+        </w:rPr>
+        <w:t>, enabling users to better understand the scale, patterns and key drivers of human displacement based on climate and environmental risks</w:t>
       </w:r>
     </w:p>
     <w:p>
@@ -902,7 +1141,13 @@
         <w:rPr>
           <w:rFonts w:ascii="Times New Roman" w:hAnsi="Times New Roman" w:cs="Times New Roman"/>
         </w:rPr>
-        <w:t xml:space="preserve">Insight generation: </w:t>
+        <w:t>Generate Insights</w:t>
+      </w:r>
+      <w:r>
+        <w:rPr>
+          <w:rFonts w:ascii="Times New Roman" w:hAnsi="Times New Roman" w:cs="Times New Roman"/>
+        </w:rPr>
+        <w:t xml:space="preserve">: </w:t>
       </w:r>
       <w:r>
         <w:rPr>
@@ -970,17 +1215,77 @@
     </w:p>
     <w:p>
       <w:pPr>
-        <w:pStyle w:val="ListParagraph"/>
         <w:spacing w:line="360" w:lineRule="auto"/>
-        <w:ind w:left="784"/>
-        <w:rPr>
-          <w:rFonts w:ascii="Times New Roman" w:hAnsi="Times New Roman" w:cs="Times New Roman"/>
-        </w:rPr>
-      </w:pPr>
+        <w:rPr>
+          <w:rFonts w:ascii="Times New Roman" w:hAnsi="Times New Roman" w:cs="Times New Roman"/>
+        </w:rPr>
+      </w:pPr>
+      <w:r>
+        <w:rPr>
+          <w:rFonts w:ascii="Times New Roman" w:hAnsi="Times New Roman" w:cs="Times New Roman"/>
+        </w:rPr>
+        <w:t xml:space="preserve">The key insights selected for this dashboard </w:t>
+      </w:r>
+      <w:r>
+        <w:rPr>
+          <w:rFonts w:ascii="Times New Roman" w:hAnsi="Times New Roman" w:cs="Times New Roman"/>
+        </w:rPr>
+        <w:t>such as</w:t>
+      </w:r>
+      <w:r>
+        <w:rPr>
+          <w:rFonts w:ascii="Times New Roman" w:hAnsi="Times New Roman" w:cs="Times New Roman"/>
+        </w:rPr>
+        <w:t xml:space="preserve"> total displacement, hazard types, affected countries and time series trends were chosen to provide a comprehensive view of global humanitarian risks. Identifying the most contributing hazard types is important to understand the environmental drivers and climate related risks.  </w:t>
+      </w:r>
+    </w:p>
+    <w:p>
+      <w:pPr>
+        <w:spacing w:line="360" w:lineRule="auto"/>
+        <w:rPr>
+          <w:rFonts w:ascii="Times New Roman" w:hAnsi="Times New Roman" w:cs="Times New Roman"/>
+        </w:rPr>
+      </w:pPr>
+      <w:r>
+        <w:rPr>
+          <w:rFonts w:ascii="Times New Roman" w:hAnsi="Times New Roman" w:cs="Times New Roman"/>
+        </w:rPr>
+        <w:t xml:space="preserve">The analysis of geographical vulnerability through country-based data supports targeted decision making and resource allocation. Lastly, time series trends enable stakeholders to observe how displacements have evolved over the years helping to identify patterns and potential increases linked to climate change. </w:t>
+      </w:r>
+    </w:p>
+    <w:p>
+      <w:pPr>
+        <w:spacing w:line="360" w:lineRule="auto"/>
+        <w:rPr>
+          <w:rFonts w:ascii="Times New Roman" w:hAnsi="Times New Roman" w:cs="Times New Roman"/>
+        </w:rPr>
+      </w:pPr>
+      <w:r>
+        <w:rPr>
+          <w:rFonts w:ascii="Times New Roman" w:hAnsi="Times New Roman" w:cs="Times New Roman"/>
+        </w:rPr>
+        <w:t>Overall, these insights act as the bridge between the scale and cause transforming raw data into meaningful tool for sustainability planning and policy development</w:t>
+      </w:r>
+      <w:r>
+        <w:rPr>
+          <w:rFonts w:ascii="Times New Roman" w:hAnsi="Times New Roman" w:cs="Times New Roman"/>
+        </w:rPr>
+        <w:t>.</w:t>
+      </w:r>
     </w:p>
     <w:p>
       <w:pPr>
         <w:pStyle w:val="Heading1"/>
+        <w:keepNext w:val="0"/>
+        <w:keepLines w:val="0"/>
+        <w:spacing w:line="360" w:lineRule="auto"/>
+      </w:pPr>
+    </w:p>
+    <w:p>
+      <w:pPr>
+        <w:pStyle w:val="Heading1"/>
+        <w:keepNext w:val="0"/>
+        <w:keepLines w:val="0"/>
         <w:spacing w:line="360" w:lineRule="auto"/>
       </w:pPr>
       <w:r>
@@ -999,79 +1304,145 @@
         <w:rPr>
           <w:rFonts w:ascii="Times New Roman" w:hAnsi="Times New Roman" w:cs="Times New Roman"/>
         </w:rPr>
-        <w:t>Methodolog</w:t>
-      </w:r>
-      <w:r>
-        <w:rPr>
-          <w:rFonts w:ascii="Times New Roman" w:hAnsi="Times New Roman" w:cs="Times New Roman"/>
-        </w:rPr>
-        <w:t>y use was</w:t>
-      </w:r>
-      <w:r>
-        <w:rPr>
-          <w:rFonts w:ascii="Times New Roman" w:hAnsi="Times New Roman" w:cs="Times New Roman"/>
-        </w:rPr>
-        <w:t xml:space="preserve"> iterative development</w:t>
-      </w:r>
-      <w:r>
-        <w:rPr>
-          <w:rFonts w:ascii="Times New Roman" w:hAnsi="Times New Roman" w:cs="Times New Roman"/>
-        </w:rPr>
-        <w:t xml:space="preserve">. </w:t>
-      </w:r>
-      <w:r>
-        <w:rPr>
-          <w:rFonts w:ascii="Times New Roman" w:hAnsi="Times New Roman" w:cs="Times New Roman"/>
-        </w:rPr>
-        <w:t xml:space="preserve">This approach was used to gradually build and </w:t>
-      </w:r>
-      <w:r>
-        <w:rPr>
-          <w:rFonts w:ascii="Times New Roman" w:hAnsi="Times New Roman" w:cs="Times New Roman"/>
-        </w:rPr>
-        <w:t xml:space="preserve">adjust </w:t>
-      </w:r>
-      <w:r>
-        <w:rPr>
-          <w:rFonts w:ascii="Times New Roman" w:hAnsi="Times New Roman" w:cs="Times New Roman"/>
-        </w:rPr>
-        <w:t>the dashboard in manageable stages.</w:t>
-      </w:r>
-      <w:r>
-        <w:rPr>
-          <w:rFonts w:ascii="Times New Roman" w:hAnsi="Times New Roman" w:cs="Times New Roman"/>
-        </w:rPr>
-        <w:t xml:space="preserve"> This</w:t>
-      </w:r>
-      <w:r>
-        <w:rPr>
-          <w:rFonts w:ascii="Times New Roman" w:hAnsi="Times New Roman" w:cs="Times New Roman"/>
-        </w:rPr>
-        <w:t xml:space="preserve"> allowed early development of a </w:t>
-      </w:r>
-      <w:r>
-        <w:rPr>
-          <w:rFonts w:ascii="Times New Roman" w:hAnsi="Times New Roman" w:cs="Times New Roman"/>
-        </w:rPr>
-        <w:t xml:space="preserve">Minimum Viable Product (MVP), </w:t>
-      </w:r>
-      <w:r>
-        <w:rPr>
-          <w:rFonts w:ascii="Times New Roman" w:hAnsi="Times New Roman" w:cs="Times New Roman"/>
-        </w:rPr>
-        <w:t xml:space="preserve">enabling validation of data processing and visual outputs before expanding functionality. </w:t>
-      </w:r>
-      <w:r>
-        <w:rPr>
-          <w:rFonts w:ascii="Times New Roman" w:hAnsi="Times New Roman" w:cs="Times New Roman"/>
-        </w:rPr>
-        <w:t>This helped r</w:t>
-      </w:r>
-      <w:r>
-        <w:rPr>
-          <w:rFonts w:ascii="Times New Roman" w:hAnsi="Times New Roman" w:cs="Times New Roman"/>
-        </w:rPr>
-        <w:t>educe</w:t>
+        <w:t>An iterative development approach was used where the dashboard was developed in incremental stages rather than in a single continuous process. This methodology was selected because it allowed early validation of data processing and visual outputs, reducing the risk of errors in later stages.</w:t>
+      </w:r>
+    </w:p>
+    <w:p>
+      <w:pPr>
+        <w:spacing w:line="360" w:lineRule="auto"/>
+        <w:rPr>
+          <w:rFonts w:ascii="Times New Roman" w:hAnsi="Times New Roman" w:cs="Times New Roman"/>
+        </w:rPr>
+      </w:pPr>
+      <w:r>
+        <w:rPr>
+          <w:rFonts w:ascii="Times New Roman" w:hAnsi="Times New Roman" w:cs="Times New Roman"/>
+        </w:rPr>
+        <w:t>It began</w:t>
+      </w:r>
+      <w:r>
+        <w:rPr>
+          <w:rFonts w:ascii="Times New Roman" w:hAnsi="Times New Roman" w:cs="Times New Roman"/>
+        </w:rPr>
+        <w:t xml:space="preserve"> with loading the data, then KPI calculations and the main trend visualisations. The initial stage was to verify data correctness and ensure that key metrics such as total displacement was accurately calculated.</w:t>
+      </w:r>
+    </w:p>
+    <w:p>
+      <w:pPr>
+        <w:spacing w:line="360" w:lineRule="auto"/>
+        <w:rPr>
+          <w:rFonts w:ascii="Times New Roman" w:hAnsi="Times New Roman" w:cs="Times New Roman"/>
+        </w:rPr>
+      </w:pPr>
+      <w:r>
+        <w:rPr>
+          <w:rFonts w:ascii="Times New Roman" w:hAnsi="Times New Roman" w:cs="Times New Roman"/>
+        </w:rPr>
+        <w:t xml:space="preserve">The dashboard was then adjusted through multiple iterations where additional features such </w:t>
+      </w:r>
+      <w:r>
+        <w:rPr>
+          <w:rFonts w:ascii="Times New Roman" w:hAnsi="Times New Roman" w:cs="Times New Roman"/>
+        </w:rPr>
+        <w:t>hazard-based</w:t>
+      </w:r>
+      <w:r>
+        <w:rPr>
+          <w:rFonts w:ascii="Times New Roman" w:hAnsi="Times New Roman" w:cs="Times New Roman"/>
+        </w:rPr>
+        <w:t xml:space="preserve"> filtering, multiline </w:t>
+      </w:r>
+      <w:r>
+        <w:rPr>
+          <w:rFonts w:ascii="Times New Roman" w:hAnsi="Times New Roman" w:cs="Times New Roman"/>
+        </w:rPr>
+        <w:t xml:space="preserve">trend analysis and geospatial visualisations were introduced. Each iteration included </w:t>
+      </w:r>
+      <w:r>
+        <w:rPr>
+          <w:rFonts w:ascii="Times New Roman" w:hAnsi="Times New Roman" w:cs="Times New Roman"/>
+        </w:rPr>
+        <w:t>testing</w:t>
+      </w:r>
+      <w:r>
+        <w:rPr>
+          <w:rFonts w:ascii="Times New Roman" w:hAnsi="Times New Roman" w:cs="Times New Roman"/>
+        </w:rPr>
+        <w:t xml:space="preserve"> and debugging to ensure that new components did not </w:t>
+      </w:r>
+      <w:r>
+        <w:rPr>
+          <w:rFonts w:ascii="Times New Roman" w:hAnsi="Times New Roman" w:cs="Times New Roman"/>
+        </w:rPr>
+        <w:t>interfere</w:t>
+      </w:r>
+      <w:r>
+        <w:rPr>
+          <w:rFonts w:ascii="Times New Roman" w:hAnsi="Times New Roman" w:cs="Times New Roman"/>
+        </w:rPr>
+        <w:t xml:space="preserve"> with the existing functionality.</w:t>
+      </w:r>
+    </w:p>
+    <w:p>
+      <w:pPr>
+        <w:spacing w:line="360" w:lineRule="auto"/>
+        <w:rPr>
+          <w:rFonts w:ascii="Times New Roman" w:hAnsi="Times New Roman" w:cs="Times New Roman"/>
+        </w:rPr>
+      </w:pPr>
+      <w:r>
+        <w:rPr>
+          <w:rFonts w:ascii="Times New Roman" w:hAnsi="Times New Roman" w:cs="Times New Roman"/>
+        </w:rPr>
+        <w:t xml:space="preserve">This approach also allowed flexibility in handling real world issues such as missing values, data inconsistencies and layout improvements. Functional testing was conducted before final user interface enhancements, ensuring that the system remained accurate and stable before improving usability and presentation. </w:t>
+      </w:r>
+    </w:p>
+    <w:p>
+      <w:pPr>
+        <w:spacing w:line="360" w:lineRule="auto"/>
+        <w:rPr>
+          <w:rFonts w:ascii="Times New Roman" w:hAnsi="Times New Roman" w:cs="Times New Roman"/>
+        </w:rPr>
+      </w:pPr>
+    </w:p>
+    <w:p>
+      <w:pPr>
+        <w:spacing w:line="360" w:lineRule="auto"/>
+        <w:rPr>
+          <w:rFonts w:ascii="Times New Roman" w:hAnsi="Times New Roman" w:cs="Times New Roman"/>
+          <w:b/>
+          <w:bCs/>
+        </w:rPr>
+      </w:pPr>
+      <w:r>
+        <w:rPr>
+          <w:rFonts w:ascii="Times New Roman" w:hAnsi="Times New Roman" w:cs="Times New Roman"/>
+          <w:b/>
+          <w:bCs/>
+        </w:rPr>
+        <w:t xml:space="preserve">Phase-1: </w:t>
+      </w:r>
+      <w:r>
+        <w:rPr>
+          <w:rFonts w:ascii="Times New Roman" w:hAnsi="Times New Roman" w:cs="Times New Roman"/>
+          <w:b/>
+          <w:bCs/>
+        </w:rPr>
+        <w:t xml:space="preserve">Environmental Setup </w:t>
+      </w:r>
+    </w:p>
+    <w:p>
+      <w:pPr>
+        <w:spacing w:line="360" w:lineRule="auto"/>
+        <w:rPr>
+          <w:rFonts w:ascii="Times New Roman" w:hAnsi="Times New Roman" w:cs="Times New Roman"/>
+        </w:rPr>
+      </w:pPr>
+      <w:r>
+        <w:rPr>
+          <w:rFonts w:ascii="Times New Roman" w:hAnsi="Times New Roman" w:cs="Times New Roman"/>
+        </w:rPr>
+        <w:t>Set up the development environment using</w:t>
       </w:r>
       <w:r>
         <w:rPr>
@@ -1079,11 +1450,39 @@
         </w:rPr>
         <w:t xml:space="preserve"> </w:t>
       </w:r>
-      <w:r>
-        <w:rPr>
-          <w:rFonts w:ascii="Times New Roman" w:hAnsi="Times New Roman" w:cs="Times New Roman"/>
-        </w:rPr>
-        <w:t>the risk of major errors by allowing continuous testing and debugging throughout the development.</w:t>
+      <w:proofErr w:type="spellStart"/>
+      <w:r>
+        <w:rPr>
+          <w:rFonts w:ascii="Times New Roman" w:hAnsi="Times New Roman" w:cs="Times New Roman"/>
+        </w:rPr>
+        <w:t>Miniconda</w:t>
+      </w:r>
+      <w:proofErr w:type="spellEnd"/>
+      <w:r>
+        <w:rPr>
+          <w:rFonts w:ascii="Times New Roman" w:hAnsi="Times New Roman" w:cs="Times New Roman"/>
+        </w:rPr>
+        <w:t xml:space="preserve"> </w:t>
+      </w:r>
+      <w:r>
+        <w:rPr>
+          <w:rFonts w:ascii="Times New Roman" w:hAnsi="Times New Roman" w:cs="Times New Roman"/>
+        </w:rPr>
+        <w:t xml:space="preserve">and installed required libraries such as Pandas, Plotly and </w:t>
+      </w:r>
+      <w:proofErr w:type="spellStart"/>
+      <w:r>
+        <w:rPr>
+          <w:rFonts w:ascii="Times New Roman" w:hAnsi="Times New Roman" w:cs="Times New Roman"/>
+        </w:rPr>
+        <w:t>Streamlit</w:t>
+      </w:r>
+      <w:proofErr w:type="spellEnd"/>
+      <w:r>
+        <w:rPr>
+          <w:rFonts w:ascii="Times New Roman" w:hAnsi="Times New Roman" w:cs="Times New Roman"/>
+        </w:rPr>
+        <w:t>.</w:t>
       </w:r>
     </w:p>
     <w:p>
@@ -1101,15 +1500,15 @@
           <w:b/>
           <w:bCs/>
         </w:rPr>
-        <w:t xml:space="preserve">Phase-1: </w:t>
-      </w:r>
-      <w:r>
-        <w:rPr>
-          <w:rFonts w:ascii="Times New Roman" w:hAnsi="Times New Roman" w:cs="Times New Roman"/>
-          <w:b/>
-          <w:bCs/>
-        </w:rPr>
-        <w:t xml:space="preserve">Environmental Setup </w:t>
+        <w:t xml:space="preserve">Phase-2: </w:t>
+      </w:r>
+      <w:r>
+        <w:rPr>
+          <w:rFonts w:ascii="Times New Roman" w:hAnsi="Times New Roman" w:cs="Times New Roman"/>
+          <w:b/>
+          <w:bCs/>
+        </w:rPr>
+        <w:t xml:space="preserve">Initial data profiling </w:t>
       </w:r>
     </w:p>
     <w:p>
@@ -1123,33 +1522,278 @@
         <w:rPr>
           <w:rFonts w:ascii="Times New Roman" w:hAnsi="Times New Roman" w:cs="Times New Roman"/>
         </w:rPr>
-        <w:t>Set up the development environment using</w:t>
-      </w:r>
-      <w:r>
-        <w:rPr>
-          <w:rFonts w:ascii="Times New Roman" w:hAnsi="Times New Roman" w:cs="Times New Roman"/>
-        </w:rPr>
-        <w:t xml:space="preserve"> </w:t>
+        <w:t>Initial exploration of the raw dataset was carried out to understand the data structure, identify missing values and data inconsistencies. This step provided an overview of data quality before cleaning.</w:t>
+      </w:r>
+    </w:p>
+    <w:p>
+      <w:pPr>
+        <w:spacing w:line="360" w:lineRule="auto"/>
+        <w:rPr>
+          <w:rFonts w:ascii="Times New Roman" w:hAnsi="Times New Roman" w:cs="Times New Roman"/>
+          <w:b/>
+          <w:bCs/>
+        </w:rPr>
+      </w:pPr>
+      <w:r>
+        <w:rPr>
+          <w:rFonts w:ascii="Times New Roman" w:hAnsi="Times New Roman" w:cs="Times New Roman"/>
+          <w:b/>
+          <w:bCs/>
+        </w:rPr>
+        <w:t>Phase-</w:t>
+      </w:r>
+      <w:r>
+        <w:rPr>
+          <w:rFonts w:ascii="Times New Roman" w:hAnsi="Times New Roman" w:cs="Times New Roman"/>
+          <w:b/>
+          <w:bCs/>
+        </w:rPr>
+        <w:t>3</w:t>
+      </w:r>
+      <w:r>
+        <w:rPr>
+          <w:rFonts w:ascii="Times New Roman" w:hAnsi="Times New Roman" w:cs="Times New Roman"/>
+          <w:b/>
+          <w:bCs/>
+        </w:rPr>
+        <w:t xml:space="preserve">: </w:t>
+      </w:r>
+      <w:r>
+        <w:rPr>
+          <w:rFonts w:ascii="Times New Roman" w:hAnsi="Times New Roman" w:cs="Times New Roman"/>
+          <w:b/>
+          <w:bCs/>
+        </w:rPr>
+        <w:t>Data Preparation</w:t>
+      </w:r>
+    </w:p>
+    <w:p>
+      <w:pPr>
+        <w:spacing w:line="360" w:lineRule="auto"/>
+        <w:rPr>
+          <w:rFonts w:ascii="Times New Roman" w:hAnsi="Times New Roman" w:cs="Times New Roman"/>
+        </w:rPr>
+      </w:pPr>
+      <w:r>
+        <w:rPr>
+          <w:rFonts w:ascii="Times New Roman" w:hAnsi="Times New Roman" w:cs="Times New Roman"/>
+        </w:rPr>
+        <w:t xml:space="preserve">The dataset was cleaned and structured by handling missing values, removing unnecessary columns, duplicate rows and converting data formats where necessary. </w:t>
+      </w:r>
+    </w:p>
+    <w:p>
+      <w:pPr>
+        <w:spacing w:line="360" w:lineRule="auto"/>
+        <w:rPr>
+          <w:rFonts w:ascii="Times New Roman" w:hAnsi="Times New Roman" w:cs="Times New Roman"/>
+        </w:rPr>
+      </w:pPr>
+    </w:p>
+    <w:p>
+      <w:pPr>
+        <w:spacing w:line="360" w:lineRule="auto"/>
+        <w:rPr>
+          <w:rFonts w:ascii="Times New Roman" w:hAnsi="Times New Roman" w:cs="Times New Roman"/>
+          <w:b/>
+          <w:bCs/>
+        </w:rPr>
+      </w:pPr>
+      <w:r>
+        <w:rPr>
+          <w:rFonts w:ascii="Times New Roman" w:hAnsi="Times New Roman" w:cs="Times New Roman"/>
+          <w:b/>
+          <w:bCs/>
+        </w:rPr>
+        <w:lastRenderedPageBreak/>
+        <w:t>Phase-</w:t>
+      </w:r>
+      <w:r>
+        <w:rPr>
+          <w:rFonts w:ascii="Times New Roman" w:hAnsi="Times New Roman" w:cs="Times New Roman"/>
+          <w:b/>
+          <w:bCs/>
+        </w:rPr>
+        <w:t>4</w:t>
+      </w:r>
+      <w:r>
+        <w:rPr>
+          <w:rFonts w:ascii="Times New Roman" w:hAnsi="Times New Roman" w:cs="Times New Roman"/>
+          <w:b/>
+          <w:bCs/>
+        </w:rPr>
+        <w:t>:</w:t>
+      </w:r>
+      <w:r>
+        <w:rPr>
+          <w:rFonts w:ascii="Times New Roman" w:hAnsi="Times New Roman" w:cs="Times New Roman"/>
+          <w:b/>
+          <w:bCs/>
+        </w:rPr>
+        <w:t xml:space="preserve"> Exploratory Data Analysis (EDA)</w:t>
+      </w:r>
+    </w:p>
+    <w:p>
+      <w:pPr>
+        <w:spacing w:line="360" w:lineRule="auto"/>
+        <w:rPr>
+          <w:rFonts w:ascii="Times New Roman" w:hAnsi="Times New Roman" w:cs="Times New Roman"/>
+        </w:rPr>
+      </w:pPr>
+      <w:r>
+        <w:rPr>
+          <w:rFonts w:ascii="Times New Roman" w:hAnsi="Times New Roman" w:cs="Times New Roman"/>
+        </w:rPr>
+        <w:t xml:space="preserve">Performed data explorations to </w:t>
+      </w:r>
+      <w:r>
+        <w:rPr>
+          <w:rFonts w:ascii="Times New Roman" w:hAnsi="Times New Roman" w:cs="Times New Roman"/>
+        </w:rPr>
+        <w:t>understand the identify key patterns such as most contribution hazard type</w:t>
+      </w:r>
+      <w:r>
+        <w:rPr>
+          <w:rFonts w:ascii="Times New Roman" w:hAnsi="Times New Roman" w:cs="Times New Roman"/>
+        </w:rPr>
+        <w:t xml:space="preserve"> and displacements overtime.</w:t>
+      </w:r>
+    </w:p>
+    <w:p>
+      <w:pPr>
+        <w:spacing w:line="360" w:lineRule="auto"/>
+        <w:rPr>
+          <w:rFonts w:ascii="Times New Roman" w:hAnsi="Times New Roman" w:cs="Times New Roman"/>
+          <w:b/>
+          <w:bCs/>
+        </w:rPr>
+      </w:pPr>
+      <w:r>
+        <w:rPr>
+          <w:rFonts w:ascii="Times New Roman" w:hAnsi="Times New Roman" w:cs="Times New Roman"/>
+          <w:b/>
+          <w:bCs/>
+        </w:rPr>
+        <w:t>Phase-</w:t>
+      </w:r>
+      <w:r>
+        <w:rPr>
+          <w:rFonts w:ascii="Times New Roman" w:hAnsi="Times New Roman" w:cs="Times New Roman"/>
+          <w:b/>
+          <w:bCs/>
+        </w:rPr>
+        <w:t>5</w:t>
+      </w:r>
+      <w:r>
+        <w:rPr>
+          <w:rFonts w:ascii="Times New Roman" w:hAnsi="Times New Roman" w:cs="Times New Roman"/>
+          <w:b/>
+          <w:bCs/>
+        </w:rPr>
+        <w:t>:</w:t>
+      </w:r>
+      <w:r>
+        <w:rPr>
+          <w:rFonts w:ascii="Times New Roman" w:hAnsi="Times New Roman" w:cs="Times New Roman"/>
+          <w:b/>
+          <w:bCs/>
+        </w:rPr>
+        <w:t xml:space="preserve"> Dashboard Development</w:t>
+      </w:r>
+    </w:p>
+    <w:p>
+      <w:pPr>
+        <w:spacing w:line="360" w:lineRule="auto"/>
+        <w:rPr>
+          <w:rFonts w:ascii="Times New Roman" w:hAnsi="Times New Roman" w:cs="Times New Roman"/>
+        </w:rPr>
+      </w:pPr>
+      <w:r>
+        <w:rPr>
+          <w:rFonts w:ascii="Times New Roman" w:hAnsi="Times New Roman" w:cs="Times New Roman"/>
+        </w:rPr>
+        <w:t xml:space="preserve">Developed an interactive dashboard using </w:t>
       </w:r>
       <w:proofErr w:type="spellStart"/>
       <w:r>
         <w:rPr>
           <w:rFonts w:ascii="Times New Roman" w:hAnsi="Times New Roman" w:cs="Times New Roman"/>
         </w:rPr>
-        <w:t>Miniconda</w:t>
+        <w:t>Streamlit</w:t>
       </w:r>
       <w:proofErr w:type="spellEnd"/>
       <w:r>
         <w:rPr>
           <w:rFonts w:ascii="Times New Roman" w:hAnsi="Times New Roman" w:cs="Times New Roman"/>
         </w:rPr>
-        <w:t xml:space="preserve"> </w:t>
-      </w:r>
-      <w:r>
-        <w:rPr>
-          <w:rFonts w:ascii="Times New Roman" w:hAnsi="Times New Roman" w:cs="Times New Roman"/>
-        </w:rPr>
-        <w:t xml:space="preserve">and installed required libraries such as Pandas, Plotly and </w:t>
+        <w:t xml:space="preserve"> with KPIs, line charts, bar charts and map visualisations</w:t>
+      </w:r>
+      <w:r>
+        <w:rPr>
+          <w:rFonts w:ascii="Times New Roman" w:hAnsi="Times New Roman" w:cs="Times New Roman"/>
+        </w:rPr>
+        <w:t>.</w:t>
+      </w:r>
+      <w:r>
+        <w:rPr>
+          <w:rFonts w:ascii="Times New Roman" w:hAnsi="Times New Roman" w:cs="Times New Roman"/>
+        </w:rPr>
+        <w:t xml:space="preserve"> Filters were also implemented to allow users to explore the data dynamically.</w:t>
+      </w:r>
+    </w:p>
+    <w:p>
+      <w:pPr>
+        <w:spacing w:line="360" w:lineRule="auto"/>
+        <w:rPr>
+          <w:rFonts w:ascii="Times New Roman" w:hAnsi="Times New Roman" w:cs="Times New Roman"/>
+          <w:b/>
+          <w:bCs/>
+        </w:rPr>
+      </w:pPr>
+      <w:r>
+        <w:rPr>
+          <w:rFonts w:ascii="Times New Roman" w:hAnsi="Times New Roman" w:cs="Times New Roman"/>
+          <w:b/>
+          <w:bCs/>
+        </w:rPr>
+        <w:t>Phase-</w:t>
+      </w:r>
+      <w:r>
+        <w:rPr>
+          <w:rFonts w:ascii="Times New Roman" w:hAnsi="Times New Roman" w:cs="Times New Roman"/>
+          <w:b/>
+          <w:bCs/>
+        </w:rPr>
+        <w:t>6</w:t>
+      </w:r>
+      <w:r>
+        <w:rPr>
+          <w:rFonts w:ascii="Times New Roman" w:hAnsi="Times New Roman" w:cs="Times New Roman"/>
+          <w:b/>
+          <w:bCs/>
+        </w:rPr>
+        <w:t>:</w:t>
+      </w:r>
+      <w:r>
+        <w:rPr>
+          <w:rFonts w:ascii="Times New Roman" w:hAnsi="Times New Roman" w:cs="Times New Roman"/>
+          <w:b/>
+          <w:bCs/>
+        </w:rPr>
+        <w:t xml:space="preserve">  Testing and Deployment</w:t>
+      </w:r>
+    </w:p>
+    <w:p>
+      <w:pPr>
+        <w:spacing w:line="360" w:lineRule="auto"/>
+        <w:rPr>
+          <w:rFonts w:ascii="Times New Roman" w:hAnsi="Times New Roman" w:cs="Times New Roman"/>
+        </w:rPr>
+      </w:pPr>
+      <w:r>
+        <w:rPr>
+          <w:rFonts w:ascii="Times New Roman" w:hAnsi="Times New Roman" w:cs="Times New Roman"/>
+        </w:rPr>
+        <w:t xml:space="preserve">Functional testing was conducted using defined test cases to ensure accuracy and responsiveness. The finalised dashboard was then deployed on </w:t>
       </w:r>
       <w:proofErr w:type="spellStart"/>
       <w:r>
@@ -1163,316 +1807,137 @@
         <w:rPr>
           <w:rFonts w:ascii="Times New Roman" w:hAnsi="Times New Roman" w:cs="Times New Roman"/>
         </w:rPr>
-        <w:t>.</w:t>
-      </w:r>
-    </w:p>
-    <w:p>
-      <w:pPr>
-        <w:spacing w:line="360" w:lineRule="auto"/>
-        <w:rPr>
-          <w:rFonts w:ascii="Times New Roman" w:hAnsi="Times New Roman" w:cs="Times New Roman"/>
-          <w:b/>
-          <w:bCs/>
-        </w:rPr>
-      </w:pPr>
-      <w:r>
-        <w:rPr>
-          <w:rFonts w:ascii="Times New Roman" w:hAnsi="Times New Roman" w:cs="Times New Roman"/>
-          <w:b/>
-          <w:bCs/>
-        </w:rPr>
-        <w:t xml:space="preserve">Phase-2: </w:t>
-      </w:r>
-      <w:r>
-        <w:rPr>
-          <w:rFonts w:ascii="Times New Roman" w:hAnsi="Times New Roman" w:cs="Times New Roman"/>
-          <w:b/>
-          <w:bCs/>
-        </w:rPr>
-        <w:t>Pre profiling</w:t>
-      </w:r>
-    </w:p>
-    <w:p>
-      <w:pPr>
-        <w:spacing w:line="360" w:lineRule="auto"/>
-        <w:rPr>
-          <w:rFonts w:ascii="Times New Roman" w:hAnsi="Times New Roman" w:cs="Times New Roman"/>
-        </w:rPr>
-      </w:pPr>
-      <w:r>
-        <w:rPr>
-          <w:rFonts w:ascii="Times New Roman" w:hAnsi="Times New Roman" w:cs="Times New Roman"/>
-        </w:rPr>
-        <w:t>Performed both initial and post cleaning data explorations to understand the data structure (</w:t>
-      </w:r>
-      <w:proofErr w:type="spellStart"/>
-      <w:r>
-        <w:rPr>
-          <w:rFonts w:ascii="Times New Roman" w:hAnsi="Times New Roman" w:cs="Times New Roman"/>
-        </w:rPr>
-        <w:t>eg</w:t>
-      </w:r>
-      <w:proofErr w:type="spellEnd"/>
-      <w:r>
-        <w:rPr>
-          <w:rFonts w:ascii="Times New Roman" w:hAnsi="Times New Roman" w:cs="Times New Roman"/>
-        </w:rPr>
-        <w:t>: data type), identify missing values</w:t>
-      </w:r>
-      <w:r>
-        <w:rPr>
-          <w:rFonts w:ascii="Times New Roman" w:hAnsi="Times New Roman" w:cs="Times New Roman"/>
-        </w:rPr>
-        <w:t xml:space="preserve"> and inconsistencies</w:t>
-      </w:r>
-      <w:r>
-        <w:rPr>
-          <w:rFonts w:ascii="Times New Roman" w:hAnsi="Times New Roman" w:cs="Times New Roman"/>
-        </w:rPr>
-        <w:t>.</w:t>
-      </w:r>
-    </w:p>
-    <w:p>
-      <w:pPr>
-        <w:spacing w:line="360" w:lineRule="auto"/>
-        <w:rPr>
-          <w:rFonts w:ascii="Times New Roman" w:hAnsi="Times New Roman" w:cs="Times New Roman"/>
-          <w:b/>
-          <w:bCs/>
-        </w:rPr>
-      </w:pPr>
-      <w:r>
-        <w:rPr>
-          <w:rFonts w:ascii="Times New Roman" w:hAnsi="Times New Roman" w:cs="Times New Roman"/>
-          <w:b/>
-          <w:bCs/>
-        </w:rPr>
-        <w:t>Phase-</w:t>
-      </w:r>
-      <w:r>
-        <w:rPr>
-          <w:rFonts w:ascii="Times New Roman" w:hAnsi="Times New Roman" w:cs="Times New Roman"/>
-          <w:b/>
-          <w:bCs/>
-        </w:rPr>
-        <w:t>3</w:t>
-      </w:r>
-      <w:r>
-        <w:rPr>
-          <w:rFonts w:ascii="Times New Roman" w:hAnsi="Times New Roman" w:cs="Times New Roman"/>
-          <w:b/>
-          <w:bCs/>
-        </w:rPr>
-        <w:t xml:space="preserve">: </w:t>
-      </w:r>
-      <w:r>
-        <w:rPr>
-          <w:rFonts w:ascii="Times New Roman" w:hAnsi="Times New Roman" w:cs="Times New Roman"/>
-          <w:b/>
-          <w:bCs/>
-        </w:rPr>
-        <w:t>Data Preparation</w:t>
-      </w:r>
-    </w:p>
-    <w:p>
-      <w:pPr>
-        <w:spacing w:line="360" w:lineRule="auto"/>
-        <w:rPr>
-          <w:rFonts w:ascii="Times New Roman" w:hAnsi="Times New Roman" w:cs="Times New Roman"/>
-        </w:rPr>
-      </w:pPr>
-      <w:r>
-        <w:rPr>
-          <w:rFonts w:ascii="Times New Roman" w:hAnsi="Times New Roman" w:cs="Times New Roman"/>
-        </w:rPr>
-        <w:t>Cleaned and structured the dataset by handling missing values, removing duplicates and exporting a processed dataset for analysis.</w:t>
-      </w:r>
-    </w:p>
-    <w:p>
-      <w:pPr>
-        <w:spacing w:line="360" w:lineRule="auto"/>
-        <w:rPr>
-          <w:rFonts w:ascii="Times New Roman" w:hAnsi="Times New Roman" w:cs="Times New Roman"/>
-          <w:b/>
-          <w:bCs/>
-        </w:rPr>
-      </w:pPr>
-      <w:r>
-        <w:rPr>
-          <w:rFonts w:ascii="Times New Roman" w:hAnsi="Times New Roman" w:cs="Times New Roman"/>
-          <w:b/>
-          <w:bCs/>
-        </w:rPr>
-        <w:t>Phase-</w:t>
-      </w:r>
-      <w:r>
-        <w:rPr>
-          <w:rFonts w:ascii="Times New Roman" w:hAnsi="Times New Roman" w:cs="Times New Roman"/>
-          <w:b/>
-          <w:bCs/>
-        </w:rPr>
-        <w:t>4</w:t>
-      </w:r>
-      <w:r>
-        <w:rPr>
-          <w:rFonts w:ascii="Times New Roman" w:hAnsi="Times New Roman" w:cs="Times New Roman"/>
-          <w:b/>
-          <w:bCs/>
-        </w:rPr>
-        <w:t>:</w:t>
-      </w:r>
-      <w:r>
-        <w:rPr>
-          <w:rFonts w:ascii="Times New Roman" w:hAnsi="Times New Roman" w:cs="Times New Roman"/>
-          <w:b/>
-          <w:bCs/>
-        </w:rPr>
-        <w:t xml:space="preserve"> Exploratory Data Analysis (EDA)</w:t>
-      </w:r>
-    </w:p>
-    <w:p>
-      <w:pPr>
-        <w:spacing w:line="360" w:lineRule="auto"/>
-        <w:rPr>
-          <w:rFonts w:ascii="Times New Roman" w:hAnsi="Times New Roman" w:cs="Times New Roman"/>
-        </w:rPr>
-      </w:pPr>
-      <w:r>
-        <w:rPr>
-          <w:rFonts w:ascii="Times New Roman" w:hAnsi="Times New Roman" w:cs="Times New Roman"/>
-        </w:rPr>
-        <w:t xml:space="preserve">Performed data explorations to </w:t>
-      </w:r>
-      <w:r>
-        <w:rPr>
-          <w:rFonts w:ascii="Times New Roman" w:hAnsi="Times New Roman" w:cs="Times New Roman"/>
-        </w:rPr>
-        <w:t>understand the identify key patterns such as most contribution hazard type.</w:t>
-      </w:r>
-    </w:p>
-    <w:p>
-      <w:pPr>
-        <w:spacing w:line="360" w:lineRule="auto"/>
-        <w:rPr>
-          <w:rFonts w:ascii="Times New Roman" w:hAnsi="Times New Roman" w:cs="Times New Roman"/>
-          <w:b/>
-          <w:bCs/>
-        </w:rPr>
-      </w:pPr>
-      <w:r>
-        <w:rPr>
-          <w:rFonts w:ascii="Times New Roman" w:hAnsi="Times New Roman" w:cs="Times New Roman"/>
-          <w:b/>
-          <w:bCs/>
-        </w:rPr>
-        <w:t>Phase-4:</w:t>
-      </w:r>
-      <w:r>
-        <w:rPr>
-          <w:rFonts w:ascii="Times New Roman" w:hAnsi="Times New Roman" w:cs="Times New Roman"/>
-          <w:b/>
-          <w:bCs/>
-        </w:rPr>
-        <w:t xml:space="preserve"> Dashboard Development</w:t>
-      </w:r>
-    </w:p>
-    <w:p>
-      <w:pPr>
-        <w:spacing w:line="360" w:lineRule="auto"/>
-        <w:rPr>
-          <w:rFonts w:ascii="Times New Roman" w:hAnsi="Times New Roman" w:cs="Times New Roman"/>
-        </w:rPr>
-      </w:pPr>
-      <w:r>
-        <w:rPr>
-          <w:rFonts w:ascii="Times New Roman" w:hAnsi="Times New Roman" w:cs="Times New Roman"/>
-        </w:rPr>
-        <w:t xml:space="preserve">Developed an interactive dashboard using </w:t>
-      </w:r>
-      <w:proofErr w:type="spellStart"/>
-      <w:r>
-        <w:rPr>
-          <w:rFonts w:ascii="Times New Roman" w:hAnsi="Times New Roman" w:cs="Times New Roman"/>
-        </w:rPr>
-        <w:t>Streamlit</w:t>
-      </w:r>
-      <w:proofErr w:type="spellEnd"/>
-      <w:r>
-        <w:rPr>
-          <w:rFonts w:ascii="Times New Roman" w:hAnsi="Times New Roman" w:cs="Times New Roman"/>
-        </w:rPr>
-        <w:t xml:space="preserve"> with KPIs, line charts, bar charts and map visualisations to present insights.</w:t>
-      </w:r>
-    </w:p>
-    <w:p>
-      <w:pPr>
-        <w:spacing w:line="360" w:lineRule="auto"/>
-        <w:rPr>
-          <w:rFonts w:ascii="Times New Roman" w:hAnsi="Times New Roman" w:cs="Times New Roman"/>
-          <w:b/>
-          <w:bCs/>
-        </w:rPr>
-      </w:pPr>
-      <w:r>
-        <w:rPr>
-          <w:rFonts w:ascii="Times New Roman" w:hAnsi="Times New Roman" w:cs="Times New Roman"/>
-          <w:b/>
-          <w:bCs/>
-        </w:rPr>
-        <w:t>Phase-5:</w:t>
-      </w:r>
-      <w:r>
-        <w:rPr>
-          <w:rFonts w:ascii="Times New Roman" w:hAnsi="Times New Roman" w:cs="Times New Roman"/>
-          <w:b/>
-          <w:bCs/>
-        </w:rPr>
-        <w:t xml:space="preserve">  Testing and Deployment</w:t>
-      </w:r>
-    </w:p>
-    <w:p>
-      <w:pPr>
-        <w:spacing w:line="360" w:lineRule="auto"/>
-        <w:rPr>
-          <w:rFonts w:ascii="Times New Roman" w:hAnsi="Times New Roman" w:cs="Times New Roman"/>
-        </w:rPr>
-      </w:pPr>
-      <w:r>
-        <w:rPr>
-          <w:rFonts w:ascii="Times New Roman" w:hAnsi="Times New Roman" w:cs="Times New Roman"/>
-        </w:rPr>
-        <w:t xml:space="preserve">Conducted functional testing using test cases and deployed the finalised dashboard on </w:t>
-      </w:r>
-      <w:proofErr w:type="spellStart"/>
-      <w:r>
-        <w:rPr>
-          <w:rFonts w:ascii="Times New Roman" w:hAnsi="Times New Roman" w:cs="Times New Roman"/>
-        </w:rPr>
-        <w:t>Streamlit</w:t>
-      </w:r>
-      <w:proofErr w:type="spellEnd"/>
-    </w:p>
-    <w:p>
-      <w:pPr>
-        <w:spacing w:line="360" w:lineRule="auto"/>
-        <w:jc w:val="center"/>
-        <w:rPr>
-          <w:rFonts w:ascii="Times New Roman" w:hAnsi="Times New Roman" w:cs="Times New Roman"/>
-        </w:rPr>
-      </w:pPr>
-    </w:p>
-    <w:p>
-      <w:pPr>
-        <w:spacing w:line="360" w:lineRule="auto"/>
-        <w:rPr>
-          <w:rFonts w:ascii="Times New Roman" w:hAnsi="Times New Roman" w:cs="Times New Roman"/>
-        </w:rPr>
-      </w:pPr>
-    </w:p>
-    <w:p>
-      <w:pPr>
-        <w:keepNext/>
-        <w:keepLines/>
+        <w:t xml:space="preserve"> for user access. </w:t>
+      </w:r>
+    </w:p>
+    <w:p>
+      <w:pPr>
+        <w:spacing w:before="360" w:after="80" w:line="360" w:lineRule="auto"/>
+        <w:outlineLvl w:val="0"/>
+        <w:rPr>
+          <w:rFonts w:ascii="Times New Roman" w:eastAsia="Times New Roman" w:hAnsi="Times New Roman" w:cs="Times New Roman"/>
+          <w:b/>
+          <w:bCs/>
+          <w:color w:val="0F4761"/>
+          <w:sz w:val="40"/>
+          <w:szCs w:val="40"/>
+        </w:rPr>
+      </w:pPr>
+    </w:p>
+    <w:p>
+      <w:pPr>
+        <w:spacing w:before="360" w:after="80" w:line="360" w:lineRule="auto"/>
+        <w:outlineLvl w:val="0"/>
+        <w:rPr>
+          <w:rFonts w:ascii="Times New Roman" w:eastAsia="Times New Roman" w:hAnsi="Times New Roman" w:cs="Times New Roman"/>
+          <w:b/>
+          <w:bCs/>
+          <w:color w:val="0F4761"/>
+          <w:sz w:val="40"/>
+          <w:szCs w:val="40"/>
+        </w:rPr>
+      </w:pPr>
+    </w:p>
+    <w:p>
+      <w:pPr>
+        <w:spacing w:before="360" w:after="80" w:line="360" w:lineRule="auto"/>
+        <w:outlineLvl w:val="0"/>
+        <w:rPr>
+          <w:rFonts w:ascii="Times New Roman" w:eastAsia="Times New Roman" w:hAnsi="Times New Roman" w:cs="Times New Roman"/>
+          <w:b/>
+          <w:bCs/>
+          <w:color w:val="0F4761"/>
+          <w:sz w:val="40"/>
+          <w:szCs w:val="40"/>
+        </w:rPr>
+      </w:pPr>
+    </w:p>
+    <w:p>
+      <w:pPr>
+        <w:spacing w:before="360" w:after="80" w:line="360" w:lineRule="auto"/>
+        <w:outlineLvl w:val="0"/>
+        <w:rPr>
+          <w:rFonts w:ascii="Times New Roman" w:eastAsia="Times New Roman" w:hAnsi="Times New Roman" w:cs="Times New Roman"/>
+          <w:b/>
+          <w:bCs/>
+          <w:color w:val="0F4761"/>
+          <w:sz w:val="40"/>
+          <w:szCs w:val="40"/>
+        </w:rPr>
+      </w:pPr>
+    </w:p>
+    <w:p>
+      <w:pPr>
+        <w:spacing w:before="360" w:after="80" w:line="360" w:lineRule="auto"/>
+        <w:outlineLvl w:val="0"/>
+        <w:rPr>
+          <w:rFonts w:ascii="Times New Roman" w:eastAsia="Times New Roman" w:hAnsi="Times New Roman" w:cs="Times New Roman"/>
+          <w:b/>
+          <w:bCs/>
+          <w:color w:val="0F4761"/>
+          <w:sz w:val="40"/>
+          <w:szCs w:val="40"/>
+        </w:rPr>
+      </w:pPr>
+    </w:p>
+    <w:p>
+      <w:pPr>
+        <w:spacing w:before="360" w:after="80" w:line="360" w:lineRule="auto"/>
+        <w:outlineLvl w:val="0"/>
+        <w:rPr>
+          <w:rFonts w:ascii="Times New Roman" w:eastAsia="Times New Roman" w:hAnsi="Times New Roman" w:cs="Times New Roman"/>
+          <w:b/>
+          <w:bCs/>
+          <w:color w:val="0F4761"/>
+          <w:sz w:val="40"/>
+          <w:szCs w:val="40"/>
+        </w:rPr>
+      </w:pPr>
+    </w:p>
+    <w:p>
+      <w:pPr>
+        <w:spacing w:before="360" w:after="80" w:line="360" w:lineRule="auto"/>
+        <w:outlineLvl w:val="0"/>
+        <w:rPr>
+          <w:rFonts w:ascii="Times New Roman" w:eastAsia="Times New Roman" w:hAnsi="Times New Roman" w:cs="Times New Roman"/>
+          <w:b/>
+          <w:bCs/>
+          <w:color w:val="0F4761"/>
+          <w:sz w:val="40"/>
+          <w:szCs w:val="40"/>
+        </w:rPr>
+      </w:pPr>
+    </w:p>
+    <w:p>
+      <w:pPr>
+        <w:spacing w:before="360" w:after="80" w:line="360" w:lineRule="auto"/>
+        <w:outlineLvl w:val="0"/>
+        <w:rPr>
+          <w:rFonts w:ascii="Times New Roman" w:eastAsia="Times New Roman" w:hAnsi="Times New Roman" w:cs="Times New Roman"/>
+          <w:b/>
+          <w:bCs/>
+          <w:color w:val="0F4761"/>
+          <w:sz w:val="40"/>
+          <w:szCs w:val="40"/>
+        </w:rPr>
+      </w:pPr>
+    </w:p>
+    <w:p>
+      <w:pPr>
+        <w:spacing w:before="360" w:after="80" w:line="360" w:lineRule="auto"/>
+        <w:outlineLvl w:val="0"/>
+        <w:rPr>
+          <w:rFonts w:ascii="Times New Roman" w:eastAsia="Times New Roman" w:hAnsi="Times New Roman" w:cs="Times New Roman"/>
+          <w:b/>
+          <w:bCs/>
+          <w:color w:val="0F4761"/>
+          <w:sz w:val="40"/>
+          <w:szCs w:val="40"/>
+        </w:rPr>
+      </w:pPr>
+    </w:p>
+    <w:p>
+      <w:pPr>
         <w:spacing w:before="360" w:after="80" w:line="360" w:lineRule="auto"/>
         <w:outlineLvl w:val="0"/>
         <w:rPr>
@@ -1669,7 +2134,21 @@
                 <w:rFonts w:ascii="Times New Roman" w:eastAsia="Aptos" w:hAnsi="Times New Roman" w:cs="Times New Roman"/>
                 <w:color w:val="000000"/>
               </w:rPr>
-              <w:t>_date to ensure smooth interactivity.</w:t>
+              <w:t>_dat</w:t>
+            </w:r>
+            <w:r>
+              <w:rPr>
+                <w:rFonts w:ascii="Times New Roman" w:eastAsia="Aptos" w:hAnsi="Times New Roman" w:cs="Times New Roman"/>
+                <w:color w:val="000000"/>
+              </w:rPr>
+              <w:t>a</w:t>
+            </w:r>
+            <w:r>
+              <w:rPr>
+                <w:rFonts w:ascii="Times New Roman" w:eastAsia="Aptos" w:hAnsi="Times New Roman" w:cs="Times New Roman"/>
+                <w:color w:val="000000"/>
+              </w:rPr>
+              <w:t xml:space="preserve"> to ensure smooth interactivity.</w:t>
             </w:r>
           </w:p>
         </w:tc>
@@ -1723,7 +2202,7 @@
                 <w:rFonts w:ascii="Times New Roman" w:eastAsia="Aptos" w:hAnsi="Times New Roman" w:cs="Times New Roman"/>
                 <w:color w:val="000000"/>
               </w:rPr>
-              <w:t>The visuals must scale dynamically to fit the user’s screen width</w:t>
+              <w:t>The system must provide a fast interaction with less latency.</w:t>
             </w:r>
           </w:p>
         </w:tc>
@@ -1776,7 +2255,7 @@
                 <w:rFonts w:ascii="Times New Roman" w:eastAsia="Aptos" w:hAnsi="Times New Roman" w:cs="Times New Roman"/>
                 <w:color w:val="000000"/>
               </w:rPr>
-              <w:t>The system must provide a fast interaction with less latency.</w:t>
+              <w:t>The visualisation must be clear, readable and clutter free.</w:t>
             </w:r>
           </w:p>
         </w:tc>
@@ -1825,13 +2304,6 @@
                 <w:color w:val="000000"/>
               </w:rPr>
             </w:pPr>
-            <w:r>
-              <w:rPr>
-                <w:rFonts w:ascii="Times New Roman" w:eastAsia="Aptos" w:hAnsi="Times New Roman" w:cs="Times New Roman"/>
-                <w:color w:val="000000"/>
-              </w:rPr>
-              <w:t>The visualisation must be clear, readable and clutter free.</w:t>
-            </w:r>
           </w:p>
         </w:tc>
       </w:tr>
@@ -1854,7 +2326,7 @@
     </w:p>
     <w:p>
       <w:pPr>
-        <w:spacing w:before="360" w:after="80" w:line="240" w:lineRule="auto"/>
+        <w:spacing w:before="360" w:after="80" w:line="360" w:lineRule="auto"/>
         <w:outlineLvl w:val="0"/>
         <w:rPr>
           <w:rFonts w:ascii="Times New Roman" w:eastAsia="Times New Roman" w:hAnsi="Times New Roman" w:cs="Times New Roman"/>
@@ -1868,7 +2340,7 @@
     </w:p>
     <w:p>
       <w:pPr>
-        <w:spacing w:before="360" w:after="80" w:line="240" w:lineRule="auto"/>
+        <w:spacing w:before="360" w:after="80" w:line="360" w:lineRule="auto"/>
         <w:outlineLvl w:val="0"/>
         <w:rPr>
           <w:rFonts w:ascii="Times New Roman" w:eastAsia="Times New Roman" w:hAnsi="Times New Roman" w:cs="Times New Roman"/>
@@ -1882,7 +2354,7 @@
     </w:p>
     <w:p>
       <w:pPr>
-        <w:spacing w:before="360" w:after="80" w:line="240" w:lineRule="auto"/>
+        <w:spacing w:before="360" w:after="80" w:line="360" w:lineRule="auto"/>
         <w:outlineLvl w:val="0"/>
         <w:rPr>
           <w:rFonts w:ascii="Times New Roman" w:eastAsia="Times New Roman" w:hAnsi="Times New Roman" w:cs="Times New Roman"/>
@@ -1896,7 +2368,7 @@
     </w:p>
     <w:p>
       <w:pPr>
-        <w:spacing w:before="360" w:after="80" w:line="240" w:lineRule="auto"/>
+        <w:spacing w:before="360" w:after="80" w:line="360" w:lineRule="auto"/>
         <w:outlineLvl w:val="0"/>
         <w:rPr>
           <w:rFonts w:ascii="Times New Roman" w:eastAsia="Times New Roman" w:hAnsi="Times New Roman" w:cs="Times New Roman"/>
@@ -1910,7 +2382,7 @@
     </w:p>
     <w:p>
       <w:pPr>
-        <w:spacing w:before="360" w:after="80" w:line="240" w:lineRule="auto"/>
+        <w:spacing w:before="360" w:after="80" w:line="360" w:lineRule="auto"/>
         <w:outlineLvl w:val="0"/>
         <w:rPr>
           <w:rFonts w:ascii="Times New Roman" w:eastAsia="Times New Roman" w:hAnsi="Times New Roman" w:cs="Times New Roman"/>
@@ -1924,7 +2396,7 @@
     </w:p>
     <w:p>
       <w:pPr>
-        <w:spacing w:before="360" w:after="80" w:line="240" w:lineRule="auto"/>
+        <w:spacing w:before="360" w:after="80" w:line="360" w:lineRule="auto"/>
         <w:outlineLvl w:val="0"/>
         <w:rPr>
           <w:rFonts w:ascii="Times New Roman" w:eastAsia="Times New Roman" w:hAnsi="Times New Roman" w:cs="Times New Roman"/>
@@ -1938,21 +2410,7 @@
     </w:p>
     <w:p>
       <w:pPr>
-        <w:spacing w:before="360" w:after="80" w:line="240" w:lineRule="auto"/>
-        <w:outlineLvl w:val="0"/>
-        <w:rPr>
-          <w:rFonts w:ascii="Times New Roman" w:eastAsia="Times New Roman" w:hAnsi="Times New Roman" w:cs="Times New Roman"/>
-          <w:b/>
-          <w:bCs/>
-          <w:color w:val="0F4761"/>
-          <w:sz w:val="40"/>
-          <w:szCs w:val="40"/>
-        </w:rPr>
-      </w:pPr>
-    </w:p>
-    <w:p>
-      <w:pPr>
-        <w:spacing w:before="360" w:after="80" w:line="240" w:lineRule="auto"/>
+        <w:spacing w:before="360" w:after="80" w:line="360" w:lineRule="auto"/>
         <w:outlineLvl w:val="0"/>
         <w:rPr>
           <w:rFonts w:ascii="Times New Roman" w:eastAsia="Times New Roman" w:hAnsi="Times New Roman" w:cs="Times New Roman"/>
@@ -1984,8 +2442,7 @@
       </w:tblPr>
       <w:tblGrid>
         <w:gridCol w:w="576"/>
-        <w:gridCol w:w="987"/>
-        <w:gridCol w:w="459"/>
+        <w:gridCol w:w="1446"/>
         <w:gridCol w:w="2509"/>
         <w:gridCol w:w="4493"/>
       </w:tblGrid>
@@ -1997,6 +2454,7 @@
           </w:tcPr>
           <w:p>
             <w:pPr>
+              <w:spacing w:line="360" w:lineRule="auto"/>
               <w:jc w:val="left"/>
               <w:rPr>
                 <w:rFonts w:ascii="Times New Roman" w:eastAsia="Aptos" w:hAnsi="Times New Roman" w:cs="Times New Roman"/>
@@ -2016,11 +2474,12 @@
         </w:tc>
         <w:tc>
           <w:tcPr>
-            <w:tcW w:w="987" w:type="dxa"/>
+            <w:tcW w:w="1446" w:type="dxa"/>
             <w:vAlign w:val="center"/>
           </w:tcPr>
           <w:p>
             <w:pPr>
+              <w:spacing w:line="360" w:lineRule="auto"/>
               <w:jc w:val="left"/>
               <w:rPr>
                 <w:rFonts w:ascii="Times New Roman" w:eastAsia="Aptos" w:hAnsi="Times New Roman" w:cs="Times New Roman"/>
@@ -2040,75 +2499,77 @@
         </w:tc>
         <w:tc>
           <w:tcPr>
-            <w:tcW w:w="2968" w:type="dxa"/>
+            <w:tcW w:w="2509" w:type="dxa"/>
+            <w:vAlign w:val="center"/>
+          </w:tcPr>
+          <w:p>
+            <w:pPr>
+              <w:spacing w:line="360" w:lineRule="auto"/>
+              <w:jc w:val="left"/>
+              <w:rPr>
+                <w:rFonts w:ascii="Times New Roman" w:eastAsia="Aptos" w:hAnsi="Times New Roman" w:cs="Times New Roman"/>
+                <w:b/>
+                <w:bCs/>
+              </w:rPr>
+            </w:pPr>
+            <w:r>
+              <w:rPr>
+                <w:rFonts w:ascii="Times New Roman" w:eastAsia="Aptos" w:hAnsi="Times New Roman" w:cs="Times New Roman"/>
+                <w:b/>
+                <w:bCs/>
+              </w:rPr>
+              <w:t>Title:</w:t>
+            </w:r>
+            <w:r>
+              <w:rPr>
+                <w:rFonts w:ascii="Times New Roman" w:eastAsia="Aptos" w:hAnsi="Times New Roman" w:cs="Times New Roman"/>
+              </w:rPr>
+              <w:t xml:space="preserve"> Global Data Filtering</w:t>
+            </w:r>
+          </w:p>
+        </w:tc>
+        <w:tc>
+          <w:tcPr>
+            <w:tcW w:w="4493" w:type="dxa"/>
+            <w:vAlign w:val="center"/>
+          </w:tcPr>
+          <w:p>
+            <w:pPr>
+              <w:spacing w:line="360" w:lineRule="auto"/>
+              <w:jc w:val="left"/>
+              <w:rPr>
+                <w:rFonts w:ascii="Times New Roman" w:eastAsia="Aptos" w:hAnsi="Times New Roman" w:cs="Times New Roman"/>
+                <w:b/>
+                <w:bCs/>
+              </w:rPr>
+            </w:pPr>
+            <w:r>
+              <w:rPr>
+                <w:rFonts w:ascii="Times New Roman" w:eastAsia="Aptos" w:hAnsi="Times New Roman" w:cs="Times New Roman"/>
+                <w:b/>
+                <w:bCs/>
+              </w:rPr>
+              <w:t xml:space="preserve">Test case Title: </w:t>
+            </w:r>
+            <w:r>
+              <w:rPr>
+                <w:rFonts w:ascii="Times New Roman" w:eastAsia="Aptos" w:hAnsi="Times New Roman" w:cs="Times New Roman"/>
+              </w:rPr>
+              <w:t>Global Data Filtering</w:t>
+            </w:r>
+          </w:p>
+        </w:tc>
+      </w:tr>
+      <w:tr>
+        <w:tc>
+          <w:tcPr>
+            <w:tcW w:w="2022" w:type="dxa"/>
             <w:gridSpan w:val="2"/>
             <w:vAlign w:val="center"/>
           </w:tcPr>
           <w:p>
             <w:pPr>
-              <w:jc w:val="left"/>
-              <w:rPr>
-                <w:rFonts w:ascii="Times New Roman" w:eastAsia="Aptos" w:hAnsi="Times New Roman" w:cs="Times New Roman"/>
-                <w:b/>
-                <w:bCs/>
-              </w:rPr>
-            </w:pPr>
-            <w:r>
-              <w:rPr>
-                <w:rFonts w:ascii="Times New Roman" w:eastAsia="Aptos" w:hAnsi="Times New Roman" w:cs="Times New Roman"/>
-                <w:b/>
-                <w:bCs/>
-              </w:rPr>
-              <w:t>Title:</w:t>
-            </w:r>
-            <w:r>
-              <w:rPr>
-                <w:rFonts w:ascii="Times New Roman" w:eastAsia="Aptos" w:hAnsi="Times New Roman" w:cs="Times New Roman"/>
-              </w:rPr>
-              <w:t xml:space="preserve"> Global Data Filtering</w:t>
-            </w:r>
-          </w:p>
-        </w:tc>
-        <w:tc>
-          <w:tcPr>
-            <w:tcW w:w="4493" w:type="dxa"/>
-            <w:vAlign w:val="center"/>
-          </w:tcPr>
-          <w:p>
-            <w:pPr>
-              <w:jc w:val="left"/>
-              <w:rPr>
-                <w:rFonts w:ascii="Times New Roman" w:eastAsia="Aptos" w:hAnsi="Times New Roman" w:cs="Times New Roman"/>
-                <w:b/>
-                <w:bCs/>
-              </w:rPr>
-            </w:pPr>
-            <w:r>
-              <w:rPr>
-                <w:rFonts w:ascii="Times New Roman" w:eastAsia="Aptos" w:hAnsi="Times New Roman" w:cs="Times New Roman"/>
-                <w:b/>
-                <w:bCs/>
-              </w:rPr>
-              <w:t xml:space="preserve">Test case Title: </w:t>
-            </w:r>
-            <w:r>
-              <w:rPr>
-                <w:rFonts w:ascii="Times New Roman" w:eastAsia="Aptos" w:hAnsi="Times New Roman" w:cs="Times New Roman"/>
-              </w:rPr>
-              <w:t>Global Data Filtering</w:t>
-            </w:r>
-          </w:p>
-        </w:tc>
-      </w:tr>
-      <w:tr>
-        <w:tc>
-          <w:tcPr>
-            <w:tcW w:w="2022" w:type="dxa"/>
-            <w:gridSpan w:val="3"/>
-            <w:vAlign w:val="center"/>
-          </w:tcPr>
-          <w:p>
-            <w:pPr>
+              <w:spacing w:line="360" w:lineRule="auto"/>
               <w:jc w:val="left"/>
               <w:rPr>
                 <w:rFonts w:ascii="Times New Roman" w:eastAsia="Aptos" w:hAnsi="Times New Roman" w:cs="Times New Roman"/>
@@ -2134,6 +2595,7 @@
           </w:tcPr>
           <w:p>
             <w:pPr>
+              <w:spacing w:line="360" w:lineRule="auto"/>
               <w:jc w:val="left"/>
               <w:rPr>
                 <w:rFonts w:ascii="Times New Roman" w:eastAsia="Aptos" w:hAnsi="Times New Roman" w:cs="Times New Roman"/>
@@ -2152,11 +2614,12 @@
         <w:tc>
           <w:tcPr>
             <w:tcW w:w="2022" w:type="dxa"/>
-            <w:gridSpan w:val="3"/>
+            <w:gridSpan w:val="2"/>
             <w:vAlign w:val="center"/>
           </w:tcPr>
           <w:p>
             <w:pPr>
+              <w:spacing w:line="360" w:lineRule="auto"/>
               <w:jc w:val="left"/>
               <w:rPr>
                 <w:rFonts w:ascii="Times New Roman" w:eastAsia="Aptos" w:hAnsi="Times New Roman" w:cs="Times New Roman"/>
@@ -2182,6 +2645,7 @@
           </w:tcPr>
           <w:p>
             <w:pPr>
+              <w:spacing w:line="360" w:lineRule="auto"/>
               <w:jc w:val="left"/>
               <w:rPr>
                 <w:rFonts w:ascii="Times New Roman" w:eastAsia="Aptos" w:hAnsi="Times New Roman" w:cs="Times New Roman"/>
@@ -2196,6 +2660,7 @@
           </w:p>
           <w:p>
             <w:pPr>
+              <w:spacing w:line="360" w:lineRule="auto"/>
               <w:jc w:val="left"/>
               <w:rPr>
                 <w:rFonts w:ascii="Times New Roman" w:eastAsia="Aptos" w:hAnsi="Times New Roman" w:cs="Times New Roman"/>
@@ -2210,6 +2675,7 @@
           </w:p>
           <w:p>
             <w:pPr>
+              <w:spacing w:line="360" w:lineRule="auto"/>
               <w:jc w:val="left"/>
               <w:rPr>
                 <w:rFonts w:ascii="Times New Roman" w:eastAsia="Aptos" w:hAnsi="Times New Roman" w:cs="Times New Roman"/>
@@ -2228,11 +2694,12 @@
         <w:tc>
           <w:tcPr>
             <w:tcW w:w="2022" w:type="dxa"/>
-            <w:gridSpan w:val="3"/>
+            <w:gridSpan w:val="2"/>
             <w:vAlign w:val="center"/>
           </w:tcPr>
           <w:p>
             <w:pPr>
+              <w:spacing w:line="360" w:lineRule="auto"/>
               <w:jc w:val="left"/>
               <w:rPr>
                 <w:rFonts w:ascii="Times New Roman" w:eastAsia="Aptos" w:hAnsi="Times New Roman" w:cs="Times New Roman"/>
@@ -2258,6 +2725,7 @@
           </w:tcPr>
           <w:p>
             <w:pPr>
+              <w:spacing w:line="360" w:lineRule="auto"/>
               <w:jc w:val="left"/>
               <w:rPr>
                 <w:rFonts w:ascii="Times New Roman" w:eastAsia="Aptos" w:hAnsi="Times New Roman" w:cs="Times New Roman"/>
@@ -2272,6 +2740,7 @@
           </w:p>
           <w:p>
             <w:pPr>
+              <w:spacing w:line="360" w:lineRule="auto"/>
               <w:jc w:val="left"/>
               <w:rPr>
                 <w:rFonts w:ascii="Times New Roman" w:eastAsia="Aptos" w:hAnsi="Times New Roman" w:cs="Times New Roman"/>
@@ -2298,11 +2767,12 @@
         <w:tc>
           <w:tcPr>
             <w:tcW w:w="2022" w:type="dxa"/>
-            <w:gridSpan w:val="3"/>
+            <w:gridSpan w:val="2"/>
             <w:vAlign w:val="center"/>
           </w:tcPr>
           <w:p>
             <w:pPr>
+              <w:spacing w:line="360" w:lineRule="auto"/>
               <w:jc w:val="left"/>
               <w:rPr>
                 <w:rFonts w:ascii="Times New Roman" w:eastAsia="Aptos" w:hAnsi="Times New Roman" w:cs="Times New Roman"/>
@@ -2328,6 +2798,7 @@
           </w:tcPr>
           <w:p>
             <w:pPr>
+              <w:spacing w:line="360" w:lineRule="auto"/>
               <w:jc w:val="left"/>
               <w:rPr>
                 <w:rFonts w:ascii="Times New Roman" w:eastAsia="Aptos" w:hAnsi="Times New Roman" w:cs="Times New Roman"/>
@@ -2342,6 +2813,7 @@
           </w:p>
           <w:p>
             <w:pPr>
+              <w:spacing w:line="360" w:lineRule="auto"/>
               <w:jc w:val="left"/>
               <w:rPr>
                 <w:rFonts w:ascii="Times New Roman" w:eastAsia="Aptos" w:hAnsi="Times New Roman" w:cs="Times New Roman"/>
@@ -2356,6 +2828,7 @@
           </w:p>
           <w:p>
             <w:pPr>
+              <w:spacing w:line="360" w:lineRule="auto"/>
               <w:jc w:val="left"/>
               <w:rPr>
                 <w:rFonts w:ascii="Times New Roman" w:eastAsia="Aptos" w:hAnsi="Times New Roman" w:cs="Times New Roman"/>
@@ -2375,7 +2848,7 @@
     </w:tbl>
     <w:p>
       <w:pPr>
-        <w:spacing w:line="240" w:lineRule="auto"/>
+        <w:spacing w:line="360" w:lineRule="auto"/>
         <w:rPr>
           <w:rFonts w:ascii="Times New Roman" w:eastAsia="Aptos" w:hAnsi="Times New Roman" w:cs="Times New Roman"/>
           <w:b/>
@@ -2390,20 +2863,20 @@
         <w:tblLook w:val="04A0" w:firstRow="1" w:lastRow="0" w:firstColumn="1" w:lastColumn="0" w:noHBand="0" w:noVBand="1"/>
       </w:tblPr>
       <w:tblGrid>
-        <w:gridCol w:w="576"/>
-        <w:gridCol w:w="987"/>
-        <w:gridCol w:w="459"/>
+        <w:gridCol w:w="846"/>
+        <w:gridCol w:w="1176"/>
         <w:gridCol w:w="2509"/>
         <w:gridCol w:w="4493"/>
       </w:tblGrid>
       <w:tr>
         <w:tc>
           <w:tcPr>
-            <w:tcW w:w="576" w:type="dxa"/>
+            <w:tcW w:w="846" w:type="dxa"/>
             <w:vAlign w:val="center"/>
           </w:tcPr>
           <w:p>
             <w:pPr>
+              <w:spacing w:line="360" w:lineRule="auto"/>
               <w:jc w:val="left"/>
               <w:rPr>
                 <w:rFonts w:ascii="Times New Roman" w:eastAsia="Aptos" w:hAnsi="Times New Roman" w:cs="Times New Roman"/>
@@ -2423,11 +2896,12 @@
         </w:tc>
         <w:tc>
           <w:tcPr>
-            <w:tcW w:w="987" w:type="dxa"/>
+            <w:tcW w:w="1176" w:type="dxa"/>
             <w:vAlign w:val="center"/>
           </w:tcPr>
           <w:p>
             <w:pPr>
+              <w:spacing w:line="360" w:lineRule="auto"/>
               <w:jc w:val="left"/>
               <w:rPr>
                 <w:rFonts w:ascii="Times New Roman" w:eastAsia="Aptos" w:hAnsi="Times New Roman" w:cs="Times New Roman"/>
@@ -2447,75 +2921,77 @@
         </w:tc>
         <w:tc>
           <w:tcPr>
-            <w:tcW w:w="2968" w:type="dxa"/>
+            <w:tcW w:w="2509" w:type="dxa"/>
+            <w:vAlign w:val="center"/>
+          </w:tcPr>
+          <w:p>
+            <w:pPr>
+              <w:spacing w:line="360" w:lineRule="auto"/>
+              <w:jc w:val="left"/>
+              <w:rPr>
+                <w:rFonts w:ascii="Times New Roman" w:eastAsia="Aptos" w:hAnsi="Times New Roman" w:cs="Times New Roman"/>
+                <w:b/>
+                <w:bCs/>
+              </w:rPr>
+            </w:pPr>
+            <w:r>
+              <w:rPr>
+                <w:rFonts w:ascii="Times New Roman" w:eastAsia="Aptos" w:hAnsi="Times New Roman" w:cs="Times New Roman"/>
+                <w:b/>
+                <w:bCs/>
+              </w:rPr>
+              <w:t>Title:</w:t>
+            </w:r>
+            <w:r>
+              <w:rPr>
+                <w:rFonts w:ascii="Times New Roman" w:eastAsia="Aptos" w:hAnsi="Times New Roman" w:cs="Times New Roman"/>
+              </w:rPr>
+              <w:t xml:space="preserve"> Categorical Filtering</w:t>
+            </w:r>
+          </w:p>
+        </w:tc>
+        <w:tc>
+          <w:tcPr>
+            <w:tcW w:w="4493" w:type="dxa"/>
+            <w:vAlign w:val="center"/>
+          </w:tcPr>
+          <w:p>
+            <w:pPr>
+              <w:spacing w:line="360" w:lineRule="auto"/>
+              <w:jc w:val="left"/>
+              <w:rPr>
+                <w:rFonts w:ascii="Times New Roman" w:eastAsia="Aptos" w:hAnsi="Times New Roman" w:cs="Times New Roman"/>
+                <w:b/>
+                <w:bCs/>
+              </w:rPr>
+            </w:pPr>
+            <w:r>
+              <w:rPr>
+                <w:rFonts w:ascii="Times New Roman" w:eastAsia="Aptos" w:hAnsi="Times New Roman" w:cs="Times New Roman"/>
+                <w:b/>
+                <w:bCs/>
+              </w:rPr>
+              <w:t xml:space="preserve">Test case Title: </w:t>
+            </w:r>
+            <w:r>
+              <w:rPr>
+                <w:rFonts w:ascii="Times New Roman" w:eastAsia="Aptos" w:hAnsi="Times New Roman" w:cs="Times New Roman"/>
+              </w:rPr>
+              <w:t>Hazard Type filtering</w:t>
+            </w:r>
+          </w:p>
+        </w:tc>
+      </w:tr>
+      <w:tr>
+        <w:tc>
+          <w:tcPr>
+            <w:tcW w:w="2022" w:type="dxa"/>
             <w:gridSpan w:val="2"/>
             <w:vAlign w:val="center"/>
           </w:tcPr>
           <w:p>
             <w:pPr>
-              <w:jc w:val="left"/>
-              <w:rPr>
-                <w:rFonts w:ascii="Times New Roman" w:eastAsia="Aptos" w:hAnsi="Times New Roman" w:cs="Times New Roman"/>
-                <w:b/>
-                <w:bCs/>
-              </w:rPr>
-            </w:pPr>
-            <w:r>
-              <w:rPr>
-                <w:rFonts w:ascii="Times New Roman" w:eastAsia="Aptos" w:hAnsi="Times New Roman" w:cs="Times New Roman"/>
-                <w:b/>
-                <w:bCs/>
-              </w:rPr>
-              <w:t>Title:</w:t>
-            </w:r>
-            <w:r>
-              <w:rPr>
-                <w:rFonts w:ascii="Times New Roman" w:eastAsia="Aptos" w:hAnsi="Times New Roman" w:cs="Times New Roman"/>
-              </w:rPr>
-              <w:t xml:space="preserve"> Categorical Filtering</w:t>
-            </w:r>
-          </w:p>
-        </w:tc>
-        <w:tc>
-          <w:tcPr>
-            <w:tcW w:w="4493" w:type="dxa"/>
-            <w:vAlign w:val="center"/>
-          </w:tcPr>
-          <w:p>
-            <w:pPr>
-              <w:jc w:val="left"/>
-              <w:rPr>
-                <w:rFonts w:ascii="Times New Roman" w:eastAsia="Aptos" w:hAnsi="Times New Roman" w:cs="Times New Roman"/>
-                <w:b/>
-                <w:bCs/>
-              </w:rPr>
-            </w:pPr>
-            <w:r>
-              <w:rPr>
-                <w:rFonts w:ascii="Times New Roman" w:eastAsia="Aptos" w:hAnsi="Times New Roman" w:cs="Times New Roman"/>
-                <w:b/>
-                <w:bCs/>
-              </w:rPr>
-              <w:t xml:space="preserve">Test case Title: </w:t>
-            </w:r>
-            <w:r>
-              <w:rPr>
-                <w:rFonts w:ascii="Times New Roman" w:eastAsia="Aptos" w:hAnsi="Times New Roman" w:cs="Times New Roman"/>
-              </w:rPr>
-              <w:t>Hazard Type filtering</w:t>
-            </w:r>
-          </w:p>
-        </w:tc>
-      </w:tr>
-      <w:tr>
-        <w:tc>
-          <w:tcPr>
-            <w:tcW w:w="2022" w:type="dxa"/>
-            <w:gridSpan w:val="3"/>
-            <w:vAlign w:val="center"/>
-          </w:tcPr>
-          <w:p>
-            <w:pPr>
+              <w:spacing w:line="360" w:lineRule="auto"/>
               <w:jc w:val="left"/>
               <w:rPr>
                 <w:rFonts w:ascii="Times New Roman" w:eastAsia="Aptos" w:hAnsi="Times New Roman" w:cs="Times New Roman"/>
@@ -2541,6 +3017,7 @@
           </w:tcPr>
           <w:p>
             <w:pPr>
+              <w:spacing w:line="360" w:lineRule="auto"/>
               <w:jc w:val="left"/>
               <w:rPr>
                 <w:rFonts w:ascii="Times New Roman" w:eastAsia="Aptos" w:hAnsi="Times New Roman" w:cs="Times New Roman"/>
@@ -2559,11 +3036,12 @@
         <w:tc>
           <w:tcPr>
             <w:tcW w:w="2022" w:type="dxa"/>
-            <w:gridSpan w:val="3"/>
+            <w:gridSpan w:val="2"/>
             <w:vAlign w:val="center"/>
           </w:tcPr>
           <w:p>
             <w:pPr>
+              <w:spacing w:line="360" w:lineRule="auto"/>
               <w:jc w:val="left"/>
               <w:rPr>
                 <w:rFonts w:ascii="Times New Roman" w:eastAsia="Aptos" w:hAnsi="Times New Roman" w:cs="Times New Roman"/>
@@ -2589,6 +3067,7 @@
           </w:tcPr>
           <w:p>
             <w:pPr>
+              <w:spacing w:line="360" w:lineRule="auto"/>
               <w:jc w:val="left"/>
               <w:rPr>
                 <w:rFonts w:ascii="Times New Roman" w:eastAsia="Aptos" w:hAnsi="Times New Roman" w:cs="Times New Roman"/>
@@ -2603,6 +3082,7 @@
           </w:p>
           <w:p>
             <w:pPr>
+              <w:spacing w:line="360" w:lineRule="auto"/>
               <w:jc w:val="left"/>
               <w:rPr>
                 <w:rFonts w:ascii="Times New Roman" w:eastAsia="Aptos" w:hAnsi="Times New Roman" w:cs="Times New Roman"/>
@@ -2617,6 +3097,7 @@
           </w:p>
           <w:p>
             <w:pPr>
+              <w:spacing w:line="360" w:lineRule="auto"/>
               <w:jc w:val="left"/>
               <w:rPr>
                 <w:rFonts w:ascii="Times New Roman" w:eastAsia="Aptos" w:hAnsi="Times New Roman" w:cs="Times New Roman"/>
@@ -2631,6 +3112,7 @@
           </w:p>
           <w:p>
             <w:pPr>
+              <w:spacing w:line="360" w:lineRule="auto"/>
               <w:jc w:val="left"/>
               <w:rPr>
                 <w:rFonts w:ascii="Times New Roman" w:eastAsia="Aptos" w:hAnsi="Times New Roman" w:cs="Times New Roman"/>
@@ -2649,11 +3131,12 @@
         <w:tc>
           <w:tcPr>
             <w:tcW w:w="2022" w:type="dxa"/>
-            <w:gridSpan w:val="3"/>
+            <w:gridSpan w:val="2"/>
             <w:vAlign w:val="center"/>
           </w:tcPr>
           <w:p>
             <w:pPr>
+              <w:spacing w:line="360" w:lineRule="auto"/>
               <w:jc w:val="left"/>
               <w:rPr>
                 <w:rFonts w:ascii="Times New Roman" w:eastAsia="Aptos" w:hAnsi="Times New Roman" w:cs="Times New Roman"/>
@@ -2679,6 +3162,7 @@
           </w:tcPr>
           <w:p>
             <w:pPr>
+              <w:spacing w:line="360" w:lineRule="auto"/>
               <w:jc w:val="left"/>
               <w:rPr>
                 <w:rFonts w:ascii="Times New Roman" w:eastAsia="Aptos" w:hAnsi="Times New Roman" w:cs="Times New Roman"/>
@@ -2693,6 +3177,7 @@
           </w:p>
           <w:p>
             <w:pPr>
+              <w:spacing w:line="360" w:lineRule="auto"/>
               <w:jc w:val="left"/>
               <w:rPr>
                 <w:rFonts w:ascii="Times New Roman" w:eastAsia="Aptos" w:hAnsi="Times New Roman" w:cs="Times New Roman"/>
@@ -2719,11 +3204,12 @@
         <w:tc>
           <w:tcPr>
             <w:tcW w:w="2022" w:type="dxa"/>
-            <w:gridSpan w:val="3"/>
+            <w:gridSpan w:val="2"/>
             <w:vAlign w:val="center"/>
           </w:tcPr>
           <w:p>
             <w:pPr>
+              <w:spacing w:line="360" w:lineRule="auto"/>
               <w:jc w:val="left"/>
               <w:rPr>
                 <w:rFonts w:ascii="Times New Roman" w:eastAsia="Aptos" w:hAnsi="Times New Roman" w:cs="Times New Roman"/>
@@ -2749,6 +3235,7 @@
           </w:tcPr>
           <w:p>
             <w:pPr>
+              <w:spacing w:line="360" w:lineRule="auto"/>
               <w:jc w:val="left"/>
               <w:rPr>
                 <w:rFonts w:ascii="Times New Roman" w:eastAsia="Aptos" w:hAnsi="Times New Roman" w:cs="Times New Roman"/>
@@ -2763,6 +3250,7 @@
           </w:p>
           <w:p>
             <w:pPr>
+              <w:spacing w:line="360" w:lineRule="auto"/>
               <w:jc w:val="left"/>
               <w:rPr>
                 <w:rFonts w:ascii="Times New Roman" w:eastAsia="Aptos" w:hAnsi="Times New Roman" w:cs="Times New Roman"/>
@@ -2777,6 +3265,7 @@
           </w:p>
           <w:p>
             <w:pPr>
+              <w:spacing w:line="360" w:lineRule="auto"/>
               <w:jc w:val="left"/>
               <w:rPr>
                 <w:rFonts w:ascii="Times New Roman" w:eastAsia="Aptos" w:hAnsi="Times New Roman" w:cs="Times New Roman"/>
@@ -2796,7 +3285,7 @@
     </w:tbl>
     <w:p>
       <w:pPr>
-        <w:spacing w:line="240" w:lineRule="auto"/>
+        <w:spacing w:line="360" w:lineRule="auto"/>
         <w:rPr>
           <w:rFonts w:ascii="Times New Roman" w:eastAsia="Aptos" w:hAnsi="Times New Roman" w:cs="Times New Roman"/>
           <w:b/>
@@ -2811,44 +3300,46 @@
         <w:tblLook w:val="04A0" w:firstRow="1" w:lastRow="0" w:firstColumn="1" w:lastColumn="0" w:noHBand="0" w:noVBand="1"/>
       </w:tblPr>
       <w:tblGrid>
-        <w:gridCol w:w="576"/>
-        <w:gridCol w:w="987"/>
-        <w:gridCol w:w="459"/>
+        <w:gridCol w:w="846"/>
+        <w:gridCol w:w="1176"/>
         <w:gridCol w:w="2509"/>
         <w:gridCol w:w="4493"/>
       </w:tblGrid>
       <w:tr>
         <w:tc>
           <w:tcPr>
-            <w:tcW w:w="576" w:type="dxa"/>
+            <w:tcW w:w="846" w:type="dxa"/>
             <w:vAlign w:val="center"/>
           </w:tcPr>
           <w:p>
             <w:pPr>
-              <w:jc w:val="left"/>
-              <w:rPr>
-                <w:rFonts w:ascii="Times New Roman" w:eastAsia="Aptos" w:hAnsi="Times New Roman" w:cs="Times New Roman"/>
-                <w:b/>
-                <w:bCs/>
-              </w:rPr>
-            </w:pPr>
-            <w:r>
-              <w:rPr>
-                <w:rFonts w:ascii="Times New Roman" w:eastAsia="Aptos" w:hAnsi="Times New Roman" w:cs="Times New Roman"/>
-                <w:b/>
-                <w:bCs/>
-              </w:rPr>
+              <w:spacing w:line="360" w:lineRule="auto"/>
+              <w:jc w:val="left"/>
+              <w:rPr>
+                <w:rFonts w:ascii="Times New Roman" w:eastAsia="Aptos" w:hAnsi="Times New Roman" w:cs="Times New Roman"/>
+                <w:b/>
+                <w:bCs/>
+              </w:rPr>
+            </w:pPr>
+            <w:r>
+              <w:rPr>
+                <w:rFonts w:ascii="Times New Roman" w:eastAsia="Aptos" w:hAnsi="Times New Roman" w:cs="Times New Roman"/>
+                <w:b/>
+                <w:bCs/>
+              </w:rPr>
+              <w:lastRenderedPageBreak/>
               <w:t>#03</w:t>
             </w:r>
           </w:p>
         </w:tc>
         <w:tc>
           <w:tcPr>
-            <w:tcW w:w="987" w:type="dxa"/>
+            <w:tcW w:w="1176" w:type="dxa"/>
             <w:vAlign w:val="center"/>
           </w:tcPr>
           <w:p>
             <w:pPr>
+              <w:spacing w:line="360" w:lineRule="auto"/>
               <w:jc w:val="left"/>
               <w:rPr>
                 <w:rFonts w:ascii="Times New Roman" w:eastAsia="Aptos" w:hAnsi="Times New Roman" w:cs="Times New Roman"/>
@@ -2868,69 +3359,77 @@
         </w:tc>
         <w:tc>
           <w:tcPr>
-            <w:tcW w:w="2968" w:type="dxa"/>
+            <w:tcW w:w="2509" w:type="dxa"/>
+            <w:vAlign w:val="center"/>
+          </w:tcPr>
+          <w:p>
+            <w:pPr>
+              <w:spacing w:line="360" w:lineRule="auto"/>
+              <w:jc w:val="left"/>
+              <w:rPr>
+                <w:rFonts w:ascii="Times New Roman" w:eastAsia="Aptos" w:hAnsi="Times New Roman" w:cs="Times New Roman"/>
+                <w:b/>
+                <w:bCs/>
+              </w:rPr>
+            </w:pPr>
+            <w:r>
+              <w:rPr>
+                <w:rFonts w:ascii="Times New Roman" w:eastAsia="Aptos" w:hAnsi="Times New Roman" w:cs="Times New Roman"/>
+                <w:b/>
+                <w:bCs/>
+              </w:rPr>
+              <w:t>Title:</w:t>
+            </w:r>
+            <w:r>
+              <w:rPr>
+                <w:rFonts w:ascii="Times New Roman" w:eastAsia="Aptos" w:hAnsi="Times New Roman" w:cs="Times New Roman"/>
+              </w:rPr>
+              <w:t xml:space="preserve"> top 5 Hazard trend logic</w:t>
+            </w:r>
+          </w:p>
+        </w:tc>
+        <w:tc>
+          <w:tcPr>
+            <w:tcW w:w="4493" w:type="dxa"/>
+            <w:vAlign w:val="center"/>
+          </w:tcPr>
+          <w:p>
+            <w:pPr>
+              <w:spacing w:line="360" w:lineRule="auto"/>
+              <w:jc w:val="left"/>
+              <w:rPr>
+                <w:rFonts w:ascii="Times New Roman" w:eastAsia="Aptos" w:hAnsi="Times New Roman" w:cs="Times New Roman"/>
+                <w:b/>
+                <w:bCs/>
+              </w:rPr>
+            </w:pPr>
+            <w:r>
+              <w:rPr>
+                <w:rFonts w:ascii="Times New Roman" w:eastAsia="Aptos" w:hAnsi="Times New Roman" w:cs="Times New Roman"/>
+                <w:b/>
+                <w:bCs/>
+              </w:rPr>
+              <w:t xml:space="preserve">Test case Title: </w:t>
+            </w:r>
+            <w:r>
+              <w:rPr>
+                <w:rFonts w:ascii="Times New Roman" w:eastAsia="Aptos" w:hAnsi="Times New Roman" w:cs="Times New Roman"/>
+              </w:rPr>
+              <w:t>Top 5 Hazard trend analysis</w:t>
+            </w:r>
+          </w:p>
+        </w:tc>
+      </w:tr>
+      <w:tr>
+        <w:tc>
+          <w:tcPr>
+            <w:tcW w:w="2022" w:type="dxa"/>
             <w:gridSpan w:val="2"/>
             <w:vAlign w:val="center"/>
           </w:tcPr>
           <w:p>
             <w:pPr>
-              <w:jc w:val="left"/>
-              <w:rPr>
-                <w:rFonts w:ascii="Times New Roman" w:eastAsia="Aptos" w:hAnsi="Times New Roman" w:cs="Times New Roman"/>
-                <w:b/>
-                <w:bCs/>
-              </w:rPr>
-            </w:pPr>
-            <w:r>
-              <w:rPr>
-                <w:rFonts w:ascii="Times New Roman" w:eastAsia="Aptos" w:hAnsi="Times New Roman" w:cs="Times New Roman"/>
-                <w:b/>
-                <w:bCs/>
-              </w:rPr>
-              <w:t>Title:</w:t>
-            </w:r>
-            <w:r>
-              <w:rPr>
-                <w:rFonts w:ascii="Times New Roman" w:eastAsia="Aptos" w:hAnsi="Times New Roman" w:cs="Times New Roman"/>
-              </w:rPr>
-              <w:t xml:space="preserve"> top 5 Hazard trend logic</w:t>
-            </w:r>
-          </w:p>
-        </w:tc>
-        <w:tc>
-          <w:tcPr>
-            <w:tcW w:w="4493" w:type="dxa"/>
-            <w:vAlign w:val="center"/>
-          </w:tcPr>
-          <w:p>
-            <w:pPr>
-              <w:jc w:val="left"/>
-              <w:rPr>
-                <w:rFonts w:ascii="Times New Roman" w:eastAsia="Aptos" w:hAnsi="Times New Roman" w:cs="Times New Roman"/>
-                <w:b/>
-                <w:bCs/>
-              </w:rPr>
-            </w:pPr>
-            <w:r>
-              <w:rPr>
-                <w:rFonts w:ascii="Times New Roman" w:eastAsia="Aptos" w:hAnsi="Times New Roman" w:cs="Times New Roman"/>
-                <w:b/>
-                <w:bCs/>
-              </w:rPr>
-              <w:t>Test case Title: Top 5 Hazard trend analysis</w:t>
-            </w:r>
-          </w:p>
-        </w:tc>
-      </w:tr>
-      <w:tr>
-        <w:tc>
-          <w:tcPr>
-            <w:tcW w:w="2022" w:type="dxa"/>
-            <w:gridSpan w:val="3"/>
-            <w:vAlign w:val="center"/>
-          </w:tcPr>
-          <w:p>
-            <w:pPr>
+              <w:spacing w:line="360" w:lineRule="auto"/>
               <w:jc w:val="left"/>
               <w:rPr>
                 <w:rFonts w:ascii="Times New Roman" w:eastAsia="Aptos" w:hAnsi="Times New Roman" w:cs="Times New Roman"/>
@@ -2956,6 +3455,7 @@
           </w:tcPr>
           <w:p>
             <w:pPr>
+              <w:spacing w:line="360" w:lineRule="auto"/>
               <w:jc w:val="left"/>
               <w:rPr>
                 <w:rFonts w:ascii="Times New Roman" w:eastAsia="Aptos" w:hAnsi="Times New Roman" w:cs="Times New Roman"/>
@@ -2974,11 +3474,12 @@
         <w:tc>
           <w:tcPr>
             <w:tcW w:w="2022" w:type="dxa"/>
-            <w:gridSpan w:val="3"/>
+            <w:gridSpan w:val="2"/>
             <w:vAlign w:val="center"/>
           </w:tcPr>
           <w:p>
             <w:pPr>
+              <w:spacing w:line="360" w:lineRule="auto"/>
               <w:jc w:val="left"/>
               <w:rPr>
                 <w:rFonts w:ascii="Times New Roman" w:eastAsia="Aptos" w:hAnsi="Times New Roman" w:cs="Times New Roman"/>
@@ -3004,6 +3505,7 @@
           </w:tcPr>
           <w:p>
             <w:pPr>
+              <w:spacing w:line="360" w:lineRule="auto"/>
               <w:jc w:val="left"/>
               <w:rPr>
                 <w:rFonts w:ascii="Times New Roman" w:eastAsia="Aptos" w:hAnsi="Times New Roman" w:cs="Times New Roman"/>
@@ -3018,6 +3520,7 @@
           </w:p>
           <w:p>
             <w:pPr>
+              <w:spacing w:line="360" w:lineRule="auto"/>
               <w:jc w:val="left"/>
               <w:rPr>
                 <w:rFonts w:ascii="Times New Roman" w:eastAsia="Aptos" w:hAnsi="Times New Roman" w:cs="Times New Roman"/>
@@ -3032,6 +3535,7 @@
           </w:p>
           <w:p>
             <w:pPr>
+              <w:spacing w:line="360" w:lineRule="auto"/>
               <w:jc w:val="left"/>
               <w:rPr>
                 <w:rFonts w:ascii="Times New Roman" w:eastAsia="Aptos" w:hAnsi="Times New Roman" w:cs="Times New Roman"/>
@@ -3050,11 +3554,12 @@
         <w:tc>
           <w:tcPr>
             <w:tcW w:w="2022" w:type="dxa"/>
-            <w:gridSpan w:val="3"/>
+            <w:gridSpan w:val="2"/>
             <w:vAlign w:val="center"/>
           </w:tcPr>
           <w:p>
             <w:pPr>
+              <w:spacing w:line="360" w:lineRule="auto"/>
               <w:jc w:val="left"/>
               <w:rPr>
                 <w:rFonts w:ascii="Times New Roman" w:eastAsia="Aptos" w:hAnsi="Times New Roman" w:cs="Times New Roman"/>
@@ -3080,6 +3585,7 @@
           </w:tcPr>
           <w:p>
             <w:pPr>
+              <w:spacing w:line="360" w:lineRule="auto"/>
               <w:jc w:val="left"/>
               <w:rPr>
                 <w:rFonts w:ascii="Times New Roman" w:eastAsia="Aptos" w:hAnsi="Times New Roman" w:cs="Times New Roman"/>
@@ -3120,11 +3626,12 @@
         <w:tc>
           <w:tcPr>
             <w:tcW w:w="2022" w:type="dxa"/>
-            <w:gridSpan w:val="3"/>
+            <w:gridSpan w:val="2"/>
             <w:vAlign w:val="center"/>
           </w:tcPr>
           <w:p>
             <w:pPr>
+              <w:spacing w:line="360" w:lineRule="auto"/>
               <w:jc w:val="left"/>
               <w:rPr>
                 <w:rFonts w:ascii="Times New Roman" w:eastAsia="Aptos" w:hAnsi="Times New Roman" w:cs="Times New Roman"/>
@@ -3150,6 +3657,7 @@
           </w:tcPr>
           <w:p>
             <w:pPr>
+              <w:spacing w:line="360" w:lineRule="auto"/>
               <w:jc w:val="left"/>
               <w:rPr>
                 <w:rFonts w:ascii="Times New Roman" w:eastAsia="Aptos" w:hAnsi="Times New Roman" w:cs="Times New Roman"/>
@@ -3164,6 +3672,7 @@
           </w:p>
           <w:p>
             <w:pPr>
+              <w:spacing w:line="360" w:lineRule="auto"/>
               <w:jc w:val="left"/>
               <w:rPr>
                 <w:rFonts w:ascii="Times New Roman" w:eastAsia="Aptos" w:hAnsi="Times New Roman" w:cs="Times New Roman"/>
@@ -3178,6 +3687,7 @@
           </w:p>
           <w:p>
             <w:pPr>
+              <w:spacing w:line="360" w:lineRule="auto"/>
               <w:jc w:val="left"/>
               <w:rPr>
                 <w:rFonts w:ascii="Times New Roman" w:eastAsia="Aptos" w:hAnsi="Times New Roman" w:cs="Times New Roman"/>
@@ -3197,35 +3707,7 @@
     </w:tbl>
     <w:p>
       <w:pPr>
-        <w:spacing w:line="240" w:lineRule="auto"/>
-        <w:rPr>
-          <w:rFonts w:ascii="Times New Roman" w:eastAsia="Aptos" w:hAnsi="Times New Roman" w:cs="Times New Roman"/>
-          <w:b/>
-          <w:bCs/>
-        </w:rPr>
-      </w:pPr>
-      <w:r>
-        <w:rPr>
-          <w:rFonts w:ascii="Times New Roman" w:eastAsia="Aptos" w:hAnsi="Times New Roman" w:cs="Times New Roman"/>
-          <w:b/>
-          <w:bCs/>
-        </w:rPr>
-        <w:br/>
-      </w:r>
-    </w:p>
-    <w:p>
-      <w:pPr>
-        <w:spacing w:line="240" w:lineRule="auto"/>
-        <w:rPr>
-          <w:rFonts w:ascii="Times New Roman" w:eastAsia="Aptos" w:hAnsi="Times New Roman" w:cs="Times New Roman"/>
-          <w:b/>
-          <w:bCs/>
-        </w:rPr>
-      </w:pPr>
-    </w:p>
-    <w:p>
-      <w:pPr>
-        <w:spacing w:line="240" w:lineRule="auto"/>
+        <w:spacing w:line="360" w:lineRule="auto"/>
         <w:rPr>
           <w:rFonts w:ascii="Times New Roman" w:eastAsia="Aptos" w:hAnsi="Times New Roman" w:cs="Times New Roman"/>
           <w:b/>
@@ -3240,45 +3722,45 @@
         <w:tblLook w:val="04A0" w:firstRow="1" w:lastRow="0" w:firstColumn="1" w:lastColumn="0" w:noHBand="0" w:noVBand="1"/>
       </w:tblPr>
       <w:tblGrid>
-        <w:gridCol w:w="576"/>
-        <w:gridCol w:w="987"/>
-        <w:gridCol w:w="459"/>
+        <w:gridCol w:w="846"/>
+        <w:gridCol w:w="1176"/>
         <w:gridCol w:w="2509"/>
         <w:gridCol w:w="4493"/>
       </w:tblGrid>
       <w:tr>
         <w:tc>
           <w:tcPr>
-            <w:tcW w:w="576" w:type="dxa"/>
+            <w:tcW w:w="846" w:type="dxa"/>
             <w:vAlign w:val="center"/>
           </w:tcPr>
           <w:p>
             <w:pPr>
-              <w:jc w:val="left"/>
-              <w:rPr>
-                <w:rFonts w:ascii="Times New Roman" w:eastAsia="Aptos" w:hAnsi="Times New Roman" w:cs="Times New Roman"/>
-                <w:b/>
-                <w:bCs/>
-              </w:rPr>
-            </w:pPr>
-            <w:r>
-              <w:rPr>
-                <w:rFonts w:ascii="Times New Roman" w:eastAsia="Aptos" w:hAnsi="Times New Roman" w:cs="Times New Roman"/>
-                <w:b/>
-                <w:bCs/>
-              </w:rPr>
-              <w:lastRenderedPageBreak/>
+              <w:spacing w:line="360" w:lineRule="auto"/>
+              <w:jc w:val="left"/>
+              <w:rPr>
+                <w:rFonts w:ascii="Times New Roman" w:eastAsia="Aptos" w:hAnsi="Times New Roman" w:cs="Times New Roman"/>
+                <w:b/>
+                <w:bCs/>
+              </w:rPr>
+            </w:pPr>
+            <w:r>
+              <w:rPr>
+                <w:rFonts w:ascii="Times New Roman" w:eastAsia="Aptos" w:hAnsi="Times New Roman" w:cs="Times New Roman"/>
+                <w:b/>
+                <w:bCs/>
+              </w:rPr>
               <w:t>#04</w:t>
             </w:r>
           </w:p>
         </w:tc>
         <w:tc>
           <w:tcPr>
-            <w:tcW w:w="987" w:type="dxa"/>
+            <w:tcW w:w="1176" w:type="dxa"/>
             <w:vAlign w:val="center"/>
           </w:tcPr>
           <w:p>
             <w:pPr>
+              <w:spacing w:line="360" w:lineRule="auto"/>
               <w:jc w:val="left"/>
               <w:rPr>
                 <w:rFonts w:ascii="Times New Roman" w:eastAsia="Aptos" w:hAnsi="Times New Roman" w:cs="Times New Roman"/>
@@ -3298,75 +3780,77 @@
         </w:tc>
         <w:tc>
           <w:tcPr>
-            <w:tcW w:w="2968" w:type="dxa"/>
+            <w:tcW w:w="2509" w:type="dxa"/>
+            <w:vAlign w:val="center"/>
+          </w:tcPr>
+          <w:p>
+            <w:pPr>
+              <w:spacing w:line="360" w:lineRule="auto"/>
+              <w:jc w:val="left"/>
+              <w:rPr>
+                <w:rFonts w:ascii="Times New Roman" w:eastAsia="Aptos" w:hAnsi="Times New Roman" w:cs="Times New Roman"/>
+                <w:b/>
+                <w:bCs/>
+              </w:rPr>
+            </w:pPr>
+            <w:r>
+              <w:rPr>
+                <w:rFonts w:ascii="Times New Roman" w:eastAsia="Aptos" w:hAnsi="Times New Roman" w:cs="Times New Roman"/>
+                <w:b/>
+                <w:bCs/>
+              </w:rPr>
+              <w:t>Title:</w:t>
+            </w:r>
+            <w:r>
+              <w:rPr>
+                <w:rFonts w:ascii="Times New Roman" w:eastAsia="Aptos" w:hAnsi="Times New Roman" w:cs="Times New Roman"/>
+              </w:rPr>
+              <w:t xml:space="preserve"> Geospatial Map</w:t>
+            </w:r>
+          </w:p>
+        </w:tc>
+        <w:tc>
+          <w:tcPr>
+            <w:tcW w:w="4493" w:type="dxa"/>
+            <w:vAlign w:val="center"/>
+          </w:tcPr>
+          <w:p>
+            <w:pPr>
+              <w:spacing w:line="360" w:lineRule="auto"/>
+              <w:jc w:val="left"/>
+              <w:rPr>
+                <w:rFonts w:ascii="Times New Roman" w:eastAsia="Aptos" w:hAnsi="Times New Roman" w:cs="Times New Roman"/>
+                <w:b/>
+                <w:bCs/>
+              </w:rPr>
+            </w:pPr>
+            <w:r>
+              <w:rPr>
+                <w:rFonts w:ascii="Times New Roman" w:eastAsia="Aptos" w:hAnsi="Times New Roman" w:cs="Times New Roman"/>
+                <w:b/>
+                <w:bCs/>
+              </w:rPr>
+              <w:t xml:space="preserve">Test case Title: </w:t>
+            </w:r>
+            <w:r>
+              <w:rPr>
+                <w:rFonts w:ascii="Times New Roman" w:eastAsia="Aptos" w:hAnsi="Times New Roman" w:cs="Times New Roman"/>
+              </w:rPr>
+              <w:t>Geospatial Map Hover</w:t>
+            </w:r>
+          </w:p>
+        </w:tc>
+      </w:tr>
+      <w:tr>
+        <w:tc>
+          <w:tcPr>
+            <w:tcW w:w="2022" w:type="dxa"/>
             <w:gridSpan w:val="2"/>
             <w:vAlign w:val="center"/>
           </w:tcPr>
           <w:p>
             <w:pPr>
-              <w:jc w:val="left"/>
-              <w:rPr>
-                <w:rFonts w:ascii="Times New Roman" w:eastAsia="Aptos" w:hAnsi="Times New Roman" w:cs="Times New Roman"/>
-                <w:b/>
-                <w:bCs/>
-              </w:rPr>
-            </w:pPr>
-            <w:r>
-              <w:rPr>
-                <w:rFonts w:ascii="Times New Roman" w:eastAsia="Aptos" w:hAnsi="Times New Roman" w:cs="Times New Roman"/>
-                <w:b/>
-                <w:bCs/>
-              </w:rPr>
-              <w:t>Title:</w:t>
-            </w:r>
-            <w:r>
-              <w:rPr>
-                <w:rFonts w:ascii="Times New Roman" w:eastAsia="Aptos" w:hAnsi="Times New Roman" w:cs="Times New Roman"/>
-              </w:rPr>
-              <w:t xml:space="preserve"> Geospatial Map</w:t>
-            </w:r>
-          </w:p>
-        </w:tc>
-        <w:tc>
-          <w:tcPr>
-            <w:tcW w:w="4493" w:type="dxa"/>
-            <w:vAlign w:val="center"/>
-          </w:tcPr>
-          <w:p>
-            <w:pPr>
-              <w:jc w:val="left"/>
-              <w:rPr>
-                <w:rFonts w:ascii="Times New Roman" w:eastAsia="Aptos" w:hAnsi="Times New Roman" w:cs="Times New Roman"/>
-                <w:b/>
-                <w:bCs/>
-              </w:rPr>
-            </w:pPr>
-            <w:r>
-              <w:rPr>
-                <w:rFonts w:ascii="Times New Roman" w:eastAsia="Aptos" w:hAnsi="Times New Roman" w:cs="Times New Roman"/>
-                <w:b/>
-                <w:bCs/>
-              </w:rPr>
-              <w:t xml:space="preserve">Test case Title: </w:t>
-            </w:r>
-            <w:r>
-              <w:rPr>
-                <w:rFonts w:ascii="Times New Roman" w:eastAsia="Aptos" w:hAnsi="Times New Roman" w:cs="Times New Roman"/>
-              </w:rPr>
-              <w:t>Geospatial Map Hover</w:t>
-            </w:r>
-          </w:p>
-        </w:tc>
-      </w:tr>
-      <w:tr>
-        <w:tc>
-          <w:tcPr>
-            <w:tcW w:w="2022" w:type="dxa"/>
-            <w:gridSpan w:val="3"/>
-            <w:vAlign w:val="center"/>
-          </w:tcPr>
-          <w:p>
-            <w:pPr>
+              <w:spacing w:line="360" w:lineRule="auto"/>
               <w:jc w:val="left"/>
               <w:rPr>
                 <w:rFonts w:ascii="Times New Roman" w:eastAsia="Aptos" w:hAnsi="Times New Roman" w:cs="Times New Roman"/>
@@ -3392,6 +3876,7 @@
           </w:tcPr>
           <w:p>
             <w:pPr>
+              <w:spacing w:line="360" w:lineRule="auto"/>
               <w:jc w:val="left"/>
               <w:rPr>
                 <w:rFonts w:ascii="Times New Roman" w:eastAsia="Aptos" w:hAnsi="Times New Roman" w:cs="Times New Roman"/>
@@ -3410,11 +3895,12 @@
         <w:tc>
           <w:tcPr>
             <w:tcW w:w="2022" w:type="dxa"/>
-            <w:gridSpan w:val="3"/>
+            <w:gridSpan w:val="2"/>
             <w:vAlign w:val="center"/>
           </w:tcPr>
           <w:p>
             <w:pPr>
+              <w:spacing w:line="360" w:lineRule="auto"/>
               <w:jc w:val="left"/>
               <w:rPr>
                 <w:rFonts w:ascii="Times New Roman" w:eastAsia="Aptos" w:hAnsi="Times New Roman" w:cs="Times New Roman"/>
@@ -3440,6 +3926,7 @@
           </w:tcPr>
           <w:p>
             <w:pPr>
+              <w:spacing w:line="360" w:lineRule="auto"/>
               <w:jc w:val="left"/>
               <w:rPr>
                 <w:rFonts w:ascii="Times New Roman" w:eastAsia="Aptos" w:hAnsi="Times New Roman" w:cs="Times New Roman"/>
@@ -3454,6 +3941,7 @@
           </w:p>
           <w:p>
             <w:pPr>
+              <w:spacing w:line="360" w:lineRule="auto"/>
               <w:jc w:val="left"/>
               <w:rPr>
                 <w:rFonts w:ascii="Times New Roman" w:eastAsia="Aptos" w:hAnsi="Times New Roman" w:cs="Times New Roman"/>
@@ -3472,11 +3960,12 @@
         <w:tc>
           <w:tcPr>
             <w:tcW w:w="2022" w:type="dxa"/>
-            <w:gridSpan w:val="3"/>
+            <w:gridSpan w:val="2"/>
             <w:vAlign w:val="center"/>
           </w:tcPr>
           <w:p>
             <w:pPr>
+              <w:spacing w:line="360" w:lineRule="auto"/>
               <w:jc w:val="left"/>
               <w:rPr>
                 <w:rFonts w:ascii="Times New Roman" w:eastAsia="Aptos" w:hAnsi="Times New Roman" w:cs="Times New Roman"/>
@@ -3502,6 +3991,7 @@
           </w:tcPr>
           <w:p>
             <w:pPr>
+              <w:spacing w:line="360" w:lineRule="auto"/>
               <w:jc w:val="left"/>
               <w:rPr>
                 <w:rFonts w:ascii="Times New Roman" w:eastAsia="Aptos" w:hAnsi="Times New Roman" w:cs="Times New Roman"/>
@@ -3548,11 +4038,12 @@
         <w:tc>
           <w:tcPr>
             <w:tcW w:w="2022" w:type="dxa"/>
-            <w:gridSpan w:val="3"/>
+            <w:gridSpan w:val="2"/>
             <w:vAlign w:val="center"/>
           </w:tcPr>
           <w:p>
             <w:pPr>
+              <w:spacing w:line="360" w:lineRule="auto"/>
               <w:jc w:val="left"/>
               <w:rPr>
                 <w:rFonts w:ascii="Times New Roman" w:eastAsia="Aptos" w:hAnsi="Times New Roman" w:cs="Times New Roman"/>
@@ -3578,6 +4069,7 @@
           </w:tcPr>
           <w:p>
             <w:pPr>
+              <w:spacing w:line="360" w:lineRule="auto"/>
               <w:jc w:val="left"/>
               <w:rPr>
                 <w:rFonts w:ascii="Times New Roman" w:eastAsia="Aptos" w:hAnsi="Times New Roman" w:cs="Times New Roman"/>
@@ -3595,7 +4087,7 @@
     </w:tbl>
     <w:p>
       <w:pPr>
-        <w:spacing w:line="240" w:lineRule="auto"/>
+        <w:spacing w:line="360" w:lineRule="auto"/>
         <w:rPr>
           <w:rFonts w:ascii="Times New Roman" w:eastAsia="Aptos" w:hAnsi="Times New Roman" w:cs="Times New Roman"/>
           <w:b/>
@@ -3610,20 +4102,20 @@
         <w:tblLook w:val="04A0" w:firstRow="1" w:lastRow="0" w:firstColumn="1" w:lastColumn="0" w:noHBand="0" w:noVBand="1"/>
       </w:tblPr>
       <w:tblGrid>
-        <w:gridCol w:w="576"/>
-        <w:gridCol w:w="987"/>
-        <w:gridCol w:w="459"/>
+        <w:gridCol w:w="846"/>
+        <w:gridCol w:w="1176"/>
         <w:gridCol w:w="2509"/>
         <w:gridCol w:w="4493"/>
       </w:tblGrid>
       <w:tr>
         <w:tc>
           <w:tcPr>
-            <w:tcW w:w="576" w:type="dxa"/>
+            <w:tcW w:w="846" w:type="dxa"/>
             <w:vAlign w:val="center"/>
           </w:tcPr>
           <w:p>
             <w:pPr>
+              <w:spacing w:line="360" w:lineRule="auto"/>
               <w:jc w:val="left"/>
               <w:rPr>
                 <w:rFonts w:ascii="Times New Roman" w:eastAsia="Aptos" w:hAnsi="Times New Roman" w:cs="Times New Roman"/>
@@ -3643,11 +4135,12 @@
         </w:tc>
         <w:tc>
           <w:tcPr>
-            <w:tcW w:w="987" w:type="dxa"/>
+            <w:tcW w:w="1176" w:type="dxa"/>
             <w:vAlign w:val="center"/>
           </w:tcPr>
           <w:p>
             <w:pPr>
+              <w:spacing w:line="360" w:lineRule="auto"/>
               <w:jc w:val="left"/>
               <w:rPr>
                 <w:rFonts w:ascii="Times New Roman" w:eastAsia="Aptos" w:hAnsi="Times New Roman" w:cs="Times New Roman"/>
@@ -3667,75 +4160,77 @@
         </w:tc>
         <w:tc>
           <w:tcPr>
-            <w:tcW w:w="2968" w:type="dxa"/>
+            <w:tcW w:w="2509" w:type="dxa"/>
+            <w:vAlign w:val="center"/>
+          </w:tcPr>
+          <w:p>
+            <w:pPr>
+              <w:spacing w:line="360" w:lineRule="auto"/>
+              <w:jc w:val="left"/>
+              <w:rPr>
+                <w:rFonts w:ascii="Times New Roman" w:eastAsia="Aptos" w:hAnsi="Times New Roman" w:cs="Times New Roman"/>
+                <w:b/>
+                <w:bCs/>
+              </w:rPr>
+            </w:pPr>
+            <w:r>
+              <w:rPr>
+                <w:rFonts w:ascii="Times New Roman" w:eastAsia="Aptos" w:hAnsi="Times New Roman" w:cs="Times New Roman"/>
+                <w:b/>
+                <w:bCs/>
+              </w:rPr>
+              <w:t>Title:</w:t>
+            </w:r>
+            <w:r>
+              <w:rPr>
+                <w:rFonts w:ascii="Times New Roman" w:eastAsia="Aptos" w:hAnsi="Times New Roman" w:cs="Times New Roman"/>
+              </w:rPr>
+              <w:t xml:space="preserve"> KPI</w:t>
+            </w:r>
+          </w:p>
+        </w:tc>
+        <w:tc>
+          <w:tcPr>
+            <w:tcW w:w="4493" w:type="dxa"/>
+            <w:vAlign w:val="center"/>
+          </w:tcPr>
+          <w:p>
+            <w:pPr>
+              <w:spacing w:line="360" w:lineRule="auto"/>
+              <w:jc w:val="left"/>
+              <w:rPr>
+                <w:rFonts w:ascii="Times New Roman" w:eastAsia="Aptos" w:hAnsi="Times New Roman" w:cs="Times New Roman"/>
+                <w:b/>
+                <w:bCs/>
+              </w:rPr>
+            </w:pPr>
+            <w:r>
+              <w:rPr>
+                <w:rFonts w:ascii="Times New Roman" w:eastAsia="Aptos" w:hAnsi="Times New Roman" w:cs="Times New Roman"/>
+                <w:b/>
+                <w:bCs/>
+              </w:rPr>
+              <w:t xml:space="preserve">Test case Title: </w:t>
+            </w:r>
+            <w:r>
+              <w:rPr>
+                <w:rFonts w:ascii="Times New Roman" w:eastAsia="Aptos" w:hAnsi="Times New Roman" w:cs="Times New Roman"/>
+              </w:rPr>
+              <w:t>KPI Accuracy</w:t>
+            </w:r>
+          </w:p>
+        </w:tc>
+      </w:tr>
+      <w:tr>
+        <w:tc>
+          <w:tcPr>
+            <w:tcW w:w="2022" w:type="dxa"/>
             <w:gridSpan w:val="2"/>
             <w:vAlign w:val="center"/>
           </w:tcPr>
           <w:p>
             <w:pPr>
-              <w:jc w:val="left"/>
-              <w:rPr>
-                <w:rFonts w:ascii="Times New Roman" w:eastAsia="Aptos" w:hAnsi="Times New Roman" w:cs="Times New Roman"/>
-                <w:b/>
-                <w:bCs/>
-              </w:rPr>
-            </w:pPr>
-            <w:r>
-              <w:rPr>
-                <w:rFonts w:ascii="Times New Roman" w:eastAsia="Aptos" w:hAnsi="Times New Roman" w:cs="Times New Roman"/>
-                <w:b/>
-                <w:bCs/>
-              </w:rPr>
-              <w:t>Title:</w:t>
-            </w:r>
-            <w:r>
-              <w:rPr>
-                <w:rFonts w:ascii="Times New Roman" w:eastAsia="Aptos" w:hAnsi="Times New Roman" w:cs="Times New Roman"/>
-              </w:rPr>
-              <w:t xml:space="preserve"> KPI</w:t>
-            </w:r>
-          </w:p>
-        </w:tc>
-        <w:tc>
-          <w:tcPr>
-            <w:tcW w:w="4493" w:type="dxa"/>
-            <w:vAlign w:val="center"/>
-          </w:tcPr>
-          <w:p>
-            <w:pPr>
-              <w:jc w:val="left"/>
-              <w:rPr>
-                <w:rFonts w:ascii="Times New Roman" w:eastAsia="Aptos" w:hAnsi="Times New Roman" w:cs="Times New Roman"/>
-                <w:b/>
-                <w:bCs/>
-              </w:rPr>
-            </w:pPr>
-            <w:r>
-              <w:rPr>
-                <w:rFonts w:ascii="Times New Roman" w:eastAsia="Aptos" w:hAnsi="Times New Roman" w:cs="Times New Roman"/>
-                <w:b/>
-                <w:bCs/>
-              </w:rPr>
-              <w:t xml:space="preserve">Test case Title: </w:t>
-            </w:r>
-            <w:r>
-              <w:rPr>
-                <w:rFonts w:ascii="Times New Roman" w:eastAsia="Aptos" w:hAnsi="Times New Roman" w:cs="Times New Roman"/>
-              </w:rPr>
-              <w:t>KPI Accuracy</w:t>
-            </w:r>
-          </w:p>
-        </w:tc>
-      </w:tr>
-      <w:tr>
-        <w:tc>
-          <w:tcPr>
-            <w:tcW w:w="2022" w:type="dxa"/>
-            <w:gridSpan w:val="3"/>
-            <w:vAlign w:val="center"/>
-          </w:tcPr>
-          <w:p>
-            <w:pPr>
+              <w:spacing w:line="360" w:lineRule="auto"/>
               <w:jc w:val="left"/>
               <w:rPr>
                 <w:rFonts w:ascii="Times New Roman" w:eastAsia="Aptos" w:hAnsi="Times New Roman" w:cs="Times New Roman"/>
@@ -3761,6 +4256,7 @@
           </w:tcPr>
           <w:p>
             <w:pPr>
+              <w:spacing w:line="360" w:lineRule="auto"/>
               <w:jc w:val="left"/>
               <w:rPr>
                 <w:rFonts w:ascii="Times New Roman" w:eastAsia="Aptos" w:hAnsi="Times New Roman" w:cs="Times New Roman"/>
@@ -3779,11 +4275,12 @@
         <w:tc>
           <w:tcPr>
             <w:tcW w:w="2022" w:type="dxa"/>
-            <w:gridSpan w:val="3"/>
+            <w:gridSpan w:val="2"/>
             <w:vAlign w:val="center"/>
           </w:tcPr>
           <w:p>
             <w:pPr>
+              <w:spacing w:line="360" w:lineRule="auto"/>
               <w:jc w:val="left"/>
               <w:rPr>
                 <w:rFonts w:ascii="Times New Roman" w:eastAsia="Aptos" w:hAnsi="Times New Roman" w:cs="Times New Roman"/>
@@ -3809,6 +4306,7 @@
           </w:tcPr>
           <w:p>
             <w:pPr>
+              <w:spacing w:line="360" w:lineRule="auto"/>
               <w:jc w:val="left"/>
               <w:rPr>
                 <w:rFonts w:ascii="Times New Roman" w:eastAsia="Aptos" w:hAnsi="Times New Roman" w:cs="Times New Roman"/>
@@ -3823,6 +4321,7 @@
           </w:p>
           <w:p>
             <w:pPr>
+              <w:spacing w:line="360" w:lineRule="auto"/>
               <w:jc w:val="left"/>
               <w:rPr>
                 <w:rFonts w:ascii="Times New Roman" w:eastAsia="Aptos" w:hAnsi="Times New Roman" w:cs="Times New Roman"/>
@@ -3841,11 +4340,12 @@
         <w:tc>
           <w:tcPr>
             <w:tcW w:w="2022" w:type="dxa"/>
-            <w:gridSpan w:val="3"/>
+            <w:gridSpan w:val="2"/>
             <w:vAlign w:val="center"/>
           </w:tcPr>
           <w:p>
             <w:pPr>
+              <w:spacing w:line="360" w:lineRule="auto"/>
               <w:jc w:val="left"/>
               <w:rPr>
                 <w:rFonts w:ascii="Times New Roman" w:eastAsia="Aptos" w:hAnsi="Times New Roman" w:cs="Times New Roman"/>
@@ -3871,6 +4371,7 @@
           </w:tcPr>
           <w:p>
             <w:pPr>
+              <w:spacing w:line="360" w:lineRule="auto"/>
               <w:jc w:val="left"/>
               <w:rPr>
                 <w:rFonts w:ascii="Times New Roman" w:eastAsia="Aptos" w:hAnsi="Times New Roman" w:cs="Times New Roman"/>
@@ -3885,6 +4386,7 @@
           </w:p>
           <w:p>
             <w:pPr>
+              <w:spacing w:line="360" w:lineRule="auto"/>
               <w:jc w:val="left"/>
               <w:rPr>
                 <w:rFonts w:ascii="Times New Roman" w:eastAsia="Aptos" w:hAnsi="Times New Roman" w:cs="Times New Roman"/>
@@ -3914,11 +4416,12 @@
         <w:tc>
           <w:tcPr>
             <w:tcW w:w="2022" w:type="dxa"/>
-            <w:gridSpan w:val="3"/>
+            <w:gridSpan w:val="2"/>
             <w:vAlign w:val="center"/>
           </w:tcPr>
           <w:p>
             <w:pPr>
+              <w:spacing w:line="360" w:lineRule="auto"/>
               <w:jc w:val="left"/>
               <w:rPr>
                 <w:rFonts w:ascii="Times New Roman" w:eastAsia="Aptos" w:hAnsi="Times New Roman" w:cs="Times New Roman"/>
@@ -3944,6 +4447,7 @@
           </w:tcPr>
           <w:p>
             <w:pPr>
+              <w:spacing w:line="360" w:lineRule="auto"/>
               <w:jc w:val="left"/>
               <w:rPr>
                 <w:rFonts w:ascii="Times New Roman" w:eastAsia="Aptos" w:hAnsi="Times New Roman" w:cs="Times New Roman"/>
@@ -3963,17 +4467,7 @@
     </w:tbl>
     <w:p>
       <w:pPr>
-        <w:spacing w:line="240" w:lineRule="auto"/>
-        <w:rPr>
-          <w:rFonts w:ascii="Times New Roman" w:eastAsia="Aptos" w:hAnsi="Times New Roman" w:cs="Times New Roman"/>
-          <w:b/>
-          <w:bCs/>
-        </w:rPr>
-      </w:pPr>
-    </w:p>
-    <w:p>
-      <w:pPr>
-        <w:spacing w:before="360" w:after="80" w:line="240" w:lineRule="auto"/>
+        <w:spacing w:before="360" w:after="80" w:line="360" w:lineRule="auto"/>
         <w:outlineLvl w:val="0"/>
         <w:rPr>
           <w:rFonts w:ascii="Times New Roman" w:eastAsia="Times New Roman" w:hAnsi="Times New Roman" w:cs="Times New Roman"/>
@@ -3984,7 +4478,11 @@
           <w:szCs w:val="40"/>
         </w:rPr>
       </w:pPr>
-      <w:r>
+    </w:p>
+    <w:p>
+      <w:pPr>
+        <w:spacing w:before="360" w:after="80" w:line="360" w:lineRule="auto"/>
+        <w:outlineLvl w:val="0"/>
         <w:rPr>
           <w:rFonts w:ascii="Times New Roman" w:eastAsia="Times New Roman" w:hAnsi="Times New Roman" w:cs="Times New Roman"/>
           <w:b/>
@@ -3993,6 +4491,17 @@
           <w:sz w:val="40"/>
           <w:szCs w:val="40"/>
         </w:rPr>
+      </w:pPr>
+      <w:r>
+        <w:rPr>
+          <w:rFonts w:ascii="Times New Roman" w:eastAsia="Times New Roman" w:hAnsi="Times New Roman" w:cs="Times New Roman"/>
+          <w:b/>
+          <w:bCs/>
+          <w:color w:val="0F4761"/>
+          <w:sz w:val="40"/>
+          <w:szCs w:val="40"/>
+        </w:rPr>
+        <w:lastRenderedPageBreak/>
         <w:t>Test log</w:t>
       </w:r>
     </w:p>
@@ -4017,6 +4526,7 @@
           </w:tcPr>
           <w:p>
             <w:pPr>
+              <w:spacing w:line="360" w:lineRule="auto"/>
               <w:rPr>
                 <w:rFonts w:ascii="Times New Roman" w:eastAsia="Aptos" w:hAnsi="Times New Roman" w:cs="Times New Roman"/>
                 <w:b/>
@@ -4039,6 +4549,7 @@
           </w:tcPr>
           <w:p>
             <w:pPr>
+              <w:spacing w:line="360" w:lineRule="auto"/>
               <w:rPr>
                 <w:rFonts w:ascii="Times New Roman" w:eastAsia="Aptos" w:hAnsi="Times New Roman" w:cs="Times New Roman"/>
                 <w:b/>
@@ -4061,6 +4572,7 @@
           </w:tcPr>
           <w:p>
             <w:pPr>
+              <w:spacing w:line="360" w:lineRule="auto"/>
               <w:rPr>
                 <w:rFonts w:ascii="Times New Roman" w:eastAsia="Aptos" w:hAnsi="Times New Roman" w:cs="Times New Roman"/>
                 <w:b/>
@@ -4083,6 +4595,7 @@
           </w:tcPr>
           <w:p>
             <w:pPr>
+              <w:spacing w:line="360" w:lineRule="auto"/>
               <w:rPr>
                 <w:rFonts w:ascii="Times New Roman" w:eastAsia="Aptos" w:hAnsi="Times New Roman" w:cs="Times New Roman"/>
                 <w:b/>
@@ -4105,6 +4618,7 @@
           </w:tcPr>
           <w:p>
             <w:pPr>
+              <w:spacing w:line="360" w:lineRule="auto"/>
               <w:rPr>
                 <w:rFonts w:ascii="Times New Roman" w:eastAsia="Aptos" w:hAnsi="Times New Roman" w:cs="Times New Roman"/>
                 <w:b/>
@@ -4127,6 +4641,7 @@
           </w:tcPr>
           <w:p>
             <w:pPr>
+              <w:spacing w:line="360" w:lineRule="auto"/>
               <w:rPr>
                 <w:rFonts w:ascii="Times New Roman" w:eastAsia="Aptos" w:hAnsi="Times New Roman" w:cs="Times New Roman"/>
                 <w:b/>
@@ -4151,6 +4666,7 @@
           </w:tcPr>
           <w:p>
             <w:pPr>
+              <w:spacing w:line="360" w:lineRule="auto"/>
               <w:rPr>
                 <w:rFonts w:ascii="Times New Roman" w:eastAsia="Aptos" w:hAnsi="Times New Roman" w:cs="Times New Roman"/>
               </w:rPr>
@@ -4169,6 +4685,7 @@
           </w:tcPr>
           <w:p>
             <w:pPr>
+              <w:spacing w:line="360" w:lineRule="auto"/>
               <w:rPr>
                 <w:rFonts w:ascii="Times New Roman" w:eastAsia="Aptos" w:hAnsi="Times New Roman" w:cs="Times New Roman"/>
               </w:rPr>
@@ -4187,6 +4704,7 @@
           </w:tcPr>
           <w:p>
             <w:pPr>
+              <w:spacing w:line="360" w:lineRule="auto"/>
               <w:rPr>
                 <w:rFonts w:ascii="Times New Roman" w:eastAsia="Aptos" w:hAnsi="Times New Roman" w:cs="Times New Roman"/>
               </w:rPr>
@@ -4205,6 +4723,7 @@
           </w:tcPr>
           <w:p>
             <w:pPr>
+              <w:spacing w:line="360" w:lineRule="auto"/>
               <w:rPr>
                 <w:rFonts w:ascii="Times New Roman" w:eastAsia="Aptos" w:hAnsi="Times New Roman" w:cs="Times New Roman"/>
               </w:rPr>
@@ -4223,6 +4742,7 @@
           </w:tcPr>
           <w:p>
             <w:pPr>
+              <w:spacing w:line="360" w:lineRule="auto"/>
               <w:rPr>
                 <w:rFonts w:ascii="Times New Roman" w:eastAsia="Aptos" w:hAnsi="Times New Roman" w:cs="Times New Roman"/>
               </w:rPr>
@@ -4241,6 +4761,7 @@
           </w:tcPr>
           <w:p>
             <w:pPr>
+              <w:spacing w:line="360" w:lineRule="auto"/>
               <w:rPr>
                 <w:rFonts w:ascii="Times New Roman" w:eastAsia="Aptos" w:hAnsi="Times New Roman" w:cs="Times New Roman"/>
               </w:rPr>
@@ -4255,6 +4776,7 @@
           </w:tcPr>
           <w:p>
             <w:pPr>
+              <w:spacing w:line="360" w:lineRule="auto"/>
               <w:rPr>
                 <w:rFonts w:ascii="Times New Roman" w:eastAsia="Aptos" w:hAnsi="Times New Roman" w:cs="Times New Roman"/>
               </w:rPr>
@@ -4273,6 +4795,7 @@
           </w:tcPr>
           <w:p>
             <w:pPr>
+              <w:spacing w:line="360" w:lineRule="auto"/>
               <w:rPr>
                 <w:rFonts w:ascii="Times New Roman" w:eastAsia="Aptos" w:hAnsi="Times New Roman" w:cs="Times New Roman"/>
               </w:rPr>
@@ -4291,6 +4814,7 @@
           </w:tcPr>
           <w:p>
             <w:pPr>
+              <w:spacing w:line="360" w:lineRule="auto"/>
               <w:rPr>
                 <w:rFonts w:ascii="Times New Roman" w:eastAsia="Aptos" w:hAnsi="Times New Roman" w:cs="Times New Roman"/>
               </w:rPr>
@@ -4309,6 +4833,7 @@
           </w:tcPr>
           <w:p>
             <w:pPr>
+              <w:spacing w:line="360" w:lineRule="auto"/>
               <w:rPr>
                 <w:rFonts w:ascii="Times New Roman" w:eastAsia="Aptos" w:hAnsi="Times New Roman" w:cs="Times New Roman"/>
               </w:rPr>
@@ -4327,6 +4852,7 @@
           </w:tcPr>
           <w:p>
             <w:pPr>
+              <w:spacing w:line="360" w:lineRule="auto"/>
               <w:rPr>
                 <w:rFonts w:ascii="Times New Roman" w:eastAsia="Aptos" w:hAnsi="Times New Roman" w:cs="Times New Roman"/>
               </w:rPr>
@@ -4345,6 +4871,7 @@
           </w:tcPr>
           <w:p>
             <w:pPr>
+              <w:spacing w:line="360" w:lineRule="auto"/>
               <w:rPr>
                 <w:rFonts w:ascii="Times New Roman" w:eastAsia="Aptos" w:hAnsi="Times New Roman" w:cs="Times New Roman"/>
               </w:rPr>
@@ -4359,6 +4886,7 @@
           </w:tcPr>
           <w:p>
             <w:pPr>
+              <w:spacing w:line="360" w:lineRule="auto"/>
               <w:rPr>
                 <w:rFonts w:ascii="Times New Roman" w:eastAsia="Aptos" w:hAnsi="Times New Roman" w:cs="Times New Roman"/>
               </w:rPr>
@@ -4377,6 +4905,7 @@
           </w:tcPr>
           <w:p>
             <w:pPr>
+              <w:spacing w:line="360" w:lineRule="auto"/>
               <w:rPr>
                 <w:rFonts w:ascii="Times New Roman" w:eastAsia="Aptos" w:hAnsi="Times New Roman" w:cs="Times New Roman"/>
               </w:rPr>
@@ -4395,6 +4924,7 @@
           </w:tcPr>
           <w:p>
             <w:pPr>
+              <w:spacing w:line="360" w:lineRule="auto"/>
               <w:rPr>
                 <w:rFonts w:ascii="Times New Roman" w:eastAsia="Aptos" w:hAnsi="Times New Roman" w:cs="Times New Roman"/>
               </w:rPr>
@@ -4413,6 +4943,7 @@
           </w:tcPr>
           <w:p>
             <w:pPr>
+              <w:spacing w:line="360" w:lineRule="auto"/>
               <w:rPr>
                 <w:rFonts w:ascii="Times New Roman" w:eastAsia="Aptos" w:hAnsi="Times New Roman" w:cs="Times New Roman"/>
               </w:rPr>
@@ -4431,6 +4962,7 @@
           </w:tcPr>
           <w:p>
             <w:pPr>
+              <w:spacing w:line="360" w:lineRule="auto"/>
               <w:rPr>
                 <w:rFonts w:ascii="Times New Roman" w:eastAsia="Aptos" w:hAnsi="Times New Roman" w:cs="Times New Roman"/>
               </w:rPr>
@@ -4449,6 +4981,7 @@
           </w:tcPr>
           <w:p>
             <w:pPr>
+              <w:spacing w:line="360" w:lineRule="auto"/>
               <w:rPr>
                 <w:rFonts w:ascii="Times New Roman" w:eastAsia="Aptos" w:hAnsi="Times New Roman" w:cs="Times New Roman"/>
               </w:rPr>
@@ -4463,6 +4996,7 @@
           </w:tcPr>
           <w:p>
             <w:pPr>
+              <w:spacing w:line="360" w:lineRule="auto"/>
               <w:rPr>
                 <w:rFonts w:ascii="Times New Roman" w:eastAsia="Aptos" w:hAnsi="Times New Roman" w:cs="Times New Roman"/>
               </w:rPr>
@@ -4481,6 +5015,7 @@
           </w:tcPr>
           <w:p>
             <w:pPr>
+              <w:spacing w:line="360" w:lineRule="auto"/>
               <w:rPr>
                 <w:rFonts w:ascii="Times New Roman" w:eastAsia="Aptos" w:hAnsi="Times New Roman" w:cs="Times New Roman"/>
               </w:rPr>
@@ -4499,6 +5034,7 @@
           </w:tcPr>
           <w:p>
             <w:pPr>
+              <w:spacing w:line="360" w:lineRule="auto"/>
               <w:rPr>
                 <w:rFonts w:ascii="Times New Roman" w:eastAsia="Aptos" w:hAnsi="Times New Roman" w:cs="Times New Roman"/>
               </w:rPr>
@@ -4517,6 +5053,7 @@
           </w:tcPr>
           <w:p>
             <w:pPr>
+              <w:spacing w:line="360" w:lineRule="auto"/>
               <w:rPr>
                 <w:rFonts w:ascii="Times New Roman" w:eastAsia="Aptos" w:hAnsi="Times New Roman" w:cs="Times New Roman"/>
               </w:rPr>
@@ -4535,6 +5072,7 @@
           </w:tcPr>
           <w:p>
             <w:pPr>
+              <w:spacing w:line="360" w:lineRule="auto"/>
               <w:rPr>
                 <w:rFonts w:ascii="Times New Roman" w:eastAsia="Aptos" w:hAnsi="Times New Roman" w:cs="Times New Roman"/>
               </w:rPr>
@@ -4553,6 +5091,7 @@
           </w:tcPr>
           <w:p>
             <w:pPr>
+              <w:spacing w:line="360" w:lineRule="auto"/>
               <w:rPr>
                 <w:rFonts w:ascii="Times New Roman" w:eastAsia="Aptos" w:hAnsi="Times New Roman" w:cs="Times New Roman"/>
               </w:rPr>
@@ -4567,6 +5106,7 @@
           </w:tcPr>
           <w:p>
             <w:pPr>
+              <w:spacing w:line="360" w:lineRule="auto"/>
               <w:rPr>
                 <w:rFonts w:ascii="Times New Roman" w:eastAsia="Aptos" w:hAnsi="Times New Roman" w:cs="Times New Roman"/>
               </w:rPr>
@@ -4585,6 +5125,7 @@
           </w:tcPr>
           <w:p>
             <w:pPr>
+              <w:spacing w:line="360" w:lineRule="auto"/>
               <w:rPr>
                 <w:rFonts w:ascii="Times New Roman" w:eastAsia="Aptos" w:hAnsi="Times New Roman" w:cs="Times New Roman"/>
               </w:rPr>
@@ -4603,6 +5144,7 @@
           </w:tcPr>
           <w:p>
             <w:pPr>
+              <w:spacing w:line="360" w:lineRule="auto"/>
               <w:rPr>
                 <w:rFonts w:ascii="Times New Roman" w:eastAsia="Aptos" w:hAnsi="Times New Roman" w:cs="Times New Roman"/>
               </w:rPr>
@@ -4621,6 +5163,7 @@
           </w:tcPr>
           <w:p>
             <w:pPr>
+              <w:spacing w:line="360" w:lineRule="auto"/>
               <w:rPr>
                 <w:rFonts w:ascii="Times New Roman" w:eastAsia="Aptos" w:hAnsi="Times New Roman" w:cs="Times New Roman"/>
               </w:rPr>
@@ -4639,6 +5182,7 @@
           </w:tcPr>
           <w:p>
             <w:pPr>
+              <w:spacing w:line="360" w:lineRule="auto"/>
               <w:rPr>
                 <w:rFonts w:ascii="Times New Roman" w:eastAsia="Aptos" w:hAnsi="Times New Roman" w:cs="Times New Roman"/>
               </w:rPr>
@@ -4657,6 +5201,7 @@
           </w:tcPr>
           <w:p>
             <w:pPr>
+              <w:spacing w:line="360" w:lineRule="auto"/>
               <w:rPr>
                 <w:rFonts w:ascii="Times New Roman" w:eastAsia="Aptos" w:hAnsi="Times New Roman" w:cs="Times New Roman"/>
               </w:rPr>
@@ -5591,7 +6136,6 @@
   <w:style w:type="character" w:default="1" w:styleId="DefaultParagraphFont">
     <w:name w:val="Default Paragraph Font"/>
     <w:uiPriority w:val="1"/>
-    <w:semiHidden/>
     <w:unhideWhenUsed/>
   </w:style>
   <w:style w:type="table" w:default="1" w:styleId="TableNormal">
@@ -6278,6 +6822,29 @@
       </w:tcPr>
     </w:tblStylePr>
   </w:style>
+  <w:style w:type="character" w:styleId="Hyperlink">
+    <w:name w:val="Hyperlink"/>
+    <w:basedOn w:val="DefaultParagraphFont"/>
+    <w:uiPriority w:val="99"/>
+    <w:unhideWhenUsed/>
+    <w:rsid w:val="00A73F30"/>
+    <w:rPr>
+      <w:color w:val="467886" w:themeColor="hyperlink"/>
+      <w:u w:val="single"/>
+    </w:rPr>
+  </w:style>
+  <w:style w:type="character" w:styleId="UnresolvedMention">
+    <w:name w:val="Unresolved Mention"/>
+    <w:basedOn w:val="DefaultParagraphFont"/>
+    <w:uiPriority w:val="99"/>
+    <w:semiHidden/>
+    <w:unhideWhenUsed/>
+    <w:rsid w:val="00A73F30"/>
+    <w:rPr>
+      <w:color w:val="605E5C"/>
+      <w:shd w:val="clear" w:color="auto" w:fill="E1DFDD"/>
+    </w:rPr>
+  </w:style>
 </w:styles>
 </file>
 

</xml_diff>

<commit_message>
Report - Adjusted the details and formats
</commit_message>
<xml_diff>
--- a/w2149479_ShamlaAqthar_Report.docx
+++ b/w2149479_ShamlaAqthar_Report.docx
@@ -108,7 +108,7 @@
           <w:noProof/>
         </w:rPr>
         <w:drawing>
-          <wp:anchor distT="0" distB="0" distL="114300" distR="114300" simplePos="0" relativeHeight="251660288" behindDoc="0" locked="0" layoutInCell="1" allowOverlap="1" wp14:anchorId="27BD4142" wp14:editId="7EDC99B7">
+          <wp:anchor distT="0" distB="0" distL="114300" distR="114300" simplePos="0" relativeHeight="251660288" behindDoc="0" locked="0" layoutInCell="1" allowOverlap="1" wp14:anchorId="27BD4142" wp14:editId="147CA7A0">
             <wp:simplePos x="0" y="0"/>
             <wp:positionH relativeFrom="column">
               <wp:posOffset>-152400</wp:posOffset>
@@ -474,33 +474,20 @@
     <w:p>
       <w:pPr>
         <w:pStyle w:val="Heading1"/>
-        <w:jc w:val="center"/>
+        <w:spacing w:line="360" w:lineRule="auto"/>
       </w:pPr>
       <w:r>
         <w:lastRenderedPageBreak/>
-        <w:t>Individual Coursework 5DATA004C Data Science Project Lifecycle</w:t>
-      </w:r>
-    </w:p>
-    <w:p>
-      <w:pPr>
-        <w:jc w:val="center"/>
+        <w:t>Aims and Objectives</w:t>
+      </w:r>
+    </w:p>
+    <w:p>
+      <w:pPr>
+        <w:spacing w:line="240" w:lineRule="auto"/>
         <w:rPr>
           <w:rFonts w:ascii="Times New Roman" w:hAnsi="Times New Roman" w:cs="Times New Roman"/>
           <w:b/>
           <w:bCs/>
-          <w:sz w:val="28"/>
-          <w:szCs w:val="28"/>
-          <w:u w:val="single"/>
-        </w:rPr>
-      </w:pPr>
-    </w:p>
-    <w:p>
-      <w:pPr>
-        <w:spacing w:line="720" w:lineRule="auto"/>
-        <w:rPr>
-          <w:rFonts w:ascii="Times New Roman" w:hAnsi="Times New Roman" w:cs="Times New Roman"/>
-          <w:sz w:val="28"/>
-          <w:szCs w:val="28"/>
         </w:rPr>
       </w:pPr>
       <w:r>
@@ -508,79 +495,23 @@
           <w:rFonts w:ascii="Times New Roman" w:hAnsi="Times New Roman" w:cs="Times New Roman"/>
           <w:b/>
           <w:bCs/>
-          <w:sz w:val="28"/>
-          <w:szCs w:val="28"/>
-        </w:rPr>
-        <w:t>Name:</w:t>
-      </w:r>
-      <w:r>
-        <w:rPr>
-          <w:rFonts w:ascii="Times New Roman" w:hAnsi="Times New Roman" w:cs="Times New Roman"/>
-          <w:sz w:val="28"/>
-          <w:szCs w:val="28"/>
-        </w:rPr>
-        <w:t xml:space="preserve"> </w:t>
-      </w:r>
-      <w:r>
-        <w:rPr>
-          <w:rFonts w:ascii="Times New Roman" w:hAnsi="Times New Roman" w:cs="Times New Roman"/>
-          <w:sz w:val="28"/>
-          <w:szCs w:val="28"/>
-        </w:rPr>
-        <w:t>Shamla Aqthar</w:t>
-      </w:r>
-    </w:p>
-    <w:p>
-      <w:pPr>
-        <w:spacing w:line="720" w:lineRule="auto"/>
-        <w:rPr>
-          <w:rFonts w:ascii="Times New Roman" w:hAnsi="Times New Roman" w:cs="Times New Roman"/>
-          <w:sz w:val="28"/>
-          <w:szCs w:val="28"/>
-        </w:rPr>
-      </w:pPr>
-      <w:r>
+        </w:rPr>
+        <w:t xml:space="preserve">Dataset: </w:t>
+      </w:r>
+      <w:r>
+        <w:rPr>
+          <w:rFonts w:ascii="Times New Roman" w:hAnsi="Times New Roman" w:cs="Times New Roman"/>
+        </w:rPr>
+        <w:t>Internal displacements (new displacements) associated with disasters</w:t>
+      </w:r>
+    </w:p>
+    <w:p>
+      <w:pPr>
+        <w:spacing w:line="240" w:lineRule="auto"/>
         <w:rPr>
           <w:rFonts w:ascii="Times New Roman" w:hAnsi="Times New Roman" w:cs="Times New Roman"/>
           <w:b/>
           <w:bCs/>
-          <w:sz w:val="28"/>
-          <w:szCs w:val="28"/>
-        </w:rPr>
-        <w:t>Student Id:</w:t>
-      </w:r>
-      <w:r>
-        <w:rPr>
-          <w:rFonts w:ascii="Times New Roman" w:hAnsi="Times New Roman" w:cs="Times New Roman"/>
-          <w:sz w:val="28"/>
-          <w:szCs w:val="28"/>
-        </w:rPr>
-        <w:t xml:space="preserve"> </w:t>
-      </w:r>
-      <w:r>
-        <w:rPr>
-          <w:rFonts w:ascii="Times New Roman" w:hAnsi="Times New Roman" w:cs="Times New Roman"/>
-          <w:sz w:val="28"/>
-          <w:szCs w:val="28"/>
-        </w:rPr>
-        <w:t>w2149479 / 20241956</w:t>
-      </w:r>
-      <w:r>
-        <w:rPr>
-          <w:rFonts w:ascii="Times New Roman" w:hAnsi="Times New Roman" w:cs="Times New Roman"/>
-          <w:sz w:val="28"/>
-          <w:szCs w:val="28"/>
-        </w:rPr>
-        <w:tab/>
-      </w:r>
-    </w:p>
-    <w:p>
-      <w:pPr>
-        <w:spacing w:line="720" w:lineRule="auto"/>
-        <w:rPr>
-          <w:rFonts w:ascii="Times New Roman" w:hAnsi="Times New Roman" w:cs="Times New Roman"/>
-          <w:sz w:val="28"/>
-          <w:szCs w:val="28"/>
         </w:rPr>
       </w:pPr>
       <w:r>
@@ -588,323 +519,48 @@
           <w:rFonts w:ascii="Times New Roman" w:hAnsi="Times New Roman" w:cs="Times New Roman"/>
           <w:b/>
           <w:bCs/>
-          <w:sz w:val="28"/>
-          <w:szCs w:val="28"/>
-        </w:rPr>
-        <w:t>Dataset:</w:t>
-      </w:r>
-      <w:r>
-        <w:rPr>
-          <w:rFonts w:ascii="Times New Roman" w:hAnsi="Times New Roman" w:cs="Times New Roman"/>
-          <w:sz w:val="28"/>
-          <w:szCs w:val="28"/>
-        </w:rPr>
-        <w:t xml:space="preserve"> Internal displacements (new displacements) associated with disasters</w:t>
-      </w:r>
-    </w:p>
-    <w:p>
-      <w:pPr>
-        <w:spacing w:line="720" w:lineRule="auto"/>
-        <w:rPr>
-          <w:rFonts w:ascii="Times New Roman" w:hAnsi="Times New Roman" w:cs="Times New Roman"/>
-          <w:sz w:val="28"/>
-          <w:szCs w:val="28"/>
-        </w:rPr>
-      </w:pPr>
+        </w:rPr>
+        <w:t xml:space="preserve">Dataset Source: </w:t>
+      </w:r>
+      <w:r>
+        <w:rPr>
+          <w:rFonts w:ascii="Times New Roman" w:hAnsi="Times New Roman" w:cs="Times New Roman"/>
+        </w:rPr>
+        <w:t>Humanitarian Data Exchange (HDX)</w:t>
+      </w:r>
       <w:r>
         <w:rPr>
           <w:rFonts w:ascii="Times New Roman" w:hAnsi="Times New Roman" w:cs="Times New Roman"/>
           <w:b/>
           <w:bCs/>
-          <w:sz w:val="28"/>
-          <w:szCs w:val="28"/>
-        </w:rPr>
-        <w:t xml:space="preserve">Link to </w:t>
-      </w:r>
-      <w:r>
+        </w:rPr>
+        <w:t xml:space="preserve"> </w:t>
+      </w:r>
+    </w:p>
+    <w:p>
+      <w:pPr>
+        <w:spacing w:line="240" w:lineRule="auto"/>
         <w:rPr>
           <w:rFonts w:ascii="Times New Roman" w:hAnsi="Times New Roman" w:cs="Times New Roman"/>
           <w:b/>
           <w:bCs/>
-          <w:sz w:val="28"/>
-          <w:szCs w:val="28"/>
-        </w:rPr>
-        <w:t>v</w:t>
-      </w:r>
+        </w:rPr>
+      </w:pPr>
       <w:r>
         <w:rPr>
           <w:rFonts w:ascii="Times New Roman" w:hAnsi="Times New Roman" w:cs="Times New Roman"/>
           <w:b/>
           <w:bCs/>
-          <w:sz w:val="28"/>
-          <w:szCs w:val="28"/>
-        </w:rPr>
-        <w:t>ideo presentation:</w:t>
-      </w:r>
-    </w:p>
-    <w:p>
-      <w:pPr>
-        <w:spacing w:line="720" w:lineRule="auto"/>
-        <w:rPr>
-          <w:rFonts w:ascii="Times New Roman" w:hAnsi="Times New Roman" w:cs="Times New Roman"/>
-          <w:b/>
-          <w:bCs/>
-          <w:sz w:val="28"/>
-          <w:szCs w:val="28"/>
-        </w:rPr>
-      </w:pPr>
-      <w:r>
-        <w:rPr>
-          <w:rFonts w:ascii="Times New Roman" w:hAnsi="Times New Roman" w:cs="Times New Roman"/>
-          <w:b/>
-          <w:bCs/>
-          <w:sz w:val="28"/>
-          <w:szCs w:val="28"/>
-        </w:rPr>
-        <w:t xml:space="preserve">Link to </w:t>
-      </w:r>
-      <w:proofErr w:type="spellStart"/>
-      <w:r>
-        <w:rPr>
-          <w:rFonts w:ascii="Times New Roman" w:hAnsi="Times New Roman" w:cs="Times New Roman"/>
-          <w:b/>
-          <w:bCs/>
-          <w:sz w:val="28"/>
-          <w:szCs w:val="28"/>
-        </w:rPr>
-        <w:t>Streamlit</w:t>
-      </w:r>
-      <w:proofErr w:type="spellEnd"/>
-      <w:r>
-        <w:rPr>
-          <w:rFonts w:ascii="Times New Roman" w:hAnsi="Times New Roman" w:cs="Times New Roman"/>
-          <w:b/>
-          <w:bCs/>
-          <w:sz w:val="28"/>
-          <w:szCs w:val="28"/>
-        </w:rPr>
-        <w:t xml:space="preserve"> app:</w:t>
-      </w:r>
-      <w:r>
-        <w:rPr>
-          <w:rFonts w:ascii="Times New Roman" w:hAnsi="Times New Roman" w:cs="Times New Roman"/>
-          <w:b/>
-          <w:bCs/>
-          <w:sz w:val="28"/>
-          <w:szCs w:val="28"/>
-        </w:rPr>
-        <w:tab/>
-      </w:r>
-      <w:r>
-        <w:rPr>
-          <w:rFonts w:ascii="Times New Roman" w:hAnsi="Times New Roman" w:cs="Times New Roman"/>
-          <w:b/>
-          <w:bCs/>
-          <w:sz w:val="28"/>
-          <w:szCs w:val="28"/>
-        </w:rPr>
-        <w:tab/>
-      </w:r>
-    </w:p>
-    <w:p>
-      <w:pPr>
-        <w:spacing w:line="720" w:lineRule="auto"/>
-        <w:rPr>
-          <w:rFonts w:ascii="Times New Roman" w:hAnsi="Times New Roman" w:cs="Times New Roman"/>
-          <w:b/>
-          <w:bCs/>
-          <w:sz w:val="28"/>
-          <w:szCs w:val="28"/>
-        </w:rPr>
-      </w:pPr>
-      <w:r>
-        <w:rPr>
-          <w:rFonts w:ascii="Times New Roman" w:hAnsi="Times New Roman" w:cs="Times New Roman"/>
-          <w:b/>
-          <w:bCs/>
-          <w:sz w:val="28"/>
-          <w:szCs w:val="28"/>
-        </w:rPr>
-        <w:t>Link to GitHub repository:</w:t>
-      </w:r>
-    </w:p>
-    <w:p>
-      <w:pPr>
-        <w:rPr>
-          <w:rFonts w:ascii="Times New Roman" w:hAnsi="Times New Roman" w:cs="Times New Roman"/>
-          <w:b/>
-          <w:bCs/>
-          <w:sz w:val="28"/>
-          <w:szCs w:val="28"/>
-        </w:rPr>
-      </w:pPr>
-    </w:p>
-    <w:p>
-      <w:pPr>
-        <w:rPr>
-          <w:rFonts w:ascii="Times New Roman" w:hAnsi="Times New Roman" w:cs="Times New Roman"/>
-          <w:b/>
-          <w:bCs/>
-          <w:sz w:val="28"/>
-          <w:szCs w:val="28"/>
-        </w:rPr>
-      </w:pPr>
-    </w:p>
-    <w:p>
-      <w:pPr>
-        <w:rPr>
-          <w:rFonts w:ascii="Times New Roman" w:hAnsi="Times New Roman" w:cs="Times New Roman"/>
-          <w:b/>
-          <w:bCs/>
-          <w:sz w:val="28"/>
-          <w:szCs w:val="28"/>
-        </w:rPr>
-      </w:pPr>
-    </w:p>
-    <w:p>
-      <w:pPr>
-        <w:rPr>
-          <w:rFonts w:ascii="Times New Roman" w:hAnsi="Times New Roman" w:cs="Times New Roman"/>
-          <w:b/>
-          <w:bCs/>
-          <w:sz w:val="28"/>
-          <w:szCs w:val="28"/>
-        </w:rPr>
-      </w:pPr>
-    </w:p>
-    <w:p>
-      <w:pPr>
-        <w:rPr>
-          <w:rFonts w:ascii="Times New Roman" w:hAnsi="Times New Roman" w:cs="Times New Roman"/>
-          <w:b/>
-          <w:bCs/>
-          <w:sz w:val="28"/>
-          <w:szCs w:val="28"/>
-        </w:rPr>
-      </w:pPr>
-    </w:p>
-    <w:p>
-      <w:pPr>
-        <w:rPr>
-          <w:rFonts w:ascii="Times New Roman" w:hAnsi="Times New Roman" w:cs="Times New Roman"/>
-          <w:b/>
-          <w:bCs/>
-          <w:sz w:val="28"/>
-          <w:szCs w:val="28"/>
-        </w:rPr>
-      </w:pPr>
-    </w:p>
-    <w:p>
-      <w:pPr>
-        <w:rPr>
-          <w:rFonts w:ascii="Times New Roman" w:hAnsi="Times New Roman" w:cs="Times New Roman"/>
-          <w:b/>
-          <w:bCs/>
-          <w:sz w:val="28"/>
-          <w:szCs w:val="28"/>
-        </w:rPr>
-      </w:pPr>
-    </w:p>
-    <w:p>
-      <w:pPr>
-        <w:rPr>
-          <w:rFonts w:ascii="Times New Roman" w:hAnsi="Times New Roman" w:cs="Times New Roman"/>
-          <w:b/>
-          <w:bCs/>
-          <w:sz w:val="28"/>
-          <w:szCs w:val="28"/>
-        </w:rPr>
-      </w:pPr>
-    </w:p>
-    <w:p>
-      <w:pPr>
-        <w:rPr>
-          <w:rFonts w:ascii="Times New Roman" w:hAnsi="Times New Roman" w:cs="Times New Roman"/>
-          <w:b/>
-          <w:bCs/>
-          <w:sz w:val="28"/>
-          <w:szCs w:val="28"/>
-        </w:rPr>
-      </w:pPr>
-    </w:p>
-    <w:p>
-      <w:pPr>
-        <w:pStyle w:val="Heading1"/>
-        <w:spacing w:line="360" w:lineRule="auto"/>
-      </w:pPr>
-      <w:r>
-        <w:lastRenderedPageBreak/>
-        <w:t>Aims and Objectives</w:t>
-      </w:r>
-    </w:p>
-    <w:p>
-      <w:pPr>
-        <w:spacing w:line="360" w:lineRule="auto"/>
-        <w:rPr>
-          <w:rFonts w:ascii="Times New Roman" w:hAnsi="Times New Roman" w:cs="Times New Roman"/>
-        </w:rPr>
-      </w:pPr>
-      <w:r>
-        <w:rPr>
-          <w:rFonts w:ascii="Times New Roman" w:hAnsi="Times New Roman" w:cs="Times New Roman"/>
-          <w:b/>
-          <w:bCs/>
-        </w:rPr>
-        <w:t>Dataset name:</w:t>
-      </w:r>
-      <w:r>
-        <w:rPr>
-          <w:rFonts w:ascii="Times New Roman" w:hAnsi="Times New Roman" w:cs="Times New Roman"/>
-          <w:sz w:val="28"/>
-          <w:szCs w:val="28"/>
-        </w:rPr>
-        <w:t xml:space="preserve"> </w:t>
-      </w:r>
-      <w:r>
-        <w:rPr>
-          <w:rFonts w:ascii="Times New Roman" w:hAnsi="Times New Roman" w:cs="Times New Roman"/>
-        </w:rPr>
-        <w:t>Internal displacements (new displacements) associated with disasters</w:t>
-      </w:r>
-    </w:p>
-    <w:p>
-      <w:pPr>
-        <w:spacing w:line="360" w:lineRule="auto"/>
-        <w:rPr>
-          <w:rFonts w:ascii="Times New Roman" w:hAnsi="Times New Roman" w:cs="Times New Roman"/>
-          <w:b/>
-          <w:bCs/>
-        </w:rPr>
-      </w:pPr>
-      <w:r>
-        <w:rPr>
-          <w:rFonts w:ascii="Times New Roman" w:hAnsi="Times New Roman" w:cs="Times New Roman"/>
-          <w:b/>
-          <w:bCs/>
-        </w:rPr>
-        <w:t>Dataset source link</w:t>
-      </w:r>
-      <w:r>
-        <w:rPr>
-          <w:rFonts w:ascii="Times New Roman" w:hAnsi="Times New Roman" w:cs="Times New Roman"/>
-          <w:b/>
-          <w:bCs/>
-        </w:rPr>
-        <w:t>:</w:t>
-      </w:r>
-      <w:r>
-        <w:rPr>
-          <w:rFonts w:ascii="Times New Roman" w:hAnsi="Times New Roman" w:cs="Times New Roman"/>
-          <w:b/>
-          <w:bCs/>
-        </w:rPr>
-        <w:t xml:space="preserve"> </w:t>
+        </w:rPr>
+        <w:t xml:space="preserve">Source link: </w:t>
       </w:r>
       <w:hyperlink r:id="rId8" w:history="1">
         <w:r>
           <w:rPr>
             <w:rStyle w:val="Hyperlink"/>
             <w:rFonts w:ascii="Times New Roman" w:hAnsi="Times New Roman" w:cs="Times New Roman"/>
+            <w:b/>
+            <w:bCs/>
           </w:rPr>
           <w:t>https://data.humdata.org/dataset/idmc-internal-displacements-new-displacements-associated-with-disasters</w:t>
         </w:r>
@@ -912,85 +568,46 @@
       <w:r>
         <w:rPr>
           <w:rFonts w:ascii="Times New Roman" w:hAnsi="Times New Roman" w:cs="Times New Roman"/>
-        </w:rPr>
-        <w:t xml:space="preserve"> </w:t>
-      </w:r>
-    </w:p>
-    <w:p>
-      <w:pPr>
-        <w:spacing w:line="360" w:lineRule="auto"/>
-        <w:rPr>
-          <w:rFonts w:ascii="Times New Roman" w:hAnsi="Times New Roman" w:cs="Times New Roman"/>
-        </w:rPr>
-      </w:pPr>
-      <w:r>
-        <w:rPr>
-          <w:rFonts w:ascii="Times New Roman" w:hAnsi="Times New Roman" w:cs="Times New Roman"/>
-        </w:rPr>
-        <w:t>The</w:t>
-      </w:r>
-      <w:r>
-        <w:rPr>
-          <w:rFonts w:ascii="Times New Roman" w:hAnsi="Times New Roman" w:cs="Times New Roman"/>
-        </w:rPr>
-        <w:t xml:space="preserve"> </w:t>
-      </w:r>
-      <w:r>
-        <w:rPr>
-          <w:rFonts w:ascii="Times New Roman" w:hAnsi="Times New Roman" w:cs="Times New Roman"/>
-        </w:rPr>
-        <w:t xml:space="preserve">aim </w:t>
-      </w:r>
-      <w:r>
-        <w:rPr>
-          <w:rFonts w:ascii="Times New Roman" w:hAnsi="Times New Roman" w:cs="Times New Roman"/>
-        </w:rPr>
-        <w:t xml:space="preserve">of this project </w:t>
-      </w:r>
-      <w:r>
-        <w:rPr>
-          <w:rFonts w:ascii="Times New Roman" w:hAnsi="Times New Roman" w:cs="Times New Roman"/>
-        </w:rPr>
-        <w:t>is to develop an interactive data dashboard that analyses global disaster displacement trend</w:t>
-      </w:r>
-      <w:r>
-        <w:rPr>
-          <w:rFonts w:ascii="Times New Roman" w:hAnsi="Times New Roman" w:cs="Times New Roman"/>
-        </w:rPr>
-        <w:t>s</w:t>
-      </w:r>
-      <w:r>
-        <w:rPr>
-          <w:rFonts w:ascii="Times New Roman" w:hAnsi="Times New Roman" w:cs="Times New Roman"/>
-        </w:rPr>
-        <w:t>, enabling users to better understand the scale, patterns and key drivers of human displacement based on climate and environmental risks</w:t>
-      </w:r>
-    </w:p>
-    <w:p>
-      <w:pPr>
-        <w:spacing w:line="360" w:lineRule="auto"/>
-        <w:rPr>
-          <w:rFonts w:ascii="Times New Roman" w:hAnsi="Times New Roman" w:cs="Times New Roman"/>
           <w:b/>
           <w:bCs/>
         </w:rPr>
-      </w:pPr>
-      <w:r>
+        <w:t xml:space="preserve"> </w:t>
+      </w:r>
+    </w:p>
+    <w:p>
+      <w:pPr>
+        <w:spacing w:line="360" w:lineRule="auto"/>
+        <w:rPr>
+          <w:rFonts w:ascii="Times New Roman" w:hAnsi="Times New Roman" w:cs="Times New Roman"/>
+        </w:rPr>
+      </w:pPr>
+      <w:r>
+        <w:rPr>
+          <w:rFonts w:ascii="Times New Roman" w:hAnsi="Times New Roman" w:cs="Times New Roman"/>
+        </w:rPr>
+        <w:t xml:space="preserve">The dataset contains global records of disaster-related internal displacement events, hazard types, affected countries and displacement figures. The aim of this project is to develop an interactive data dashboard that analyses global disaster displacement trends, enabling users to better understand the scale, patterns and key drivers of human displacement based on climate and environmental risks </w:t>
+      </w:r>
+    </w:p>
+    <w:p>
+      <w:pPr>
+        <w:spacing w:line="360" w:lineRule="auto"/>
         <w:rPr>
           <w:rFonts w:ascii="Times New Roman" w:hAnsi="Times New Roman" w:cs="Times New Roman"/>
           <w:b/>
           <w:bCs/>
         </w:rPr>
+      </w:pPr>
+      <w:r>
+        <w:rPr>
+          <w:rFonts w:ascii="Times New Roman" w:hAnsi="Times New Roman" w:cs="Times New Roman"/>
+          <w:b/>
+          <w:bCs/>
+        </w:rPr>
         <w:t xml:space="preserve">Objectives </w:t>
       </w:r>
     </w:p>
     <w:p>
       <w:pPr>
-        <w:pStyle w:val="ListParagraph"/>
-        <w:numPr>
-          <w:ilvl w:val="0"/>
-          <w:numId w:val="3"/>
-        </w:numPr>
         <w:spacing w:line="360" w:lineRule="auto"/>
         <w:rPr>
           <w:rFonts w:ascii="Times New Roman" w:hAnsi="Times New Roman" w:cs="Times New Roman"/>
@@ -1000,28 +617,11 @@
         <w:rPr>
           <w:rFonts w:ascii="Times New Roman" w:hAnsi="Times New Roman" w:cs="Times New Roman"/>
         </w:rPr>
-        <w:t xml:space="preserve">Exploratory data analysis: </w:t>
-      </w:r>
-      <w:r>
-        <w:rPr>
-          <w:rFonts w:ascii="Times New Roman" w:hAnsi="Times New Roman" w:cs="Times New Roman"/>
-        </w:rPr>
-        <w:t>T</w:t>
-      </w:r>
-      <w:r>
-        <w:rPr>
-          <w:rFonts w:ascii="Times New Roman" w:hAnsi="Times New Roman" w:cs="Times New Roman"/>
-        </w:rPr>
-        <w:t>o identify patterns which include the most contributing hazard type and calculating displacements across time.</w:t>
-      </w:r>
-    </w:p>
-    <w:p>
-      <w:pPr>
-        <w:pStyle w:val="ListParagraph"/>
-        <w:numPr>
-          <w:ilvl w:val="0"/>
-          <w:numId w:val="3"/>
-        </w:numPr>
+        <w:t>• To identify patterns which include the most contributing hazard type and calculating displacements across time through exploratory data analysis.</w:t>
+      </w:r>
+    </w:p>
+    <w:p>
+      <w:pPr>
         <w:spacing w:line="360" w:lineRule="auto"/>
         <w:rPr>
           <w:rFonts w:ascii="Times New Roman" w:hAnsi="Times New Roman" w:cs="Times New Roman"/>
@@ -1031,40 +631,11 @@
         <w:rPr>
           <w:rFonts w:ascii="Times New Roman" w:hAnsi="Times New Roman" w:cs="Times New Roman"/>
         </w:rPr>
-        <w:t xml:space="preserve">Data preparation: </w:t>
-      </w:r>
-      <w:r>
-        <w:rPr>
-          <w:rFonts w:ascii="Times New Roman" w:hAnsi="Times New Roman" w:cs="Times New Roman"/>
-        </w:rPr>
-        <w:t>C</w:t>
-      </w:r>
-      <w:r>
-        <w:rPr>
-          <w:rFonts w:ascii="Times New Roman" w:hAnsi="Times New Roman" w:cs="Times New Roman"/>
-        </w:rPr>
-        <w:t xml:space="preserve">lean and preprocess </w:t>
-      </w:r>
-      <w:r>
-        <w:rPr>
-          <w:rFonts w:ascii="Times New Roman" w:hAnsi="Times New Roman" w:cs="Times New Roman"/>
-        </w:rPr>
-        <w:t>a la</w:t>
-      </w:r>
-      <w:r>
-        <w:rPr>
-          <w:rFonts w:ascii="Times New Roman" w:hAnsi="Times New Roman" w:cs="Times New Roman"/>
-        </w:rPr>
-        <w:t>rgescale dataset using python, addressing missing values, inconsistencies and formatting issues to ensure data reliability.</w:t>
-      </w:r>
-    </w:p>
-    <w:p>
-      <w:pPr>
-        <w:pStyle w:val="ListParagraph"/>
-        <w:numPr>
-          <w:ilvl w:val="0"/>
-          <w:numId w:val="3"/>
-        </w:numPr>
+        <w:t xml:space="preserve"> • Clean and preprocess a large-scale dataset using python, addressing missing values, inconsistencies and formatting issues to ensure data reliability. </w:t>
+      </w:r>
+    </w:p>
+    <w:p>
+      <w:pPr>
         <w:spacing w:line="360" w:lineRule="auto"/>
         <w:rPr>
           <w:rFonts w:ascii="Times New Roman" w:hAnsi="Times New Roman" w:cs="Times New Roman"/>
@@ -1074,64 +645,11 @@
         <w:rPr>
           <w:rFonts w:ascii="Times New Roman" w:hAnsi="Times New Roman" w:cs="Times New Roman"/>
         </w:rPr>
-        <w:t xml:space="preserve">Interactive dashboard: </w:t>
-      </w:r>
-      <w:r>
-        <w:rPr>
-          <w:rFonts w:ascii="Times New Roman" w:hAnsi="Times New Roman" w:cs="Times New Roman"/>
-        </w:rPr>
-        <w:t xml:space="preserve">To </w:t>
-      </w:r>
-      <w:r>
-        <w:rPr>
-          <w:rFonts w:ascii="Times New Roman" w:hAnsi="Times New Roman" w:cs="Times New Roman"/>
-        </w:rPr>
-        <w:t>develop a dynamic and user-friendly visual</w:t>
-      </w:r>
-      <w:r>
-        <w:rPr>
-          <w:rFonts w:ascii="Times New Roman" w:hAnsi="Times New Roman" w:cs="Times New Roman"/>
-        </w:rPr>
-        <w:t>isation</w:t>
-      </w:r>
-      <w:r>
-        <w:rPr>
-          <w:rFonts w:ascii="Times New Roman" w:hAnsi="Times New Roman" w:cs="Times New Roman"/>
-        </w:rPr>
-        <w:t xml:space="preserve"> using </w:t>
-      </w:r>
-      <w:r>
-        <w:rPr>
-          <w:rFonts w:ascii="Times New Roman" w:hAnsi="Times New Roman" w:cs="Times New Roman"/>
-        </w:rPr>
-        <w:t>Pl</w:t>
-      </w:r>
-      <w:r>
-        <w:rPr>
-          <w:rFonts w:ascii="Times New Roman" w:hAnsi="Times New Roman" w:cs="Times New Roman"/>
-        </w:rPr>
-        <w:t>otly allowing the users to explore trends from 20</w:t>
-      </w:r>
-      <w:r>
-        <w:rPr>
-          <w:rFonts w:ascii="Times New Roman" w:hAnsi="Times New Roman" w:cs="Times New Roman"/>
-        </w:rPr>
-        <w:t>0</w:t>
-      </w:r>
-      <w:r>
-        <w:rPr>
-          <w:rFonts w:ascii="Times New Roman" w:hAnsi="Times New Roman" w:cs="Times New Roman"/>
-        </w:rPr>
-        <w:t>8 to 2024</w:t>
-      </w:r>
-    </w:p>
-    <w:p>
-      <w:pPr>
-        <w:pStyle w:val="ListParagraph"/>
-        <w:numPr>
-          <w:ilvl w:val="0"/>
-          <w:numId w:val="3"/>
-        </w:numPr>
+        <w:t xml:space="preserve">• To develop a dynamic and user-friendly visualisation using Plotly allowing the users to explore yearly trends </w:t>
+      </w:r>
+    </w:p>
+    <w:p>
+      <w:pPr>
         <w:spacing w:line="360" w:lineRule="auto"/>
         <w:rPr>
           <w:rFonts w:ascii="Times New Roman" w:hAnsi="Times New Roman" w:cs="Times New Roman"/>
@@ -1141,28 +659,23 @@
         <w:rPr>
           <w:rFonts w:ascii="Times New Roman" w:hAnsi="Times New Roman" w:cs="Times New Roman"/>
         </w:rPr>
-        <w:t>Generate Insights</w:t>
-      </w:r>
-      <w:r>
-        <w:rPr>
-          <w:rFonts w:ascii="Times New Roman" w:hAnsi="Times New Roman" w:cs="Times New Roman"/>
-        </w:rPr>
-        <w:t xml:space="preserve">: </w:t>
-      </w:r>
-      <w:r>
-        <w:rPr>
-          <w:rFonts w:ascii="Times New Roman" w:hAnsi="Times New Roman" w:cs="Times New Roman"/>
-        </w:rPr>
-        <w:t>Derive meaningful insights on displacement patterns hazard impacts and affected regions to support data driven understanding.</w:t>
-      </w:r>
-    </w:p>
-    <w:p>
-      <w:pPr>
-        <w:pStyle w:val="ListParagraph"/>
-        <w:numPr>
-          <w:ilvl w:val="0"/>
-          <w:numId w:val="3"/>
-        </w:numPr>
+        <w:t xml:space="preserve">• </w:t>
+      </w:r>
+      <w:r>
+        <w:rPr>
+          <w:rFonts w:ascii="Times New Roman" w:hAnsi="Times New Roman" w:cs="Times New Roman"/>
+        </w:rPr>
+        <w:t>To d</w:t>
+      </w:r>
+      <w:r>
+        <w:rPr>
+          <w:rFonts w:ascii="Times New Roman" w:hAnsi="Times New Roman" w:cs="Times New Roman"/>
+        </w:rPr>
+        <w:t xml:space="preserve">erive meaningful insights on displacement patterns hazard impacts and affected regions to support data driven understanding. </w:t>
+      </w:r>
+    </w:p>
+    <w:p>
+      <w:pPr>
         <w:spacing w:line="360" w:lineRule="auto"/>
         <w:rPr>
           <w:rFonts w:ascii="Times New Roman" w:hAnsi="Times New Roman" w:cs="Times New Roman"/>
@@ -1172,19 +685,19 @@
         <w:rPr>
           <w:rFonts w:ascii="Times New Roman" w:hAnsi="Times New Roman" w:cs="Times New Roman"/>
         </w:rPr>
-        <w:t xml:space="preserve">Deployment: </w:t>
-      </w:r>
-      <w:r>
-        <w:rPr>
-          <w:rFonts w:ascii="Times New Roman" w:hAnsi="Times New Roman" w:cs="Times New Roman"/>
-        </w:rPr>
-        <w:t>De</w:t>
-      </w:r>
-      <w:r>
-        <w:rPr>
-          <w:rFonts w:ascii="Times New Roman" w:hAnsi="Times New Roman" w:cs="Times New Roman"/>
-        </w:rPr>
-        <w:t xml:space="preserve">ploy the dashboard using </w:t>
+        <w:t xml:space="preserve">• </w:t>
+      </w:r>
+      <w:r>
+        <w:rPr>
+          <w:rFonts w:ascii="Times New Roman" w:hAnsi="Times New Roman" w:cs="Times New Roman"/>
+        </w:rPr>
+        <w:t>To d</w:t>
+      </w:r>
+      <w:r>
+        <w:rPr>
+          <w:rFonts w:ascii="Times New Roman" w:hAnsi="Times New Roman" w:cs="Times New Roman"/>
+        </w:rPr>
+        <w:t xml:space="preserve">eploy the dashboard using </w:t>
       </w:r>
       <w:proofErr w:type="spellStart"/>
       <w:r>
@@ -1198,19 +711,7 @@
         <w:rPr>
           <w:rFonts w:ascii="Times New Roman" w:hAnsi="Times New Roman" w:cs="Times New Roman"/>
         </w:rPr>
-        <w:t xml:space="preserve"> </w:t>
-      </w:r>
-      <w:r>
-        <w:rPr>
-          <w:rFonts w:ascii="Times New Roman" w:hAnsi="Times New Roman" w:cs="Times New Roman"/>
-        </w:rPr>
-        <w:t>C</w:t>
-      </w:r>
-      <w:r>
-        <w:rPr>
-          <w:rFonts w:ascii="Times New Roman" w:hAnsi="Times New Roman" w:cs="Times New Roman"/>
-        </w:rPr>
-        <w:t xml:space="preserve">loud which ensures accessibility and enables real-time interaction for users. </w:t>
+        <w:t xml:space="preserve"> which ensures accessibility and enables real-time interaction for users. </w:t>
       </w:r>
     </w:p>
     <w:p>
@@ -1224,19 +725,19 @@
         <w:rPr>
           <w:rFonts w:ascii="Times New Roman" w:hAnsi="Times New Roman" w:cs="Times New Roman"/>
         </w:rPr>
-        <w:t xml:space="preserve">The key insights selected for this dashboard </w:t>
-      </w:r>
-      <w:r>
-        <w:rPr>
-          <w:rFonts w:ascii="Times New Roman" w:hAnsi="Times New Roman" w:cs="Times New Roman"/>
-        </w:rPr>
-        <w:t>such as</w:t>
-      </w:r>
-      <w:r>
-        <w:rPr>
-          <w:rFonts w:ascii="Times New Roman" w:hAnsi="Times New Roman" w:cs="Times New Roman"/>
-        </w:rPr>
-        <w:t xml:space="preserve"> total displacement, hazard types, affected countries and time series trends were chosen to provide a comprehensive view of global humanitarian risks. Identifying the most contributing hazard types is important to understand the environmental drivers and climate related risks.  </w:t>
+        <w:t>The key insights selected for this dashboard were chosen to provide a comprehensive view of global humanitarian risks. Total displacement provides a clear overview of the overall severity of the issue while identifying the most contributing hazard helps understand the environmental drivers and climate related risks behind displacement. Timeseries trends show how displacement patterns have evolved over time, highlighting potential increases linked to climate change. Country</w:t>
+      </w:r>
+      <w:r>
+        <w:rPr>
+          <w:rFonts w:ascii="Times New Roman" w:hAnsi="Times New Roman" w:cs="Times New Roman"/>
+        </w:rPr>
+        <w:t>-</w:t>
+      </w:r>
+      <w:r>
+        <w:rPr>
+          <w:rFonts w:ascii="Times New Roman" w:hAnsi="Times New Roman" w:cs="Times New Roman"/>
+        </w:rPr>
+        <w:t xml:space="preserve">based analysis indicated geographical vulnerability and supports targeted decision making and resource allocation in high-risk regions. </w:t>
       </w:r>
     </w:p>
     <w:p>
@@ -1250,27 +751,14 @@
         <w:rPr>
           <w:rFonts w:ascii="Times New Roman" w:hAnsi="Times New Roman" w:cs="Times New Roman"/>
         </w:rPr>
-        <w:t xml:space="preserve">The analysis of geographical vulnerability through country-based data supports targeted decision making and resource allocation. Lastly, time series trends enable stakeholders to observe how displacements have evolved over the years helping to identify patterns and potential increases linked to climate change. </w:t>
-      </w:r>
-    </w:p>
-    <w:p>
-      <w:pPr>
-        <w:spacing w:line="360" w:lineRule="auto"/>
-        <w:rPr>
-          <w:rFonts w:ascii="Times New Roman" w:hAnsi="Times New Roman" w:cs="Times New Roman"/>
-        </w:rPr>
-      </w:pPr>
-      <w:r>
-        <w:rPr>
-          <w:rFonts w:ascii="Times New Roman" w:hAnsi="Times New Roman" w:cs="Times New Roman"/>
-        </w:rPr>
-        <w:t>Overall, these insights act as the bridge between the scale and cause transforming raw data into meaningful tool for sustainability planning and policy development</w:t>
-      </w:r>
-      <w:r>
-        <w:rPr>
-          <w:rFonts w:ascii="Times New Roman" w:hAnsi="Times New Roman" w:cs="Times New Roman"/>
-        </w:rPr>
-        <w:t>.</w:t>
+        <w:t xml:space="preserve">These insights are aligned with UN SDG 13(climate action) and SDG 11(sustainable cities and communities) which focus on addressing climate risks and building resilient communities. </w:t>
+      </w:r>
+      <w:r>
+        <w:rPr>
+          <w:rFonts w:ascii="Times New Roman" w:hAnsi="Times New Roman" w:cs="Times New Roman"/>
+        </w:rPr>
+        <w:lastRenderedPageBreak/>
+        <w:t xml:space="preserve">Overall, the dashboard transforms raw data into meaningful insights for data driven decision making such as disaster preparedness and long-term sustainability planning.   </w:t>
       </w:r>
     </w:p>
     <w:p>
@@ -1280,17 +768,34 @@
         <w:keepLines w:val="0"/>
         <w:spacing w:line="360" w:lineRule="auto"/>
       </w:pPr>
-    </w:p>
-    <w:p>
-      <w:pPr>
-        <w:pStyle w:val="Heading1"/>
-        <w:keepNext w:val="0"/>
-        <w:keepLines w:val="0"/>
+      <w:r>
+        <w:t>Development Methodology</w:t>
+      </w:r>
+    </w:p>
+    <w:p>
+      <w:pPr>
         <w:spacing w:line="360" w:lineRule="auto"/>
-      </w:pPr>
-      <w:r>
-        <w:lastRenderedPageBreak/>
-        <w:t>Development Methodology</w:t>
+        <w:rPr>
+          <w:rFonts w:ascii="Times New Roman" w:hAnsi="Times New Roman" w:cs="Times New Roman"/>
+        </w:rPr>
+      </w:pPr>
+      <w:r>
+        <w:rPr>
+          <w:rFonts w:ascii="Times New Roman" w:hAnsi="Times New Roman" w:cs="Times New Roman"/>
+        </w:rPr>
+        <w:t xml:space="preserve">An iterative development approach was used where the dashboard was developed in incremental stages rather than in a single continuous process. </w:t>
+      </w:r>
+      <w:r>
+        <w:rPr>
+          <w:rFonts w:ascii="Times New Roman" w:hAnsi="Times New Roman" w:cs="Times New Roman"/>
+        </w:rPr>
+        <w:t xml:space="preserve">Alternative methods such as waterfall were considered, however they were not suitable due to the need of continuous testing and adjustments during data exploration. </w:t>
+      </w:r>
+      <w:r>
+        <w:rPr>
+          <w:rFonts w:ascii="Times New Roman" w:hAnsi="Times New Roman" w:cs="Times New Roman"/>
+        </w:rPr>
+        <w:t xml:space="preserve">This methodology was selected because it allowed early validation of data processing and visual outputs, reducing the risk of errors in later stages. </w:t>
       </w:r>
     </w:p>
     <w:p>
@@ -1304,7 +809,73 @@
         <w:rPr>
           <w:rFonts w:ascii="Times New Roman" w:hAnsi="Times New Roman" w:cs="Times New Roman"/>
         </w:rPr>
-        <w:t>An iterative development approach was used where the dashboard was developed in incremental stages rather than in a single continuous process. This methodology was selected because it allowed early validation of data processing and visual outputs, reducing the risk of errors in later stages.</w:t>
+        <w:t>It started off with loading the data, identifying key indicators and countries affected and then the main trend visualisations</w:t>
+      </w:r>
+      <w:r>
+        <w:rPr>
+          <w:rFonts w:ascii="Times New Roman" w:hAnsi="Times New Roman" w:cs="Times New Roman"/>
+        </w:rPr>
+        <w:t xml:space="preserve"> which involved </w:t>
+      </w:r>
+      <w:r>
+        <w:rPr>
+          <w:rFonts w:ascii="Times New Roman" w:hAnsi="Times New Roman" w:cs="Times New Roman"/>
+        </w:rPr>
+        <w:t xml:space="preserve">using </w:t>
+      </w:r>
+      <w:r>
+        <w:rPr>
+          <w:rFonts w:ascii="Times New Roman" w:hAnsi="Times New Roman" w:cs="Times New Roman"/>
+        </w:rPr>
+        <w:t xml:space="preserve">key variables such as year, </w:t>
+      </w:r>
+      <w:proofErr w:type="spellStart"/>
+      <w:r>
+        <w:rPr>
+          <w:rFonts w:ascii="Times New Roman" w:hAnsi="Times New Roman" w:cs="Times New Roman"/>
+        </w:rPr>
+        <w:t>country_name</w:t>
+      </w:r>
+      <w:proofErr w:type="spellEnd"/>
+      <w:r>
+        <w:rPr>
+          <w:rFonts w:ascii="Times New Roman" w:hAnsi="Times New Roman" w:cs="Times New Roman"/>
+        </w:rPr>
+        <w:t xml:space="preserve">, </w:t>
+      </w:r>
+      <w:proofErr w:type="spellStart"/>
+      <w:r>
+        <w:rPr>
+          <w:rFonts w:ascii="Times New Roman" w:hAnsi="Times New Roman" w:cs="Times New Roman"/>
+        </w:rPr>
+        <w:t>hazard_type_name</w:t>
+      </w:r>
+      <w:proofErr w:type="spellEnd"/>
+      <w:r>
+        <w:rPr>
+          <w:rFonts w:ascii="Times New Roman" w:hAnsi="Times New Roman" w:cs="Times New Roman"/>
+        </w:rPr>
+        <w:t xml:space="preserve"> and </w:t>
+      </w:r>
+      <w:proofErr w:type="spellStart"/>
+      <w:r>
+        <w:rPr>
+          <w:rFonts w:ascii="Times New Roman" w:hAnsi="Times New Roman" w:cs="Times New Roman"/>
+        </w:rPr>
+        <w:t>new_displacement</w:t>
+      </w:r>
+      <w:proofErr w:type="spellEnd"/>
+      <w:r>
+        <w:rPr>
+          <w:rFonts w:ascii="Times New Roman" w:hAnsi="Times New Roman" w:cs="Times New Roman"/>
+        </w:rPr>
+        <w:t xml:space="preserve"> from the dataset</w:t>
+      </w:r>
+      <w:r>
+        <w:rPr>
+          <w:rFonts w:ascii="Times New Roman" w:hAnsi="Times New Roman" w:cs="Times New Roman"/>
+        </w:rPr>
+        <w:t xml:space="preserve">. This initial stage was to verify data correctness and ensure that key metrics such as total displacement was accurately calculated. </w:t>
       </w:r>
     </w:p>
     <w:p>
@@ -1318,13 +889,7 @@
         <w:rPr>
           <w:rFonts w:ascii="Times New Roman" w:hAnsi="Times New Roman" w:cs="Times New Roman"/>
         </w:rPr>
-        <w:t>It began</w:t>
-      </w:r>
-      <w:r>
-        <w:rPr>
-          <w:rFonts w:ascii="Times New Roman" w:hAnsi="Times New Roman" w:cs="Times New Roman"/>
-        </w:rPr>
-        <w:t xml:space="preserve"> with loading the data, then KPI calculations and the main trend visualisations. The initial stage was to verify data correctness and ensure that key metrics such as total displacement was accurately calculated.</w:t>
+        <w:t xml:space="preserve">The dashboard was then adjusted through multiple iterations where additional features such hazard-based filtering, multiline trend analysis and geospatial visualisations were introduced. Each iteration included testing and debugging to ensure that new components did not interfere with the existing functionality. </w:t>
       </w:r>
     </w:p>
     <w:p>
@@ -1338,49 +903,7 @@
         <w:rPr>
           <w:rFonts w:ascii="Times New Roman" w:hAnsi="Times New Roman" w:cs="Times New Roman"/>
         </w:rPr>
-        <w:t xml:space="preserve">The dashboard was then adjusted through multiple iterations where additional features such </w:t>
-      </w:r>
-      <w:r>
-        <w:rPr>
-          <w:rFonts w:ascii="Times New Roman" w:hAnsi="Times New Roman" w:cs="Times New Roman"/>
-        </w:rPr>
-        <w:t>hazard-based</w:t>
-      </w:r>
-      <w:r>
-        <w:rPr>
-          <w:rFonts w:ascii="Times New Roman" w:hAnsi="Times New Roman" w:cs="Times New Roman"/>
-        </w:rPr>
-        <w:t xml:space="preserve"> filtering, multiline </w:t>
-      </w:r>
-      <w:r>
-        <w:rPr>
-          <w:rFonts w:ascii="Times New Roman" w:hAnsi="Times New Roman" w:cs="Times New Roman"/>
-        </w:rPr>
-        <w:t xml:space="preserve">trend analysis and geospatial visualisations were introduced. Each iteration included </w:t>
-      </w:r>
-      <w:r>
-        <w:rPr>
-          <w:rFonts w:ascii="Times New Roman" w:hAnsi="Times New Roman" w:cs="Times New Roman"/>
-        </w:rPr>
-        <w:t>testing</w:t>
-      </w:r>
-      <w:r>
-        <w:rPr>
-          <w:rFonts w:ascii="Times New Roman" w:hAnsi="Times New Roman" w:cs="Times New Roman"/>
-        </w:rPr>
-        <w:t xml:space="preserve"> and debugging to ensure that new components did not </w:t>
-      </w:r>
-      <w:r>
-        <w:rPr>
-          <w:rFonts w:ascii="Times New Roman" w:hAnsi="Times New Roman" w:cs="Times New Roman"/>
-        </w:rPr>
-        <w:t>interfere</w:t>
-      </w:r>
-      <w:r>
-        <w:rPr>
-          <w:rFonts w:ascii="Times New Roman" w:hAnsi="Times New Roman" w:cs="Times New Roman"/>
-        </w:rPr>
-        <w:t xml:space="preserve"> with the existing functionality.</w:t>
+        <w:t xml:space="preserve">This approach also allowed flexibility in handling real world issues such as missing values, data inconsistencies and layout improvements. Functional testing was conducted before final user interface enhancements, ensuring that the system remained accurate and stable before improving usability and presentation. </w:t>
       </w:r>
     </w:p>
     <w:p>
@@ -1394,7 +917,19 @@
         <w:rPr>
           <w:rFonts w:ascii="Times New Roman" w:hAnsi="Times New Roman" w:cs="Times New Roman"/>
         </w:rPr>
-        <w:t xml:space="preserve">This approach also allowed flexibility in handling real world issues such as missing values, data inconsistencies and layout improvements. Functional testing was conducted before final user interface enhancements, ensuring that the system remained accurate and stable before improving usability and presentation. </w:t>
+        <w:t xml:space="preserve">The development followed the key phases of the iterative model such </w:t>
+      </w:r>
+      <w:r>
+        <w:rPr>
+          <w:rFonts w:ascii="Times New Roman" w:hAnsi="Times New Roman" w:cs="Times New Roman"/>
+        </w:rPr>
+        <w:t xml:space="preserve">as </w:t>
+      </w:r>
+      <w:r>
+        <w:rPr>
+          <w:rFonts w:ascii="Times New Roman" w:hAnsi="Times New Roman" w:cs="Times New Roman"/>
+        </w:rPr>
+        <w:t xml:space="preserve">requirement analysis, system design, implementation, testing and evaluation which were revisited across multiple cycles. </w:t>
       </w:r>
     </w:p>
     <w:p>
@@ -1404,15 +939,69 @@
           <w:rFonts w:ascii="Times New Roman" w:hAnsi="Times New Roman" w:cs="Times New Roman"/>
         </w:rPr>
       </w:pPr>
-    </w:p>
-    <w:p>
-      <w:pPr>
-        <w:spacing w:line="360" w:lineRule="auto"/>
+      <w:r>
         <w:rPr>
           <w:rFonts w:ascii="Times New Roman" w:hAnsi="Times New Roman" w:cs="Times New Roman"/>
           <w:b/>
           <w:bCs/>
         </w:rPr>
+        <w:t>Phase-1: Environmental Setup</w:t>
+      </w:r>
+      <w:r>
+        <w:rPr>
+          <w:rFonts w:ascii="Times New Roman" w:hAnsi="Times New Roman" w:cs="Times New Roman"/>
+        </w:rPr>
+        <w:t xml:space="preserve"> </w:t>
+      </w:r>
+    </w:p>
+    <w:p>
+      <w:pPr>
+        <w:spacing w:line="360" w:lineRule="auto"/>
+        <w:rPr>
+          <w:rFonts w:ascii="Times New Roman" w:hAnsi="Times New Roman" w:cs="Times New Roman"/>
+        </w:rPr>
+      </w:pPr>
+      <w:r>
+        <w:rPr>
+          <w:rFonts w:ascii="Times New Roman" w:hAnsi="Times New Roman" w:cs="Times New Roman"/>
+        </w:rPr>
+        <w:t xml:space="preserve">Set up the development environment using </w:t>
+      </w:r>
+      <w:proofErr w:type="spellStart"/>
+      <w:r>
+        <w:rPr>
+          <w:rFonts w:ascii="Times New Roman" w:hAnsi="Times New Roman" w:cs="Times New Roman"/>
+        </w:rPr>
+        <w:t>Miniconda</w:t>
+      </w:r>
+      <w:proofErr w:type="spellEnd"/>
+      <w:r>
+        <w:rPr>
+          <w:rFonts w:ascii="Times New Roman" w:hAnsi="Times New Roman" w:cs="Times New Roman"/>
+        </w:rPr>
+        <w:t xml:space="preserve"> and installed required libraries such as Pandas, Plotly and </w:t>
+      </w:r>
+      <w:proofErr w:type="spellStart"/>
+      <w:r>
+        <w:rPr>
+          <w:rFonts w:ascii="Times New Roman" w:hAnsi="Times New Roman" w:cs="Times New Roman"/>
+        </w:rPr>
+        <w:t>Streamlit</w:t>
+      </w:r>
+      <w:proofErr w:type="spellEnd"/>
+      <w:r>
+        <w:rPr>
+          <w:rFonts w:ascii="Times New Roman" w:hAnsi="Times New Roman" w:cs="Times New Roman"/>
+        </w:rPr>
+        <w:t xml:space="preserve">. </w:t>
+      </w:r>
+    </w:p>
+    <w:p>
+      <w:pPr>
+        <w:spacing w:line="360" w:lineRule="auto"/>
+        <w:rPr>
+          <w:rFonts w:ascii="Times New Roman" w:hAnsi="Times New Roman" w:cs="Times New Roman"/>
+        </w:rPr>
       </w:pPr>
       <w:r>
         <w:rPr>
@@ -1420,7 +1009,13 @@
           <w:b/>
           <w:bCs/>
         </w:rPr>
-        <w:t xml:space="preserve">Phase-1: </w:t>
+        <w:t>Phase-2:</w:t>
+      </w:r>
+      <w:r>
+        <w:rPr>
+          <w:rFonts w:ascii="Times New Roman" w:hAnsi="Times New Roman" w:cs="Times New Roman"/>
+        </w:rPr>
+        <w:t xml:space="preserve"> </w:t>
       </w:r>
       <w:r>
         <w:rPr>
@@ -1428,7 +1023,13 @@
           <w:b/>
           <w:bCs/>
         </w:rPr>
-        <w:t xml:space="preserve">Environmental Setup </w:t>
+        <w:t>Initial data profiling</w:t>
+      </w:r>
+      <w:r>
+        <w:rPr>
+          <w:rFonts w:ascii="Times New Roman" w:hAnsi="Times New Roman" w:cs="Times New Roman"/>
+        </w:rPr>
+        <w:t xml:space="preserve"> </w:t>
       </w:r>
     </w:p>
     <w:p>
@@ -1442,47 +1043,8 @@
         <w:rPr>
           <w:rFonts w:ascii="Times New Roman" w:hAnsi="Times New Roman" w:cs="Times New Roman"/>
         </w:rPr>
-        <w:t>Set up the development environment using</w:t>
-      </w:r>
-      <w:r>
-        <w:rPr>
-          <w:rFonts w:ascii="Times New Roman" w:hAnsi="Times New Roman" w:cs="Times New Roman"/>
-        </w:rPr>
-        <w:t xml:space="preserve"> </w:t>
-      </w:r>
-      <w:proofErr w:type="spellStart"/>
-      <w:r>
-        <w:rPr>
-          <w:rFonts w:ascii="Times New Roman" w:hAnsi="Times New Roman" w:cs="Times New Roman"/>
-        </w:rPr>
-        <w:t>Miniconda</w:t>
-      </w:r>
-      <w:proofErr w:type="spellEnd"/>
-      <w:r>
-        <w:rPr>
-          <w:rFonts w:ascii="Times New Roman" w:hAnsi="Times New Roman" w:cs="Times New Roman"/>
-        </w:rPr>
-        <w:t xml:space="preserve"> </w:t>
-      </w:r>
-      <w:r>
-        <w:rPr>
-          <w:rFonts w:ascii="Times New Roman" w:hAnsi="Times New Roman" w:cs="Times New Roman"/>
-        </w:rPr>
-        <w:t xml:space="preserve">and installed required libraries such as Pandas, Plotly and </w:t>
-      </w:r>
-      <w:proofErr w:type="spellStart"/>
-      <w:r>
-        <w:rPr>
-          <w:rFonts w:ascii="Times New Roman" w:hAnsi="Times New Roman" w:cs="Times New Roman"/>
-        </w:rPr>
-        <w:t>Streamlit</w:t>
-      </w:r>
-      <w:proofErr w:type="spellEnd"/>
-      <w:r>
-        <w:rPr>
-          <w:rFonts w:ascii="Times New Roman" w:hAnsi="Times New Roman" w:cs="Times New Roman"/>
-        </w:rPr>
-        <w:t>.</w:t>
+        <w:lastRenderedPageBreak/>
+        <w:t xml:space="preserve">Initial exploration of the raw dataset was carried out to understand the data structure, identify missing values and data inconsistencies. This step provided an overview of data quality before cleaning. </w:t>
       </w:r>
     </w:p>
     <w:p>
@@ -1500,71 +1062,129 @@
           <w:b/>
           <w:bCs/>
         </w:rPr>
-        <w:t xml:space="preserve">Phase-2: </w:t>
-      </w:r>
-      <w:r>
+        <w:t xml:space="preserve">Phase-3: Data Preparation </w:t>
+      </w:r>
+    </w:p>
+    <w:p>
+      <w:pPr>
+        <w:spacing w:line="360" w:lineRule="auto"/>
+        <w:rPr>
+          <w:rFonts w:ascii="Times New Roman" w:hAnsi="Times New Roman" w:cs="Times New Roman"/>
+        </w:rPr>
+      </w:pPr>
+      <w:r>
+        <w:rPr>
+          <w:rFonts w:ascii="Times New Roman" w:hAnsi="Times New Roman" w:cs="Times New Roman"/>
+        </w:rPr>
+        <w:t xml:space="preserve">The dataset was cleaned and structured by handling missing values, removing unnecessary columns, duplicate rows and converting data formats where necessary. </w:t>
+      </w:r>
+    </w:p>
+    <w:p>
+      <w:pPr>
+        <w:spacing w:line="360" w:lineRule="auto"/>
         <w:rPr>
           <w:rFonts w:ascii="Times New Roman" w:hAnsi="Times New Roman" w:cs="Times New Roman"/>
           <w:b/>
           <w:bCs/>
         </w:rPr>
-        <w:t xml:space="preserve">Initial data profiling </w:t>
-      </w:r>
-    </w:p>
-    <w:p>
-      <w:pPr>
-        <w:spacing w:line="360" w:lineRule="auto"/>
-        <w:rPr>
-          <w:rFonts w:ascii="Times New Roman" w:hAnsi="Times New Roman" w:cs="Times New Roman"/>
-        </w:rPr>
-      </w:pPr>
-      <w:r>
-        <w:rPr>
-          <w:rFonts w:ascii="Times New Roman" w:hAnsi="Times New Roman" w:cs="Times New Roman"/>
-        </w:rPr>
-        <w:t>Initial exploration of the raw dataset was carried out to understand the data structure, identify missing values and data inconsistencies. This step provided an overview of data quality before cleaning.</w:t>
-      </w:r>
-    </w:p>
-    <w:p>
-      <w:pPr>
-        <w:spacing w:line="360" w:lineRule="auto"/>
+      </w:pPr>
+      <w:r>
         <w:rPr>
           <w:rFonts w:ascii="Times New Roman" w:hAnsi="Times New Roman" w:cs="Times New Roman"/>
           <w:b/>
           <w:bCs/>
         </w:rPr>
-      </w:pPr>
-      <w:r>
+        <w:t xml:space="preserve">Phase-4: Exploratory Data Analysis (EDA) </w:t>
+      </w:r>
+    </w:p>
+    <w:p>
+      <w:pPr>
+        <w:spacing w:line="360" w:lineRule="auto"/>
+        <w:rPr>
+          <w:rFonts w:ascii="Times New Roman" w:hAnsi="Times New Roman" w:cs="Times New Roman"/>
+        </w:rPr>
+      </w:pPr>
+      <w:r>
+        <w:rPr>
+          <w:rFonts w:ascii="Times New Roman" w:hAnsi="Times New Roman" w:cs="Times New Roman"/>
+        </w:rPr>
+        <w:t xml:space="preserve">Performed data explorations to understand the identify key patterns such as most </w:t>
+      </w:r>
+      <w:r>
+        <w:rPr>
+          <w:rFonts w:ascii="Times New Roman" w:hAnsi="Times New Roman" w:cs="Times New Roman"/>
+        </w:rPr>
+        <w:t xml:space="preserve">contributing </w:t>
+      </w:r>
+      <w:r>
+        <w:rPr>
+          <w:rFonts w:ascii="Times New Roman" w:hAnsi="Times New Roman" w:cs="Times New Roman"/>
+        </w:rPr>
+        <w:t xml:space="preserve">hazard type and displacements overtime. </w:t>
+      </w:r>
+    </w:p>
+    <w:p>
+      <w:pPr>
+        <w:spacing w:line="360" w:lineRule="auto"/>
         <w:rPr>
           <w:rFonts w:ascii="Times New Roman" w:hAnsi="Times New Roman" w:cs="Times New Roman"/>
           <w:b/>
           <w:bCs/>
         </w:rPr>
-        <w:t>Phase-</w:t>
-      </w:r>
+      </w:pPr>
       <w:r>
         <w:rPr>
           <w:rFonts w:ascii="Times New Roman" w:hAnsi="Times New Roman" w:cs="Times New Roman"/>
           <w:b/>
           <w:bCs/>
         </w:rPr>
-        <w:t>3</w:t>
-      </w:r>
-      <w:r>
+        <w:t xml:space="preserve">Phase-5: Dashboard Development </w:t>
+      </w:r>
+    </w:p>
+    <w:p>
+      <w:pPr>
+        <w:spacing w:line="360" w:lineRule="auto"/>
+        <w:rPr>
+          <w:rFonts w:ascii="Times New Roman" w:hAnsi="Times New Roman" w:cs="Times New Roman"/>
+        </w:rPr>
+      </w:pPr>
+      <w:r>
+        <w:rPr>
+          <w:rFonts w:ascii="Times New Roman" w:hAnsi="Times New Roman" w:cs="Times New Roman"/>
+        </w:rPr>
+        <w:t xml:space="preserve">Developed an interactive dashboard using </w:t>
+      </w:r>
+      <w:proofErr w:type="spellStart"/>
+      <w:r>
+        <w:rPr>
+          <w:rFonts w:ascii="Times New Roman" w:hAnsi="Times New Roman" w:cs="Times New Roman"/>
+        </w:rPr>
+        <w:t>Streamlit</w:t>
+      </w:r>
+      <w:proofErr w:type="spellEnd"/>
+      <w:r>
+        <w:rPr>
+          <w:rFonts w:ascii="Times New Roman" w:hAnsi="Times New Roman" w:cs="Times New Roman"/>
+        </w:rPr>
+        <w:t xml:space="preserve"> with KPIs, line charts, bar charts and map visualisations. Filters were also implemented to allow users to explore the data dynamically. </w:t>
+      </w:r>
+    </w:p>
+    <w:p>
+      <w:pPr>
+        <w:spacing w:line="360" w:lineRule="auto"/>
         <w:rPr>
           <w:rFonts w:ascii="Times New Roman" w:hAnsi="Times New Roman" w:cs="Times New Roman"/>
           <w:b/>
           <w:bCs/>
         </w:rPr>
-        <w:t xml:space="preserve">: </w:t>
-      </w:r>
+      </w:pPr>
       <w:r>
         <w:rPr>
           <w:rFonts w:ascii="Times New Roman" w:hAnsi="Times New Roman" w:cs="Times New Roman"/>
           <w:b/>
           <w:bCs/>
         </w:rPr>
-        <w:t>Data Preparation</w:t>
+        <w:t xml:space="preserve">Phase-6: Testing and Deployment </w:t>
       </w:r>
     </w:p>
     <w:p>
@@ -1578,7 +1198,21 @@
         <w:rPr>
           <w:rFonts w:ascii="Times New Roman" w:hAnsi="Times New Roman" w:cs="Times New Roman"/>
         </w:rPr>
-        <w:t xml:space="preserve">The dataset was cleaned and structured by handling missing values, removing unnecessary columns, duplicate rows and converting data formats where necessary. </w:t>
+        <w:t xml:space="preserve">Functional testing was conducted using defined test cases to ensure accuracy and responsiveness. The finalised dashboard was then deployed on </w:t>
+      </w:r>
+      <w:proofErr w:type="spellStart"/>
+      <w:r>
+        <w:rPr>
+          <w:rFonts w:ascii="Times New Roman" w:hAnsi="Times New Roman" w:cs="Times New Roman"/>
+        </w:rPr>
+        <w:t>Streamlit</w:t>
+      </w:r>
+      <w:proofErr w:type="spellEnd"/>
+      <w:r>
+        <w:rPr>
+          <w:rFonts w:ascii="Times New Roman" w:hAnsi="Times New Roman" w:cs="Times New Roman"/>
+        </w:rPr>
+        <w:t xml:space="preserve"> for user access.</w:t>
       </w:r>
     </w:p>
     <w:p>
@@ -1588,226 +1222,11 @@
           <w:rFonts w:ascii="Times New Roman" w:hAnsi="Times New Roman" w:cs="Times New Roman"/>
         </w:rPr>
       </w:pPr>
-    </w:p>
-    <w:p>
-      <w:pPr>
-        <w:spacing w:line="360" w:lineRule="auto"/>
-        <w:rPr>
-          <w:rFonts w:ascii="Times New Roman" w:hAnsi="Times New Roman" w:cs="Times New Roman"/>
-          <w:b/>
-          <w:bCs/>
-        </w:rPr>
-      </w:pPr>
-      <w:r>
-        <w:rPr>
-          <w:rFonts w:ascii="Times New Roman" w:hAnsi="Times New Roman" w:cs="Times New Roman"/>
-          <w:b/>
-          <w:bCs/>
-        </w:rPr>
-        <w:lastRenderedPageBreak/>
-        <w:t>Phase-</w:t>
-      </w:r>
-      <w:r>
-        <w:rPr>
-          <w:rFonts w:ascii="Times New Roman" w:hAnsi="Times New Roman" w:cs="Times New Roman"/>
-          <w:b/>
-          <w:bCs/>
-        </w:rPr>
-        <w:t>4</w:t>
-      </w:r>
-      <w:r>
-        <w:rPr>
-          <w:rFonts w:ascii="Times New Roman" w:hAnsi="Times New Roman" w:cs="Times New Roman"/>
-          <w:b/>
-          <w:bCs/>
-        </w:rPr>
-        <w:t>:</w:t>
-      </w:r>
-      <w:r>
-        <w:rPr>
-          <w:rFonts w:ascii="Times New Roman" w:hAnsi="Times New Roman" w:cs="Times New Roman"/>
-          <w:b/>
-          <w:bCs/>
-        </w:rPr>
-        <w:t xml:space="preserve"> Exploratory Data Analysis (EDA)</w:t>
-      </w:r>
-    </w:p>
-    <w:p>
-      <w:pPr>
-        <w:spacing w:line="360" w:lineRule="auto"/>
-        <w:rPr>
-          <w:rFonts w:ascii="Times New Roman" w:hAnsi="Times New Roman" w:cs="Times New Roman"/>
-        </w:rPr>
-      </w:pPr>
-      <w:r>
-        <w:rPr>
-          <w:rFonts w:ascii="Times New Roman" w:hAnsi="Times New Roman" w:cs="Times New Roman"/>
-        </w:rPr>
-        <w:t xml:space="preserve">Performed data explorations to </w:t>
-      </w:r>
-      <w:r>
-        <w:rPr>
-          <w:rFonts w:ascii="Times New Roman" w:hAnsi="Times New Roman" w:cs="Times New Roman"/>
-        </w:rPr>
-        <w:t>understand the identify key patterns such as most contribution hazard type</w:t>
-      </w:r>
-      <w:r>
-        <w:rPr>
-          <w:rFonts w:ascii="Times New Roman" w:hAnsi="Times New Roman" w:cs="Times New Roman"/>
-        </w:rPr>
-        <w:t xml:space="preserve"> and displacements overtime.</w:t>
-      </w:r>
-    </w:p>
-    <w:p>
-      <w:pPr>
-        <w:spacing w:line="360" w:lineRule="auto"/>
-        <w:rPr>
-          <w:rFonts w:ascii="Times New Roman" w:hAnsi="Times New Roman" w:cs="Times New Roman"/>
-          <w:b/>
-          <w:bCs/>
-        </w:rPr>
-      </w:pPr>
-      <w:r>
-        <w:rPr>
-          <w:rFonts w:ascii="Times New Roman" w:hAnsi="Times New Roman" w:cs="Times New Roman"/>
-          <w:b/>
-          <w:bCs/>
-        </w:rPr>
-        <w:t>Phase-</w:t>
-      </w:r>
-      <w:r>
-        <w:rPr>
-          <w:rFonts w:ascii="Times New Roman" w:hAnsi="Times New Roman" w:cs="Times New Roman"/>
-          <w:b/>
-          <w:bCs/>
-        </w:rPr>
-        <w:t>5</w:t>
-      </w:r>
-      <w:r>
-        <w:rPr>
-          <w:rFonts w:ascii="Times New Roman" w:hAnsi="Times New Roman" w:cs="Times New Roman"/>
-          <w:b/>
-          <w:bCs/>
-        </w:rPr>
-        <w:t>:</w:t>
-      </w:r>
-      <w:r>
-        <w:rPr>
-          <w:rFonts w:ascii="Times New Roman" w:hAnsi="Times New Roman" w:cs="Times New Roman"/>
-          <w:b/>
-          <w:bCs/>
-        </w:rPr>
-        <w:t xml:space="preserve"> Dashboard Development</w:t>
-      </w:r>
-    </w:p>
-    <w:p>
-      <w:pPr>
-        <w:spacing w:line="360" w:lineRule="auto"/>
-        <w:rPr>
-          <w:rFonts w:ascii="Times New Roman" w:hAnsi="Times New Roman" w:cs="Times New Roman"/>
-        </w:rPr>
-      </w:pPr>
-      <w:r>
-        <w:rPr>
-          <w:rFonts w:ascii="Times New Roman" w:hAnsi="Times New Roman" w:cs="Times New Roman"/>
-        </w:rPr>
-        <w:t xml:space="preserve">Developed an interactive dashboard using </w:t>
-      </w:r>
-      <w:proofErr w:type="spellStart"/>
-      <w:r>
-        <w:rPr>
-          <w:rFonts w:ascii="Times New Roman" w:hAnsi="Times New Roman" w:cs="Times New Roman"/>
-        </w:rPr>
-        <w:t>Streamlit</w:t>
-      </w:r>
-      <w:proofErr w:type="spellEnd"/>
-      <w:r>
-        <w:rPr>
-          <w:rFonts w:ascii="Times New Roman" w:hAnsi="Times New Roman" w:cs="Times New Roman"/>
-        </w:rPr>
-        <w:t xml:space="preserve"> with KPIs, line charts, bar charts and map visualisations</w:t>
-      </w:r>
-      <w:r>
-        <w:rPr>
-          <w:rFonts w:ascii="Times New Roman" w:hAnsi="Times New Roman" w:cs="Times New Roman"/>
-        </w:rPr>
-        <w:t>.</w:t>
-      </w:r>
-      <w:r>
-        <w:rPr>
-          <w:rFonts w:ascii="Times New Roman" w:hAnsi="Times New Roman" w:cs="Times New Roman"/>
-        </w:rPr>
-        <w:t xml:space="preserve"> Filters were also implemented to allow users to explore the data dynamically.</w:t>
-      </w:r>
-    </w:p>
-    <w:p>
-      <w:pPr>
-        <w:spacing w:line="360" w:lineRule="auto"/>
-        <w:rPr>
-          <w:rFonts w:ascii="Times New Roman" w:hAnsi="Times New Roman" w:cs="Times New Roman"/>
-          <w:b/>
-          <w:bCs/>
-        </w:rPr>
-      </w:pPr>
-      <w:r>
-        <w:rPr>
-          <w:rFonts w:ascii="Times New Roman" w:hAnsi="Times New Roman" w:cs="Times New Roman"/>
-          <w:b/>
-          <w:bCs/>
-        </w:rPr>
-        <w:t>Phase-</w:t>
-      </w:r>
-      <w:r>
-        <w:rPr>
-          <w:rFonts w:ascii="Times New Roman" w:hAnsi="Times New Roman" w:cs="Times New Roman"/>
-          <w:b/>
-          <w:bCs/>
-        </w:rPr>
-        <w:t>6</w:t>
-      </w:r>
-      <w:r>
-        <w:rPr>
-          <w:rFonts w:ascii="Times New Roman" w:hAnsi="Times New Roman" w:cs="Times New Roman"/>
-          <w:b/>
-          <w:bCs/>
-        </w:rPr>
-        <w:t>:</w:t>
-      </w:r>
-      <w:r>
-        <w:rPr>
-          <w:rFonts w:ascii="Times New Roman" w:hAnsi="Times New Roman" w:cs="Times New Roman"/>
-          <w:b/>
-          <w:bCs/>
-        </w:rPr>
-        <w:t xml:space="preserve">  Testing and Deployment</w:t>
-      </w:r>
-    </w:p>
-    <w:p>
-      <w:pPr>
-        <w:spacing w:line="360" w:lineRule="auto"/>
-        <w:rPr>
-          <w:rFonts w:ascii="Times New Roman" w:hAnsi="Times New Roman" w:cs="Times New Roman"/>
-        </w:rPr>
-      </w:pPr>
-      <w:r>
-        <w:rPr>
-          <w:rFonts w:ascii="Times New Roman" w:hAnsi="Times New Roman" w:cs="Times New Roman"/>
-        </w:rPr>
-        <w:t xml:space="preserve">Functional testing was conducted using defined test cases to ensure accuracy and responsiveness. The finalised dashboard was then deployed on </w:t>
-      </w:r>
-      <w:proofErr w:type="spellStart"/>
-      <w:r>
-        <w:rPr>
-          <w:rFonts w:ascii="Times New Roman" w:hAnsi="Times New Roman" w:cs="Times New Roman"/>
-        </w:rPr>
-        <w:t>Streamlit</w:t>
-      </w:r>
-      <w:proofErr w:type="spellEnd"/>
-      <w:r>
-        <w:rPr>
-          <w:rFonts w:ascii="Times New Roman" w:hAnsi="Times New Roman" w:cs="Times New Roman"/>
-        </w:rPr>
-        <w:t xml:space="preserve"> for user access. </w:t>
+      <w:r>
+        <w:rPr>
+          <w:rFonts w:ascii="Times New Roman" w:hAnsi="Times New Roman" w:cs="Times New Roman"/>
+        </w:rPr>
+        <w:t xml:space="preserve">. </w:t>
       </w:r>
     </w:p>
     <w:p>
@@ -1921,11 +1340,7 @@
           <w:szCs w:val="40"/>
         </w:rPr>
       </w:pPr>
-    </w:p>
-    <w:p>
-      <w:pPr>
-        <w:spacing w:before="360" w:after="80" w:line="360" w:lineRule="auto"/>
-        <w:outlineLvl w:val="0"/>
+      <w:r>
         <w:rPr>
           <w:rFonts w:ascii="Times New Roman" w:eastAsia="Times New Roman" w:hAnsi="Times New Roman" w:cs="Times New Roman"/>
           <w:b/>
@@ -1934,10 +1349,418 @@
           <w:sz w:val="40"/>
           <w:szCs w:val="40"/>
         </w:rPr>
-      </w:pPr>
-    </w:p>
-    <w:p>
-      <w:pPr>
+        <w:t>Requirements</w:t>
+      </w:r>
+    </w:p>
+    <w:tbl>
+      <w:tblPr>
+        <w:tblStyle w:val="GridTable4-Accent21"/>
+        <w:tblW w:w="9086" w:type="dxa"/>
+        <w:tblLook w:val="04A0" w:firstRow="1" w:lastRow="0" w:firstColumn="1" w:lastColumn="0" w:noHBand="0" w:noVBand="1"/>
+      </w:tblPr>
+      <w:tblGrid>
+        <w:gridCol w:w="4543"/>
+        <w:gridCol w:w="4543"/>
+      </w:tblGrid>
+      <w:tr>
+        <w:trPr>
+          <w:cnfStyle w:val="100000000000" w:firstRow="1" w:lastRow="0" w:firstColumn="0" w:lastColumn="0" w:oddVBand="0" w:evenVBand="0" w:oddHBand="0" w:evenHBand="0" w:firstRowFirstColumn="0" w:firstRowLastColumn="0" w:lastRowFirstColumn="0" w:lastRowLastColumn="0"/>
+          <w:trHeight w:val="1351"/>
+        </w:trPr>
+        <w:tc>
+          <w:tcPr>
+            <w:cnfStyle w:val="001000000000" w:firstRow="0" w:lastRow="0" w:firstColumn="1" w:lastColumn="0" w:oddVBand="0" w:evenVBand="0" w:oddHBand="0" w:evenHBand="0" w:firstRowFirstColumn="0" w:firstRowLastColumn="0" w:lastRowFirstColumn="0" w:lastRowLastColumn="0"/>
+            <w:tcW w:w="4543" w:type="dxa"/>
+            <w:vAlign w:val="center"/>
+          </w:tcPr>
+          <w:p>
+            <w:pPr>
+              <w:spacing w:line="360" w:lineRule="auto"/>
+              <w:jc w:val="center"/>
+              <w:rPr>
+                <w:rFonts w:ascii="Times New Roman" w:eastAsia="Aptos" w:hAnsi="Times New Roman" w:cs="Times New Roman"/>
+                <w:sz w:val="36"/>
+                <w:szCs w:val="36"/>
+              </w:rPr>
+            </w:pPr>
+            <w:r>
+              <w:rPr>
+                <w:rFonts w:ascii="Times New Roman" w:eastAsia="Aptos" w:hAnsi="Times New Roman" w:cs="Times New Roman"/>
+                <w:sz w:val="36"/>
+                <w:szCs w:val="36"/>
+              </w:rPr>
+              <w:t>Functional</w:t>
+            </w:r>
+          </w:p>
+        </w:tc>
+        <w:tc>
+          <w:tcPr>
+            <w:tcW w:w="4543" w:type="dxa"/>
+            <w:vAlign w:val="center"/>
+          </w:tcPr>
+          <w:p>
+            <w:pPr>
+              <w:spacing w:line="360" w:lineRule="auto"/>
+              <w:jc w:val="center"/>
+              <w:cnfStyle w:val="100000000000" w:firstRow="1" w:lastRow="0" w:firstColumn="0" w:lastColumn="0" w:oddVBand="0" w:evenVBand="0" w:oddHBand="0" w:evenHBand="0" w:firstRowFirstColumn="0" w:firstRowLastColumn="0" w:lastRowFirstColumn="0" w:lastRowLastColumn="0"/>
+              <w:rPr>
+                <w:rFonts w:ascii="Times New Roman" w:eastAsia="Aptos" w:hAnsi="Times New Roman" w:cs="Times New Roman"/>
+                <w:sz w:val="36"/>
+                <w:szCs w:val="36"/>
+              </w:rPr>
+            </w:pPr>
+            <w:r>
+              <w:rPr>
+                <w:rFonts w:ascii="Times New Roman" w:eastAsia="Aptos" w:hAnsi="Times New Roman" w:cs="Times New Roman"/>
+                <w:sz w:val="36"/>
+                <w:szCs w:val="36"/>
+              </w:rPr>
+              <w:t>Non-Functional</w:t>
+            </w:r>
+          </w:p>
+        </w:tc>
+      </w:tr>
+      <w:tr>
+        <w:trPr>
+          <w:cnfStyle w:val="000000100000" w:firstRow="0" w:lastRow="0" w:firstColumn="0" w:lastColumn="0" w:oddVBand="0" w:evenVBand="0" w:oddHBand="1" w:evenHBand="0" w:firstRowFirstColumn="0" w:firstRowLastColumn="0" w:lastRowFirstColumn="0" w:lastRowLastColumn="0"/>
+          <w:trHeight w:val="2949"/>
+        </w:trPr>
+        <w:tc>
+          <w:tcPr>
+            <w:cnfStyle w:val="001000000000" w:firstRow="0" w:lastRow="0" w:firstColumn="1" w:lastColumn="0" w:oddVBand="0" w:evenVBand="0" w:oddHBand="0" w:evenHBand="0" w:firstRowFirstColumn="0" w:firstRowLastColumn="0" w:lastRowFirstColumn="0" w:lastRowLastColumn="0"/>
+            <w:tcW w:w="4543" w:type="dxa"/>
+            <w:vAlign w:val="center"/>
+          </w:tcPr>
+          <w:p>
+            <w:pPr>
+              <w:spacing w:line="360" w:lineRule="auto"/>
+              <w:rPr>
+                <w:rFonts w:ascii="Times New Roman" w:eastAsia="Aptos" w:hAnsi="Times New Roman" w:cs="Times New Roman"/>
+                <w:b w:val="0"/>
+                <w:bCs w:val="0"/>
+                <w:color w:val="000000"/>
+              </w:rPr>
+            </w:pPr>
+            <w:r>
+              <w:rPr>
+                <w:rFonts w:ascii="Times New Roman" w:eastAsia="Aptos" w:hAnsi="Times New Roman" w:cs="Times New Roman"/>
+                <w:b w:val="0"/>
+                <w:bCs w:val="0"/>
+                <w:color w:val="000000"/>
+              </w:rPr>
+              <w:t>The system shall automatically clean and structure the raw dataset upon execution handling missing values and inconsistencies to ensure data integrity before visualisations</w:t>
+            </w:r>
+          </w:p>
+          <w:p>
+            <w:pPr>
+              <w:spacing w:line="360" w:lineRule="auto"/>
+              <w:rPr>
+                <w:rFonts w:ascii="Times New Roman" w:eastAsia="Aptos" w:hAnsi="Times New Roman" w:cs="Times New Roman"/>
+                <w:b w:val="0"/>
+                <w:bCs w:val="0"/>
+                <w:color w:val="000000"/>
+              </w:rPr>
+            </w:pPr>
+          </w:p>
+        </w:tc>
+        <w:tc>
+          <w:tcPr>
+            <w:tcW w:w="4543" w:type="dxa"/>
+            <w:vAlign w:val="center"/>
+          </w:tcPr>
+          <w:p>
+            <w:pPr>
+              <w:spacing w:line="360" w:lineRule="auto"/>
+              <w:cnfStyle w:val="000000100000" w:firstRow="0" w:lastRow="0" w:firstColumn="0" w:lastColumn="0" w:oddVBand="0" w:evenVBand="0" w:oddHBand="1" w:evenHBand="0" w:firstRowFirstColumn="0" w:firstRowLastColumn="0" w:lastRowFirstColumn="0" w:lastRowLastColumn="0"/>
+              <w:rPr>
+                <w:rFonts w:ascii="Times New Roman" w:hAnsi="Times New Roman" w:cs="Times New Roman"/>
+              </w:rPr>
+            </w:pPr>
+            <w:r>
+              <w:rPr>
+                <w:rFonts w:ascii="Times New Roman" w:hAnsi="Times New Roman" w:cs="Times New Roman"/>
+              </w:rPr>
+              <w:t>The dashboard must have a good layout with clear visual hierarchy</w:t>
+            </w:r>
+          </w:p>
+          <w:p>
+            <w:pPr>
+              <w:spacing w:line="360" w:lineRule="auto"/>
+              <w:cnfStyle w:val="000000100000" w:firstRow="0" w:lastRow="0" w:firstColumn="0" w:lastColumn="0" w:oddVBand="0" w:evenVBand="0" w:oddHBand="1" w:evenHBand="0" w:firstRowFirstColumn="0" w:firstRowLastColumn="0" w:lastRowFirstColumn="0" w:lastRowLastColumn="0"/>
+              <w:rPr>
+                <w:rFonts w:ascii="Times New Roman" w:eastAsia="Aptos" w:hAnsi="Times New Roman" w:cs="Times New Roman"/>
+                <w:color w:val="000000"/>
+              </w:rPr>
+            </w:pPr>
+          </w:p>
+        </w:tc>
+      </w:tr>
+      <w:tr>
+        <w:trPr>
+          <w:trHeight w:val="2124"/>
+        </w:trPr>
+        <w:tc>
+          <w:tcPr>
+            <w:cnfStyle w:val="001000000000" w:firstRow="0" w:lastRow="0" w:firstColumn="1" w:lastColumn="0" w:oddVBand="0" w:evenVBand="0" w:oddHBand="0" w:evenHBand="0" w:firstRowFirstColumn="0" w:firstRowLastColumn="0" w:lastRowFirstColumn="0" w:lastRowLastColumn="0"/>
+            <w:tcW w:w="4543" w:type="dxa"/>
+            <w:vAlign w:val="center"/>
+          </w:tcPr>
+          <w:p>
+            <w:pPr>
+              <w:spacing w:line="360" w:lineRule="auto"/>
+              <w:rPr>
+                <w:rFonts w:ascii="Times New Roman" w:hAnsi="Times New Roman" w:cs="Times New Roman"/>
+                <w:b w:val="0"/>
+                <w:bCs w:val="0"/>
+              </w:rPr>
+            </w:pPr>
+            <w:r>
+              <w:rPr>
+                <w:rFonts w:ascii="Times New Roman" w:hAnsi="Times New Roman" w:cs="Times New Roman"/>
+                <w:b w:val="0"/>
+                <w:bCs w:val="0"/>
+              </w:rPr>
+              <w:t>The system shall display aggregated KPI metrics of total displacement, leading hazard types and the most affected country</w:t>
+            </w:r>
+          </w:p>
+        </w:tc>
+        <w:tc>
+          <w:tcPr>
+            <w:tcW w:w="4543" w:type="dxa"/>
+            <w:vAlign w:val="center"/>
+          </w:tcPr>
+          <w:p>
+            <w:pPr>
+              <w:spacing w:line="360" w:lineRule="auto"/>
+              <w:cnfStyle w:val="000000000000" w:firstRow="0" w:lastRow="0" w:firstColumn="0" w:lastColumn="0" w:oddVBand="0" w:evenVBand="0" w:oddHBand="0" w:evenHBand="0" w:firstRowFirstColumn="0" w:firstRowLastColumn="0" w:lastRowFirstColumn="0" w:lastRowLastColumn="0"/>
+              <w:rPr>
+                <w:rFonts w:ascii="Times New Roman" w:eastAsia="Aptos" w:hAnsi="Times New Roman" w:cs="Times New Roman"/>
+                <w:color w:val="000000"/>
+              </w:rPr>
+            </w:pPr>
+            <w:r>
+              <w:rPr>
+                <w:rFonts w:ascii="Times New Roman" w:eastAsia="Aptos" w:hAnsi="Times New Roman" w:cs="Times New Roman"/>
+                <w:color w:val="000000"/>
+              </w:rPr>
+              <w:t>Data loading must be optimized using @</w:t>
+            </w:r>
+            <w:proofErr w:type="gramStart"/>
+            <w:r>
+              <w:rPr>
+                <w:rFonts w:ascii="Times New Roman" w:eastAsia="Aptos" w:hAnsi="Times New Roman" w:cs="Times New Roman"/>
+                <w:color w:val="000000"/>
+              </w:rPr>
+              <w:t>st.cache</w:t>
+            </w:r>
+            <w:proofErr w:type="gramEnd"/>
+            <w:r>
+              <w:rPr>
+                <w:rFonts w:ascii="Times New Roman" w:eastAsia="Aptos" w:hAnsi="Times New Roman" w:cs="Times New Roman"/>
+                <w:color w:val="000000"/>
+              </w:rPr>
+              <w:t>_dat</w:t>
+            </w:r>
+            <w:r>
+              <w:rPr>
+                <w:rFonts w:ascii="Times New Roman" w:eastAsia="Aptos" w:hAnsi="Times New Roman" w:cs="Times New Roman"/>
+                <w:color w:val="000000"/>
+              </w:rPr>
+              <w:t>a</w:t>
+            </w:r>
+            <w:r>
+              <w:rPr>
+                <w:rFonts w:ascii="Times New Roman" w:eastAsia="Aptos" w:hAnsi="Times New Roman" w:cs="Times New Roman"/>
+                <w:color w:val="000000"/>
+              </w:rPr>
+              <w:t xml:space="preserve"> to ensure smooth interactivity.</w:t>
+            </w:r>
+          </w:p>
+        </w:tc>
+      </w:tr>
+      <w:tr>
+        <w:trPr>
+          <w:cnfStyle w:val="000000100000" w:firstRow="0" w:lastRow="0" w:firstColumn="0" w:lastColumn="0" w:oddVBand="0" w:evenVBand="0" w:oddHBand="1" w:evenHBand="0" w:firstRowFirstColumn="0" w:firstRowLastColumn="0" w:lastRowFirstColumn="0" w:lastRowLastColumn="0"/>
+          <w:trHeight w:val="2344"/>
+        </w:trPr>
+        <w:tc>
+          <w:tcPr>
+            <w:cnfStyle w:val="001000000000" w:firstRow="0" w:lastRow="0" w:firstColumn="1" w:lastColumn="0" w:oddVBand="0" w:evenVBand="0" w:oddHBand="0" w:evenHBand="0" w:firstRowFirstColumn="0" w:firstRowLastColumn="0" w:lastRowFirstColumn="0" w:lastRowLastColumn="0"/>
+            <w:tcW w:w="4543" w:type="dxa"/>
+            <w:vAlign w:val="center"/>
+          </w:tcPr>
+          <w:p>
+            <w:pPr>
+              <w:spacing w:line="360" w:lineRule="auto"/>
+              <w:rPr>
+                <w:rFonts w:ascii="Times New Roman" w:hAnsi="Times New Roman" w:cs="Times New Roman"/>
+                <w:b w:val="0"/>
+                <w:bCs w:val="0"/>
+              </w:rPr>
+            </w:pPr>
+            <w:r>
+              <w:rPr>
+                <w:rFonts w:ascii="Times New Roman" w:hAnsi="Times New Roman" w:cs="Times New Roman"/>
+                <w:b w:val="0"/>
+                <w:bCs w:val="0"/>
+              </w:rPr>
+              <w:t>The system shall provide integrated charts such as time series for displacements and top 5 hazards and bar charts for top 10 affected countries and hazard types to allow simultaneous trends and categorical analysis.</w:t>
+            </w:r>
+          </w:p>
+          <w:p>
+            <w:pPr>
+              <w:spacing w:line="360" w:lineRule="auto"/>
+              <w:rPr>
+                <w:rFonts w:ascii="Times New Roman" w:eastAsia="Aptos" w:hAnsi="Times New Roman" w:cs="Times New Roman"/>
+                <w:b w:val="0"/>
+                <w:bCs w:val="0"/>
+                <w:color w:val="000000"/>
+              </w:rPr>
+            </w:pPr>
+          </w:p>
+        </w:tc>
+        <w:tc>
+          <w:tcPr>
+            <w:tcW w:w="4543" w:type="dxa"/>
+            <w:vAlign w:val="center"/>
+          </w:tcPr>
+          <w:p>
+            <w:pPr>
+              <w:spacing w:line="360" w:lineRule="auto"/>
+              <w:cnfStyle w:val="000000100000" w:firstRow="0" w:lastRow="0" w:firstColumn="0" w:lastColumn="0" w:oddVBand="0" w:evenVBand="0" w:oddHBand="1" w:evenHBand="0" w:firstRowFirstColumn="0" w:firstRowLastColumn="0" w:lastRowFirstColumn="0" w:lastRowLastColumn="0"/>
+              <w:rPr>
+                <w:rFonts w:ascii="Times New Roman" w:eastAsia="Aptos" w:hAnsi="Times New Roman" w:cs="Times New Roman"/>
+                <w:color w:val="000000"/>
+              </w:rPr>
+            </w:pPr>
+            <w:r>
+              <w:rPr>
+                <w:rFonts w:ascii="Times New Roman" w:eastAsia="Aptos" w:hAnsi="Times New Roman" w:cs="Times New Roman"/>
+                <w:color w:val="000000"/>
+              </w:rPr>
+              <w:t>The system must provide a fast interaction with less latency.</w:t>
+            </w:r>
+          </w:p>
+        </w:tc>
+      </w:tr>
+      <w:tr>
+        <w:trPr>
+          <w:trHeight w:val="1187"/>
+        </w:trPr>
+        <w:tc>
+          <w:tcPr>
+            <w:cnfStyle w:val="001000000000" w:firstRow="0" w:lastRow="0" w:firstColumn="1" w:lastColumn="0" w:oddVBand="0" w:evenVBand="0" w:oddHBand="0" w:evenHBand="0" w:firstRowFirstColumn="0" w:firstRowLastColumn="0" w:lastRowFirstColumn="0" w:lastRowLastColumn="0"/>
+            <w:tcW w:w="4543" w:type="dxa"/>
+            <w:vAlign w:val="center"/>
+          </w:tcPr>
+          <w:p>
+            <w:pPr>
+              <w:spacing w:line="360" w:lineRule="auto"/>
+              <w:rPr>
+                <w:rFonts w:ascii="Times New Roman" w:hAnsi="Times New Roman" w:cs="Times New Roman"/>
+                <w:b w:val="0"/>
+                <w:bCs w:val="0"/>
+              </w:rPr>
+            </w:pPr>
+            <w:r>
+              <w:rPr>
+                <w:rFonts w:ascii="Times New Roman" w:hAnsi="Times New Roman" w:cs="Times New Roman"/>
+                <w:b w:val="0"/>
+                <w:bCs w:val="0"/>
+              </w:rPr>
+              <w:t>The system shall include a map to illustrate the regional impact of disasters</w:t>
+            </w:r>
+          </w:p>
+          <w:p>
+            <w:pPr>
+              <w:spacing w:line="360" w:lineRule="auto"/>
+              <w:rPr>
+                <w:rFonts w:ascii="Times New Roman" w:eastAsia="Aptos" w:hAnsi="Times New Roman" w:cs="Times New Roman"/>
+                <w:b w:val="0"/>
+                <w:bCs w:val="0"/>
+                <w:color w:val="000000"/>
+              </w:rPr>
+            </w:pPr>
+          </w:p>
+        </w:tc>
+        <w:tc>
+          <w:tcPr>
+            <w:tcW w:w="4543" w:type="dxa"/>
+            <w:vAlign w:val="center"/>
+          </w:tcPr>
+          <w:p>
+            <w:pPr>
+              <w:spacing w:line="360" w:lineRule="auto"/>
+              <w:cnfStyle w:val="000000000000" w:firstRow="0" w:lastRow="0" w:firstColumn="0" w:lastColumn="0" w:oddVBand="0" w:evenVBand="0" w:oddHBand="0" w:evenHBand="0" w:firstRowFirstColumn="0" w:firstRowLastColumn="0" w:lastRowFirstColumn="0" w:lastRowLastColumn="0"/>
+              <w:rPr>
+                <w:rFonts w:ascii="Times New Roman" w:eastAsia="Aptos" w:hAnsi="Times New Roman" w:cs="Times New Roman"/>
+                <w:color w:val="000000"/>
+              </w:rPr>
+            </w:pPr>
+            <w:r>
+              <w:rPr>
+                <w:rFonts w:ascii="Times New Roman" w:eastAsia="Aptos" w:hAnsi="Times New Roman" w:cs="Times New Roman"/>
+                <w:color w:val="000000"/>
+              </w:rPr>
+              <w:t>The visualisation must be clear, readable and clutter free.</w:t>
+            </w:r>
+          </w:p>
+        </w:tc>
+      </w:tr>
+      <w:tr>
+        <w:trPr>
+          <w:cnfStyle w:val="000000100000" w:firstRow="0" w:lastRow="0" w:firstColumn="0" w:lastColumn="0" w:oddVBand="0" w:evenVBand="0" w:oddHBand="1" w:evenHBand="0" w:firstRowFirstColumn="0" w:firstRowLastColumn="0" w:lastRowFirstColumn="0" w:lastRowLastColumn="0"/>
+          <w:trHeight w:val="483"/>
+        </w:trPr>
+        <w:tc>
+          <w:tcPr>
+            <w:cnfStyle w:val="001000000000" w:firstRow="0" w:lastRow="0" w:firstColumn="1" w:lastColumn="0" w:oddVBand="0" w:evenVBand="0" w:oddHBand="0" w:evenHBand="0" w:firstRowFirstColumn="0" w:firstRowLastColumn="0" w:lastRowFirstColumn="0" w:lastRowLastColumn="0"/>
+            <w:tcW w:w="4543" w:type="dxa"/>
+            <w:vAlign w:val="center"/>
+          </w:tcPr>
+          <w:p>
+            <w:pPr>
+              <w:spacing w:line="360" w:lineRule="auto"/>
+              <w:rPr>
+                <w:rFonts w:ascii="Times New Roman" w:eastAsia="Aptos" w:hAnsi="Times New Roman" w:cs="Times New Roman"/>
+                <w:b w:val="0"/>
+                <w:bCs w:val="0"/>
+                <w:color w:val="000000"/>
+              </w:rPr>
+            </w:pPr>
+            <w:r>
+              <w:rPr>
+                <w:rFonts w:ascii="Times New Roman" w:eastAsia="Aptos" w:hAnsi="Times New Roman" w:cs="Times New Roman"/>
+                <w:b w:val="0"/>
+                <w:bCs w:val="0"/>
+                <w:color w:val="000000"/>
+              </w:rPr>
+              <w:t>The app will provide filters and slicers to allow user interaction</w:t>
+            </w:r>
+          </w:p>
+        </w:tc>
+        <w:tc>
+          <w:tcPr>
+            <w:tcW w:w="4543" w:type="dxa"/>
+            <w:vAlign w:val="center"/>
+          </w:tcPr>
+          <w:p>
+            <w:pPr>
+              <w:spacing w:line="360" w:lineRule="auto"/>
+              <w:cnfStyle w:val="000000100000" w:firstRow="0" w:lastRow="0" w:firstColumn="0" w:lastColumn="0" w:oddVBand="0" w:evenVBand="0" w:oddHBand="1" w:evenHBand="0" w:firstRowFirstColumn="0" w:firstRowLastColumn="0" w:lastRowFirstColumn="0" w:lastRowLastColumn="0"/>
+              <w:rPr>
+                <w:rFonts w:ascii="Times New Roman" w:eastAsia="Aptos" w:hAnsi="Times New Roman" w:cs="Times New Roman"/>
+                <w:color w:val="000000"/>
+              </w:rPr>
+            </w:pPr>
+          </w:p>
+        </w:tc>
+      </w:tr>
+    </w:tbl>
+    <w:p>
+      <w:pPr>
+        <w:keepNext/>
+        <w:keepLines/>
         <w:spacing w:before="360" w:after="80" w:line="360" w:lineRule="auto"/>
         <w:outlineLvl w:val="0"/>
         <w:rPr>
@@ -1949,7 +1772,11 @@
           <w:szCs w:val="40"/>
         </w:rPr>
       </w:pPr>
-      <w:r>
+    </w:p>
+    <w:p>
+      <w:pPr>
+        <w:spacing w:before="360" w:after="80" w:line="360" w:lineRule="auto"/>
+        <w:outlineLvl w:val="0"/>
         <w:rPr>
           <w:rFonts w:ascii="Times New Roman" w:eastAsia="Times New Roman" w:hAnsi="Times New Roman" w:cs="Times New Roman"/>
           <w:b/>
@@ -1958,360 +1785,10 @@
           <w:sz w:val="40"/>
           <w:szCs w:val="40"/>
         </w:rPr>
-        <w:lastRenderedPageBreak/>
-        <w:t>Requirements</w:t>
-      </w:r>
-    </w:p>
-    <w:tbl>
-      <w:tblPr>
-        <w:tblStyle w:val="GridTable4-Accent21"/>
-        <w:tblW w:w="0" w:type="auto"/>
-        <w:tblLook w:val="04A0" w:firstRow="1" w:lastRow="0" w:firstColumn="1" w:lastColumn="0" w:noHBand="0" w:noVBand="1"/>
-      </w:tblPr>
-      <w:tblGrid>
-        <w:gridCol w:w="4508"/>
-        <w:gridCol w:w="4508"/>
-      </w:tblGrid>
-      <w:tr>
-        <w:trPr>
-          <w:cnfStyle w:val="100000000000" w:firstRow="1" w:lastRow="0" w:firstColumn="0" w:lastColumn="0" w:oddVBand="0" w:evenVBand="0" w:oddHBand="0" w:evenHBand="0" w:firstRowFirstColumn="0" w:firstRowLastColumn="0" w:lastRowFirstColumn="0" w:lastRowLastColumn="0"/>
-        </w:trPr>
-        <w:tc>
-          <w:tcPr>
-            <w:cnfStyle w:val="001000000000" w:firstRow="0" w:lastRow="0" w:firstColumn="1" w:lastColumn="0" w:oddVBand="0" w:evenVBand="0" w:oddHBand="0" w:evenHBand="0" w:firstRowFirstColumn="0" w:firstRowLastColumn="0" w:lastRowFirstColumn="0" w:lastRowLastColumn="0"/>
-            <w:tcW w:w="4508" w:type="dxa"/>
-          </w:tcPr>
-          <w:p>
-            <w:pPr>
-              <w:spacing w:line="360" w:lineRule="auto"/>
-              <w:jc w:val="center"/>
-              <w:rPr>
-                <w:rFonts w:ascii="Times New Roman" w:eastAsia="Aptos" w:hAnsi="Times New Roman" w:cs="Times New Roman"/>
-              </w:rPr>
-            </w:pPr>
-            <w:r>
-              <w:rPr>
-                <w:rFonts w:ascii="Times New Roman" w:eastAsia="Aptos" w:hAnsi="Times New Roman" w:cs="Times New Roman"/>
-              </w:rPr>
-              <w:t>Functional</w:t>
-            </w:r>
-          </w:p>
-        </w:tc>
-        <w:tc>
-          <w:tcPr>
-            <w:tcW w:w="4508" w:type="dxa"/>
-          </w:tcPr>
-          <w:p>
-            <w:pPr>
-              <w:spacing w:line="360" w:lineRule="auto"/>
-              <w:jc w:val="center"/>
-              <w:cnfStyle w:val="100000000000" w:firstRow="1" w:lastRow="0" w:firstColumn="0" w:lastColumn="0" w:oddVBand="0" w:evenVBand="0" w:oddHBand="0" w:evenHBand="0" w:firstRowFirstColumn="0" w:firstRowLastColumn="0" w:lastRowFirstColumn="0" w:lastRowLastColumn="0"/>
-              <w:rPr>
-                <w:rFonts w:ascii="Times New Roman" w:eastAsia="Aptos" w:hAnsi="Times New Roman" w:cs="Times New Roman"/>
-              </w:rPr>
-            </w:pPr>
-            <w:r>
-              <w:rPr>
-                <w:rFonts w:ascii="Times New Roman" w:eastAsia="Aptos" w:hAnsi="Times New Roman" w:cs="Times New Roman"/>
-              </w:rPr>
-              <w:t>Non-Functional</w:t>
-            </w:r>
-          </w:p>
-        </w:tc>
-      </w:tr>
-      <w:tr>
-        <w:trPr>
-          <w:cnfStyle w:val="000000100000" w:firstRow="0" w:lastRow="0" w:firstColumn="0" w:lastColumn="0" w:oddVBand="0" w:evenVBand="0" w:oddHBand="1" w:evenHBand="0" w:firstRowFirstColumn="0" w:firstRowLastColumn="0" w:lastRowFirstColumn="0" w:lastRowLastColumn="0"/>
-          <w:trHeight w:val="842"/>
-        </w:trPr>
-        <w:tc>
-          <w:tcPr>
-            <w:cnfStyle w:val="001000000000" w:firstRow="0" w:lastRow="0" w:firstColumn="1" w:lastColumn="0" w:oddVBand="0" w:evenVBand="0" w:oddHBand="0" w:evenHBand="0" w:firstRowFirstColumn="0" w:firstRowLastColumn="0" w:lastRowFirstColumn="0" w:lastRowLastColumn="0"/>
-            <w:tcW w:w="4508" w:type="dxa"/>
-          </w:tcPr>
-          <w:p>
-            <w:pPr>
-              <w:spacing w:line="360" w:lineRule="auto"/>
-              <w:rPr>
-                <w:rFonts w:ascii="Times New Roman" w:eastAsia="Aptos" w:hAnsi="Times New Roman" w:cs="Times New Roman"/>
-                <w:b w:val="0"/>
-                <w:bCs w:val="0"/>
-                <w:color w:val="000000"/>
-              </w:rPr>
-            </w:pPr>
-            <w:r>
-              <w:rPr>
-                <w:rFonts w:ascii="Times New Roman" w:eastAsia="Aptos" w:hAnsi="Times New Roman" w:cs="Times New Roman"/>
-                <w:b w:val="0"/>
-                <w:bCs w:val="0"/>
-                <w:color w:val="000000"/>
-              </w:rPr>
-              <w:t>The system shall display aggregated KPI metrics of total displacement, leading hazard types and the most affected country.</w:t>
-            </w:r>
-          </w:p>
-        </w:tc>
-        <w:tc>
-          <w:tcPr>
-            <w:tcW w:w="4508" w:type="dxa"/>
-          </w:tcPr>
-          <w:p>
-            <w:pPr>
-              <w:spacing w:line="360" w:lineRule="auto"/>
-              <w:cnfStyle w:val="000000100000" w:firstRow="0" w:lastRow="0" w:firstColumn="0" w:lastColumn="0" w:oddVBand="0" w:evenVBand="0" w:oddHBand="1" w:evenHBand="0" w:firstRowFirstColumn="0" w:firstRowLastColumn="0" w:lastRowFirstColumn="0" w:lastRowLastColumn="0"/>
-              <w:rPr>
-                <w:rFonts w:ascii="Times New Roman" w:eastAsia="Aptos" w:hAnsi="Times New Roman" w:cs="Times New Roman"/>
-                <w:color w:val="000000"/>
-              </w:rPr>
-            </w:pPr>
-            <w:r>
-              <w:rPr>
-                <w:rFonts w:ascii="Times New Roman" w:eastAsia="Aptos" w:hAnsi="Times New Roman" w:cs="Times New Roman"/>
-                <w:color w:val="000000"/>
-              </w:rPr>
-              <w:t>The dashboard must have an intuitive layout with clear visual hierarchy</w:t>
-            </w:r>
-          </w:p>
-        </w:tc>
-      </w:tr>
-      <w:tr>
-        <w:tc>
-          <w:tcPr>
-            <w:cnfStyle w:val="001000000000" w:firstRow="0" w:lastRow="0" w:firstColumn="1" w:lastColumn="0" w:oddVBand="0" w:evenVBand="0" w:oddHBand="0" w:evenHBand="0" w:firstRowFirstColumn="0" w:firstRowLastColumn="0" w:lastRowFirstColumn="0" w:lastRowLastColumn="0"/>
-            <w:tcW w:w="4508" w:type="dxa"/>
-          </w:tcPr>
-          <w:p>
-            <w:pPr>
-              <w:spacing w:line="360" w:lineRule="auto"/>
-              <w:rPr>
-                <w:rFonts w:ascii="Times New Roman" w:eastAsia="Aptos" w:hAnsi="Times New Roman" w:cs="Times New Roman"/>
-                <w:b w:val="0"/>
-                <w:bCs w:val="0"/>
-                <w:color w:val="000000"/>
-              </w:rPr>
-            </w:pPr>
-            <w:r>
-              <w:rPr>
-                <w:rFonts w:ascii="Times New Roman" w:eastAsia="Aptos" w:hAnsi="Times New Roman" w:cs="Times New Roman"/>
-                <w:b w:val="0"/>
-                <w:bCs w:val="0"/>
-                <w:color w:val="000000"/>
-              </w:rPr>
-              <w:t>The app shall provide a time series line chart to visualise displacement trends from 2008-2024</w:t>
-            </w:r>
-          </w:p>
-        </w:tc>
-        <w:tc>
-          <w:tcPr>
-            <w:tcW w:w="4508" w:type="dxa"/>
-          </w:tcPr>
-          <w:p>
-            <w:pPr>
-              <w:spacing w:line="360" w:lineRule="auto"/>
-              <w:cnfStyle w:val="000000000000" w:firstRow="0" w:lastRow="0" w:firstColumn="0" w:lastColumn="0" w:oddVBand="0" w:evenVBand="0" w:oddHBand="0" w:evenHBand="0" w:firstRowFirstColumn="0" w:firstRowLastColumn="0" w:lastRowFirstColumn="0" w:lastRowLastColumn="0"/>
-              <w:rPr>
-                <w:rFonts w:ascii="Times New Roman" w:eastAsia="Aptos" w:hAnsi="Times New Roman" w:cs="Times New Roman"/>
-                <w:color w:val="000000"/>
-              </w:rPr>
-            </w:pPr>
-            <w:r>
-              <w:rPr>
-                <w:rFonts w:ascii="Times New Roman" w:eastAsia="Aptos" w:hAnsi="Times New Roman" w:cs="Times New Roman"/>
-                <w:color w:val="000000"/>
-              </w:rPr>
-              <w:t>Data loading must be optimized using @</w:t>
-            </w:r>
-            <w:proofErr w:type="gramStart"/>
-            <w:r>
-              <w:rPr>
-                <w:rFonts w:ascii="Times New Roman" w:eastAsia="Aptos" w:hAnsi="Times New Roman" w:cs="Times New Roman"/>
-                <w:color w:val="000000"/>
-              </w:rPr>
-              <w:t>st.cache</w:t>
-            </w:r>
-            <w:proofErr w:type="gramEnd"/>
-            <w:r>
-              <w:rPr>
-                <w:rFonts w:ascii="Times New Roman" w:eastAsia="Aptos" w:hAnsi="Times New Roman" w:cs="Times New Roman"/>
-                <w:color w:val="000000"/>
-              </w:rPr>
-              <w:t>_dat</w:t>
-            </w:r>
-            <w:r>
-              <w:rPr>
-                <w:rFonts w:ascii="Times New Roman" w:eastAsia="Aptos" w:hAnsi="Times New Roman" w:cs="Times New Roman"/>
-                <w:color w:val="000000"/>
-              </w:rPr>
-              <w:t>a</w:t>
-            </w:r>
-            <w:r>
-              <w:rPr>
-                <w:rFonts w:ascii="Times New Roman" w:eastAsia="Aptos" w:hAnsi="Times New Roman" w:cs="Times New Roman"/>
-                <w:color w:val="000000"/>
-              </w:rPr>
-              <w:t xml:space="preserve"> to ensure smooth interactivity.</w:t>
-            </w:r>
-          </w:p>
-        </w:tc>
-      </w:tr>
-      <w:tr>
-        <w:trPr>
-          <w:cnfStyle w:val="000000100000" w:firstRow="0" w:lastRow="0" w:firstColumn="0" w:lastColumn="0" w:oddVBand="0" w:evenVBand="0" w:oddHBand="1" w:evenHBand="0" w:firstRowFirstColumn="0" w:firstRowLastColumn="0" w:lastRowFirstColumn="0" w:lastRowLastColumn="0"/>
-          <w:trHeight w:val="712"/>
-        </w:trPr>
-        <w:tc>
-          <w:tcPr>
-            <w:cnfStyle w:val="001000000000" w:firstRow="0" w:lastRow="0" w:firstColumn="1" w:lastColumn="0" w:oddVBand="0" w:evenVBand="0" w:oddHBand="0" w:evenHBand="0" w:firstRowFirstColumn="0" w:firstRowLastColumn="0" w:lastRowFirstColumn="0" w:lastRowLastColumn="0"/>
-            <w:tcW w:w="4508" w:type="dxa"/>
-          </w:tcPr>
-          <w:p>
-            <w:pPr>
-              <w:spacing w:line="360" w:lineRule="auto"/>
-              <w:rPr>
-                <w:rFonts w:ascii="Times New Roman" w:eastAsia="Aptos" w:hAnsi="Times New Roman" w:cs="Times New Roman"/>
-                <w:b w:val="0"/>
-                <w:bCs w:val="0"/>
-                <w:color w:val="000000"/>
-              </w:rPr>
-            </w:pPr>
-            <w:r>
-              <w:rPr>
-                <w:rFonts w:ascii="Times New Roman" w:eastAsia="Aptos" w:hAnsi="Times New Roman" w:cs="Times New Roman"/>
-                <w:b w:val="0"/>
-                <w:bCs w:val="0"/>
-                <w:color w:val="000000"/>
-              </w:rPr>
-              <w:t>The system shall include a map to illustrate the regional impact of disasters</w:t>
-            </w:r>
-          </w:p>
-        </w:tc>
-        <w:tc>
-          <w:tcPr>
-            <w:tcW w:w="4508" w:type="dxa"/>
-          </w:tcPr>
-          <w:p>
-            <w:pPr>
-              <w:spacing w:line="360" w:lineRule="auto"/>
-              <w:cnfStyle w:val="000000100000" w:firstRow="0" w:lastRow="0" w:firstColumn="0" w:lastColumn="0" w:oddVBand="0" w:evenVBand="0" w:oddHBand="1" w:evenHBand="0" w:firstRowFirstColumn="0" w:firstRowLastColumn="0" w:lastRowFirstColumn="0" w:lastRowLastColumn="0"/>
-              <w:rPr>
-                <w:rFonts w:ascii="Times New Roman" w:eastAsia="Aptos" w:hAnsi="Times New Roman" w:cs="Times New Roman"/>
-                <w:color w:val="000000"/>
-              </w:rPr>
-            </w:pPr>
-            <w:r>
-              <w:rPr>
-                <w:rFonts w:ascii="Times New Roman" w:eastAsia="Aptos" w:hAnsi="Times New Roman" w:cs="Times New Roman"/>
-                <w:color w:val="000000"/>
-              </w:rPr>
-              <w:t>The system must provide a fast interaction with less latency.</w:t>
-            </w:r>
-          </w:p>
-        </w:tc>
-      </w:tr>
-      <w:tr>
-        <w:trPr>
-          <w:trHeight w:val="712"/>
-        </w:trPr>
-        <w:tc>
-          <w:tcPr>
-            <w:cnfStyle w:val="001000000000" w:firstRow="0" w:lastRow="0" w:firstColumn="1" w:lastColumn="0" w:oddVBand="0" w:evenVBand="0" w:oddHBand="0" w:evenHBand="0" w:firstRowFirstColumn="0" w:firstRowLastColumn="0" w:lastRowFirstColumn="0" w:lastRowLastColumn="0"/>
-            <w:tcW w:w="4508" w:type="dxa"/>
-          </w:tcPr>
-          <w:p>
-            <w:pPr>
-              <w:spacing w:line="360" w:lineRule="auto"/>
-              <w:rPr>
-                <w:rFonts w:ascii="Times New Roman" w:eastAsia="Aptos" w:hAnsi="Times New Roman" w:cs="Times New Roman"/>
-                <w:b w:val="0"/>
-                <w:bCs w:val="0"/>
-                <w:color w:val="000000"/>
-              </w:rPr>
-            </w:pPr>
-            <w:r>
-              <w:rPr>
-                <w:rFonts w:ascii="Times New Roman" w:eastAsia="Aptos" w:hAnsi="Times New Roman" w:cs="Times New Roman"/>
-                <w:b w:val="0"/>
-                <w:bCs w:val="0"/>
-                <w:color w:val="000000"/>
-              </w:rPr>
-              <w:t>The system shall include bar charts to display the top 5 contributing hazards and total number of displacements by hazard type.</w:t>
-            </w:r>
-          </w:p>
-        </w:tc>
-        <w:tc>
-          <w:tcPr>
-            <w:tcW w:w="4508" w:type="dxa"/>
-          </w:tcPr>
-          <w:p>
-            <w:pPr>
-              <w:spacing w:line="360" w:lineRule="auto"/>
-              <w:cnfStyle w:val="000000000000" w:firstRow="0" w:lastRow="0" w:firstColumn="0" w:lastColumn="0" w:oddVBand="0" w:evenVBand="0" w:oddHBand="0" w:evenHBand="0" w:firstRowFirstColumn="0" w:firstRowLastColumn="0" w:lastRowFirstColumn="0" w:lastRowLastColumn="0"/>
-              <w:rPr>
-                <w:rFonts w:ascii="Times New Roman" w:eastAsia="Aptos" w:hAnsi="Times New Roman" w:cs="Times New Roman"/>
-                <w:color w:val="000000"/>
-              </w:rPr>
-            </w:pPr>
-            <w:r>
-              <w:rPr>
-                <w:rFonts w:ascii="Times New Roman" w:eastAsia="Aptos" w:hAnsi="Times New Roman" w:cs="Times New Roman"/>
-                <w:color w:val="000000"/>
-              </w:rPr>
-              <w:t>The visualisation must be clear, readable and clutter free.</w:t>
-            </w:r>
-          </w:p>
-        </w:tc>
-      </w:tr>
-      <w:tr>
-        <w:trPr>
-          <w:cnfStyle w:val="000000100000" w:firstRow="0" w:lastRow="0" w:firstColumn="0" w:lastColumn="0" w:oddVBand="0" w:evenVBand="0" w:oddHBand="1" w:evenHBand="0" w:firstRowFirstColumn="0" w:firstRowLastColumn="0" w:lastRowFirstColumn="0" w:lastRowLastColumn="0"/>
-          <w:trHeight w:val="708"/>
-        </w:trPr>
-        <w:tc>
-          <w:tcPr>
-            <w:cnfStyle w:val="001000000000" w:firstRow="0" w:lastRow="0" w:firstColumn="1" w:lastColumn="0" w:oddVBand="0" w:evenVBand="0" w:oddHBand="0" w:evenHBand="0" w:firstRowFirstColumn="0" w:firstRowLastColumn="0" w:lastRowFirstColumn="0" w:lastRowLastColumn="0"/>
-            <w:tcW w:w="4508" w:type="dxa"/>
-          </w:tcPr>
-          <w:p>
-            <w:pPr>
-              <w:spacing w:line="360" w:lineRule="auto"/>
-              <w:rPr>
-                <w:rFonts w:ascii="Times New Roman" w:eastAsia="Aptos" w:hAnsi="Times New Roman" w:cs="Times New Roman"/>
-                <w:b w:val="0"/>
-                <w:bCs w:val="0"/>
-                <w:color w:val="000000"/>
-              </w:rPr>
-            </w:pPr>
-            <w:r>
-              <w:rPr>
-                <w:rFonts w:ascii="Times New Roman" w:eastAsia="Aptos" w:hAnsi="Times New Roman" w:cs="Times New Roman"/>
-                <w:b w:val="0"/>
-                <w:bCs w:val="0"/>
-                <w:color w:val="000000"/>
-              </w:rPr>
-              <w:t>The app will provide filters and slicers to allow user interaction</w:t>
-            </w:r>
-          </w:p>
-        </w:tc>
-        <w:tc>
-          <w:tcPr>
-            <w:tcW w:w="4508" w:type="dxa"/>
-          </w:tcPr>
-          <w:p>
-            <w:pPr>
-              <w:spacing w:line="360" w:lineRule="auto"/>
-              <w:cnfStyle w:val="000000100000" w:firstRow="0" w:lastRow="0" w:firstColumn="0" w:lastColumn="0" w:oddVBand="0" w:evenVBand="0" w:oddHBand="1" w:evenHBand="0" w:firstRowFirstColumn="0" w:firstRowLastColumn="0" w:lastRowFirstColumn="0" w:lastRowLastColumn="0"/>
-              <w:rPr>
-                <w:rFonts w:ascii="Times New Roman" w:eastAsia="Aptos" w:hAnsi="Times New Roman" w:cs="Times New Roman"/>
-                <w:color w:val="000000"/>
-              </w:rPr>
-            </w:pPr>
-          </w:p>
-        </w:tc>
-      </w:tr>
-    </w:tbl>
-    <w:p>
-      <w:pPr>
-        <w:keepNext/>
-        <w:keepLines/>
+      </w:pPr>
+    </w:p>
+    <w:p>
+      <w:pPr>
         <w:spacing w:before="360" w:after="80" w:line="360" w:lineRule="auto"/>
         <w:outlineLvl w:val="0"/>
         <w:rPr>
@@ -2323,11 +1800,7 @@
           <w:szCs w:val="40"/>
         </w:rPr>
       </w:pPr>
-    </w:p>
-    <w:p>
-      <w:pPr>
-        <w:spacing w:before="360" w:after="80" w:line="360" w:lineRule="auto"/>
-        <w:outlineLvl w:val="0"/>
+      <w:r>
         <w:rPr>
           <w:rFonts w:ascii="Times New Roman" w:eastAsia="Times New Roman" w:hAnsi="Times New Roman" w:cs="Times New Roman"/>
           <w:b/>
@@ -2336,101 +1809,6 @@
           <w:sz w:val="40"/>
           <w:szCs w:val="40"/>
         </w:rPr>
-      </w:pPr>
-    </w:p>
-    <w:p>
-      <w:pPr>
-        <w:spacing w:before="360" w:after="80" w:line="360" w:lineRule="auto"/>
-        <w:outlineLvl w:val="0"/>
-        <w:rPr>
-          <w:rFonts w:ascii="Times New Roman" w:eastAsia="Times New Roman" w:hAnsi="Times New Roman" w:cs="Times New Roman"/>
-          <w:b/>
-          <w:bCs/>
-          <w:color w:val="0F4761"/>
-          <w:sz w:val="40"/>
-          <w:szCs w:val="40"/>
-        </w:rPr>
-      </w:pPr>
-    </w:p>
-    <w:p>
-      <w:pPr>
-        <w:spacing w:before="360" w:after="80" w:line="360" w:lineRule="auto"/>
-        <w:outlineLvl w:val="0"/>
-        <w:rPr>
-          <w:rFonts w:ascii="Times New Roman" w:eastAsia="Times New Roman" w:hAnsi="Times New Roman" w:cs="Times New Roman"/>
-          <w:b/>
-          <w:bCs/>
-          <w:color w:val="0F4761"/>
-          <w:sz w:val="40"/>
-          <w:szCs w:val="40"/>
-        </w:rPr>
-      </w:pPr>
-    </w:p>
-    <w:p>
-      <w:pPr>
-        <w:spacing w:before="360" w:after="80" w:line="360" w:lineRule="auto"/>
-        <w:outlineLvl w:val="0"/>
-        <w:rPr>
-          <w:rFonts w:ascii="Times New Roman" w:eastAsia="Times New Roman" w:hAnsi="Times New Roman" w:cs="Times New Roman"/>
-          <w:b/>
-          <w:bCs/>
-          <w:color w:val="0F4761"/>
-          <w:sz w:val="40"/>
-          <w:szCs w:val="40"/>
-        </w:rPr>
-      </w:pPr>
-    </w:p>
-    <w:p>
-      <w:pPr>
-        <w:spacing w:before="360" w:after="80" w:line="360" w:lineRule="auto"/>
-        <w:outlineLvl w:val="0"/>
-        <w:rPr>
-          <w:rFonts w:ascii="Times New Roman" w:eastAsia="Times New Roman" w:hAnsi="Times New Roman" w:cs="Times New Roman"/>
-          <w:b/>
-          <w:bCs/>
-          <w:color w:val="0F4761"/>
-          <w:sz w:val="40"/>
-          <w:szCs w:val="40"/>
-        </w:rPr>
-      </w:pPr>
-    </w:p>
-    <w:p>
-      <w:pPr>
-        <w:spacing w:before="360" w:after="80" w:line="360" w:lineRule="auto"/>
-        <w:outlineLvl w:val="0"/>
-        <w:rPr>
-          <w:rFonts w:ascii="Times New Roman" w:eastAsia="Times New Roman" w:hAnsi="Times New Roman" w:cs="Times New Roman"/>
-          <w:b/>
-          <w:bCs/>
-          <w:color w:val="0F4761"/>
-          <w:sz w:val="40"/>
-          <w:szCs w:val="40"/>
-        </w:rPr>
-      </w:pPr>
-    </w:p>
-    <w:p>
-      <w:pPr>
-        <w:spacing w:before="360" w:after="80" w:line="360" w:lineRule="auto"/>
-        <w:outlineLvl w:val="0"/>
-        <w:rPr>
-          <w:rFonts w:ascii="Times New Roman" w:eastAsia="Times New Roman" w:hAnsi="Times New Roman" w:cs="Times New Roman"/>
-          <w:b/>
-          <w:bCs/>
-          <w:color w:val="0F4761"/>
-          <w:sz w:val="40"/>
-          <w:szCs w:val="40"/>
-        </w:rPr>
-      </w:pPr>
-      <w:r>
-        <w:rPr>
-          <w:rFonts w:ascii="Times New Roman" w:eastAsia="Times New Roman" w:hAnsi="Times New Roman" w:cs="Times New Roman"/>
-          <w:b/>
-          <w:bCs/>
-          <w:color w:val="0F4761"/>
-          <w:sz w:val="40"/>
-          <w:szCs w:val="40"/>
-        </w:rPr>
-        <w:lastRenderedPageBreak/>
         <w:t>Test cases</w:t>
       </w:r>
     </w:p>
@@ -2518,13 +1896,35 @@
                 <w:b/>
                 <w:bCs/>
               </w:rPr>
-              <w:t>Title:</w:t>
-            </w:r>
-            <w:r>
-              <w:rPr>
-                <w:rFonts w:ascii="Times New Roman" w:eastAsia="Aptos" w:hAnsi="Times New Roman" w:cs="Times New Roman"/>
-              </w:rPr>
-              <w:t xml:space="preserve"> Global Data Filtering</w:t>
+              <w:t>Title</w:t>
+            </w:r>
+            <w:proofErr w:type="gramStart"/>
+            <w:r>
+              <w:rPr>
+                <w:rFonts w:ascii="Times New Roman" w:eastAsia="Aptos" w:hAnsi="Times New Roman" w:cs="Times New Roman"/>
+                <w:b/>
+                <w:bCs/>
+              </w:rPr>
+              <w:t>:</w:t>
+            </w:r>
+            <w:r>
+              <w:rPr>
+                <w:rFonts w:ascii="Times New Roman" w:eastAsia="Aptos" w:hAnsi="Times New Roman" w:cs="Times New Roman"/>
+              </w:rPr>
+              <w:t xml:space="preserve"> </w:t>
+            </w:r>
+            <w:r>
+              <w:rPr>
+                <w:rFonts w:ascii="Times New Roman" w:hAnsi="Times New Roman" w:cs="Times New Roman"/>
+              </w:rPr>
+              <w:t>:</w:t>
+            </w:r>
+            <w:proofErr w:type="gramEnd"/>
+            <w:r>
+              <w:rPr>
+                <w:rFonts w:ascii="Times New Roman" w:hAnsi="Times New Roman" w:cs="Times New Roman"/>
+              </w:rPr>
+              <w:t xml:space="preserve"> Global year filter functionality</w:t>
             </w:r>
           </w:p>
         </w:tc>
@@ -2553,9 +1953,9 @@
             </w:r>
             <w:r>
               <w:rPr>
-                <w:rFonts w:ascii="Times New Roman" w:eastAsia="Aptos" w:hAnsi="Times New Roman" w:cs="Times New Roman"/>
-              </w:rPr>
-              <w:t>Global Data Filtering</w:t>
+                <w:rFonts w:ascii="Times New Roman" w:hAnsi="Times New Roman" w:cs="Times New Roman"/>
+              </w:rPr>
+              <w:t>ear range filtering validation</w:t>
             </w:r>
           </w:p>
         </w:tc>
@@ -2726,39 +2126,91 @@
           <w:p>
             <w:pPr>
               <w:spacing w:line="360" w:lineRule="auto"/>
-              <w:jc w:val="left"/>
-              <w:rPr>
-                <w:rFonts w:ascii="Times New Roman" w:eastAsia="Aptos" w:hAnsi="Times New Roman" w:cs="Times New Roman"/>
-              </w:rPr>
-            </w:pPr>
-            <w:r>
-              <w:rPr>
-                <w:rFonts w:ascii="Times New Roman" w:eastAsia="Aptos" w:hAnsi="Times New Roman" w:cs="Times New Roman"/>
-              </w:rPr>
-              <w:t>Cleaned dataset must be loaded</w:t>
-            </w:r>
-          </w:p>
-          <w:p>
-            <w:pPr>
-              <w:spacing w:line="360" w:lineRule="auto"/>
-              <w:jc w:val="left"/>
-              <w:rPr>
-                <w:rFonts w:ascii="Times New Roman" w:eastAsia="Aptos" w:hAnsi="Times New Roman" w:cs="Times New Roman"/>
-              </w:rPr>
-            </w:pPr>
+              <w:rPr>
+                <w:rFonts w:ascii="Times New Roman" w:hAnsi="Times New Roman" w:cs="Times New Roman"/>
+              </w:rPr>
+            </w:pPr>
+            <w:r>
+              <w:rPr>
+                <w:rFonts w:ascii="Times New Roman" w:hAnsi="Times New Roman" w:cs="Times New Roman"/>
+              </w:rPr>
+              <w:t xml:space="preserve">cleaned_data.csv must be loaded </w:t>
+            </w:r>
+          </w:p>
+          <w:p>
+            <w:pPr>
+              <w:spacing w:line="360" w:lineRule="auto"/>
+              <w:rPr>
+                <w:rFonts w:ascii="Times New Roman" w:hAnsi="Times New Roman" w:cs="Times New Roman"/>
+              </w:rPr>
+            </w:pPr>
+            <w:r>
+              <w:rPr>
+                <w:rFonts w:ascii="Times New Roman" w:hAnsi="Times New Roman" w:cs="Times New Roman"/>
+              </w:rPr>
+              <w:t xml:space="preserve">Python environment must have pandas, </w:t>
+            </w:r>
             <w:proofErr w:type="spellStart"/>
             <w:r>
               <w:rPr>
-                <w:rFonts w:ascii="Times New Roman" w:eastAsia="Aptos" w:hAnsi="Times New Roman" w:cs="Times New Roman"/>
+                <w:rFonts w:ascii="Times New Roman" w:hAnsi="Times New Roman" w:cs="Times New Roman"/>
+              </w:rPr>
+              <w:t>plotly</w:t>
+            </w:r>
+            <w:proofErr w:type="spellEnd"/>
+            <w:r>
+              <w:rPr>
+                <w:rFonts w:ascii="Times New Roman" w:hAnsi="Times New Roman" w:cs="Times New Roman"/>
+              </w:rPr>
+              <w:t xml:space="preserve"> and </w:t>
+            </w:r>
+            <w:proofErr w:type="spellStart"/>
+            <w:r>
+              <w:rPr>
+                <w:rFonts w:ascii="Times New Roman" w:hAnsi="Times New Roman" w:cs="Times New Roman"/>
+              </w:rPr>
+              <w:t>streamlit</w:t>
+            </w:r>
+            <w:proofErr w:type="spellEnd"/>
+            <w:r>
+              <w:rPr>
+                <w:rFonts w:ascii="Times New Roman" w:hAnsi="Times New Roman" w:cs="Times New Roman"/>
+              </w:rPr>
+              <w:t xml:space="preserve"> </w:t>
+            </w:r>
+            <w:r>
+              <w:rPr>
+                <w:rFonts w:ascii="Times New Roman" w:hAnsi="Times New Roman" w:cs="Times New Roman"/>
+              </w:rPr>
+              <w:t>libraries</w:t>
+            </w:r>
+            <w:r>
+              <w:rPr>
+                <w:rFonts w:ascii="Times New Roman" w:hAnsi="Times New Roman" w:cs="Times New Roman"/>
+              </w:rPr>
+              <w:t xml:space="preserve"> installed </w:t>
+            </w:r>
+          </w:p>
+          <w:p>
+            <w:pPr>
+              <w:spacing w:line="360" w:lineRule="auto"/>
+              <w:rPr>
+                <w:rFonts w:ascii="Times New Roman" w:hAnsi="Times New Roman" w:cs="Times New Roman"/>
+              </w:rPr>
+            </w:pPr>
+            <w:proofErr w:type="spellStart"/>
+            <w:r>
+              <w:rPr>
+                <w:rFonts w:ascii="Times New Roman" w:hAnsi="Times New Roman" w:cs="Times New Roman"/>
               </w:rPr>
               <w:t>Streamlit</w:t>
             </w:r>
             <w:proofErr w:type="spellEnd"/>
             <w:r>
               <w:rPr>
-                <w:rFonts w:ascii="Times New Roman" w:eastAsia="Aptos" w:hAnsi="Times New Roman" w:cs="Times New Roman"/>
-              </w:rPr>
-              <w:t xml:space="preserve"> sidebar must be functional</w:t>
+                <w:rFonts w:ascii="Times New Roman" w:hAnsi="Times New Roman" w:cs="Times New Roman"/>
+              </w:rPr>
+              <w:t xml:space="preserve"> sidebar must be functional </w:t>
             </w:r>
           </w:p>
         </w:tc>
@@ -2946,7 +2398,13 @@
               <w:rPr>
                 <w:rFonts w:ascii="Times New Roman" w:eastAsia="Aptos" w:hAnsi="Times New Roman" w:cs="Times New Roman"/>
               </w:rPr>
-              <w:t xml:space="preserve"> Categorical Filtering</w:t>
+              <w:t xml:space="preserve"> </w:t>
+            </w:r>
+            <w:r>
+              <w:rPr>
+                <w:rFonts w:ascii="Times New Roman" w:hAnsi="Times New Roman" w:cs="Times New Roman"/>
+              </w:rPr>
+              <w:t>Hazard type filter functionality</w:t>
             </w:r>
           </w:p>
         </w:tc>
@@ -2975,9 +2433,9 @@
             </w:r>
             <w:r>
               <w:rPr>
-                <w:rFonts w:ascii="Times New Roman" w:eastAsia="Aptos" w:hAnsi="Times New Roman" w:cs="Times New Roman"/>
-              </w:rPr>
-              <w:t>Hazard Type filtering</w:t>
+                <w:rFonts w:ascii="Times New Roman" w:hAnsi="Times New Roman" w:cs="Times New Roman"/>
+              </w:rPr>
+              <w:t>Single hazard selection validation</w:t>
             </w:r>
           </w:p>
         </w:tc>
@@ -3163,39 +2621,92 @@
           <w:p>
             <w:pPr>
               <w:spacing w:line="360" w:lineRule="auto"/>
-              <w:jc w:val="left"/>
-              <w:rPr>
-                <w:rFonts w:ascii="Times New Roman" w:eastAsia="Aptos" w:hAnsi="Times New Roman" w:cs="Times New Roman"/>
-              </w:rPr>
-            </w:pPr>
-            <w:r>
-              <w:rPr>
-                <w:rFonts w:ascii="Times New Roman" w:eastAsia="Aptos" w:hAnsi="Times New Roman" w:cs="Times New Roman"/>
-              </w:rPr>
-              <w:t>Cleaned dataset must be loaded</w:t>
-            </w:r>
-          </w:p>
-          <w:p>
-            <w:pPr>
-              <w:spacing w:line="360" w:lineRule="auto"/>
-              <w:jc w:val="left"/>
-              <w:rPr>
-                <w:rFonts w:ascii="Times New Roman" w:eastAsia="Aptos" w:hAnsi="Times New Roman" w:cs="Times New Roman"/>
-              </w:rPr>
-            </w:pPr>
+              <w:rPr>
+                <w:rFonts w:ascii="Times New Roman" w:hAnsi="Times New Roman" w:cs="Times New Roman"/>
+              </w:rPr>
+            </w:pPr>
+            <w:r>
+              <w:rPr>
+                <w:rFonts w:ascii="Times New Roman" w:hAnsi="Times New Roman" w:cs="Times New Roman"/>
+              </w:rPr>
+              <w:t xml:space="preserve">cleaned_data.csv must be loaded </w:t>
+            </w:r>
+          </w:p>
+          <w:p>
+            <w:pPr>
+              <w:spacing w:line="360" w:lineRule="auto"/>
+              <w:rPr>
+                <w:rFonts w:ascii="Times New Roman" w:hAnsi="Times New Roman" w:cs="Times New Roman"/>
+              </w:rPr>
+            </w:pPr>
+            <w:r>
+              <w:rPr>
+                <w:rFonts w:ascii="Times New Roman" w:hAnsi="Times New Roman" w:cs="Times New Roman"/>
+              </w:rPr>
+              <w:lastRenderedPageBreak/>
+              <w:t xml:space="preserve">Python environment must have pandas, </w:t>
+            </w:r>
             <w:proofErr w:type="spellStart"/>
             <w:r>
               <w:rPr>
-                <w:rFonts w:ascii="Times New Roman" w:eastAsia="Aptos" w:hAnsi="Times New Roman" w:cs="Times New Roman"/>
+                <w:rFonts w:ascii="Times New Roman" w:hAnsi="Times New Roman" w:cs="Times New Roman"/>
+              </w:rPr>
+              <w:t>plotly</w:t>
+            </w:r>
+            <w:proofErr w:type="spellEnd"/>
+            <w:r>
+              <w:rPr>
+                <w:rFonts w:ascii="Times New Roman" w:hAnsi="Times New Roman" w:cs="Times New Roman"/>
+              </w:rPr>
+              <w:t xml:space="preserve"> and </w:t>
+            </w:r>
+            <w:proofErr w:type="spellStart"/>
+            <w:r>
+              <w:rPr>
+                <w:rFonts w:ascii="Times New Roman" w:hAnsi="Times New Roman" w:cs="Times New Roman"/>
+              </w:rPr>
+              <w:t>streamlit</w:t>
+            </w:r>
+            <w:proofErr w:type="spellEnd"/>
+            <w:r>
+              <w:rPr>
+                <w:rFonts w:ascii="Times New Roman" w:hAnsi="Times New Roman" w:cs="Times New Roman"/>
+              </w:rPr>
+              <w:t xml:space="preserve"> </w:t>
+            </w:r>
+            <w:r>
+              <w:rPr>
+                <w:rFonts w:ascii="Times New Roman" w:hAnsi="Times New Roman" w:cs="Times New Roman"/>
+              </w:rPr>
+              <w:t>libraries</w:t>
+            </w:r>
+            <w:r>
+              <w:rPr>
+                <w:rFonts w:ascii="Times New Roman" w:hAnsi="Times New Roman" w:cs="Times New Roman"/>
+              </w:rPr>
+              <w:t xml:space="preserve"> installed </w:t>
+            </w:r>
+          </w:p>
+          <w:p>
+            <w:pPr>
+              <w:spacing w:line="360" w:lineRule="auto"/>
+              <w:rPr>
+                <w:rFonts w:ascii="Times New Roman" w:hAnsi="Times New Roman" w:cs="Times New Roman"/>
+              </w:rPr>
+            </w:pPr>
+            <w:proofErr w:type="spellStart"/>
+            <w:r>
+              <w:rPr>
+                <w:rFonts w:ascii="Times New Roman" w:hAnsi="Times New Roman" w:cs="Times New Roman"/>
               </w:rPr>
               <w:t>Streamlit</w:t>
             </w:r>
             <w:proofErr w:type="spellEnd"/>
             <w:r>
               <w:rPr>
-                <w:rFonts w:ascii="Times New Roman" w:eastAsia="Aptos" w:hAnsi="Times New Roman" w:cs="Times New Roman"/>
-              </w:rPr>
-              <w:t xml:space="preserve"> sidebar must be functional</w:t>
+                <w:rFonts w:ascii="Times New Roman" w:hAnsi="Times New Roman" w:cs="Times New Roman"/>
+              </w:rPr>
+              <w:t xml:space="preserve"> sidebar must be functional </w:t>
             </w:r>
           </w:p>
         </w:tc>
@@ -3223,6 +2734,7 @@
                 <w:b/>
                 <w:bCs/>
               </w:rPr>
+              <w:lastRenderedPageBreak/>
               <w:t>Expected result</w:t>
             </w:r>
           </w:p>
@@ -3254,30 +2766,15 @@
               <w:jc w:val="left"/>
               <w:rPr>
                 <w:rFonts w:ascii="Times New Roman" w:eastAsia="Aptos" w:hAnsi="Times New Roman" w:cs="Times New Roman"/>
-              </w:rPr>
-            </w:pPr>
-            <w:r>
-              <w:rPr>
-                <w:rFonts w:ascii="Times New Roman" w:eastAsia="Aptos" w:hAnsi="Times New Roman" w:cs="Times New Roman"/>
-              </w:rPr>
-              <w:t>The line for top 5 hazard types and the bar for displacements by hazard types should display only one legend for flood.</w:t>
-            </w:r>
-          </w:p>
-          <w:p>
-            <w:pPr>
-              <w:spacing w:line="360" w:lineRule="auto"/>
-              <w:jc w:val="left"/>
-              <w:rPr>
-                <w:rFonts w:ascii="Times New Roman" w:eastAsia="Aptos" w:hAnsi="Times New Roman" w:cs="Times New Roman"/>
-                <w:b/>
-                <w:bCs/>
-              </w:rPr>
-            </w:pPr>
-            <w:r>
-              <w:rPr>
-                <w:rFonts w:ascii="Times New Roman" w:eastAsia="Aptos" w:hAnsi="Times New Roman" w:cs="Times New Roman"/>
-              </w:rPr>
-              <w:t>No other hazard types must be visible in the legend.</w:t>
+                <w:b/>
+                <w:bCs/>
+              </w:rPr>
+            </w:pPr>
+            <w:r>
+              <w:rPr>
+                <w:rFonts w:ascii="Times New Roman" w:hAnsi="Times New Roman" w:cs="Times New Roman"/>
+              </w:rPr>
+              <w:t>No other hazard types but flood must be visible in the legend of trend of top 5 hazard types and displacements by hazard type bar chart.</w:t>
             </w:r>
           </w:p>
         </w:tc>
@@ -3327,7 +2824,6 @@
                 <w:b/>
                 <w:bCs/>
               </w:rPr>
-              <w:lastRenderedPageBreak/>
               <w:t>#03</w:t>
             </w:r>
           </w:p>
@@ -3384,7 +2880,13 @@
               <w:rPr>
                 <w:rFonts w:ascii="Times New Roman" w:eastAsia="Aptos" w:hAnsi="Times New Roman" w:cs="Times New Roman"/>
               </w:rPr>
-              <w:t xml:space="preserve"> top 5 Hazard trend logic</w:t>
+              <w:t xml:space="preserve"> </w:t>
+            </w:r>
+            <w:r>
+              <w:rPr>
+                <w:rFonts w:ascii="Times New Roman" w:hAnsi="Times New Roman" w:cs="Times New Roman"/>
+              </w:rPr>
+              <w:t>top 5 Hazard trend logic</w:t>
             </w:r>
           </w:p>
         </w:tc>
@@ -3413,9 +2915,9 @@
             </w:r>
             <w:r>
               <w:rPr>
-                <w:rFonts w:ascii="Times New Roman" w:eastAsia="Aptos" w:hAnsi="Times New Roman" w:cs="Times New Roman"/>
-              </w:rPr>
-              <w:t>Top 5 Hazard trend analysis</w:t>
+                <w:rFonts w:ascii="Times New Roman" w:hAnsi="Times New Roman" w:cs="Times New Roman"/>
+              </w:rPr>
+              <w:t>Top 5 Hazard display validation</w:t>
             </w:r>
           </w:p>
         </w:tc>
@@ -3586,28 +3088,27 @@
           <w:p>
             <w:pPr>
               <w:spacing w:line="360" w:lineRule="auto"/>
-              <w:jc w:val="left"/>
-              <w:rPr>
-                <w:rFonts w:ascii="Times New Roman" w:eastAsia="Aptos" w:hAnsi="Times New Roman" w:cs="Times New Roman"/>
-              </w:rPr>
-            </w:pPr>
-            <w:r>
-              <w:rPr>
-                <w:rFonts w:ascii="Times New Roman" w:eastAsia="Aptos" w:hAnsi="Times New Roman" w:cs="Times New Roman"/>
+              <w:rPr>
+                <w:rFonts w:ascii="Times New Roman" w:hAnsi="Times New Roman" w:cs="Times New Roman"/>
+              </w:rPr>
+            </w:pPr>
+            <w:r>
+              <w:rPr>
+                <w:rFonts w:ascii="Times New Roman" w:hAnsi="Times New Roman" w:cs="Times New Roman"/>
               </w:rPr>
               <w:t xml:space="preserve">The data aggregation logic must correctly use </w:t>
             </w:r>
             <w:proofErr w:type="gramStart"/>
             <w:r>
               <w:rPr>
-                <w:rFonts w:ascii="Times New Roman" w:eastAsia="Aptos" w:hAnsi="Times New Roman" w:cs="Times New Roman"/>
+                <w:rFonts w:ascii="Times New Roman" w:hAnsi="Times New Roman" w:cs="Times New Roman"/>
               </w:rPr>
               <w:t>‘.</w:t>
             </w:r>
             <w:proofErr w:type="spellStart"/>
             <w:r>
               <w:rPr>
-                <w:rFonts w:ascii="Times New Roman" w:eastAsia="Aptos" w:hAnsi="Times New Roman" w:cs="Times New Roman"/>
+                <w:rFonts w:ascii="Times New Roman" w:hAnsi="Times New Roman" w:cs="Times New Roman"/>
               </w:rPr>
               <w:t>nlargest</w:t>
             </w:r>
@@ -3615,9 +3116,85 @@
             <w:proofErr w:type="gramEnd"/>
             <w:r>
               <w:rPr>
-                <w:rFonts w:ascii="Times New Roman" w:eastAsia="Aptos" w:hAnsi="Times New Roman" w:cs="Times New Roman"/>
-              </w:rPr>
-              <w:t>(5)’ on the filtered data frame.</w:t>
+                <w:rFonts w:ascii="Times New Roman" w:hAnsi="Times New Roman" w:cs="Times New Roman"/>
+              </w:rPr>
+              <w:t xml:space="preserve">(5)’ on the filtered data frame. </w:t>
+            </w:r>
+          </w:p>
+          <w:p>
+            <w:pPr>
+              <w:spacing w:line="360" w:lineRule="auto"/>
+              <w:rPr>
+                <w:rFonts w:ascii="Times New Roman" w:hAnsi="Times New Roman" w:cs="Times New Roman"/>
+              </w:rPr>
+            </w:pPr>
+            <w:r>
+              <w:rPr>
+                <w:rFonts w:ascii="Times New Roman" w:hAnsi="Times New Roman" w:cs="Times New Roman"/>
+              </w:rPr>
+              <w:t xml:space="preserve">python environment must have pandas, </w:t>
+            </w:r>
+            <w:proofErr w:type="spellStart"/>
+            <w:r>
+              <w:rPr>
+                <w:rFonts w:ascii="Times New Roman" w:hAnsi="Times New Roman" w:cs="Times New Roman"/>
+              </w:rPr>
+              <w:t>plotly</w:t>
+            </w:r>
+            <w:proofErr w:type="spellEnd"/>
+            <w:r>
+              <w:rPr>
+                <w:rFonts w:ascii="Times New Roman" w:hAnsi="Times New Roman" w:cs="Times New Roman"/>
+              </w:rPr>
+              <w:t xml:space="preserve"> and </w:t>
+            </w:r>
+            <w:proofErr w:type="spellStart"/>
+            <w:r>
+              <w:rPr>
+                <w:rFonts w:ascii="Times New Roman" w:hAnsi="Times New Roman" w:cs="Times New Roman"/>
+              </w:rPr>
+              <w:t>streamlit</w:t>
+            </w:r>
+            <w:proofErr w:type="spellEnd"/>
+            <w:r>
+              <w:rPr>
+                <w:rFonts w:ascii="Times New Roman" w:hAnsi="Times New Roman" w:cs="Times New Roman"/>
+              </w:rPr>
+              <w:t xml:space="preserve"> </w:t>
+            </w:r>
+            <w:r>
+              <w:rPr>
+                <w:rFonts w:ascii="Times New Roman" w:hAnsi="Times New Roman" w:cs="Times New Roman"/>
+              </w:rPr>
+              <w:t>libraries</w:t>
+            </w:r>
+            <w:r>
+              <w:rPr>
+                <w:rFonts w:ascii="Times New Roman" w:hAnsi="Times New Roman" w:cs="Times New Roman"/>
+              </w:rPr>
+              <w:t xml:space="preserve"> installed </w:t>
+            </w:r>
+          </w:p>
+          <w:p>
+            <w:pPr>
+              <w:spacing w:line="360" w:lineRule="auto"/>
+              <w:rPr>
+                <w:rFonts w:ascii="Times New Roman" w:hAnsi="Times New Roman" w:cs="Times New Roman"/>
+              </w:rPr>
+            </w:pPr>
+            <w:proofErr w:type="spellStart"/>
+            <w:r>
+              <w:rPr>
+                <w:rFonts w:ascii="Times New Roman" w:hAnsi="Times New Roman" w:cs="Times New Roman"/>
+              </w:rPr>
+              <w:t>Streamlit</w:t>
+            </w:r>
+            <w:proofErr w:type="spellEnd"/>
+            <w:r>
+              <w:rPr>
+                <w:rFonts w:ascii="Times New Roman" w:hAnsi="Times New Roman" w:cs="Times New Roman"/>
+              </w:rPr>
+              <w:t xml:space="preserve"> sidebar must be functional </w:t>
             </w:r>
           </w:p>
         </w:tc>
@@ -3805,7 +3382,13 @@
               <w:rPr>
                 <w:rFonts w:ascii="Times New Roman" w:eastAsia="Aptos" w:hAnsi="Times New Roman" w:cs="Times New Roman"/>
               </w:rPr>
-              <w:t xml:space="preserve"> Geospatial Map</w:t>
+              <w:t xml:space="preserve"> </w:t>
+            </w:r>
+            <w:r>
+              <w:rPr>
+                <w:rFonts w:ascii="Times New Roman" w:hAnsi="Times New Roman" w:cs="Times New Roman"/>
+              </w:rPr>
+              <w:t>Geospatial map interaction</w:t>
             </w:r>
           </w:p>
         </w:tc>
@@ -3834,9 +3417,9 @@
             </w:r>
             <w:r>
               <w:rPr>
-                <w:rFonts w:ascii="Times New Roman" w:eastAsia="Aptos" w:hAnsi="Times New Roman" w:cs="Times New Roman"/>
-              </w:rPr>
-              <w:t>Geospatial Map Hover</w:t>
+                <w:rFonts w:ascii="Times New Roman" w:hAnsi="Times New Roman" w:cs="Times New Roman"/>
+              </w:rPr>
+              <w:t>Map hover information validation</w:t>
             </w:r>
           </w:p>
         </w:tc>
@@ -3927,31 +3510,43 @@
           <w:p>
             <w:pPr>
               <w:spacing w:line="360" w:lineRule="auto"/>
-              <w:jc w:val="left"/>
-              <w:rPr>
-                <w:rFonts w:ascii="Times New Roman" w:eastAsia="Aptos" w:hAnsi="Times New Roman" w:cs="Times New Roman"/>
-              </w:rPr>
-            </w:pPr>
-            <w:r>
-              <w:rPr>
-                <w:rFonts w:ascii="Times New Roman" w:eastAsia="Aptos" w:hAnsi="Times New Roman" w:cs="Times New Roman"/>
-              </w:rPr>
-              <w:t>Hover over any country on the map</w:t>
-            </w:r>
-          </w:p>
-          <w:p>
-            <w:pPr>
-              <w:spacing w:line="360" w:lineRule="auto"/>
-              <w:jc w:val="left"/>
-              <w:rPr>
-                <w:rFonts w:ascii="Times New Roman" w:eastAsia="Aptos" w:hAnsi="Times New Roman" w:cs="Times New Roman"/>
-              </w:rPr>
-            </w:pPr>
-            <w:r>
-              <w:rPr>
-                <w:rFonts w:ascii="Times New Roman" w:eastAsia="Aptos" w:hAnsi="Times New Roman" w:cs="Times New Roman"/>
-              </w:rPr>
-              <w:t>Observe tooltip information</w:t>
+              <w:rPr>
+                <w:rFonts w:ascii="Times New Roman" w:hAnsi="Times New Roman" w:cs="Times New Roman"/>
+              </w:rPr>
+            </w:pPr>
+            <w:r>
+              <w:rPr>
+                <w:rFonts w:ascii="Times New Roman" w:hAnsi="Times New Roman" w:cs="Times New Roman"/>
+              </w:rPr>
+              <w:t xml:space="preserve">Navigate to the global map of the dashboard </w:t>
+            </w:r>
+          </w:p>
+          <w:p>
+            <w:pPr>
+              <w:spacing w:line="360" w:lineRule="auto"/>
+              <w:rPr>
+                <w:rFonts w:ascii="Times New Roman" w:hAnsi="Times New Roman" w:cs="Times New Roman"/>
+              </w:rPr>
+            </w:pPr>
+            <w:r>
+              <w:rPr>
+                <w:rFonts w:ascii="Times New Roman" w:hAnsi="Times New Roman" w:cs="Times New Roman"/>
+              </w:rPr>
+              <w:t xml:space="preserve">Hover over any country on the map </w:t>
+            </w:r>
+          </w:p>
+          <w:p>
+            <w:pPr>
+              <w:spacing w:line="360" w:lineRule="auto"/>
+              <w:rPr>
+                <w:rFonts w:ascii="Times New Roman" w:hAnsi="Times New Roman" w:cs="Times New Roman"/>
+              </w:rPr>
+            </w:pPr>
+            <w:r>
+              <w:rPr>
+                <w:rFonts w:ascii="Times New Roman" w:hAnsi="Times New Roman" w:cs="Times New Roman"/>
+              </w:rPr>
+              <w:t xml:space="preserve">Observe tooltip information </w:t>
             </w:r>
           </w:p>
         </w:tc>
@@ -3992,44 +3587,112 @@
           <w:p>
             <w:pPr>
               <w:spacing w:line="360" w:lineRule="auto"/>
-              <w:jc w:val="left"/>
-              <w:rPr>
-                <w:rFonts w:ascii="Times New Roman" w:eastAsia="Aptos" w:hAnsi="Times New Roman" w:cs="Times New Roman"/>
-              </w:rPr>
-            </w:pPr>
-            <w:r>
-              <w:rPr>
-                <w:rFonts w:ascii="Times New Roman" w:eastAsia="Aptos" w:hAnsi="Times New Roman" w:cs="Times New Roman"/>
+              <w:rPr>
+                <w:rFonts w:ascii="Times New Roman" w:hAnsi="Times New Roman" w:cs="Times New Roman"/>
+              </w:rPr>
+            </w:pPr>
+            <w:r>
+              <w:rPr>
+                <w:rFonts w:ascii="Times New Roman" w:hAnsi="Times New Roman" w:cs="Times New Roman"/>
               </w:rPr>
               <w:t xml:space="preserve">The choropleth function must correctly use </w:t>
             </w:r>
             <w:proofErr w:type="gramStart"/>
             <w:r>
               <w:rPr>
-                <w:rFonts w:ascii="Times New Roman" w:eastAsia="Aptos" w:hAnsi="Times New Roman" w:cs="Times New Roman"/>
+                <w:rFonts w:ascii="Times New Roman" w:hAnsi="Times New Roman" w:cs="Times New Roman"/>
               </w:rPr>
               <w:t>‘.</w:t>
             </w:r>
             <w:proofErr w:type="spellStart"/>
             <w:r>
               <w:rPr>
-                <w:rFonts w:ascii="Times New Roman" w:eastAsia="Aptos" w:hAnsi="Times New Roman" w:cs="Times New Roman"/>
+                <w:rFonts w:ascii="Times New Roman" w:hAnsi="Times New Roman" w:cs="Times New Roman"/>
               </w:rPr>
               <w:t>hover</w:t>
             </w:r>
             <w:proofErr w:type="gramEnd"/>
             <w:r>
               <w:rPr>
-                <w:rFonts w:ascii="Times New Roman" w:eastAsia="Aptos" w:hAnsi="Times New Roman" w:cs="Times New Roman"/>
+                <w:rFonts w:ascii="Times New Roman" w:hAnsi="Times New Roman" w:cs="Times New Roman"/>
               </w:rPr>
               <w:t>_name</w:t>
             </w:r>
             <w:proofErr w:type="spellEnd"/>
             <w:r>
               <w:rPr>
-                <w:rFonts w:ascii="Times New Roman" w:eastAsia="Aptos" w:hAnsi="Times New Roman" w:cs="Times New Roman"/>
-              </w:rPr>
-              <w:t>’ on the filtered data frame.</w:t>
+                <w:rFonts w:ascii="Times New Roman" w:hAnsi="Times New Roman" w:cs="Times New Roman"/>
+              </w:rPr>
+              <w:t xml:space="preserve">’ on the filtered data frame </w:t>
+            </w:r>
+          </w:p>
+          <w:p>
+            <w:pPr>
+              <w:spacing w:line="360" w:lineRule="auto"/>
+              <w:rPr>
+                <w:rFonts w:ascii="Times New Roman" w:hAnsi="Times New Roman" w:cs="Times New Roman"/>
+              </w:rPr>
+            </w:pPr>
+            <w:r>
+              <w:rPr>
+                <w:rFonts w:ascii="Times New Roman" w:hAnsi="Times New Roman" w:cs="Times New Roman"/>
+              </w:rPr>
+              <w:lastRenderedPageBreak/>
+              <w:t xml:space="preserve">cleaned_data.csv must be loaded </w:t>
+            </w:r>
+          </w:p>
+          <w:p>
+            <w:pPr>
+              <w:spacing w:line="360" w:lineRule="auto"/>
+              <w:rPr>
+                <w:rFonts w:ascii="Times New Roman" w:hAnsi="Times New Roman" w:cs="Times New Roman"/>
+              </w:rPr>
+            </w:pPr>
+            <w:r>
+              <w:rPr>
+                <w:rFonts w:ascii="Times New Roman" w:hAnsi="Times New Roman" w:cs="Times New Roman"/>
+              </w:rPr>
+              <w:t xml:space="preserve">Python environment must have pandas, </w:t>
+            </w:r>
+            <w:proofErr w:type="spellStart"/>
+            <w:r>
+              <w:rPr>
+                <w:rFonts w:ascii="Times New Roman" w:hAnsi="Times New Roman" w:cs="Times New Roman"/>
+              </w:rPr>
+              <w:t>plotly</w:t>
+            </w:r>
+            <w:proofErr w:type="spellEnd"/>
+            <w:r>
+              <w:rPr>
+                <w:rFonts w:ascii="Times New Roman" w:hAnsi="Times New Roman" w:cs="Times New Roman"/>
+              </w:rPr>
+              <w:t xml:space="preserve"> and </w:t>
+            </w:r>
+            <w:proofErr w:type="spellStart"/>
+            <w:r>
+              <w:rPr>
+                <w:rFonts w:ascii="Times New Roman" w:hAnsi="Times New Roman" w:cs="Times New Roman"/>
+              </w:rPr>
+              <w:t>streamlit</w:t>
+            </w:r>
+            <w:proofErr w:type="spellEnd"/>
+            <w:r>
+              <w:rPr>
+                <w:rFonts w:ascii="Times New Roman" w:hAnsi="Times New Roman" w:cs="Times New Roman"/>
+              </w:rPr>
+              <w:t xml:space="preserve"> </w:t>
+            </w:r>
+            <w:r>
+              <w:rPr>
+                <w:rFonts w:ascii="Times New Roman" w:hAnsi="Times New Roman" w:cs="Times New Roman"/>
+              </w:rPr>
+              <w:t>libraries</w:t>
+            </w:r>
+            <w:r>
+              <w:rPr>
+                <w:rFonts w:ascii="Times New Roman" w:hAnsi="Times New Roman" w:cs="Times New Roman"/>
+              </w:rPr>
+              <w:t xml:space="preserve"> installed </w:t>
             </w:r>
           </w:p>
         </w:tc>
@@ -4057,6 +3720,7 @@
                 <w:b/>
                 <w:bCs/>
               </w:rPr>
+              <w:lastRenderedPageBreak/>
               <w:t>Expected result</w:t>
             </w:r>
           </w:p>
@@ -4185,7 +3849,13 @@
               <w:rPr>
                 <w:rFonts w:ascii="Times New Roman" w:eastAsia="Aptos" w:hAnsi="Times New Roman" w:cs="Times New Roman"/>
               </w:rPr>
-              <w:t xml:space="preserve"> KPI</w:t>
+              <w:t xml:space="preserve"> </w:t>
+            </w:r>
+            <w:r>
+              <w:rPr>
+                <w:rFonts w:ascii="Times New Roman" w:hAnsi="Times New Roman" w:cs="Times New Roman"/>
+              </w:rPr>
+              <w:t>KPI accuracy validation</w:t>
             </w:r>
           </w:p>
         </w:tc>
@@ -4214,9 +3884,9 @@
             </w:r>
             <w:r>
               <w:rPr>
-                <w:rFonts w:ascii="Times New Roman" w:eastAsia="Aptos" w:hAnsi="Times New Roman" w:cs="Times New Roman"/>
-              </w:rPr>
-              <w:t>KPI Accuracy</w:t>
+                <w:rFonts w:ascii="Times New Roman" w:hAnsi="Times New Roman" w:cs="Times New Roman"/>
+              </w:rPr>
+              <w:t>KPI and chart consistency check</w:t>
             </w:r>
           </w:p>
         </w:tc>
@@ -4307,6 +3977,34 @@
           <w:p>
             <w:pPr>
               <w:spacing w:line="360" w:lineRule="auto"/>
+              <w:rPr>
+                <w:rFonts w:ascii="Times New Roman" w:hAnsi="Times New Roman" w:cs="Times New Roman"/>
+              </w:rPr>
+            </w:pPr>
+            <w:r>
+              <w:rPr>
+                <w:rFonts w:ascii="Times New Roman" w:hAnsi="Times New Roman" w:cs="Times New Roman"/>
+              </w:rPr>
+              <w:t xml:space="preserve">Select a specific year range </w:t>
+            </w:r>
+          </w:p>
+          <w:p>
+            <w:pPr>
+              <w:spacing w:line="360" w:lineRule="auto"/>
+              <w:rPr>
+                <w:rFonts w:ascii="Times New Roman" w:hAnsi="Times New Roman" w:cs="Times New Roman"/>
+              </w:rPr>
+            </w:pPr>
+            <w:r>
+              <w:rPr>
+                <w:rFonts w:ascii="Times New Roman" w:hAnsi="Times New Roman" w:cs="Times New Roman"/>
+              </w:rPr>
+              <w:t xml:space="preserve">Select all hazard types </w:t>
+            </w:r>
+          </w:p>
+          <w:p>
+            <w:pPr>
+              <w:spacing w:line="360" w:lineRule="auto"/>
               <w:jc w:val="left"/>
               <w:rPr>
                 <w:rFonts w:ascii="Times New Roman" w:eastAsia="Aptos" w:hAnsi="Times New Roman" w:cs="Times New Roman"/>
@@ -4314,24 +4012,9 @@
             </w:pPr>
             <w:r>
               <w:rPr>
-                <w:rFonts w:ascii="Times New Roman" w:eastAsia="Aptos" w:hAnsi="Times New Roman" w:cs="Times New Roman"/>
-              </w:rPr>
-              <w:t>Select a specific year range and select all hazard types</w:t>
-            </w:r>
-          </w:p>
-          <w:p>
-            <w:pPr>
-              <w:spacing w:line="360" w:lineRule="auto"/>
-              <w:jc w:val="left"/>
-              <w:rPr>
-                <w:rFonts w:ascii="Times New Roman" w:eastAsia="Aptos" w:hAnsi="Times New Roman" w:cs="Times New Roman"/>
-              </w:rPr>
-            </w:pPr>
-            <w:r>
-              <w:rPr>
-                <w:rFonts w:ascii="Times New Roman" w:eastAsia="Aptos" w:hAnsi="Times New Roman" w:cs="Times New Roman"/>
-              </w:rPr>
-              <w:t>Observe the name</w:t>
+                <w:rFonts w:ascii="Times New Roman" w:hAnsi="Times New Roman" w:cs="Times New Roman"/>
+              </w:rPr>
+              <w:t>Compare the KPI value and most affected country with the top 10 bar chart</w:t>
             </w:r>
           </w:p>
         </w:tc>
@@ -4372,37 +4055,90 @@
           <w:p>
             <w:pPr>
               <w:spacing w:line="360" w:lineRule="auto"/>
+              <w:rPr>
+                <w:rFonts w:ascii="Times New Roman" w:hAnsi="Times New Roman" w:cs="Times New Roman"/>
+              </w:rPr>
+            </w:pPr>
+            <w:r>
+              <w:rPr>
+                <w:rFonts w:ascii="Times New Roman" w:hAnsi="Times New Roman" w:cs="Times New Roman"/>
+              </w:rPr>
+              <w:t xml:space="preserve">cleaned_data.csv must be loaded </w:t>
+            </w:r>
+          </w:p>
+          <w:p>
+            <w:pPr>
+              <w:spacing w:line="360" w:lineRule="auto"/>
+              <w:rPr>
+                <w:rFonts w:ascii="Times New Roman" w:hAnsi="Times New Roman" w:cs="Times New Roman"/>
+              </w:rPr>
+            </w:pPr>
+            <w:r>
+              <w:rPr>
+                <w:rFonts w:ascii="Times New Roman" w:hAnsi="Times New Roman" w:cs="Times New Roman"/>
+              </w:rPr>
+              <w:t xml:space="preserve">python environment must have pandas, </w:t>
+            </w:r>
+            <w:proofErr w:type="spellStart"/>
+            <w:r>
+              <w:rPr>
+                <w:rFonts w:ascii="Times New Roman" w:hAnsi="Times New Roman" w:cs="Times New Roman"/>
+              </w:rPr>
+              <w:t>plotly</w:t>
+            </w:r>
+            <w:proofErr w:type="spellEnd"/>
+            <w:r>
+              <w:rPr>
+                <w:rFonts w:ascii="Times New Roman" w:hAnsi="Times New Roman" w:cs="Times New Roman"/>
+              </w:rPr>
+              <w:t xml:space="preserve"> and </w:t>
+            </w:r>
+            <w:proofErr w:type="spellStart"/>
+            <w:r>
+              <w:rPr>
+                <w:rFonts w:ascii="Times New Roman" w:hAnsi="Times New Roman" w:cs="Times New Roman"/>
+              </w:rPr>
+              <w:t>streamlit</w:t>
+            </w:r>
+            <w:proofErr w:type="spellEnd"/>
+            <w:r>
+              <w:rPr>
+                <w:rFonts w:ascii="Times New Roman" w:hAnsi="Times New Roman" w:cs="Times New Roman"/>
+              </w:rPr>
+              <w:t xml:space="preserve"> </w:t>
+            </w:r>
+            <w:r>
+              <w:rPr>
+                <w:rFonts w:ascii="Times New Roman" w:hAnsi="Times New Roman" w:cs="Times New Roman"/>
+              </w:rPr>
+              <w:t>libraries</w:t>
+            </w:r>
+            <w:r>
+              <w:rPr>
+                <w:rFonts w:ascii="Times New Roman" w:hAnsi="Times New Roman" w:cs="Times New Roman"/>
+              </w:rPr>
+              <w:t xml:space="preserve"> installed </w:t>
+            </w:r>
+          </w:p>
+          <w:p>
+            <w:pPr>
+              <w:spacing w:line="360" w:lineRule="auto"/>
               <w:jc w:val="left"/>
               <w:rPr>
                 <w:rFonts w:ascii="Times New Roman" w:eastAsia="Aptos" w:hAnsi="Times New Roman" w:cs="Times New Roman"/>
               </w:rPr>
             </w:pPr>
-            <w:r>
-              <w:rPr>
-                <w:rFonts w:ascii="Times New Roman" w:eastAsia="Aptos" w:hAnsi="Times New Roman" w:cs="Times New Roman"/>
-              </w:rPr>
-              <w:t>Cleaned dataset must be loaded</w:t>
-            </w:r>
-          </w:p>
-          <w:p>
-            <w:pPr>
-              <w:spacing w:line="360" w:lineRule="auto"/>
-              <w:jc w:val="left"/>
-              <w:rPr>
-                <w:rFonts w:ascii="Times New Roman" w:eastAsia="Aptos" w:hAnsi="Times New Roman" w:cs="Times New Roman"/>
-              </w:rPr>
-            </w:pPr>
             <w:proofErr w:type="spellStart"/>
             <w:r>
               <w:rPr>
-                <w:rFonts w:ascii="Times New Roman" w:eastAsia="Aptos" w:hAnsi="Times New Roman" w:cs="Times New Roman"/>
+                <w:rFonts w:ascii="Times New Roman" w:hAnsi="Times New Roman" w:cs="Times New Roman"/>
               </w:rPr>
               <w:t>Streamlit</w:t>
             </w:r>
             <w:proofErr w:type="spellEnd"/>
             <w:r>
               <w:rPr>
-                <w:rFonts w:ascii="Times New Roman" w:eastAsia="Aptos" w:hAnsi="Times New Roman" w:cs="Times New Roman"/>
+                <w:rFonts w:ascii="Times New Roman" w:hAnsi="Times New Roman" w:cs="Times New Roman"/>
               </w:rPr>
               <w:t xml:space="preserve"> sidebar must be functional</w:t>
             </w:r>
@@ -4492,7 +4228,11 @@
           <w:szCs w:val="40"/>
         </w:rPr>
       </w:pPr>
-      <w:r>
+    </w:p>
+    <w:p>
+      <w:pPr>
+        <w:spacing w:before="360" w:after="80" w:line="360" w:lineRule="auto"/>
+        <w:outlineLvl w:val="0"/>
         <w:rPr>
           <w:rFonts w:ascii="Times New Roman" w:eastAsia="Times New Roman" w:hAnsi="Times New Roman" w:cs="Times New Roman"/>
           <w:b/>
@@ -4501,7 +4241,86 @@
           <w:sz w:val="40"/>
           <w:szCs w:val="40"/>
         </w:rPr>
-        <w:lastRenderedPageBreak/>
+      </w:pPr>
+    </w:p>
+    <w:p>
+      <w:pPr>
+        <w:spacing w:before="360" w:after="80" w:line="360" w:lineRule="auto"/>
+        <w:outlineLvl w:val="0"/>
+        <w:rPr>
+          <w:rFonts w:ascii="Times New Roman" w:eastAsia="Times New Roman" w:hAnsi="Times New Roman" w:cs="Times New Roman"/>
+          <w:b/>
+          <w:bCs/>
+          <w:color w:val="0F4761"/>
+          <w:sz w:val="40"/>
+          <w:szCs w:val="40"/>
+        </w:rPr>
+      </w:pPr>
+    </w:p>
+    <w:p>
+      <w:pPr>
+        <w:spacing w:before="360" w:after="80" w:line="360" w:lineRule="auto"/>
+        <w:outlineLvl w:val="0"/>
+        <w:rPr>
+          <w:rFonts w:ascii="Times New Roman" w:eastAsia="Times New Roman" w:hAnsi="Times New Roman" w:cs="Times New Roman"/>
+          <w:b/>
+          <w:bCs/>
+          <w:color w:val="0F4761"/>
+          <w:sz w:val="40"/>
+          <w:szCs w:val="40"/>
+        </w:rPr>
+      </w:pPr>
+    </w:p>
+    <w:p>
+      <w:pPr>
+        <w:spacing w:before="360" w:after="80" w:line="360" w:lineRule="auto"/>
+        <w:outlineLvl w:val="0"/>
+        <w:rPr>
+          <w:rFonts w:ascii="Times New Roman" w:eastAsia="Times New Roman" w:hAnsi="Times New Roman" w:cs="Times New Roman"/>
+          <w:b/>
+          <w:bCs/>
+          <w:color w:val="0F4761"/>
+          <w:sz w:val="40"/>
+          <w:szCs w:val="40"/>
+        </w:rPr>
+      </w:pPr>
+    </w:p>
+    <w:p>
+      <w:pPr>
+        <w:spacing w:before="360" w:after="80" w:line="360" w:lineRule="auto"/>
+        <w:outlineLvl w:val="0"/>
+        <w:rPr>
+          <w:rFonts w:ascii="Times New Roman" w:eastAsia="Times New Roman" w:hAnsi="Times New Roman" w:cs="Times New Roman"/>
+          <w:b/>
+          <w:bCs/>
+          <w:color w:val="0F4761"/>
+          <w:sz w:val="40"/>
+          <w:szCs w:val="40"/>
+        </w:rPr>
+      </w:pPr>
+    </w:p>
+    <w:p>
+      <w:pPr>
+        <w:spacing w:before="360" w:after="80" w:line="360" w:lineRule="auto"/>
+        <w:outlineLvl w:val="0"/>
+        <w:rPr>
+          <w:rFonts w:ascii="Times New Roman" w:eastAsia="Times New Roman" w:hAnsi="Times New Roman" w:cs="Times New Roman"/>
+          <w:b/>
+          <w:bCs/>
+          <w:color w:val="0F4761"/>
+          <w:sz w:val="40"/>
+          <w:szCs w:val="40"/>
+        </w:rPr>
+      </w:pPr>
+      <w:r>
+        <w:rPr>
+          <w:rFonts w:ascii="Times New Roman" w:eastAsia="Times New Roman" w:hAnsi="Times New Roman" w:cs="Times New Roman"/>
+          <w:b/>
+          <w:bCs/>
+          <w:color w:val="0F4761"/>
+          <w:sz w:val="40"/>
+          <w:szCs w:val="40"/>
+        </w:rPr>
         <w:t>Test log</w:t>
       </w:r>
     </w:p>
@@ -4512,14 +4331,17 @@
         <w:tblLook w:val="04A0" w:firstRow="1" w:lastRow="0" w:firstColumn="1" w:lastColumn="0" w:noHBand="0" w:noVBand="1"/>
       </w:tblPr>
       <w:tblGrid>
-        <w:gridCol w:w="562"/>
+        <w:gridCol w:w="560"/>
         <w:gridCol w:w="1310"/>
-        <w:gridCol w:w="1667"/>
-        <w:gridCol w:w="2944"/>
+        <w:gridCol w:w="1609"/>
+        <w:gridCol w:w="2777"/>
         <w:gridCol w:w="1137"/>
-        <w:gridCol w:w="1396"/>
+        <w:gridCol w:w="1623"/>
       </w:tblGrid>
       <w:tr>
+        <w:trPr>
+          <w:trHeight w:val="497"/>
+        </w:trPr>
         <w:tc>
           <w:tcPr>
             <w:tcW w:w="562" w:type="dxa"/>
@@ -4950,9 +4772,23 @@
             </w:pPr>
             <w:r>
               <w:rPr>
-                <w:rFonts w:ascii="Times New Roman" w:eastAsia="Aptos" w:hAnsi="Times New Roman" w:cs="Times New Roman"/>
-              </w:rPr>
-              <w:t>Legend was successfully limited to just the top 5 hazard types and removed visual noise by identifying each type clearly.</w:t>
+                <w:rFonts w:ascii="Times New Roman" w:hAnsi="Times New Roman" w:cs="Times New Roman"/>
+              </w:rPr>
+              <w:t>The system raised a ‘</w:t>
+            </w:r>
+            <w:proofErr w:type="spellStart"/>
+            <w:r>
+              <w:rPr>
+                <w:rFonts w:ascii="Times New Roman" w:hAnsi="Times New Roman" w:cs="Times New Roman"/>
+              </w:rPr>
+              <w:t>ValueError</w:t>
+            </w:r>
+            <w:proofErr w:type="spellEnd"/>
+            <w:r>
+              <w:rPr>
+                <w:rFonts w:ascii="Times New Roman" w:hAnsi="Times New Roman" w:cs="Times New Roman"/>
+              </w:rPr>
+              <w:t>’. The chart failed to display due to an error in how data was grouped</w:t>
             </w:r>
           </w:p>
         </w:tc>
@@ -4971,7 +4807,7 @@
               <w:rPr>
                 <w:rFonts w:ascii="Times New Roman" w:eastAsia="Aptos" w:hAnsi="Times New Roman" w:cs="Times New Roman"/>
               </w:rPr>
-              <w:t>Pass</w:t>
+              <w:t>Fail</w:t>
             </w:r>
           </w:p>
         </w:tc>
@@ -4986,6 +4822,54 @@
                 <w:rFonts w:ascii="Times New Roman" w:eastAsia="Aptos" w:hAnsi="Times New Roman" w:cs="Times New Roman"/>
               </w:rPr>
             </w:pPr>
+            <w:r>
+              <w:rPr>
+                <w:rFonts w:ascii="Times New Roman" w:hAnsi="Times New Roman" w:cs="Times New Roman"/>
+              </w:rPr>
+              <w:t xml:space="preserve">Fixed by implementing </w:t>
+            </w:r>
+            <w:proofErr w:type="gramStart"/>
+            <w:r>
+              <w:rPr>
+                <w:rFonts w:ascii="Times New Roman" w:hAnsi="Times New Roman" w:cs="Times New Roman"/>
+              </w:rPr>
+              <w:t>‘.</w:t>
+            </w:r>
+            <w:proofErr w:type="spellStart"/>
+            <w:r>
+              <w:rPr>
+                <w:rFonts w:ascii="Times New Roman" w:hAnsi="Times New Roman" w:cs="Times New Roman"/>
+              </w:rPr>
+              <w:t>reset</w:t>
+            </w:r>
+            <w:proofErr w:type="gramEnd"/>
+            <w:r>
+              <w:rPr>
+                <w:rFonts w:ascii="Times New Roman" w:hAnsi="Times New Roman" w:cs="Times New Roman"/>
+              </w:rPr>
+              <w:t>_</w:t>
+            </w:r>
+            <w:proofErr w:type="gramStart"/>
+            <w:r>
+              <w:rPr>
+                <w:rFonts w:ascii="Times New Roman" w:hAnsi="Times New Roman" w:cs="Times New Roman"/>
+              </w:rPr>
+              <w:t>index</w:t>
+            </w:r>
+            <w:proofErr w:type="spellEnd"/>
+            <w:r>
+              <w:rPr>
+                <w:rFonts w:ascii="Times New Roman" w:hAnsi="Times New Roman" w:cs="Times New Roman"/>
+              </w:rPr>
+              <w:t>(</w:t>
+            </w:r>
+            <w:proofErr w:type="gramEnd"/>
+            <w:r>
+              <w:rPr>
+                <w:rFonts w:ascii="Times New Roman" w:hAnsi="Times New Roman" w:cs="Times New Roman"/>
+              </w:rPr>
+              <w:t>) and explicit top 5 filtering logic</w:t>
+            </w:r>
           </w:p>
         </w:tc>
       </w:tr>
@@ -5172,7 +5056,19 @@
               <w:rPr>
                 <w:rFonts w:ascii="Times New Roman" w:eastAsia="Aptos" w:hAnsi="Times New Roman" w:cs="Times New Roman"/>
               </w:rPr>
-              <w:t>The most affected country KPI perfectly match the first bar in the top 10 bar chart.</w:t>
+              <w:t>The most affected country KPI perfectly match</w:t>
+            </w:r>
+            <w:r>
+              <w:rPr>
+                <w:rFonts w:ascii="Times New Roman" w:eastAsia="Aptos" w:hAnsi="Times New Roman" w:cs="Times New Roman"/>
+              </w:rPr>
+              <w:t>ed</w:t>
+            </w:r>
+            <w:r>
+              <w:rPr>
+                <w:rFonts w:ascii="Times New Roman" w:eastAsia="Aptos" w:hAnsi="Times New Roman" w:cs="Times New Roman"/>
+              </w:rPr>
+              <w:t xml:space="preserve"> the first bar in the top 10 bar chart.</w:t>
             </w:r>
           </w:p>
         </w:tc>
@@ -5212,7 +5108,7 @@
     </w:tbl>
     <w:p>
       <w:pPr>
-        <w:spacing w:line="240" w:lineRule="auto"/>
+        <w:spacing w:line="360" w:lineRule="auto"/>
         <w:rPr>
           <w:rFonts w:ascii="Times New Roman" w:eastAsia="Aptos" w:hAnsi="Times New Roman" w:cs="Times New Roman"/>
           <w:b/>
@@ -5222,15 +5118,15 @@
     </w:p>
     <w:p>
       <w:pPr>
-        <w:spacing w:line="240" w:lineRule="auto"/>
-        <w:rPr>
-          <w:rFonts w:ascii="Times New Roman" w:hAnsi="Times New Roman" w:cs="Times New Roman"/>
-        </w:rPr>
-      </w:pPr>
-    </w:p>
-    <w:p>
-      <w:pPr>
-        <w:spacing w:line="240" w:lineRule="auto"/>
+        <w:spacing w:line="360" w:lineRule="auto"/>
+        <w:rPr>
+          <w:rFonts w:ascii="Times New Roman" w:hAnsi="Times New Roman" w:cs="Times New Roman"/>
+        </w:rPr>
+      </w:pPr>
+    </w:p>
+    <w:p>
+      <w:pPr>
+        <w:spacing w:line="360" w:lineRule="auto"/>
         <w:rPr>
           <w:rFonts w:ascii="Times New Roman" w:hAnsi="Times New Roman" w:cs="Times New Roman"/>
         </w:rPr>

</xml_diff>

<commit_message>
Report - Adjusted spacings
</commit_message>
<xml_diff>
--- a/w2149479_ShamlaAqthar_Report.docx
+++ b/w2149479_ShamlaAqthar_Report.docx
@@ -608,7 +608,7 @@
     </w:p>
     <w:p>
       <w:pPr>
-        <w:spacing w:line="360" w:lineRule="auto"/>
+        <w:spacing w:line="276" w:lineRule="auto"/>
         <w:rPr>
           <w:rFonts w:ascii="Times New Roman" w:hAnsi="Times New Roman" w:cs="Times New Roman"/>
         </w:rPr>
@@ -622,21 +622,33 @@
     </w:p>
     <w:p>
       <w:pPr>
-        <w:spacing w:line="360" w:lineRule="auto"/>
-        <w:rPr>
-          <w:rFonts w:ascii="Times New Roman" w:hAnsi="Times New Roman" w:cs="Times New Roman"/>
-        </w:rPr>
-      </w:pPr>
-      <w:r>
-        <w:rPr>
-          <w:rFonts w:ascii="Times New Roman" w:hAnsi="Times New Roman" w:cs="Times New Roman"/>
-        </w:rPr>
-        <w:t xml:space="preserve"> • Clean and preprocess a large-scale dataset using python, addressing missing values, inconsistencies and formatting issues to ensure data reliability. </w:t>
+        <w:spacing w:line="276" w:lineRule="auto"/>
+        <w:rPr>
+          <w:rFonts w:ascii="Times New Roman" w:hAnsi="Times New Roman" w:cs="Times New Roman"/>
+        </w:rPr>
+      </w:pPr>
+      <w:r>
+        <w:rPr>
+          <w:rFonts w:ascii="Times New Roman" w:hAnsi="Times New Roman" w:cs="Times New Roman"/>
+        </w:rPr>
+        <w:t xml:space="preserve"> • </w:t>
+      </w:r>
+      <w:r>
+        <w:rPr>
+          <w:rFonts w:ascii="Times New Roman" w:hAnsi="Times New Roman" w:cs="Times New Roman"/>
+        </w:rPr>
+        <w:t>To c</w:t>
+      </w:r>
+      <w:r>
+        <w:rPr>
+          <w:rFonts w:ascii="Times New Roman" w:hAnsi="Times New Roman" w:cs="Times New Roman"/>
+        </w:rPr>
+        <w:t xml:space="preserve">lean and preprocess a large-scale dataset using python, addressing missing values, inconsistencies and formatting issues to ensure data reliability. </w:t>
       </w:r>
     </w:p>
     <w:p>
       <w:pPr>
-        <w:spacing w:line="360" w:lineRule="auto"/>
+        <w:spacing w:line="276" w:lineRule="auto"/>
         <w:rPr>
           <w:rFonts w:ascii="Times New Roman" w:hAnsi="Times New Roman" w:cs="Times New Roman"/>
         </w:rPr>
@@ -650,7 +662,7 @@
     </w:p>
     <w:p>
       <w:pPr>
-        <w:spacing w:line="360" w:lineRule="auto"/>
+        <w:spacing w:line="276" w:lineRule="auto"/>
         <w:rPr>
           <w:rFonts w:ascii="Times New Roman" w:hAnsi="Times New Roman" w:cs="Times New Roman"/>
         </w:rPr>
@@ -676,7 +688,7 @@
     </w:p>
     <w:p>
       <w:pPr>
-        <w:spacing w:line="360" w:lineRule="auto"/>
+        <w:spacing w:line="276" w:lineRule="auto"/>
         <w:rPr>
           <w:rFonts w:ascii="Times New Roman" w:hAnsi="Times New Roman" w:cs="Times New Roman"/>
         </w:rPr>
@@ -751,14 +763,7 @@
         <w:rPr>
           <w:rFonts w:ascii="Times New Roman" w:hAnsi="Times New Roman" w:cs="Times New Roman"/>
         </w:rPr>
-        <w:t xml:space="preserve">These insights are aligned with UN SDG 13(climate action) and SDG 11(sustainable cities and communities) which focus on addressing climate risks and building resilient communities. </w:t>
-      </w:r>
-      <w:r>
-        <w:rPr>
-          <w:rFonts w:ascii="Times New Roman" w:hAnsi="Times New Roman" w:cs="Times New Roman"/>
-        </w:rPr>
-        <w:lastRenderedPageBreak/>
-        <w:t xml:space="preserve">Overall, the dashboard transforms raw data into meaningful insights for data driven decision making such as disaster preparedness and long-term sustainability planning.   </w:t>
+        <w:t xml:space="preserve">These insights are aligned with UN SDG 13(climate action) and SDG 11(sustainable cities and communities) which focus on addressing climate risks and building resilient communities. Overall, the dashboard transforms raw data into meaningful insights for data driven decision making such as disaster preparedness and long-term sustainability planning.   </w:t>
       </w:r>
     </w:p>
     <w:p>
@@ -769,6 +774,7 @@
         <w:spacing w:line="360" w:lineRule="auto"/>
       </w:pPr>
       <w:r>
+        <w:lastRenderedPageBreak/>
         <w:t>Development Methodology</w:t>
       </w:r>
     </w:p>
@@ -1043,7 +1049,6 @@
         <w:rPr>
           <w:rFonts w:ascii="Times New Roman" w:hAnsi="Times New Roman" w:cs="Times New Roman"/>
         </w:rPr>
-        <w:lastRenderedPageBreak/>
         <w:t xml:space="preserve">Initial exploration of the raw dataset was carried out to understand the data structure, identify missing values and data inconsistencies. This step provided an overview of data quality before cleaning. </w:t>
       </w:r>
     </w:p>
@@ -1076,6 +1081,7 @@
         <w:rPr>
           <w:rFonts w:ascii="Times New Roman" w:hAnsi="Times New Roman" w:cs="Times New Roman"/>
         </w:rPr>
+        <w:lastRenderedPageBreak/>
         <w:t xml:space="preserve">The dataset was cleaned and structured by handling missing values, removing unnecessary columns, duplicate rows and converting data formats where necessary. </w:t>
       </w:r>
     </w:p>
@@ -1228,34 +1234,6 @@
         </w:rPr>
         <w:t xml:space="preserve">. </w:t>
       </w:r>
-    </w:p>
-    <w:p>
-      <w:pPr>
-        <w:spacing w:before="360" w:after="80" w:line="360" w:lineRule="auto"/>
-        <w:outlineLvl w:val="0"/>
-        <w:rPr>
-          <w:rFonts w:ascii="Times New Roman" w:eastAsia="Times New Roman" w:hAnsi="Times New Roman" w:cs="Times New Roman"/>
-          <w:b/>
-          <w:bCs/>
-          <w:color w:val="0F4761"/>
-          <w:sz w:val="40"/>
-          <w:szCs w:val="40"/>
-        </w:rPr>
-      </w:pPr>
-    </w:p>
-    <w:p>
-      <w:pPr>
-        <w:spacing w:before="360" w:after="80" w:line="360" w:lineRule="auto"/>
-        <w:outlineLvl w:val="0"/>
-        <w:rPr>
-          <w:rFonts w:ascii="Times New Roman" w:eastAsia="Times New Roman" w:hAnsi="Times New Roman" w:cs="Times New Roman"/>
-          <w:b/>
-          <w:bCs/>
-          <w:color w:val="0F4761"/>
-          <w:sz w:val="40"/>
-          <w:szCs w:val="40"/>
-        </w:rPr>
-      </w:pPr>
     </w:p>
     <w:p>
       <w:pPr>
@@ -1448,6 +1426,7 @@
                 <w:bCs w:val="0"/>
                 <w:color w:val="000000"/>
               </w:rPr>
+              <w:lastRenderedPageBreak/>
               <w:t>The system shall automatically clean and structure the raw dataset upon execution handling missing values and inconsistencies to ensure data integrity before visualisations</w:t>
             </w:r>
           </w:p>
@@ -1983,6 +1962,7 @@
                 <w:b/>
                 <w:bCs/>
               </w:rPr>
+              <w:lastRenderedPageBreak/>
               <w:t>Description</w:t>
             </w:r>
           </w:p>
@@ -2643,7 +2623,6 @@
               <w:rPr>
                 <w:rFonts w:ascii="Times New Roman" w:hAnsi="Times New Roman" w:cs="Times New Roman"/>
               </w:rPr>
-              <w:lastRenderedPageBreak/>
               <w:t xml:space="preserve">Python environment must have pandas, </w:t>
             </w:r>
             <w:proofErr w:type="spellStart"/>
@@ -2734,7 +2713,6 @@
                 <w:b/>
                 <w:bCs/>
               </w:rPr>
-              <w:lastRenderedPageBreak/>
               <w:t>Expected result</w:t>
             </w:r>
           </w:p>
@@ -2824,6 +2802,7 @@
                 <w:b/>
                 <w:bCs/>
               </w:rPr>
+              <w:lastRenderedPageBreak/>
               <w:t>#03</w:t>
             </w:r>
           </w:p>
@@ -3637,7 +3616,6 @@
               <w:rPr>
                 <w:rFonts w:ascii="Times New Roman" w:hAnsi="Times New Roman" w:cs="Times New Roman"/>
               </w:rPr>
-              <w:lastRenderedPageBreak/>
               <w:t xml:space="preserve">cleaned_data.csv must be loaded </w:t>
             </w:r>
           </w:p>
@@ -3720,7 +3698,6 @@
                 <w:b/>
                 <w:bCs/>
               </w:rPr>
-              <w:lastRenderedPageBreak/>
               <w:t>Expected result</w:t>
             </w:r>
           </w:p>
@@ -3914,6 +3891,7 @@
                 <w:b/>
                 <w:bCs/>
               </w:rPr>
+              <w:lastRenderedPageBreak/>
               <w:t>Description</w:t>
             </w:r>
           </w:p>
@@ -4497,6 +4475,7 @@
               <w:rPr>
                 <w:rFonts w:ascii="Times New Roman" w:eastAsia="Aptos" w:hAnsi="Times New Roman" w:cs="Times New Roman"/>
               </w:rPr>
+              <w:lastRenderedPageBreak/>
               <w:t>01</w:t>
             </w:r>
           </w:p>

</xml_diff>

<commit_message>
Report - Layout adjustment
</commit_message>
<xml_diff>
--- a/w2149479_ShamlaAqthar_Report.docx
+++ b/w2149479_ShamlaAqthar_Report.docx
@@ -108,7 +108,7 @@
           <w:noProof/>
         </w:rPr>
         <w:drawing>
-          <wp:anchor distT="0" distB="0" distL="114300" distR="114300" simplePos="0" relativeHeight="251660288" behindDoc="0" locked="0" layoutInCell="1" allowOverlap="1" wp14:anchorId="27BD4142" wp14:editId="147CA7A0">
+          <wp:anchor distT="0" distB="0" distL="114300" distR="114300" simplePos="0" relativeHeight="251660288" behindDoc="0" locked="0" layoutInCell="1" allowOverlap="1" wp14:anchorId="27BD4142" wp14:editId="40CCADD0">
             <wp:simplePos x="0" y="0"/>
             <wp:positionH relativeFrom="column">
               <wp:posOffset>-152400</wp:posOffset>
@@ -1057,6 +1057,14 @@
         <w:spacing w:line="360" w:lineRule="auto"/>
         <w:rPr>
           <w:rFonts w:ascii="Times New Roman" w:hAnsi="Times New Roman" w:cs="Times New Roman"/>
+        </w:rPr>
+      </w:pPr>
+    </w:p>
+    <w:p>
+      <w:pPr>
+        <w:spacing w:line="360" w:lineRule="auto"/>
+        <w:rPr>
+          <w:rFonts w:ascii="Times New Roman" w:hAnsi="Times New Roman" w:cs="Times New Roman"/>
           <w:b/>
           <w:bCs/>
         </w:rPr>
@@ -1067,6 +1075,7 @@
           <w:b/>
           <w:bCs/>
         </w:rPr>
+        <w:lastRenderedPageBreak/>
         <w:t xml:space="preserve">Phase-3: Data Preparation </w:t>
       </w:r>
     </w:p>
@@ -1081,7 +1090,6 @@
         <w:rPr>
           <w:rFonts w:ascii="Times New Roman" w:hAnsi="Times New Roman" w:cs="Times New Roman"/>
         </w:rPr>
-        <w:lastRenderedPageBreak/>
         <w:t xml:space="preserve">The dataset was cleaned and structured by handling missing values, removing unnecessary columns, duplicate rows and converting data formats where necessary. </w:t>
       </w:r>
     </w:p>
@@ -1318,7 +1326,11 @@
           <w:szCs w:val="40"/>
         </w:rPr>
       </w:pPr>
-      <w:r>
+    </w:p>
+    <w:p>
+      <w:pPr>
+        <w:spacing w:before="360" w:after="80" w:line="360" w:lineRule="auto"/>
+        <w:outlineLvl w:val="0"/>
         <w:rPr>
           <w:rFonts w:ascii="Times New Roman" w:eastAsia="Times New Roman" w:hAnsi="Times New Roman" w:cs="Times New Roman"/>
           <w:b/>
@@ -1327,6 +1339,31 @@
           <w:sz w:val="40"/>
           <w:szCs w:val="40"/>
         </w:rPr>
+      </w:pPr>
+    </w:p>
+    <w:p>
+      <w:pPr>
+        <w:spacing w:before="360" w:after="80" w:line="360" w:lineRule="auto"/>
+        <w:outlineLvl w:val="0"/>
+        <w:rPr>
+          <w:rFonts w:ascii="Times New Roman" w:eastAsia="Times New Roman" w:hAnsi="Times New Roman" w:cs="Times New Roman"/>
+          <w:b/>
+          <w:bCs/>
+          <w:color w:val="0F4761"/>
+          <w:sz w:val="40"/>
+          <w:szCs w:val="40"/>
+        </w:rPr>
+      </w:pPr>
+      <w:r>
+        <w:rPr>
+          <w:rFonts w:ascii="Times New Roman" w:eastAsia="Times New Roman" w:hAnsi="Times New Roman" w:cs="Times New Roman"/>
+          <w:b/>
+          <w:bCs/>
+          <w:color w:val="0F4761"/>
+          <w:sz w:val="40"/>
+          <w:szCs w:val="40"/>
+        </w:rPr>
+        <w:lastRenderedPageBreak/>
         <w:t>Requirements</w:t>
       </w:r>
     </w:p>
@@ -1426,7 +1463,6 @@
                 <w:bCs w:val="0"/>
                 <w:color w:val="000000"/>
               </w:rPr>
-              <w:lastRenderedPageBreak/>
               <w:t>The system shall automatically clean and structure the raw dataset upon execution handling missing values and inconsistencies to ensure data integrity before visualisations</w:t>
             </w:r>
           </w:p>
@@ -1788,6 +1824,7 @@
           <w:sz w:val="40"/>
           <w:szCs w:val="40"/>
         </w:rPr>
+        <w:lastRenderedPageBreak/>
         <w:t>Test cases</w:t>
       </w:r>
     </w:p>
@@ -1962,7 +1999,6 @@
                 <w:b/>
                 <w:bCs/>
               </w:rPr>
-              <w:lastRenderedPageBreak/>
               <w:t>Description</w:t>
             </w:r>
           </w:p>
@@ -2651,19 +2687,7 @@
               <w:rPr>
                 <w:rFonts w:ascii="Times New Roman" w:hAnsi="Times New Roman" w:cs="Times New Roman"/>
               </w:rPr>
-              <w:t xml:space="preserve"> </w:t>
-            </w:r>
-            <w:r>
-              <w:rPr>
-                <w:rFonts w:ascii="Times New Roman" w:hAnsi="Times New Roman" w:cs="Times New Roman"/>
-              </w:rPr>
-              <w:t>libraries</w:t>
-            </w:r>
-            <w:r>
-              <w:rPr>
-                <w:rFonts w:ascii="Times New Roman" w:hAnsi="Times New Roman" w:cs="Times New Roman"/>
-              </w:rPr>
-              <w:t xml:space="preserve"> installed </w:t>
+              <w:t xml:space="preserve"> libraries installed </w:t>
             </w:r>
           </w:p>
           <w:p>
@@ -2752,6 +2776,7 @@
               <w:rPr>
                 <w:rFonts w:ascii="Times New Roman" w:hAnsi="Times New Roman" w:cs="Times New Roman"/>
               </w:rPr>
+              <w:lastRenderedPageBreak/>
               <w:t>No other hazard types but flood must be visible in the legend of trend of top 5 hazard types and displacements by hazard type bar chart.</w:t>
             </w:r>
           </w:p>
@@ -2802,7 +2827,6 @@
                 <w:b/>
                 <w:bCs/>
               </w:rPr>
-              <w:lastRenderedPageBreak/>
               <w:t>#03</w:t>
             </w:r>
           </w:p>
@@ -3139,19 +3163,7 @@
               <w:rPr>
                 <w:rFonts w:ascii="Times New Roman" w:hAnsi="Times New Roman" w:cs="Times New Roman"/>
               </w:rPr>
-              <w:t xml:space="preserve"> </w:t>
-            </w:r>
-            <w:r>
-              <w:rPr>
-                <w:rFonts w:ascii="Times New Roman" w:hAnsi="Times New Roman" w:cs="Times New Roman"/>
-              </w:rPr>
-              <w:t>libraries</w:t>
-            </w:r>
-            <w:r>
-              <w:rPr>
-                <w:rFonts w:ascii="Times New Roman" w:hAnsi="Times New Roman" w:cs="Times New Roman"/>
-              </w:rPr>
-              <w:t xml:space="preserve"> installed </w:t>
+              <w:t xml:space="preserve"> libraries installed </w:t>
             </w:r>
           </w:p>
           <w:p>
@@ -3658,19 +3670,7 @@
               <w:rPr>
                 <w:rFonts w:ascii="Times New Roman" w:hAnsi="Times New Roman" w:cs="Times New Roman"/>
               </w:rPr>
-              <w:t xml:space="preserve"> </w:t>
-            </w:r>
-            <w:r>
-              <w:rPr>
-                <w:rFonts w:ascii="Times New Roman" w:hAnsi="Times New Roman" w:cs="Times New Roman"/>
-              </w:rPr>
-              <w:t>libraries</w:t>
-            </w:r>
-            <w:r>
-              <w:rPr>
-                <w:rFonts w:ascii="Times New Roman" w:hAnsi="Times New Roman" w:cs="Times New Roman"/>
-              </w:rPr>
-              <w:t xml:space="preserve"> installed </w:t>
+              <w:t xml:space="preserve"> libraries installed </w:t>
             </w:r>
           </w:p>
         </w:tc>
@@ -3891,7 +3891,6 @@
                 <w:b/>
                 <w:bCs/>
               </w:rPr>
-              <w:lastRenderedPageBreak/>
               <w:t>Description</w:t>
             </w:r>
           </w:p>
@@ -4083,19 +4082,7 @@
               <w:rPr>
                 <w:rFonts w:ascii="Times New Roman" w:hAnsi="Times New Roman" w:cs="Times New Roman"/>
               </w:rPr>
-              <w:t xml:space="preserve"> </w:t>
-            </w:r>
-            <w:r>
-              <w:rPr>
-                <w:rFonts w:ascii="Times New Roman" w:hAnsi="Times New Roman" w:cs="Times New Roman"/>
-              </w:rPr>
-              <w:t>libraries</w:t>
-            </w:r>
-            <w:r>
-              <w:rPr>
-                <w:rFonts w:ascii="Times New Roman" w:hAnsi="Times New Roman" w:cs="Times New Roman"/>
-              </w:rPr>
-              <w:t xml:space="preserve"> installed </w:t>
+              <w:t xml:space="preserve"> libraries installed </w:t>
             </w:r>
           </w:p>
           <w:p>
@@ -4299,6 +4286,7 @@
           <w:sz w:val="40"/>
           <w:szCs w:val="40"/>
         </w:rPr>
+        <w:lastRenderedPageBreak/>
         <w:t>Test log</w:t>
       </w:r>
     </w:p>
@@ -4475,7 +4463,6 @@
               <w:rPr>
                 <w:rFonts w:ascii="Times New Roman" w:eastAsia="Aptos" w:hAnsi="Times New Roman" w:cs="Times New Roman"/>
               </w:rPr>
-              <w:lastRenderedPageBreak/>
               <w:t>01</w:t>
             </w:r>
           </w:p>
@@ -6011,6 +5998,7 @@
   <w:style w:type="character" w:default="1" w:styleId="DefaultParagraphFont">
     <w:name w:val="Default Paragraph Font"/>
     <w:uiPriority w:val="1"/>
+    <w:semiHidden/>
     <w:unhideWhenUsed/>
   </w:style>
   <w:style w:type="table" w:default="1" w:styleId="TableNormal">

</xml_diff>

<commit_message>
Report - Minor adjustments
</commit_message>
<xml_diff>
--- a/w2149479_ShamlaAqthar_Report.docx
+++ b/w2149479_ShamlaAqthar_Report.docx
@@ -108,7 +108,7 @@
           <w:noProof/>
         </w:rPr>
         <w:drawing>
-          <wp:anchor distT="0" distB="0" distL="114300" distR="114300" simplePos="0" relativeHeight="251660288" behindDoc="0" locked="0" layoutInCell="1" allowOverlap="1" wp14:anchorId="27BD4142" wp14:editId="40CCADD0">
+          <wp:anchor distT="0" distB="0" distL="114300" distR="114300" simplePos="0" relativeHeight="251660288" behindDoc="0" locked="0" layoutInCell="1" allowOverlap="1" wp14:anchorId="27BD4142" wp14:editId="6FFA9837">
             <wp:simplePos x="0" y="0"/>
             <wp:positionH relativeFrom="column">
               <wp:posOffset>-152400</wp:posOffset>
@@ -215,29 +215,12 @@
           <w:bCs/>
           <w:iCs/>
           <w:color w:val="000000" w:themeColor="text1"/>
-          <w:sz w:val="56"/>
-          <w:szCs w:val="56"/>
+          <w:sz w:val="48"/>
+          <w:szCs w:val="48"/>
           <w:lang w:eastAsia="en-GB"/>
         </w:rPr>
       </w:pPr>
       <w:r>
-        <w:rPr>
-          <w:rFonts w:ascii="Times New Roman" w:hAnsi="Times New Roman" w:cs="Times New Roman"/>
-          <w:b/>
-          <w:bCs/>
-          <w:iCs/>
-          <w:color w:val="000000" w:themeColor="text1"/>
-          <w:sz w:val="56"/>
-          <w:szCs w:val="56"/>
-          <w:lang w:eastAsia="en-GB"/>
-        </w:rPr>
-        <w:t xml:space="preserve">DATA SCIENCE PROJECT LIFECYCLE </w:t>
-      </w:r>
-    </w:p>
-    <w:p>
-      <w:pPr>
-        <w:spacing w:line="360" w:lineRule="auto"/>
-        <w:jc w:val="center"/>
         <w:rPr>
           <w:rFonts w:ascii="Times New Roman" w:hAnsi="Times New Roman" w:cs="Times New Roman"/>
           <w:b/>
@@ -248,8 +231,13 @@
           <w:szCs w:val="48"/>
           <w:lang w:eastAsia="en-GB"/>
         </w:rPr>
-      </w:pPr>
-      <w:r>
+        <w:t xml:space="preserve">DATA SCIENCE PROJECT LIFECYCLE </w:t>
+      </w:r>
+    </w:p>
+    <w:p>
+      <w:pPr>
+        <w:spacing w:line="360" w:lineRule="auto"/>
+        <w:jc w:val="center"/>
         <w:rPr>
           <w:rFonts w:ascii="Times New Roman" w:hAnsi="Times New Roman" w:cs="Times New Roman"/>
           <w:b/>
@@ -260,8 +248,7 @@
           <w:szCs w:val="48"/>
           <w:lang w:eastAsia="en-GB"/>
         </w:rPr>
-        <w:t>5DATA004C</w:t>
-      </w:r>
+      </w:pPr>
       <w:r>
         <w:rPr>
           <w:rFonts w:ascii="Times New Roman" w:hAnsi="Times New Roman" w:cs="Times New Roman"/>
@@ -273,7 +260,7 @@
           <w:szCs w:val="48"/>
           <w:lang w:eastAsia="en-GB"/>
         </w:rPr>
-        <w:br/>
+        <w:t>5DATA004C</w:t>
       </w:r>
     </w:p>
     <w:p>
@@ -293,20 +280,10 @@
           <w:rFonts w:ascii="Times New Roman" w:hAnsi="Times New Roman" w:cs="Times New Roman"/>
           <w:b/>
           <w:bCs/>
-          <w:sz w:val="56"/>
-          <w:szCs w:val="56"/>
-        </w:rPr>
-        <w:t>Level 5 Business Data Analytics</w:t>
-      </w:r>
-      <w:r>
-        <w:rPr>
-          <w:rFonts w:ascii="Times New Roman" w:hAnsi="Times New Roman" w:cs="Times New Roman"/>
-          <w:b/>
-          <w:bCs/>
-          <w:sz w:val="56"/>
-          <w:szCs w:val="56"/>
-        </w:rPr>
-        <w:br/>
+          <w:sz w:val="48"/>
+          <w:szCs w:val="48"/>
+        </w:rPr>
+        <w:t xml:space="preserve">INDIVIDUAL COURSEWORK </w:t>
       </w:r>
     </w:p>
     <w:p>
@@ -317,19 +294,41 @@
           <w:rFonts w:ascii="Times New Roman" w:hAnsi="Times New Roman" w:cs="Times New Roman"/>
           <w:b/>
           <w:bCs/>
-          <w:sz w:val="56"/>
-          <w:szCs w:val="56"/>
-        </w:rPr>
-      </w:pPr>
-      <w:r>
-        <w:rPr>
-          <w:rFonts w:ascii="Times New Roman" w:hAnsi="Times New Roman" w:cs="Times New Roman"/>
-          <w:b/>
-          <w:bCs/>
-          <w:sz w:val="56"/>
-          <w:szCs w:val="56"/>
-        </w:rPr>
-        <w:t xml:space="preserve">INDIVIDUAL COURSEWORK </w:t>
+          <w:sz w:val="40"/>
+          <w:szCs w:val="40"/>
+        </w:rPr>
+      </w:pPr>
+      <w:r>
+        <w:rPr>
+          <w:rFonts w:ascii="Times New Roman" w:hAnsi="Times New Roman" w:cs="Times New Roman"/>
+          <w:b/>
+          <w:bCs/>
+          <w:sz w:val="40"/>
+          <w:szCs w:val="40"/>
+        </w:rPr>
+        <w:t xml:space="preserve">Module Leader - Mr. </w:t>
+      </w:r>
+      <w:proofErr w:type="spellStart"/>
+      <w:r>
+        <w:rPr>
+          <w:rFonts w:ascii="Times New Roman" w:hAnsi="Times New Roman" w:cs="Times New Roman"/>
+          <w:b/>
+          <w:bCs/>
+          <w:sz w:val="40"/>
+          <w:szCs w:val="40"/>
+        </w:rPr>
+        <w:t>Fouzul</w:t>
+      </w:r>
+      <w:proofErr w:type="spellEnd"/>
+      <w:r>
+        <w:rPr>
+          <w:rFonts w:ascii="Times New Roman" w:hAnsi="Times New Roman" w:cs="Times New Roman"/>
+          <w:b/>
+          <w:bCs/>
+          <w:sz w:val="40"/>
+          <w:szCs w:val="40"/>
+        </w:rPr>
+        <w:t xml:space="preserve"> Hassan</w:t>
       </w:r>
     </w:p>
     <w:p>
@@ -340,53 +339,8 @@
           <w:rFonts w:ascii="Times New Roman" w:hAnsi="Times New Roman" w:cs="Times New Roman"/>
           <w:b/>
           <w:bCs/>
-          <w:sz w:val="48"/>
-          <w:szCs w:val="48"/>
-        </w:rPr>
-      </w:pPr>
-      <w:r>
-        <w:rPr>
-          <w:rFonts w:ascii="Times New Roman" w:hAnsi="Times New Roman" w:cs="Times New Roman"/>
-          <w:b/>
-          <w:bCs/>
-          <w:sz w:val="48"/>
-          <w:szCs w:val="48"/>
-        </w:rPr>
-        <w:t xml:space="preserve">Module Leader - Mr. </w:t>
-      </w:r>
-      <w:proofErr w:type="spellStart"/>
-      <w:r>
-        <w:rPr>
-          <w:rFonts w:ascii="Times New Roman" w:hAnsi="Times New Roman" w:cs="Times New Roman"/>
-          <w:b/>
-          <w:bCs/>
-          <w:sz w:val="48"/>
-          <w:szCs w:val="48"/>
-        </w:rPr>
-        <w:t>Fouzul</w:t>
-      </w:r>
-      <w:proofErr w:type="spellEnd"/>
-      <w:r>
-        <w:rPr>
-          <w:rFonts w:ascii="Times New Roman" w:hAnsi="Times New Roman" w:cs="Times New Roman"/>
-          <w:b/>
-          <w:bCs/>
-          <w:sz w:val="48"/>
-          <w:szCs w:val="48"/>
-        </w:rPr>
-        <w:t xml:space="preserve"> Hassan</w:t>
-      </w:r>
-    </w:p>
-    <w:p>
-      <w:pPr>
-        <w:spacing w:line="360" w:lineRule="auto"/>
-        <w:jc w:val="center"/>
-        <w:rPr>
-          <w:rFonts w:ascii="Times New Roman" w:hAnsi="Times New Roman" w:cs="Times New Roman"/>
-          <w:b/>
-          <w:bCs/>
-          <w:sz w:val="48"/>
-          <w:szCs w:val="48"/>
+          <w:sz w:val="44"/>
+          <w:szCs w:val="44"/>
         </w:rPr>
       </w:pPr>
     </w:p>
@@ -398,11 +352,201 @@
           <w:rFonts w:ascii="Times New Roman" w:hAnsi="Times New Roman" w:cs="Times New Roman"/>
           <w:b/>
           <w:bCs/>
+          <w:sz w:val="32"/>
+          <w:szCs w:val="32"/>
+        </w:rPr>
+      </w:pPr>
+      <w:r>
+        <w:rPr>
+          <w:rFonts w:ascii="Times New Roman" w:hAnsi="Times New Roman" w:cs="Times New Roman"/>
+          <w:b/>
+          <w:bCs/>
+          <w:sz w:val="32"/>
+          <w:szCs w:val="32"/>
+        </w:rPr>
+        <w:t>Name: Shamla Aqthar</w:t>
+      </w:r>
+    </w:p>
+    <w:p>
+      <w:pPr>
+        <w:spacing w:line="240" w:lineRule="auto"/>
+        <w:jc w:val="left"/>
+        <w:rPr>
+          <w:rFonts w:ascii="Times New Roman" w:hAnsi="Times New Roman" w:cs="Times New Roman"/>
+          <w:b/>
+          <w:bCs/>
+          <w:sz w:val="32"/>
+          <w:szCs w:val="32"/>
+        </w:rPr>
+      </w:pPr>
+      <w:r>
+        <w:rPr>
+          <w:rFonts w:ascii="Times New Roman" w:hAnsi="Times New Roman" w:cs="Times New Roman"/>
+          <w:b/>
+          <w:bCs/>
+          <w:sz w:val="32"/>
+          <w:szCs w:val="32"/>
+        </w:rPr>
+        <w:t>Student</w:t>
+      </w:r>
+      <w:r>
+        <w:rPr>
+          <w:rFonts w:ascii="Times New Roman" w:hAnsi="Times New Roman" w:cs="Times New Roman"/>
+          <w:b/>
+          <w:bCs/>
+          <w:sz w:val="32"/>
+          <w:szCs w:val="32"/>
+        </w:rPr>
+        <w:t xml:space="preserve"> Id: w2149479</w:t>
+      </w:r>
+      <w:r>
+        <w:rPr>
+          <w:rFonts w:ascii="Times New Roman" w:hAnsi="Times New Roman" w:cs="Times New Roman"/>
+          <w:b/>
+          <w:bCs/>
+          <w:sz w:val="32"/>
+          <w:szCs w:val="32"/>
+        </w:rPr>
+        <w:t xml:space="preserve"> / 20241956</w:t>
+      </w:r>
+      <w:r>
+        <w:rPr>
+          <w:rFonts w:ascii="Times New Roman" w:hAnsi="Times New Roman" w:cs="Times New Roman"/>
+          <w:b/>
+          <w:bCs/>
+          <w:sz w:val="32"/>
+          <w:szCs w:val="32"/>
+        </w:rPr>
+        <w:br/>
+      </w:r>
+    </w:p>
+    <w:p>
+      <w:pPr>
+        <w:spacing w:line="240" w:lineRule="auto"/>
+        <w:jc w:val="left"/>
+        <w:rPr>
+          <w:rFonts w:ascii="Times New Roman" w:hAnsi="Times New Roman" w:cs="Times New Roman"/>
+          <w:sz w:val="32"/>
+          <w:szCs w:val="32"/>
+        </w:rPr>
+      </w:pPr>
+      <w:r>
+        <w:rPr>
+          <w:rFonts w:ascii="Times New Roman" w:hAnsi="Times New Roman" w:cs="Times New Roman"/>
+          <w:b/>
+          <w:bCs/>
+          <w:sz w:val="32"/>
+          <w:szCs w:val="32"/>
+        </w:rPr>
+        <w:t xml:space="preserve">Dataset: </w:t>
+      </w:r>
+      <w:r>
+        <w:rPr>
+          <w:rFonts w:ascii="Times New Roman" w:hAnsi="Times New Roman" w:cs="Times New Roman"/>
+          <w:sz w:val="32"/>
+          <w:szCs w:val="32"/>
+        </w:rPr>
+        <w:t>Internal displacements (new displacements) associated with disasters</w:t>
+      </w:r>
+    </w:p>
+    <w:p>
+      <w:pPr>
+        <w:spacing w:line="240" w:lineRule="auto"/>
+        <w:jc w:val="left"/>
+        <w:rPr>
+          <w:rFonts w:ascii="Times New Roman" w:hAnsi="Times New Roman" w:cs="Times New Roman"/>
+          <w:b/>
+          <w:bCs/>
+          <w:sz w:val="32"/>
+          <w:szCs w:val="32"/>
+        </w:rPr>
+      </w:pPr>
+      <w:r>
+        <w:rPr>
+          <w:rFonts w:ascii="Times New Roman" w:hAnsi="Times New Roman" w:cs="Times New Roman"/>
+          <w:b/>
+          <w:bCs/>
+          <w:sz w:val="32"/>
+          <w:szCs w:val="32"/>
+        </w:rPr>
+        <w:t>GitHub:</w:t>
+      </w:r>
+    </w:p>
+    <w:p>
+      <w:pPr>
+        <w:spacing w:line="240" w:lineRule="auto"/>
+        <w:jc w:val="left"/>
+        <w:rPr>
+          <w:rFonts w:ascii="Times New Roman" w:hAnsi="Times New Roman" w:cs="Times New Roman"/>
+          <w:b/>
+          <w:bCs/>
+          <w:sz w:val="32"/>
+          <w:szCs w:val="32"/>
+        </w:rPr>
+      </w:pPr>
+      <w:r>
+        <w:rPr>
+          <w:rFonts w:ascii="Times New Roman" w:hAnsi="Times New Roman" w:cs="Times New Roman"/>
+          <w:b/>
+          <w:bCs/>
+          <w:sz w:val="32"/>
+          <w:szCs w:val="32"/>
+        </w:rPr>
+        <w:t>Video:</w:t>
+      </w:r>
+    </w:p>
+    <w:p>
+      <w:pPr>
+        <w:spacing w:line="240" w:lineRule="auto"/>
+        <w:jc w:val="left"/>
+        <w:rPr>
+          <w:rFonts w:ascii="Times New Roman" w:hAnsi="Times New Roman" w:cs="Times New Roman"/>
+          <w:b/>
+          <w:bCs/>
+          <w:sz w:val="32"/>
+          <w:szCs w:val="32"/>
+        </w:rPr>
+      </w:pPr>
+      <w:proofErr w:type="spellStart"/>
+      <w:r>
+        <w:rPr>
+          <w:rFonts w:ascii="Times New Roman" w:hAnsi="Times New Roman" w:cs="Times New Roman"/>
+          <w:b/>
+          <w:bCs/>
+          <w:sz w:val="32"/>
+          <w:szCs w:val="32"/>
+        </w:rPr>
+        <w:t>Streamlit</w:t>
+      </w:r>
+      <w:proofErr w:type="spellEnd"/>
+      <w:r>
+        <w:rPr>
+          <w:rFonts w:ascii="Times New Roman" w:hAnsi="Times New Roman" w:cs="Times New Roman"/>
+          <w:b/>
+          <w:bCs/>
+          <w:sz w:val="32"/>
+          <w:szCs w:val="32"/>
+        </w:rPr>
+        <w:t xml:space="preserve">: </w:t>
+      </w:r>
+    </w:p>
+    <w:p>
+      <w:pPr>
+        <w:spacing w:line="240" w:lineRule="auto"/>
+        <w:jc w:val="left"/>
+        <w:rPr>
+          <w:rFonts w:ascii="Times New Roman" w:hAnsi="Times New Roman" w:cs="Times New Roman"/>
+          <w:b/>
+          <w:bCs/>
           <w:sz w:val="36"/>
           <w:szCs w:val="36"/>
         </w:rPr>
       </w:pPr>
-      <w:r>
+    </w:p>
+    <w:p>
+      <w:pPr>
+        <w:spacing w:line="240" w:lineRule="auto"/>
+        <w:jc w:val="left"/>
         <w:rPr>
           <w:rFonts w:ascii="Times New Roman" w:hAnsi="Times New Roman" w:cs="Times New Roman"/>
           <w:b/>
@@ -410,8 +554,7 @@
           <w:sz w:val="36"/>
           <w:szCs w:val="36"/>
         </w:rPr>
-        <w:t>Name: Shamla Aqthar</w:t>
-      </w:r>
+      </w:pPr>
     </w:p>
     <w:p>
       <w:pPr>
@@ -425,8 +568,11 @@
           <w:szCs w:val="36"/>
         </w:rPr>
       </w:pPr>
-      <w:proofErr w:type="spellStart"/>
-      <w:r>
+    </w:p>
+    <w:p>
+      <w:pPr>
+        <w:spacing w:line="240" w:lineRule="auto"/>
+        <w:jc w:val="left"/>
         <w:rPr>
           <w:rFonts w:ascii="Times New Roman" w:hAnsi="Times New Roman" w:cs="Times New Roman"/>
           <w:b/>
@@ -434,42 +580,7 @@
           <w:sz w:val="36"/>
           <w:szCs w:val="36"/>
         </w:rPr>
-        <w:t>UoW</w:t>
-      </w:r>
-      <w:proofErr w:type="spellEnd"/>
-      <w:r>
-        <w:rPr>
-          <w:rFonts w:ascii="Times New Roman" w:hAnsi="Times New Roman" w:cs="Times New Roman"/>
-          <w:b/>
-          <w:bCs/>
-          <w:sz w:val="36"/>
-          <w:szCs w:val="36"/>
-        </w:rPr>
-        <w:t xml:space="preserve"> Id: w2149479</w:t>
-      </w:r>
-    </w:p>
-    <w:p>
-      <w:pPr>
-        <w:spacing w:line="240" w:lineRule="auto"/>
-        <w:jc w:val="left"/>
-        <w:rPr>
-          <w:rFonts w:ascii="Times New Roman" w:hAnsi="Times New Roman" w:cs="Times New Roman"/>
-          <w:b/>
-          <w:bCs/>
-          <w:sz w:val="36"/>
-          <w:szCs w:val="36"/>
-        </w:rPr>
-      </w:pPr>
-      <w:r>
-        <w:rPr>
-          <w:rFonts w:ascii="Times New Roman" w:hAnsi="Times New Roman" w:cs="Times New Roman"/>
-          <w:b/>
-          <w:bCs/>
-          <w:sz w:val="36"/>
-          <w:szCs w:val="36"/>
-        </w:rPr>
-        <w:t>IIT Id: 20241956</w:t>
-      </w:r>
+      </w:pPr>
     </w:p>
     <w:p>
       <w:pPr>
@@ -559,8 +670,6 @@
           <w:rPr>
             <w:rStyle w:val="Hyperlink"/>
             <w:rFonts w:ascii="Times New Roman" w:hAnsi="Times New Roman" w:cs="Times New Roman"/>
-            <w:b/>
-            <w:bCs/>
           </w:rPr>
           <w:t>https://data.humdata.org/dataset/idmc-internal-displacements-new-displacements-associated-with-disasters</w:t>
         </w:r>
@@ -590,7 +699,7 @@
     </w:p>
     <w:p>
       <w:pPr>
-        <w:spacing w:line="360" w:lineRule="auto"/>
+        <w:spacing w:after="0" w:line="360" w:lineRule="auto"/>
         <w:rPr>
           <w:rFonts w:ascii="Times New Roman" w:hAnsi="Times New Roman" w:cs="Times New Roman"/>
           <w:b/>
@@ -801,7 +910,19 @@
         <w:rPr>
           <w:rFonts w:ascii="Times New Roman" w:hAnsi="Times New Roman" w:cs="Times New Roman"/>
         </w:rPr>
-        <w:t xml:space="preserve">This methodology was selected because it allowed early validation of data processing and visual outputs, reducing the risk of errors in later stages. </w:t>
+        <w:t>I</w:t>
+      </w:r>
+      <w:r>
+        <w:rPr>
+          <w:rFonts w:ascii="Times New Roman" w:hAnsi="Times New Roman" w:cs="Times New Roman"/>
+        </w:rPr>
+        <w:t>terative</w:t>
+      </w:r>
+      <w:r>
+        <w:rPr>
+          <w:rFonts w:ascii="Times New Roman" w:hAnsi="Times New Roman" w:cs="Times New Roman"/>
+        </w:rPr>
+        <w:t xml:space="preserve"> methodology was selected because it allowed early validation of data processing and visual outputs, reducing the risk of errors in later stages. </w:t>
       </w:r>
     </w:p>
     <w:p>
@@ -1051,14 +1172,6 @@
         </w:rPr>
         <w:t xml:space="preserve">Initial exploration of the raw dataset was carried out to understand the data structure, identify missing values and data inconsistencies. This step provided an overview of data quality before cleaning. </w:t>
       </w:r>
-    </w:p>
-    <w:p>
-      <w:pPr>
-        <w:spacing w:line="360" w:lineRule="auto"/>
-        <w:rPr>
-          <w:rFonts w:ascii="Times New Roman" w:hAnsi="Times New Roman" w:cs="Times New Roman"/>
-        </w:rPr>
-      </w:pPr>
     </w:p>
     <w:p>
       <w:pPr>
@@ -1619,7 +1732,23 @@
                 <w:b w:val="0"/>
                 <w:bCs w:val="0"/>
               </w:rPr>
-              <w:t>The system shall provide integrated charts such as time series for displacements and top 5 hazards and bar charts for top 10 affected countries and hazard types to allow simultaneous trends and categorical analysis.</w:t>
+              <w:t xml:space="preserve">The system shall provide integrated charts such as time series for displacements and top 5 hazards and bar charts for affected countries and </w:t>
+            </w:r>
+            <w:r>
+              <w:rPr>
+                <w:rFonts w:ascii="Times New Roman" w:hAnsi="Times New Roman" w:cs="Times New Roman"/>
+                <w:b w:val="0"/>
+                <w:bCs w:val="0"/>
+              </w:rPr>
+              <w:t xml:space="preserve">displacements by </w:t>
+            </w:r>
+            <w:r>
+              <w:rPr>
+                <w:rFonts w:ascii="Times New Roman" w:hAnsi="Times New Roman" w:cs="Times New Roman"/>
+                <w:b w:val="0"/>
+                <w:bCs w:val="0"/>
+              </w:rPr>
+              <w:t>hazard types to allow simultaneous trends and categorical analysis.</w:t>
             </w:r>
           </w:p>
           <w:p>
@@ -3135,7 +3264,13 @@
               <w:rPr>
                 <w:rFonts w:ascii="Times New Roman" w:hAnsi="Times New Roman" w:cs="Times New Roman"/>
               </w:rPr>
-              <w:t xml:space="preserve">python environment must have pandas, </w:t>
+              <w:t>P</w:t>
+            </w:r>
+            <w:r>
+              <w:rPr>
+                <w:rFonts w:ascii="Times New Roman" w:hAnsi="Times New Roman" w:cs="Times New Roman"/>
+              </w:rPr>
+              <w:t xml:space="preserve">ython environment must have pandas, </w:t>
             </w:r>
             <w:proofErr w:type="spellStart"/>
             <w:r>
@@ -5097,6 +5232,152 @@
           <w:rFonts w:ascii="Times New Roman" w:hAnsi="Times New Roman" w:cs="Times New Roman"/>
         </w:rPr>
       </w:pPr>
+    </w:p>
+    <w:p>
+      <w:pPr>
+        <w:spacing w:line="360" w:lineRule="auto"/>
+        <w:rPr>
+          <w:rFonts w:ascii="Times New Roman" w:hAnsi="Times New Roman" w:cs="Times New Roman"/>
+        </w:rPr>
+      </w:pPr>
+    </w:p>
+    <w:p>
+      <w:pPr>
+        <w:spacing w:line="360" w:lineRule="auto"/>
+        <w:rPr>
+          <w:rFonts w:ascii="Times New Roman" w:hAnsi="Times New Roman" w:cs="Times New Roman"/>
+        </w:rPr>
+      </w:pPr>
+    </w:p>
+    <w:p>
+      <w:pPr>
+        <w:pStyle w:val="Heading1"/>
+      </w:pPr>
+      <w:r>
+        <w:lastRenderedPageBreak/>
+        <w:t>Technical research</w:t>
+      </w:r>
+    </w:p>
+    <w:p>
+      <w:pPr>
+        <w:rPr>
+          <w:rFonts w:ascii="Times New Roman" w:hAnsi="Times New Roman" w:cs="Times New Roman"/>
+        </w:rPr>
+      </w:pPr>
+      <w:hyperlink r:id="rId9" w:history="1">
+        <w:r>
+          <w:rPr>
+            <w:rStyle w:val="Hyperlink"/>
+            <w:rFonts w:ascii="Times New Roman" w:hAnsi="Times New Roman" w:cs="Times New Roman"/>
+          </w:rPr>
+          <w:t>https://youtu.be/p2pXpcXPoGk?si=NBl_UOEIX-aM8y0g</w:t>
+        </w:r>
+      </w:hyperlink>
+      <w:r>
+        <w:rPr>
+          <w:rFonts w:ascii="Times New Roman" w:hAnsi="Times New Roman" w:cs="Times New Roman"/>
+        </w:rPr>
+        <w:t xml:space="preserve">  </w:t>
+      </w:r>
+    </w:p>
+    <w:p>
+      <w:pPr>
+        <w:rPr>
+          <w:rFonts w:ascii="Times New Roman" w:hAnsi="Times New Roman" w:cs="Times New Roman"/>
+        </w:rPr>
+      </w:pPr>
+      <w:proofErr w:type="spellStart"/>
+      <w:proofErr w:type="gramStart"/>
+      <w:r>
+        <w:rPr>
+          <w:rFonts w:ascii="Times New Roman" w:hAnsi="Times New Roman" w:cs="Times New Roman"/>
+          <w:i/>
+          <w:iCs/>
+        </w:rPr>
+        <w:t>st.warning</w:t>
+      </w:r>
+      <w:proofErr w:type="spellEnd"/>
+      <w:proofErr w:type="gramEnd"/>
+      <w:r>
+        <w:rPr>
+          <w:rFonts w:ascii="Times New Roman" w:hAnsi="Times New Roman" w:cs="Times New Roman"/>
+          <w:i/>
+          <w:iCs/>
+        </w:rPr>
+        <w:t xml:space="preserve"> - </w:t>
+      </w:r>
+      <w:proofErr w:type="spellStart"/>
+      <w:r>
+        <w:rPr>
+          <w:rFonts w:ascii="Times New Roman" w:hAnsi="Times New Roman" w:cs="Times New Roman"/>
+          <w:i/>
+          <w:iCs/>
+        </w:rPr>
+        <w:t>Streamlit</w:t>
+      </w:r>
+      <w:proofErr w:type="spellEnd"/>
+      <w:r>
+        <w:rPr>
+          <w:rFonts w:ascii="Times New Roman" w:hAnsi="Times New Roman" w:cs="Times New Roman"/>
+          <w:i/>
+          <w:iCs/>
+        </w:rPr>
+        <w:t xml:space="preserve"> Docs</w:t>
+      </w:r>
+      <w:r>
+        <w:rPr>
+          <w:rFonts w:ascii="Times New Roman" w:hAnsi="Times New Roman" w:cs="Times New Roman"/>
+        </w:rPr>
+        <w:t xml:space="preserve"> (2025) </w:t>
+      </w:r>
+      <w:r>
+        <w:rPr>
+          <w:rFonts w:ascii="Times New Roman" w:hAnsi="Times New Roman" w:cs="Times New Roman"/>
+          <w:i/>
+          <w:iCs/>
+        </w:rPr>
+        <w:t>Streamlit.io</w:t>
+      </w:r>
+      <w:r>
+        <w:rPr>
+          <w:rFonts w:ascii="Times New Roman" w:hAnsi="Times New Roman" w:cs="Times New Roman"/>
+        </w:rPr>
+        <w:t xml:space="preserve">. Available at: </w:t>
+      </w:r>
+      <w:hyperlink r:id="rId10" w:history="1">
+        <w:r>
+          <w:rPr>
+            <w:rStyle w:val="Hyperlink"/>
+            <w:rFonts w:ascii="Times New Roman" w:hAnsi="Times New Roman" w:cs="Times New Roman"/>
+          </w:rPr>
+          <w:t>https://docs.streamlit.io/develop/api-reference/status/st.warning</w:t>
+        </w:r>
+      </w:hyperlink>
+      <w:r>
+        <w:rPr>
+          <w:rFonts w:ascii="Times New Roman" w:hAnsi="Times New Roman" w:cs="Times New Roman"/>
+        </w:rPr>
+        <w:t xml:space="preserve"> </w:t>
+      </w:r>
+      <w:r>
+        <w:rPr>
+          <w:rFonts w:ascii="Times New Roman" w:hAnsi="Times New Roman" w:cs="Times New Roman"/>
+        </w:rPr>
+        <w:t>(Accessed: 26 April 2026).</w:t>
+      </w:r>
+    </w:p>
+    <w:p>
+      <w:pPr>
+        <w:rPr>
+          <w:rFonts w:ascii="Times New Roman" w:hAnsi="Times New Roman" w:cs="Times New Roman"/>
+        </w:rPr>
+      </w:pPr>
+      <w:r>
+        <w:rPr>
+          <w:rFonts w:ascii="Times New Roman" w:hAnsi="Times New Roman" w:cs="Times New Roman"/>
+        </w:rPr>
+        <w:t xml:space="preserve"> </w:t>
+      </w:r>
     </w:p>
     <w:sectPr>
       <w:pgSz w:w="11906" w:h="16838"/>
@@ -5998,7 +6279,6 @@
   <w:style w:type="character" w:default="1" w:styleId="DefaultParagraphFont">
     <w:name w:val="Default Paragraph Font"/>
     <w:uiPriority w:val="1"/>
-    <w:semiHidden/>
     <w:unhideWhenUsed/>
   </w:style>
   <w:style w:type="table" w:default="1" w:styleId="TableNormal">

</xml_diff>

<commit_message>
Report - links added
</commit_message>
<xml_diff>
--- a/w2149479_ShamlaAqthar_Report.docx
+++ b/w2149479_ShamlaAqthar_Report.docx
@@ -333,19 +333,6 @@
     </w:p>
     <w:p>
       <w:pPr>
-        <w:spacing w:line="360" w:lineRule="auto"/>
-        <w:jc w:val="center"/>
-        <w:rPr>
-          <w:rFonts w:ascii="Times New Roman" w:hAnsi="Times New Roman" w:cs="Times New Roman"/>
-          <w:b/>
-          <w:bCs/>
-          <w:sz w:val="44"/>
-          <w:szCs w:val="44"/>
-        </w:rPr>
-      </w:pPr>
-    </w:p>
-    <w:p>
-      <w:pPr>
         <w:spacing w:line="240" w:lineRule="auto"/>
         <w:jc w:val="left"/>
         <w:rPr>
@@ -356,7 +343,11 @@
           <w:szCs w:val="32"/>
         </w:rPr>
       </w:pPr>
-      <w:r>
+    </w:p>
+    <w:p>
+      <w:pPr>
+        <w:spacing w:line="240" w:lineRule="auto"/>
+        <w:jc w:val="left"/>
         <w:rPr>
           <w:rFonts w:ascii="Times New Roman" w:hAnsi="Times New Roman" w:cs="Times New Roman"/>
           <w:b/>
@@ -364,12 +355,11 @@
           <w:sz w:val="32"/>
           <w:szCs w:val="32"/>
         </w:rPr>
-        <w:t>Name: Shamla Aqthar</w:t>
-      </w:r>
-    </w:p>
-    <w:p>
-      <w:pPr>
-        <w:spacing w:line="240" w:lineRule="auto"/>
+      </w:pPr>
+    </w:p>
+    <w:p>
+      <w:pPr>
+        <w:spacing w:line="360" w:lineRule="auto"/>
         <w:jc w:val="left"/>
         <w:rPr>
           <w:rFonts w:ascii="Times New Roman" w:hAnsi="Times New Roman" w:cs="Times New Roman"/>
@@ -387,9 +377,13 @@
           <w:sz w:val="32"/>
           <w:szCs w:val="32"/>
         </w:rPr>
-        <w:t>Student</w:t>
-      </w:r>
-      <w:r>
+        <w:t>Name: Shamla Aqthar</w:t>
+      </w:r>
+    </w:p>
+    <w:p>
+      <w:pPr>
+        <w:spacing w:line="360" w:lineRule="auto"/>
+        <w:jc w:val="left"/>
         <w:rPr>
           <w:rFonts w:ascii="Times New Roman" w:hAnsi="Times New Roman" w:cs="Times New Roman"/>
           <w:b/>
@@ -397,8 +391,7 @@
           <w:sz w:val="32"/>
           <w:szCs w:val="32"/>
         </w:rPr>
-        <w:t xml:space="preserve"> Id: w2149479</w:t>
-      </w:r>
+      </w:pPr>
       <w:r>
         <w:rPr>
           <w:rFonts w:ascii="Times New Roman" w:hAnsi="Times New Roman" w:cs="Times New Roman"/>
@@ -407,7 +400,7 @@
           <w:sz w:val="32"/>
           <w:szCs w:val="32"/>
         </w:rPr>
-        <w:t xml:space="preserve"> / 20241956</w:t>
+        <w:t>Student</w:t>
       </w:r>
       <w:r>
         <w:rPr>
@@ -417,20 +410,23 @@
           <w:sz w:val="32"/>
           <w:szCs w:val="32"/>
         </w:rPr>
-        <w:br/>
-      </w:r>
-    </w:p>
-    <w:p>
-      <w:pPr>
-        <w:spacing w:line="240" w:lineRule="auto"/>
-        <w:jc w:val="left"/>
-        <w:rPr>
-          <w:rFonts w:ascii="Times New Roman" w:hAnsi="Times New Roman" w:cs="Times New Roman"/>
+        <w:t xml:space="preserve"> Id: w2149479</w:t>
+      </w:r>
+      <w:r>
+        <w:rPr>
+          <w:rFonts w:ascii="Times New Roman" w:hAnsi="Times New Roman" w:cs="Times New Roman"/>
+          <w:b/>
+          <w:bCs/>
           <w:sz w:val="32"/>
           <w:szCs w:val="32"/>
         </w:rPr>
-      </w:pPr>
-      <w:r>
+        <w:t xml:space="preserve"> / 20241956</w:t>
+      </w:r>
+    </w:p>
+    <w:p>
+      <w:pPr>
+        <w:spacing w:line="360" w:lineRule="auto"/>
+        <w:jc w:val="left"/>
         <w:rPr>
           <w:rFonts w:ascii="Times New Roman" w:hAnsi="Times New Roman" w:cs="Times New Roman"/>
           <w:b/>
@@ -438,147 +434,405 @@
           <w:sz w:val="32"/>
           <w:szCs w:val="32"/>
         </w:rPr>
+      </w:pPr>
+    </w:p>
+    <w:p>
+      <w:pPr>
+        <w:spacing w:line="360" w:lineRule="auto"/>
+        <w:jc w:val="left"/>
+        <w:rPr>
+          <w:rFonts w:ascii="Times New Roman" w:hAnsi="Times New Roman" w:cs="Times New Roman"/>
+          <w:sz w:val="28"/>
+          <w:szCs w:val="28"/>
+        </w:rPr>
+      </w:pPr>
+      <w:r>
+        <w:rPr>
+          <w:rFonts w:ascii="Times New Roman" w:hAnsi="Times New Roman" w:cs="Times New Roman"/>
+          <w:b/>
+          <w:bCs/>
+          <w:sz w:val="28"/>
+          <w:szCs w:val="28"/>
+        </w:rPr>
         <w:t xml:space="preserve">Dataset: </w:t>
       </w:r>
       <w:r>
         <w:rPr>
           <w:rFonts w:ascii="Times New Roman" w:hAnsi="Times New Roman" w:cs="Times New Roman"/>
-          <w:sz w:val="32"/>
-          <w:szCs w:val="32"/>
+          <w:sz w:val="28"/>
+          <w:szCs w:val="28"/>
         </w:rPr>
         <w:t>Internal displacements (new displacements) associated with disasters</w:t>
       </w:r>
     </w:p>
     <w:p>
       <w:pPr>
-        <w:spacing w:line="240" w:lineRule="auto"/>
+        <w:spacing w:line="360" w:lineRule="auto"/>
         <w:jc w:val="left"/>
         <w:rPr>
           <w:rFonts w:ascii="Times New Roman" w:hAnsi="Times New Roman" w:cs="Times New Roman"/>
           <w:b/>
           <w:bCs/>
-          <w:sz w:val="32"/>
-          <w:szCs w:val="32"/>
-        </w:rPr>
-      </w:pPr>
-      <w:r>
-        <w:rPr>
-          <w:rFonts w:ascii="Times New Roman" w:hAnsi="Times New Roman" w:cs="Times New Roman"/>
-          <w:b/>
-          <w:bCs/>
-          <w:sz w:val="32"/>
-          <w:szCs w:val="32"/>
+          <w:sz w:val="28"/>
+          <w:szCs w:val="28"/>
+        </w:rPr>
+      </w:pPr>
+      <w:r>
+        <w:rPr>
+          <w:rFonts w:ascii="Times New Roman" w:hAnsi="Times New Roman" w:cs="Times New Roman"/>
+          <w:b/>
+          <w:bCs/>
+          <w:sz w:val="28"/>
+          <w:szCs w:val="28"/>
+        </w:rPr>
+        <w:t>Video:</w:t>
+      </w:r>
+      <w:r>
+        <w:rPr>
+          <w:rFonts w:ascii="Times New Roman" w:hAnsi="Times New Roman" w:cs="Times New Roman"/>
+          <w:i/>
+          <w:iCs/>
+          <w:sz w:val="28"/>
+          <w:szCs w:val="28"/>
+        </w:rPr>
+        <w:fldChar w:fldCharType="begin"/>
+      </w:r>
+      <w:r>
+        <w:rPr>
+          <w:rFonts w:ascii="Times New Roman" w:hAnsi="Times New Roman" w:cs="Times New Roman"/>
+          <w:i/>
+          <w:iCs/>
+          <w:sz w:val="28"/>
+          <w:szCs w:val="28"/>
+        </w:rPr>
+        <w:instrText>HYPERLINK "</w:instrText>
+      </w:r>
+      <w:r>
+        <w:rPr>
+          <w:rFonts w:ascii="Times New Roman" w:hAnsi="Times New Roman" w:cs="Times New Roman"/>
+          <w:i/>
+          <w:iCs/>
+          <w:sz w:val="28"/>
+          <w:szCs w:val="28"/>
+        </w:rPr>
+        <w:instrText>https://drive.google.com/file/d/1VILwTeiUCL_UzqUplCj3fRxRU6k3bxNz/view?usp=sharing</w:instrText>
+      </w:r>
+      <w:r>
+        <w:rPr>
+          <w:rFonts w:ascii="Times New Roman" w:hAnsi="Times New Roman" w:cs="Times New Roman"/>
+          <w:i/>
+          <w:iCs/>
+          <w:sz w:val="28"/>
+          <w:szCs w:val="28"/>
+        </w:rPr>
+        <w:instrText>"</w:instrText>
+      </w:r>
+      <w:r>
+        <w:rPr>
+          <w:rFonts w:ascii="Times New Roman" w:hAnsi="Times New Roman" w:cs="Times New Roman"/>
+          <w:i/>
+          <w:iCs/>
+          <w:sz w:val="28"/>
+          <w:szCs w:val="28"/>
+        </w:rPr>
+        <w:fldChar w:fldCharType="separate"/>
+      </w:r>
+      <w:r>
+        <w:rPr>
+          <w:rStyle w:val="Hyperlink"/>
+          <w:rFonts w:ascii="Times New Roman" w:hAnsi="Times New Roman" w:cs="Times New Roman"/>
+          <w:i/>
+          <w:iCs/>
+          <w:sz w:val="28"/>
+          <w:szCs w:val="28"/>
+        </w:rPr>
+        <w:t>https://driv</w:t>
+      </w:r>
+      <w:r>
+        <w:rPr>
+          <w:rStyle w:val="Hyperlink"/>
+          <w:rFonts w:ascii="Times New Roman" w:hAnsi="Times New Roman" w:cs="Times New Roman"/>
+          <w:i/>
+          <w:iCs/>
+          <w:sz w:val="28"/>
+          <w:szCs w:val="28"/>
+        </w:rPr>
+        <w:t>e</w:t>
+      </w:r>
+      <w:r>
+        <w:rPr>
+          <w:rStyle w:val="Hyperlink"/>
+          <w:rFonts w:ascii="Times New Roman" w:hAnsi="Times New Roman" w:cs="Times New Roman"/>
+          <w:i/>
+          <w:iCs/>
+          <w:sz w:val="28"/>
+          <w:szCs w:val="28"/>
+        </w:rPr>
+        <w:t>.google.com/file/d/1VILwTeiUCL_UzqUplCj3fRxRU6k3bxNz/view?usp=sharing</w:t>
+      </w:r>
+      <w:r>
+        <w:rPr>
+          <w:rFonts w:ascii="Times New Roman" w:hAnsi="Times New Roman" w:cs="Times New Roman"/>
+          <w:i/>
+          <w:iCs/>
+          <w:sz w:val="28"/>
+          <w:szCs w:val="28"/>
+        </w:rPr>
+        <w:fldChar w:fldCharType="end"/>
+      </w:r>
+      <w:r>
+        <w:rPr>
+          <w:rFonts w:ascii="Times New Roman" w:hAnsi="Times New Roman" w:cs="Times New Roman"/>
+          <w:sz w:val="28"/>
+          <w:szCs w:val="28"/>
+        </w:rPr>
+        <w:t xml:space="preserve"> </w:t>
+      </w:r>
+      <w:r>
+        <w:rPr>
+          <w:rFonts w:ascii="Times New Roman" w:hAnsi="Times New Roman" w:cs="Times New Roman"/>
+          <w:sz w:val="28"/>
+          <w:szCs w:val="28"/>
+        </w:rPr>
+        <w:t xml:space="preserve"> </w:t>
+      </w:r>
+      <w:r>
+        <w:rPr>
+          <w:rFonts w:ascii="Times New Roman" w:hAnsi="Times New Roman" w:cs="Times New Roman"/>
+          <w:sz w:val="28"/>
+          <w:szCs w:val="28"/>
+        </w:rPr>
+        <w:t xml:space="preserve"> </w:t>
+      </w:r>
+      <w:r>
+        <w:rPr>
+          <w:rFonts w:ascii="Times New Roman" w:hAnsi="Times New Roman" w:cs="Times New Roman"/>
+          <w:b/>
+          <w:bCs/>
+          <w:sz w:val="28"/>
+          <w:szCs w:val="28"/>
+        </w:rPr>
+        <w:t xml:space="preserve"> </w:t>
+      </w:r>
+      <w:r>
+        <w:rPr>
+          <w:rFonts w:ascii="Times New Roman" w:hAnsi="Times New Roman" w:cs="Times New Roman"/>
+          <w:b/>
+          <w:bCs/>
+          <w:sz w:val="28"/>
+          <w:szCs w:val="28"/>
+        </w:rPr>
+        <w:t xml:space="preserve"> </w:t>
+      </w:r>
+      <w:r>
+        <w:rPr>
+          <w:rFonts w:ascii="Times New Roman" w:hAnsi="Times New Roman" w:cs="Times New Roman"/>
+          <w:b/>
+          <w:bCs/>
+          <w:sz w:val="28"/>
+          <w:szCs w:val="28"/>
+        </w:rPr>
+        <w:t xml:space="preserve"> </w:t>
+      </w:r>
+    </w:p>
+    <w:p>
+      <w:pPr>
+        <w:spacing w:line="360" w:lineRule="auto"/>
+        <w:jc w:val="left"/>
+        <w:rPr>
+          <w:rFonts w:ascii="Times New Roman" w:hAnsi="Times New Roman" w:cs="Times New Roman"/>
+          <w:b/>
+          <w:bCs/>
+          <w:sz w:val="28"/>
+          <w:szCs w:val="28"/>
+        </w:rPr>
+      </w:pPr>
+      <w:r>
+        <w:rPr>
+          <w:rFonts w:ascii="Times New Roman" w:hAnsi="Times New Roman" w:cs="Times New Roman"/>
+          <w:b/>
+          <w:bCs/>
+          <w:sz w:val="28"/>
+          <w:szCs w:val="28"/>
+        </w:rPr>
+        <w:t>Streamlit:</w:t>
+      </w:r>
+      <w:r>
+        <w:rPr>
+          <w:rFonts w:ascii="Times New Roman" w:hAnsi="Times New Roman" w:cs="Times New Roman"/>
+          <w:i/>
+          <w:iCs/>
+          <w:sz w:val="28"/>
+          <w:szCs w:val="28"/>
+        </w:rPr>
+        <w:fldChar w:fldCharType="begin"/>
+      </w:r>
+      <w:r>
+        <w:rPr>
+          <w:rFonts w:ascii="Times New Roman" w:hAnsi="Times New Roman" w:cs="Times New Roman"/>
+          <w:i/>
+          <w:iCs/>
+          <w:sz w:val="28"/>
+          <w:szCs w:val="28"/>
+        </w:rPr>
+        <w:instrText>HYPERLINK "</w:instrText>
+      </w:r>
+      <w:r>
+        <w:rPr>
+          <w:rFonts w:ascii="Times New Roman" w:hAnsi="Times New Roman" w:cs="Times New Roman"/>
+          <w:i/>
+          <w:iCs/>
+          <w:sz w:val="28"/>
+          <w:szCs w:val="28"/>
+        </w:rPr>
+        <w:instrText>https://disasterdisplacementanalysisdashboard.streamlit.app/</w:instrText>
+      </w:r>
+      <w:r>
+        <w:rPr>
+          <w:rFonts w:ascii="Times New Roman" w:hAnsi="Times New Roman" w:cs="Times New Roman"/>
+          <w:i/>
+          <w:iCs/>
+          <w:sz w:val="28"/>
+          <w:szCs w:val="28"/>
+        </w:rPr>
+        <w:instrText>"</w:instrText>
+      </w:r>
+      <w:r>
+        <w:rPr>
+          <w:rFonts w:ascii="Times New Roman" w:hAnsi="Times New Roman" w:cs="Times New Roman"/>
+          <w:i/>
+          <w:iCs/>
+          <w:sz w:val="28"/>
+          <w:szCs w:val="28"/>
+        </w:rPr>
+        <w:fldChar w:fldCharType="separate"/>
+      </w:r>
+      <w:r>
+        <w:rPr>
+          <w:rStyle w:val="Hyperlink"/>
+          <w:rFonts w:ascii="Times New Roman" w:hAnsi="Times New Roman" w:cs="Times New Roman"/>
+          <w:i/>
+          <w:iCs/>
+          <w:sz w:val="28"/>
+          <w:szCs w:val="28"/>
+        </w:rPr>
+        <w:t>https://disasterdisplacementanalysisdashboard.streamlit.app/</w:t>
+      </w:r>
+      <w:r>
+        <w:rPr>
+          <w:rFonts w:ascii="Times New Roman" w:hAnsi="Times New Roman" w:cs="Times New Roman"/>
+          <w:i/>
+          <w:iCs/>
+          <w:sz w:val="28"/>
+          <w:szCs w:val="28"/>
+        </w:rPr>
+        <w:fldChar w:fldCharType="end"/>
+      </w:r>
+      <w:r>
+        <w:rPr>
+          <w:rFonts w:ascii="Times New Roman" w:hAnsi="Times New Roman" w:cs="Times New Roman"/>
+          <w:b/>
+          <w:bCs/>
+          <w:sz w:val="28"/>
+          <w:szCs w:val="28"/>
+        </w:rPr>
+        <w:t xml:space="preserve"> </w:t>
+      </w:r>
+    </w:p>
+    <w:p>
+      <w:pPr>
+        <w:spacing w:line="360" w:lineRule="auto"/>
+        <w:jc w:val="left"/>
+        <w:rPr>
+          <w:rFonts w:ascii="Times New Roman" w:hAnsi="Times New Roman" w:cs="Times New Roman"/>
+          <w:b/>
+          <w:bCs/>
+          <w:sz w:val="28"/>
+          <w:szCs w:val="28"/>
+        </w:rPr>
+      </w:pPr>
+      <w:r>
+        <w:rPr>
+          <w:rFonts w:ascii="Times New Roman" w:hAnsi="Times New Roman" w:cs="Times New Roman"/>
+          <w:b/>
+          <w:bCs/>
+          <w:sz w:val="28"/>
+          <w:szCs w:val="28"/>
         </w:rPr>
         <w:t>GitHub:</w:t>
       </w:r>
-    </w:p>
-    <w:p>
-      <w:pPr>
-        <w:spacing w:line="240" w:lineRule="auto"/>
+      <w:r>
+        <w:rPr>
+          <w:rFonts w:ascii="Times New Roman" w:hAnsi="Times New Roman" w:cs="Times New Roman"/>
+          <w:i/>
+          <w:iCs/>
+          <w:sz w:val="28"/>
+          <w:szCs w:val="28"/>
+        </w:rPr>
+        <w:fldChar w:fldCharType="begin"/>
+      </w:r>
+      <w:r>
+        <w:rPr>
+          <w:rFonts w:ascii="Times New Roman" w:hAnsi="Times New Roman" w:cs="Times New Roman"/>
+          <w:i/>
+          <w:iCs/>
+          <w:sz w:val="28"/>
+          <w:szCs w:val="28"/>
+        </w:rPr>
+        <w:instrText>HYPERLINK "https://github.com/ShamlaAqthar19/w2149479_Disaster_Displacement_Dashboard"</w:instrText>
+      </w:r>
+      <w:r>
+        <w:rPr>
+          <w:rFonts w:ascii="Times New Roman" w:hAnsi="Times New Roman" w:cs="Times New Roman"/>
+          <w:i/>
+          <w:iCs/>
+          <w:sz w:val="28"/>
+          <w:szCs w:val="28"/>
+        </w:rPr>
+        <w:fldChar w:fldCharType="separate"/>
+      </w:r>
+      <w:r>
+        <w:rPr>
+          <w:rStyle w:val="Hyperlink"/>
+          <w:rFonts w:ascii="Times New Roman" w:hAnsi="Times New Roman" w:cs="Times New Roman"/>
+          <w:i/>
+          <w:iCs/>
+          <w:sz w:val="28"/>
+          <w:szCs w:val="28"/>
+        </w:rPr>
+        <w:t>https://github.com/ShamlaAqthar19/w2149479_Disaster_Displacement_Dashboard</w:t>
+      </w:r>
+      <w:r>
+        <w:rPr>
+          <w:rFonts w:ascii="Times New Roman" w:hAnsi="Times New Roman" w:cs="Times New Roman"/>
+          <w:i/>
+          <w:iCs/>
+          <w:sz w:val="28"/>
+          <w:szCs w:val="28"/>
+        </w:rPr>
+        <w:fldChar w:fldCharType="end"/>
+      </w:r>
+      <w:r>
+        <w:rPr>
+          <w:rFonts w:ascii="Times New Roman" w:hAnsi="Times New Roman" w:cs="Times New Roman"/>
+          <w:b/>
+          <w:bCs/>
+          <w:sz w:val="28"/>
+          <w:szCs w:val="28"/>
+        </w:rPr>
+        <w:t xml:space="preserve"> </w:t>
+      </w:r>
+    </w:p>
+    <w:p>
+      <w:pPr>
+        <w:spacing w:line="360" w:lineRule="auto"/>
         <w:jc w:val="left"/>
         <w:rPr>
           <w:rFonts w:ascii="Times New Roman" w:hAnsi="Times New Roman" w:cs="Times New Roman"/>
           <w:b/>
           <w:bCs/>
-          <w:sz w:val="32"/>
-          <w:szCs w:val="32"/>
-        </w:rPr>
-      </w:pPr>
-      <w:r>
-        <w:rPr>
-          <w:rFonts w:ascii="Times New Roman" w:hAnsi="Times New Roman" w:cs="Times New Roman"/>
-          <w:b/>
-          <w:bCs/>
-          <w:sz w:val="32"/>
-          <w:szCs w:val="32"/>
-        </w:rPr>
-        <w:t>Video:</w:t>
-      </w:r>
-    </w:p>
-    <w:p>
-      <w:pPr>
-        <w:spacing w:line="240" w:lineRule="auto"/>
-        <w:jc w:val="left"/>
-        <w:rPr>
-          <w:rFonts w:ascii="Times New Roman" w:hAnsi="Times New Roman" w:cs="Times New Roman"/>
-          <w:b/>
-          <w:bCs/>
-          <w:sz w:val="32"/>
-          <w:szCs w:val="32"/>
-        </w:rPr>
-      </w:pPr>
-      <w:proofErr w:type="spellStart"/>
-      <w:r>
-        <w:rPr>
-          <w:rFonts w:ascii="Times New Roman" w:hAnsi="Times New Roman" w:cs="Times New Roman"/>
-          <w:b/>
-          <w:bCs/>
-          <w:sz w:val="32"/>
-          <w:szCs w:val="32"/>
-        </w:rPr>
-        <w:t>Streamlit</w:t>
-      </w:r>
-      <w:proofErr w:type="spellEnd"/>
-      <w:r>
-        <w:rPr>
-          <w:rFonts w:ascii="Times New Roman" w:hAnsi="Times New Roman" w:cs="Times New Roman"/>
-          <w:b/>
-          <w:bCs/>
-          <w:sz w:val="32"/>
-          <w:szCs w:val="32"/>
-        </w:rPr>
-        <w:t xml:space="preserve">: </w:t>
-      </w:r>
-    </w:p>
-    <w:p>
-      <w:pPr>
-        <w:spacing w:line="240" w:lineRule="auto"/>
-        <w:jc w:val="left"/>
-        <w:rPr>
-          <w:rFonts w:ascii="Times New Roman" w:hAnsi="Times New Roman" w:cs="Times New Roman"/>
-          <w:b/>
-          <w:bCs/>
-          <w:sz w:val="36"/>
-          <w:szCs w:val="36"/>
-        </w:rPr>
-      </w:pPr>
-    </w:p>
-    <w:p>
-      <w:pPr>
-        <w:spacing w:line="240" w:lineRule="auto"/>
-        <w:jc w:val="left"/>
-        <w:rPr>
-          <w:rFonts w:ascii="Times New Roman" w:hAnsi="Times New Roman" w:cs="Times New Roman"/>
-          <w:b/>
-          <w:bCs/>
-          <w:sz w:val="36"/>
-          <w:szCs w:val="36"/>
-        </w:rPr>
-      </w:pPr>
-    </w:p>
-    <w:p>
-      <w:pPr>
-        <w:spacing w:line="240" w:lineRule="auto"/>
-        <w:jc w:val="left"/>
-        <w:rPr>
-          <w:rFonts w:ascii="Times New Roman" w:hAnsi="Times New Roman" w:cs="Times New Roman"/>
-          <w:b/>
-          <w:bCs/>
-          <w:sz w:val="36"/>
-          <w:szCs w:val="36"/>
-        </w:rPr>
-      </w:pPr>
-    </w:p>
-    <w:p>
-      <w:pPr>
-        <w:spacing w:line="240" w:lineRule="auto"/>
-        <w:jc w:val="left"/>
-        <w:rPr>
-          <w:rFonts w:ascii="Times New Roman" w:hAnsi="Times New Roman" w:cs="Times New Roman"/>
-          <w:b/>
-          <w:bCs/>
-          <w:sz w:val="36"/>
-          <w:szCs w:val="36"/>
+          <w:sz w:val="28"/>
+          <w:szCs w:val="28"/>
         </w:rPr>
       </w:pPr>
     </w:p>
@@ -663,13 +917,23 @@
           <w:b/>
           <w:bCs/>
         </w:rPr>
-        <w:t xml:space="preserve">Source link: </w:t>
+        <w:t>Source link:</w:t>
+      </w:r>
+      <w:r>
+        <w:rPr>
+          <w:rFonts w:ascii="Times New Roman" w:hAnsi="Times New Roman" w:cs="Times New Roman"/>
+          <w:b/>
+          <w:bCs/>
+        </w:rPr>
+        <w:t xml:space="preserve"> </w:t>
       </w:r>
       <w:hyperlink r:id="rId8" w:history="1">
         <w:r>
           <w:rPr>
             <w:rStyle w:val="Hyperlink"/>
             <w:rFonts w:ascii="Times New Roman" w:hAnsi="Times New Roman" w:cs="Times New Roman"/>
+            <w:i/>
+            <w:iCs/>
           </w:rPr>
           <w:t>https://data.humdata.org/dataset/idmc-internal-displacements-new-displacements-associated-with-disasters</w:t>
         </w:r>
@@ -4434,10 +4698,10 @@
       <w:tblGrid>
         <w:gridCol w:w="560"/>
         <w:gridCol w:w="1310"/>
-        <w:gridCol w:w="1609"/>
-        <w:gridCol w:w="2777"/>
+        <w:gridCol w:w="1593"/>
+        <w:gridCol w:w="2731"/>
         <w:gridCol w:w="1137"/>
-        <w:gridCol w:w="1623"/>
+        <w:gridCol w:w="1685"/>
       </w:tblGrid>
       <w:tr>
         <w:trPr>
@@ -4969,7 +5233,19 @@
               <w:rPr>
                 <w:rFonts w:ascii="Times New Roman" w:hAnsi="Times New Roman" w:cs="Times New Roman"/>
               </w:rPr>
-              <w:t>) and explicit top 5 filtering logic</w:t>
+              <w:t>)</w:t>
+            </w:r>
+            <w:r>
+              <w:rPr>
+                <w:rFonts w:ascii="Times New Roman" w:hAnsi="Times New Roman" w:cs="Times New Roman"/>
+              </w:rPr>
+              <w:t>’</w:t>
+            </w:r>
+            <w:r>
+              <w:rPr>
+                <w:rFonts w:ascii="Times New Roman" w:hAnsi="Times New Roman" w:cs="Times New Roman"/>
+              </w:rPr>
+              <w:t xml:space="preserve"> and explicit top 5 filtering logic</w:t>
             </w:r>
           </w:p>
         </w:tc>
@@ -5260,24 +5536,41 @@
     </w:p>
     <w:p>
       <w:pPr>
-        <w:rPr>
-          <w:rFonts w:ascii="Times New Roman" w:hAnsi="Times New Roman" w:cs="Times New Roman"/>
-        </w:rPr>
-      </w:pPr>
+        <w:pStyle w:val="NormalWeb"/>
+        <w:spacing w:before="0" w:beforeAutospacing="0" w:after="240" w:afterAutospacing="0" w:line="360" w:lineRule="auto"/>
+      </w:pPr>
+      <w:r>
+        <w:t xml:space="preserve">Build a </w:t>
+      </w:r>
+      <w:proofErr w:type="spellStart"/>
+      <w:r>
+        <w:t>Streamlit</w:t>
+      </w:r>
+      <w:proofErr w:type="spellEnd"/>
+      <w:r>
+        <w:t xml:space="preserve"> Dashboard app in Python (2026) </w:t>
+      </w:r>
+      <w:proofErr w:type="spellStart"/>
+      <w:r>
+        <w:t>Youtube</w:t>
+      </w:r>
+      <w:proofErr w:type="spellEnd"/>
+      <w:r>
+        <w:t xml:space="preserve">. Available at: </w:t>
+      </w:r>
       <w:hyperlink r:id="rId9" w:history="1">
         <w:r>
           <w:rPr>
             <w:rStyle w:val="Hyperlink"/>
-            <w:rFonts w:ascii="Times New Roman" w:hAnsi="Times New Roman" w:cs="Times New Roman"/>
           </w:rPr>
           <w:t>https://youtu.be/p2pXpcXPoGk?si=NBl_UOEIX-aM8y0g</w:t>
         </w:r>
       </w:hyperlink>
       <w:r>
-        <w:rPr>
-          <w:rFonts w:ascii="Times New Roman" w:hAnsi="Times New Roman" w:cs="Times New Roman"/>
-        </w:rPr>
-        <w:t xml:space="preserve">  </w:t>
+        <w:t xml:space="preserve"> </w:t>
+      </w:r>
+      <w:r>
+        <w:t xml:space="preserve"> (Accessed: 18 April 2026).</w:t>
       </w:r>
     </w:p>
     <w:p>
@@ -5291,8 +5584,6 @@
       <w:r>
         <w:rPr>
           <w:rFonts w:ascii="Times New Roman" w:hAnsi="Times New Roman" w:cs="Times New Roman"/>
-          <w:i/>
-          <w:iCs/>
         </w:rPr>
         <w:t>st.warning</w:t>
       </w:r>
@@ -5301,8 +5592,6 @@
       <w:r>
         <w:rPr>
           <w:rFonts w:ascii="Times New Roman" w:hAnsi="Times New Roman" w:cs="Times New Roman"/>
-          <w:i/>
-          <w:iCs/>
         </w:rPr>
         <w:t xml:space="preserve"> - </w:t>
       </w:r>
@@ -5310,8 +5599,6 @@
       <w:r>
         <w:rPr>
           <w:rFonts w:ascii="Times New Roman" w:hAnsi="Times New Roman" w:cs="Times New Roman"/>
-          <w:i/>
-          <w:iCs/>
         </w:rPr>
         <w:t>Streamlit</w:t>
       </w:r>
@@ -5319,30 +5606,8 @@
       <w:r>
         <w:rPr>
           <w:rFonts w:ascii="Times New Roman" w:hAnsi="Times New Roman" w:cs="Times New Roman"/>
-          <w:i/>
-          <w:iCs/>
-        </w:rPr>
-        <w:t xml:space="preserve"> Docs</w:t>
-      </w:r>
-      <w:r>
-        <w:rPr>
-          <w:rFonts w:ascii="Times New Roman" w:hAnsi="Times New Roman" w:cs="Times New Roman"/>
-        </w:rPr>
-        <w:t xml:space="preserve"> (2025) </w:t>
-      </w:r>
-      <w:r>
-        <w:rPr>
-          <w:rFonts w:ascii="Times New Roman" w:hAnsi="Times New Roman" w:cs="Times New Roman"/>
-          <w:i/>
-          <w:iCs/>
-        </w:rPr>
-        <w:t>Streamlit.io</w:t>
-      </w:r>
-      <w:r>
-        <w:rPr>
-          <w:rFonts w:ascii="Times New Roman" w:hAnsi="Times New Roman" w:cs="Times New Roman"/>
-        </w:rPr>
-        <w:t xml:space="preserve">. Available at: </w:t>
+        </w:rPr>
+        <w:t xml:space="preserve"> Docs (2025) Streamlit.io. Available at: </w:t>
       </w:r>
       <w:hyperlink r:id="rId10" w:history="1">
         <w:r>
@@ -6988,6 +7253,36 @@
       <w:shd w:val="clear" w:color="auto" w:fill="E1DFDD"/>
     </w:rPr>
   </w:style>
+  <w:style w:type="character" w:styleId="FollowedHyperlink">
+    <w:name w:val="FollowedHyperlink"/>
+    <w:basedOn w:val="DefaultParagraphFont"/>
+    <w:uiPriority w:val="99"/>
+    <w:semiHidden/>
+    <w:unhideWhenUsed/>
+    <w:rsid w:val="00D33C9D"/>
+    <w:rPr>
+      <w:color w:val="96607D" w:themeColor="followedHyperlink"/>
+      <w:u w:val="single"/>
+    </w:rPr>
+  </w:style>
+  <w:style w:type="paragraph" w:styleId="NormalWeb">
+    <w:name w:val="Normal (Web)"/>
+    <w:basedOn w:val="Normal"/>
+    <w:uiPriority w:val="99"/>
+    <w:semiHidden/>
+    <w:unhideWhenUsed/>
+    <w:rsid w:val="008911D0"/>
+    <w:pPr>
+      <w:spacing w:before="100" w:beforeAutospacing="1" w:after="100" w:afterAutospacing="1" w:line="240" w:lineRule="auto"/>
+      <w:jc w:val="left"/>
+    </w:pPr>
+    <w:rPr>
+      <w:rFonts w:ascii="Times New Roman" w:eastAsia="Times New Roman" w:hAnsi="Times New Roman" w:cs="Times New Roman"/>
+      <w:kern w:val="0"/>
+      <w:lang w:eastAsia="en-GB"/>
+      <w14:ligatures w14:val="none"/>
+    </w:rPr>
+  </w:style>
 </w:styles>
 </file>
 

</xml_diff>

<commit_message>
Report - Final Adjustments
</commit_message>
<xml_diff>
--- a/w2149479_ShamlaAqthar_Report.docx
+++ b/w2149479_ShamlaAqthar_Report.docx
@@ -108,7 +108,7 @@
           <w:noProof/>
         </w:rPr>
         <w:drawing>
-          <wp:anchor distT="0" distB="0" distL="114300" distR="114300" simplePos="0" relativeHeight="251660288" behindDoc="0" locked="0" layoutInCell="1" allowOverlap="1" wp14:anchorId="27BD4142" wp14:editId="6FFA9837">
+          <wp:anchor distT="0" distB="0" distL="114300" distR="114300" simplePos="0" relativeHeight="251660288" behindDoc="0" locked="0" layoutInCell="1" allowOverlap="1" wp14:anchorId="27BD4142" wp14:editId="641517E9">
             <wp:simplePos x="0" y="0"/>
             <wp:positionH relativeFrom="column">
               <wp:posOffset>-152400</wp:posOffset>
@@ -487,353 +487,151 @@
         </w:rPr>
         <w:t>Video:</w:t>
       </w:r>
-      <w:r>
-        <w:rPr>
-          <w:rFonts w:ascii="Times New Roman" w:hAnsi="Times New Roman" w:cs="Times New Roman"/>
-          <w:i/>
-          <w:iCs/>
+      <w:hyperlink r:id="rId8" w:history="1">
+        <w:r>
+          <w:rPr>
+            <w:rStyle w:val="Hyperlink"/>
+            <w:rFonts w:ascii="Times New Roman" w:hAnsi="Times New Roman" w:cs="Times New Roman"/>
+            <w:i/>
+            <w:iCs/>
+            <w:sz w:val="28"/>
+            <w:szCs w:val="28"/>
+          </w:rPr>
+          <w:t>https://drive.google.com/file/d/1VILwTeiUCL_UzqUplCj3fRxRU6k3bxNz/view?usp=sharing</w:t>
+        </w:r>
+      </w:hyperlink>
+      <w:r>
+        <w:rPr>
+          <w:rFonts w:ascii="Times New Roman" w:hAnsi="Times New Roman" w:cs="Times New Roman"/>
           <w:sz w:val="28"/>
           <w:szCs w:val="28"/>
         </w:rPr>
-        <w:fldChar w:fldCharType="begin"/>
-      </w:r>
-      <w:r>
-        <w:rPr>
-          <w:rFonts w:ascii="Times New Roman" w:hAnsi="Times New Roman" w:cs="Times New Roman"/>
-          <w:i/>
-          <w:iCs/>
+        <w:t xml:space="preserve">   </w:t>
+      </w:r>
+      <w:r>
+        <w:rPr>
+          <w:rFonts w:ascii="Times New Roman" w:hAnsi="Times New Roman" w:cs="Times New Roman"/>
+          <w:b/>
+          <w:bCs/>
           <w:sz w:val="28"/>
           <w:szCs w:val="28"/>
         </w:rPr>
-        <w:instrText>HYPERLINK "</w:instrText>
-      </w:r>
-      <w:r>
-        <w:rPr>
-          <w:rFonts w:ascii="Times New Roman" w:hAnsi="Times New Roman" w:cs="Times New Roman"/>
-          <w:i/>
-          <w:iCs/>
+        <w:t xml:space="preserve"> </w:t>
+      </w:r>
+      <w:r>
+        <w:rPr>
+          <w:rFonts w:ascii="Times New Roman" w:hAnsi="Times New Roman" w:cs="Times New Roman"/>
+          <w:b/>
+          <w:bCs/>
           <w:sz w:val="28"/>
           <w:szCs w:val="28"/>
         </w:rPr>
-        <w:instrText>https://drive.google.com/file/d/1VILwTeiUCL_UzqUplCj3fRxRU6k3bxNz/view?usp=sharing</w:instrText>
-      </w:r>
-      <w:r>
-        <w:rPr>
-          <w:rFonts w:ascii="Times New Roman" w:hAnsi="Times New Roman" w:cs="Times New Roman"/>
-          <w:i/>
-          <w:iCs/>
+        <w:t xml:space="preserve">  </w:t>
+      </w:r>
+    </w:p>
+    <w:p>
+      <w:pPr>
+        <w:spacing w:line="360" w:lineRule="auto"/>
+        <w:jc w:val="left"/>
+        <w:rPr>
+          <w:rFonts w:ascii="Times New Roman" w:hAnsi="Times New Roman" w:cs="Times New Roman"/>
+          <w:b/>
+          <w:bCs/>
           <w:sz w:val="28"/>
           <w:szCs w:val="28"/>
         </w:rPr>
-        <w:instrText>"</w:instrText>
-      </w:r>
-      <w:r>
-        <w:rPr>
-          <w:rFonts w:ascii="Times New Roman" w:hAnsi="Times New Roman" w:cs="Times New Roman"/>
-          <w:i/>
-          <w:iCs/>
+      </w:pPr>
+      <w:r>
+        <w:rPr>
+          <w:rFonts w:ascii="Times New Roman" w:hAnsi="Times New Roman" w:cs="Times New Roman"/>
+          <w:b/>
+          <w:bCs/>
           <w:sz w:val="28"/>
           <w:szCs w:val="28"/>
         </w:rPr>
-        <w:fldChar w:fldCharType="separate"/>
-      </w:r>
-      <w:r>
-        <w:rPr>
-          <w:rStyle w:val="Hyperlink"/>
-          <w:rFonts w:ascii="Times New Roman" w:hAnsi="Times New Roman" w:cs="Times New Roman"/>
-          <w:i/>
-          <w:iCs/>
+        <w:t>Streamlit:</w:t>
+      </w:r>
+      <w:hyperlink r:id="rId9" w:history="1">
+        <w:r>
+          <w:rPr>
+            <w:rStyle w:val="Hyperlink"/>
+            <w:rFonts w:ascii="Times New Roman" w:hAnsi="Times New Roman" w:cs="Times New Roman"/>
+            <w:i/>
+            <w:iCs/>
+            <w:sz w:val="28"/>
+            <w:szCs w:val="28"/>
+          </w:rPr>
+          <w:t>https://disasterdisplacementanalysisdashboard.streamlit.app/</w:t>
+        </w:r>
+      </w:hyperlink>
+      <w:r>
+        <w:rPr>
+          <w:rFonts w:ascii="Times New Roman" w:hAnsi="Times New Roman" w:cs="Times New Roman"/>
+          <w:b/>
+          <w:bCs/>
           <w:sz w:val="28"/>
           <w:szCs w:val="28"/>
         </w:rPr>
-        <w:t>https://driv</w:t>
-      </w:r>
-      <w:r>
-        <w:rPr>
-          <w:rStyle w:val="Hyperlink"/>
-          <w:rFonts w:ascii="Times New Roman" w:hAnsi="Times New Roman" w:cs="Times New Roman"/>
-          <w:i/>
-          <w:iCs/>
+        <w:t xml:space="preserve"> </w:t>
+      </w:r>
+    </w:p>
+    <w:p>
+      <w:pPr>
+        <w:spacing w:line="360" w:lineRule="auto"/>
+        <w:jc w:val="left"/>
+        <w:rPr>
+          <w:rFonts w:ascii="Times New Roman" w:hAnsi="Times New Roman" w:cs="Times New Roman"/>
+          <w:b/>
+          <w:bCs/>
           <w:sz w:val="28"/>
           <w:szCs w:val="28"/>
         </w:rPr>
-        <w:t>e</w:t>
-      </w:r>
-      <w:r>
-        <w:rPr>
-          <w:rStyle w:val="Hyperlink"/>
-          <w:rFonts w:ascii="Times New Roman" w:hAnsi="Times New Roman" w:cs="Times New Roman"/>
-          <w:i/>
-          <w:iCs/>
+      </w:pPr>
+      <w:r>
+        <w:rPr>
+          <w:rFonts w:ascii="Times New Roman" w:hAnsi="Times New Roman" w:cs="Times New Roman"/>
+          <w:b/>
+          <w:bCs/>
           <w:sz w:val="28"/>
           <w:szCs w:val="28"/>
         </w:rPr>
-        <w:t>.google.com/file/d/1VILwTeiUCL_UzqUplCj3fRxRU6k3bxNz/view?usp=sharing</w:t>
-      </w:r>
-      <w:r>
-        <w:rPr>
-          <w:rFonts w:ascii="Times New Roman" w:hAnsi="Times New Roman" w:cs="Times New Roman"/>
-          <w:i/>
-          <w:iCs/>
+        <w:t>GitHub:</w:t>
+      </w:r>
+      <w:hyperlink r:id="rId10" w:history="1">
+        <w:r>
+          <w:rPr>
+            <w:rStyle w:val="Hyperlink"/>
+            <w:rFonts w:ascii="Times New Roman" w:hAnsi="Times New Roman" w:cs="Times New Roman"/>
+            <w:i/>
+            <w:iCs/>
+            <w:sz w:val="28"/>
+            <w:szCs w:val="28"/>
+          </w:rPr>
+          <w:t>https://github.com/ShamlaAqthar19/w2149479_Disaster_Displacement_Dashboard</w:t>
+        </w:r>
+      </w:hyperlink>
+      <w:r>
+        <w:rPr>
+          <w:rFonts w:ascii="Times New Roman" w:hAnsi="Times New Roman" w:cs="Times New Roman"/>
+          <w:b/>
+          <w:bCs/>
           <w:sz w:val="28"/>
           <w:szCs w:val="28"/>
         </w:rPr>
-        <w:fldChar w:fldCharType="end"/>
-      </w:r>
-      <w:r>
-        <w:rPr>
-          <w:rFonts w:ascii="Times New Roman" w:hAnsi="Times New Roman" w:cs="Times New Roman"/>
+        <w:t xml:space="preserve"> </w:t>
+      </w:r>
+    </w:p>
+    <w:p>
+      <w:pPr>
+        <w:spacing w:line="360" w:lineRule="auto"/>
+        <w:jc w:val="left"/>
+        <w:rPr>
+          <w:rFonts w:ascii="Times New Roman" w:hAnsi="Times New Roman" w:cs="Times New Roman"/>
+          <w:b/>
+          <w:bCs/>
           <w:sz w:val="28"/>
           <w:szCs w:val="28"/>
         </w:rPr>
-        <w:t xml:space="preserve"> </w:t>
-      </w:r>
-      <w:r>
-        <w:rPr>
-          <w:rFonts w:ascii="Times New Roman" w:hAnsi="Times New Roman" w:cs="Times New Roman"/>
-          <w:sz w:val="28"/>
-          <w:szCs w:val="28"/>
-        </w:rPr>
-        <w:t xml:space="preserve"> </w:t>
-      </w:r>
-      <w:r>
-        <w:rPr>
-          <w:rFonts w:ascii="Times New Roman" w:hAnsi="Times New Roman" w:cs="Times New Roman"/>
-          <w:sz w:val="28"/>
-          <w:szCs w:val="28"/>
-        </w:rPr>
-        <w:t xml:space="preserve"> </w:t>
-      </w:r>
-      <w:r>
-        <w:rPr>
-          <w:rFonts w:ascii="Times New Roman" w:hAnsi="Times New Roman" w:cs="Times New Roman"/>
-          <w:b/>
-          <w:bCs/>
-          <w:sz w:val="28"/>
-          <w:szCs w:val="28"/>
-        </w:rPr>
-        <w:t xml:space="preserve"> </w:t>
-      </w:r>
-      <w:r>
-        <w:rPr>
-          <w:rFonts w:ascii="Times New Roman" w:hAnsi="Times New Roman" w:cs="Times New Roman"/>
-          <w:b/>
-          <w:bCs/>
-          <w:sz w:val="28"/>
-          <w:szCs w:val="28"/>
-        </w:rPr>
-        <w:t xml:space="preserve"> </w:t>
-      </w:r>
-      <w:r>
-        <w:rPr>
-          <w:rFonts w:ascii="Times New Roman" w:hAnsi="Times New Roman" w:cs="Times New Roman"/>
-          <w:b/>
-          <w:bCs/>
-          <w:sz w:val="28"/>
-          <w:szCs w:val="28"/>
-        </w:rPr>
-        <w:t xml:space="preserve"> </w:t>
-      </w:r>
-    </w:p>
-    <w:p>
-      <w:pPr>
-        <w:spacing w:line="360" w:lineRule="auto"/>
-        <w:jc w:val="left"/>
-        <w:rPr>
-          <w:rFonts w:ascii="Times New Roman" w:hAnsi="Times New Roman" w:cs="Times New Roman"/>
-          <w:b/>
-          <w:bCs/>
-          <w:sz w:val="28"/>
-          <w:szCs w:val="28"/>
-        </w:rPr>
-      </w:pPr>
-      <w:r>
-        <w:rPr>
-          <w:rFonts w:ascii="Times New Roman" w:hAnsi="Times New Roman" w:cs="Times New Roman"/>
-          <w:b/>
-          <w:bCs/>
-          <w:sz w:val="28"/>
-          <w:szCs w:val="28"/>
-        </w:rPr>
-        <w:t>Streamlit:</w:t>
-      </w:r>
-      <w:r>
-        <w:rPr>
-          <w:rFonts w:ascii="Times New Roman" w:hAnsi="Times New Roman" w:cs="Times New Roman"/>
-          <w:i/>
-          <w:iCs/>
-          <w:sz w:val="28"/>
-          <w:szCs w:val="28"/>
-        </w:rPr>
-        <w:fldChar w:fldCharType="begin"/>
-      </w:r>
-      <w:r>
-        <w:rPr>
-          <w:rFonts w:ascii="Times New Roman" w:hAnsi="Times New Roman" w:cs="Times New Roman"/>
-          <w:i/>
-          <w:iCs/>
-          <w:sz w:val="28"/>
-          <w:szCs w:val="28"/>
-        </w:rPr>
-        <w:instrText>HYPERLINK "</w:instrText>
-      </w:r>
-      <w:r>
-        <w:rPr>
-          <w:rFonts w:ascii="Times New Roman" w:hAnsi="Times New Roman" w:cs="Times New Roman"/>
-          <w:i/>
-          <w:iCs/>
-          <w:sz w:val="28"/>
-          <w:szCs w:val="28"/>
-        </w:rPr>
-        <w:instrText>https://disasterdisplacementanalysisdashboard.streamlit.app/</w:instrText>
-      </w:r>
-      <w:r>
-        <w:rPr>
-          <w:rFonts w:ascii="Times New Roman" w:hAnsi="Times New Roman" w:cs="Times New Roman"/>
-          <w:i/>
-          <w:iCs/>
-          <w:sz w:val="28"/>
-          <w:szCs w:val="28"/>
-        </w:rPr>
-        <w:instrText>"</w:instrText>
-      </w:r>
-      <w:r>
-        <w:rPr>
-          <w:rFonts w:ascii="Times New Roman" w:hAnsi="Times New Roman" w:cs="Times New Roman"/>
-          <w:i/>
-          <w:iCs/>
-          <w:sz w:val="28"/>
-          <w:szCs w:val="28"/>
-        </w:rPr>
-        <w:fldChar w:fldCharType="separate"/>
-      </w:r>
-      <w:r>
-        <w:rPr>
-          <w:rStyle w:val="Hyperlink"/>
-          <w:rFonts w:ascii="Times New Roman" w:hAnsi="Times New Roman" w:cs="Times New Roman"/>
-          <w:i/>
-          <w:iCs/>
-          <w:sz w:val="28"/>
-          <w:szCs w:val="28"/>
-        </w:rPr>
-        <w:t>https://disasterdisplacementanalysisdashboard.streamlit.app/</w:t>
-      </w:r>
-      <w:r>
-        <w:rPr>
-          <w:rFonts w:ascii="Times New Roman" w:hAnsi="Times New Roman" w:cs="Times New Roman"/>
-          <w:i/>
-          <w:iCs/>
-          <w:sz w:val="28"/>
-          <w:szCs w:val="28"/>
-        </w:rPr>
-        <w:fldChar w:fldCharType="end"/>
-      </w:r>
-      <w:r>
-        <w:rPr>
-          <w:rFonts w:ascii="Times New Roman" w:hAnsi="Times New Roman" w:cs="Times New Roman"/>
-          <w:b/>
-          <w:bCs/>
-          <w:sz w:val="28"/>
-          <w:szCs w:val="28"/>
-        </w:rPr>
-        <w:t xml:space="preserve"> </w:t>
-      </w:r>
-    </w:p>
-    <w:p>
-      <w:pPr>
-        <w:spacing w:line="360" w:lineRule="auto"/>
-        <w:jc w:val="left"/>
-        <w:rPr>
-          <w:rFonts w:ascii="Times New Roman" w:hAnsi="Times New Roman" w:cs="Times New Roman"/>
-          <w:b/>
-          <w:bCs/>
-          <w:sz w:val="28"/>
-          <w:szCs w:val="28"/>
-        </w:rPr>
-      </w:pPr>
-      <w:r>
-        <w:rPr>
-          <w:rFonts w:ascii="Times New Roman" w:hAnsi="Times New Roman" w:cs="Times New Roman"/>
-          <w:b/>
-          <w:bCs/>
-          <w:sz w:val="28"/>
-          <w:szCs w:val="28"/>
-        </w:rPr>
-        <w:t>GitHub:</w:t>
-      </w:r>
-      <w:r>
-        <w:rPr>
-          <w:rFonts w:ascii="Times New Roman" w:hAnsi="Times New Roman" w:cs="Times New Roman"/>
-          <w:i/>
-          <w:iCs/>
-          <w:sz w:val="28"/>
-          <w:szCs w:val="28"/>
-        </w:rPr>
-        <w:fldChar w:fldCharType="begin"/>
-      </w:r>
-      <w:r>
-        <w:rPr>
-          <w:rFonts w:ascii="Times New Roman" w:hAnsi="Times New Roman" w:cs="Times New Roman"/>
-          <w:i/>
-          <w:iCs/>
-          <w:sz w:val="28"/>
-          <w:szCs w:val="28"/>
-        </w:rPr>
-        <w:instrText>HYPERLINK "https://github.com/ShamlaAqthar19/w2149479_Disaster_Displacement_Dashboard"</w:instrText>
-      </w:r>
-      <w:r>
-        <w:rPr>
-          <w:rFonts w:ascii="Times New Roman" w:hAnsi="Times New Roman" w:cs="Times New Roman"/>
-          <w:i/>
-          <w:iCs/>
-          <w:sz w:val="28"/>
-          <w:szCs w:val="28"/>
-        </w:rPr>
-        <w:fldChar w:fldCharType="separate"/>
-      </w:r>
-      <w:r>
-        <w:rPr>
-          <w:rStyle w:val="Hyperlink"/>
-          <w:rFonts w:ascii="Times New Roman" w:hAnsi="Times New Roman" w:cs="Times New Roman"/>
-          <w:i/>
-          <w:iCs/>
-          <w:sz w:val="28"/>
-          <w:szCs w:val="28"/>
-        </w:rPr>
-        <w:t>https://github.com/ShamlaAqthar19/w2149479_Disaster_Displacement_Dashboard</w:t>
-      </w:r>
-      <w:r>
-        <w:rPr>
-          <w:rFonts w:ascii="Times New Roman" w:hAnsi="Times New Roman" w:cs="Times New Roman"/>
-          <w:i/>
-          <w:iCs/>
-          <w:sz w:val="28"/>
-          <w:szCs w:val="28"/>
-        </w:rPr>
-        <w:fldChar w:fldCharType="end"/>
-      </w:r>
-      <w:r>
-        <w:rPr>
-          <w:rFonts w:ascii="Times New Roman" w:hAnsi="Times New Roman" w:cs="Times New Roman"/>
-          <w:b/>
-          <w:bCs/>
-          <w:sz w:val="28"/>
-          <w:szCs w:val="28"/>
-        </w:rPr>
-        <w:t xml:space="preserve"> </w:t>
-      </w:r>
-    </w:p>
-    <w:p>
-      <w:pPr>
-        <w:spacing w:line="360" w:lineRule="auto"/>
-        <w:jc w:val="left"/>
-        <w:rPr>
-          <w:rFonts w:ascii="Times New Roman" w:hAnsi="Times New Roman" w:cs="Times New Roman"/>
-          <w:b/>
-          <w:bCs/>
-          <w:sz w:val="28"/>
-          <w:szCs w:val="28"/>
-        </w:rPr>
       </w:pPr>
     </w:p>
     <w:p>
@@ -927,7 +725,7 @@
         </w:rPr>
         <w:t xml:space="preserve"> </w:t>
       </w:r>
-      <w:hyperlink r:id="rId8" w:history="1">
+      <w:hyperlink r:id="rId11" w:history="1">
         <w:r>
           <w:rPr>
             <w:rStyle w:val="Hyperlink"/>
@@ -4390,7 +4188,19 @@
               <w:rPr>
                 <w:rFonts w:ascii="Times New Roman" w:hAnsi="Times New Roman" w:cs="Times New Roman"/>
               </w:rPr>
-              <w:t>Compare the KPI value and most affected country with the top 10 bar chart</w:t>
+              <w:t>Compare the KPI value and most affected country with the top 10 bar</w:t>
+            </w:r>
+            <w:r>
+              <w:rPr>
+                <w:rFonts w:ascii="Times New Roman" w:hAnsi="Times New Roman" w:cs="Times New Roman"/>
+              </w:rPr>
+              <w:t>-</w:t>
+            </w:r>
+            <w:r>
+              <w:rPr>
+                <w:rFonts w:ascii="Times New Roman" w:hAnsi="Times New Roman" w:cs="Times New Roman"/>
+              </w:rPr>
+              <w:t>chart</w:t>
             </w:r>
           </w:p>
         </w:tc>
@@ -4559,7 +4369,19 @@
               <w:rPr>
                 <w:rFonts w:ascii="Times New Roman" w:eastAsia="Aptos" w:hAnsi="Times New Roman" w:cs="Times New Roman"/>
               </w:rPr>
-              <w:t>The KPI value must match the first value in the Top 10 chart</w:t>
+              <w:t xml:space="preserve">The KPI value must match the first value in the Top 10 </w:t>
+            </w:r>
+            <w:r>
+              <w:rPr>
+                <w:rFonts w:ascii="Times New Roman" w:eastAsia="Aptos" w:hAnsi="Times New Roman" w:cs="Times New Roman"/>
+              </w:rPr>
+              <w:t>bar-</w:t>
+            </w:r>
+            <w:r>
+              <w:rPr>
+                <w:rFonts w:ascii="Times New Roman" w:eastAsia="Aptos" w:hAnsi="Times New Roman" w:cs="Times New Roman"/>
+              </w:rPr>
+              <w:t>chart</w:t>
             </w:r>
           </w:p>
         </w:tc>
@@ -5558,7 +5380,7 @@
       <w:r>
         <w:t xml:space="preserve">. Available at: </w:t>
       </w:r>
-      <w:hyperlink r:id="rId9" w:history="1">
+      <w:hyperlink r:id="rId12" w:history="1">
         <w:r>
           <w:rPr>
             <w:rStyle w:val="Hyperlink"/>
@@ -5567,10 +5389,7 @@
         </w:r>
       </w:hyperlink>
       <w:r>
-        <w:t xml:space="preserve"> </w:t>
-      </w:r>
-      <w:r>
-        <w:t xml:space="preserve"> (Accessed: 18 April 2026).</w:t>
+        <w:t xml:space="preserve">  (Accessed: 18 April 2026).</w:t>
       </w:r>
     </w:p>
     <w:p>
@@ -5609,7 +5428,7 @@
         </w:rPr>
         <w:t xml:space="preserve"> Docs (2025) Streamlit.io. Available at: </w:t>
       </w:r>
-      <w:hyperlink r:id="rId10" w:history="1">
+      <w:hyperlink r:id="rId13" w:history="1">
         <w:r>
           <w:rPr>
             <w:rStyle w:val="Hyperlink"/>
@@ -5622,13 +5441,7 @@
         <w:rPr>
           <w:rFonts w:ascii="Times New Roman" w:hAnsi="Times New Roman" w:cs="Times New Roman"/>
         </w:rPr>
-        <w:t xml:space="preserve"> </w:t>
-      </w:r>
-      <w:r>
-        <w:rPr>
-          <w:rFonts w:ascii="Times New Roman" w:hAnsi="Times New Roman" w:cs="Times New Roman"/>
-        </w:rPr>
-        <w:t>(Accessed: 26 April 2026).</w:t>
+        <w:t xml:space="preserve"> (Accessed: 26 April 2026).</w:t>
       </w:r>
     </w:p>
     <w:p>
@@ -6544,6 +6357,7 @@
   <w:style w:type="character" w:default="1" w:styleId="DefaultParagraphFont">
     <w:name w:val="Default Paragraph Font"/>
     <w:uiPriority w:val="1"/>
+    <w:semiHidden/>
     <w:unhideWhenUsed/>
   </w:style>
   <w:style w:type="table" w:default="1" w:styleId="TableNormal">

</xml_diff>